<commit_message>
Cobrar RecoTime a 20.000 por usuario en cada uno de los tres módulos.
Co-authored-by: Jhon123Javier <Jhon123Javier@users.noreply.github.com>
</commit_message>
<xml_diff>
--- a/documentos/recotime/Informe The Company Dev - Perfil RecoTime.docx
+++ b/documentos/recotime/Informe The Company Dev - Perfil RecoTime.docx
@@ -705,7 +705,7 @@
                 <w:color w:val="1B3325"/>
                 <w:sz w:val="20"/>
               </w:rPr>
-              <w:t>Sistema completo: $20.000 por usuario al mes. También se vende por módulos.</w:t>
+              <w:t>Cada módulo: $20.000 por usuario. Los tres juntos: $60.000.</w:t>
             </w:r>
           </w:p>
         </w:tc>
@@ -732,7 +732,47 @@
           <w:color w:val="1B3325"/>
           <w:sz w:val="26"/>
         </w:rPr>
-        <w:t>La recomendación es cobrar el sistema completo a $20.000 por usuario activo al mes. En 30 usuarios son $600.000 al mes, con la puesta en marcha incluida. La licencia regional de Odoo Standard, a US$ 8,95 por usuario, queda en $854.297 al mes para esas 30 personas, y esa cifra es solo la licencia. La VPS de Hostinger y el dominio los paga el cliente por su lado: la renovación del KVM 1 publicado hoy sale en $466.800 al año.</w:t>
+        <w:t xml:space="preserve">La recomendación es cobrar $20.000 por usuario activo al mes en cada módulo. Son tres: </w:t>
+      </w:r>
+      <w:r>
+        <w:rPr>
+          <w:rFonts w:ascii="Poppins" w:hAnsi="Poppins" w:cs="Poppins" w:eastAsia="Poppins"/>
+          <w:b/>
+          <w:i w:val="0"/>
+          <w:color w:val="1B3325"/>
+          <w:sz w:val="26"/>
+        </w:rPr>
+        <w:t>CRM</w:t>
+      </w:r>
+      <w:r>
+        <w:rPr>
+          <w:rFonts w:ascii="Poppins" w:hAnsi="Poppins" w:cs="Poppins" w:eastAsia="Poppins"/>
+          <w:b w:val="0"/>
+          <w:i w:val="0"/>
+          <w:color w:val="1B3325"/>
+          <w:sz w:val="26"/>
+        </w:rPr>
+        <w:t xml:space="preserve"> y </w:t>
+      </w:r>
+      <w:r>
+        <w:rPr>
+          <w:rFonts w:ascii="Poppins" w:hAnsi="Poppins" w:cs="Poppins" w:eastAsia="Poppins"/>
+          <w:b/>
+          <w:i w:val="0"/>
+          <w:color w:val="1B3325"/>
+          <w:sz w:val="26"/>
+        </w:rPr>
+        <w:t>ERP</w:t>
+      </w:r>
+      <w:r>
+        <w:rPr>
+          <w:rFonts w:ascii="Poppins" w:hAnsi="Poppins" w:cs="Poppins" w:eastAsia="Poppins"/>
+          <w:b w:val="0"/>
+          <w:i w:val="0"/>
+          <w:color w:val="1B3325"/>
+          <w:sz w:val="26"/>
+        </w:rPr>
+        <w:t xml:space="preserve"> de gestión, asistencia, y Drive. Un módulo, en 30 usuarios, son $600.000 al mes. Los tres juntos son $60.000 por usuario, $1.800.000 al mes. La licencia regional de Odoo Standard queda en $28.477 por usuario. La VPS y el dominio los paga el cliente: la renovación del KVM 1 sale en $466.800 al año.</w:t>
       </w:r>
     </w:p>
     <w:p>
@@ -3246,6 +3286,36 @@
               </w:rPr>
               <w:t>CRM</w:t>
             </w:r>
+            <w:r>
+              <w:rPr>
+                <w:rFonts w:ascii="Poppins" w:hAnsi="Poppins" w:cs="Poppins" w:eastAsia="Poppins"/>
+                <w:b w:val="0"/>
+                <w:i w:val="0"/>
+                <w:color w:val="1B3325"/>
+                <w:sz w:val="20"/>
+              </w:rPr>
+              <w:t xml:space="preserve"> y </w:t>
+            </w:r>
+            <w:r>
+              <w:rPr>
+                <w:rFonts w:ascii="Poppins" w:hAnsi="Poppins" w:cs="Poppins" w:eastAsia="Poppins"/>
+                <w:b/>
+                <w:i w:val="0"/>
+                <w:color w:val="1B3325"/>
+                <w:sz w:val="20"/>
+              </w:rPr>
+              <w:t>ERP</w:t>
+            </w:r>
+            <w:r>
+              <w:rPr>
+                <w:rFonts w:ascii="Poppins" w:hAnsi="Poppins" w:cs="Poppins" w:eastAsia="Poppins"/>
+                <w:b w:val="0"/>
+                <w:i w:val="0"/>
+                <w:color w:val="1B3325"/>
+                <w:sz w:val="20"/>
+              </w:rPr>
+              <w:t xml:space="preserve"> de gestión</w:t>
+            </w:r>
           </w:p>
         </w:tc>
         <w:tc>
@@ -3282,7 +3352,7 @@
                 <w:color w:val="1B3325"/>
                 <w:sz w:val="20"/>
               </w:rPr>
-              <w:t>Clientes, contactos y oportunidades. Etapas del seguimiento, responsable y próxima acción. Historial de la relación.</w:t>
+              <w:t>Clientes, contactos, oportunidades y seguimiento. Áreas, cargos, procesos y tablero. Trazabilidad del trabajador: ficha, asignación, actividad y estado. Reportes de la operación.</w:t>
             </w:r>
           </w:p>
         </w:tc>
@@ -3325,27 +3395,7 @@
                 <w:color w:val="1B3325"/>
                 <w:sz w:val="20"/>
               </w:rPr>
-              <w:t xml:space="preserve">2. </w:t>
-            </w:r>
-            <w:r>
-              <w:rPr>
-                <w:rFonts w:ascii="Poppins" w:hAnsi="Poppins" w:cs="Poppins" w:eastAsia="Poppins"/>
-                <w:b/>
-                <w:i w:val="0"/>
-                <w:color w:val="1B3325"/>
-                <w:sz w:val="20"/>
-              </w:rPr>
-              <w:t>ERP</w:t>
-            </w:r>
-            <w:r>
-              <w:rPr>
-                <w:rFonts w:ascii="Poppins" w:hAnsi="Poppins" w:cs="Poppins" w:eastAsia="Poppins"/>
-                <w:b w:val="0"/>
-                <w:i w:val="0"/>
-                <w:color w:val="1B3325"/>
-                <w:sz w:val="20"/>
-              </w:rPr>
-              <w:t xml:space="preserve"> de gestión</w:t>
+              <w:t>2. Asistencia</w:t>
             </w:r>
           </w:p>
         </w:tc>
@@ -3383,7 +3433,7 @@
                 <w:color w:val="1B3325"/>
                 <w:sz w:val="20"/>
               </w:rPr>
-              <w:t>Áreas, cargos y procesos. Tablero de la operación para gerencia. Usuarios, roles y permisos de los cuatro accesos.</w:t>
+              <w:t>Llegada, inicio y fin de almuerzo, descansos y salida. Línea de tiempo por trabajador. Lista del día para el supervisor. Reportes de la jornada.</w:t>
             </w:r>
           </w:p>
         </w:tc>
@@ -3415,7 +3465,6 @@
               <w:spacing w:before="0" w:after="0" w:line="259" w:lineRule="auto"/>
               <w:jc w:val="left"/>
               <w:widowControl/>
-              <w:keepNext/>
             </w:pPr>
             <w:r/>
             <w:r>
@@ -3426,7 +3475,7 @@
                 <w:color w:val="1B3325"/>
                 <w:sz w:val="20"/>
               </w:rPr>
-              <w:t>3. Trazabilidad del trabajador</w:t>
+              <w:t>3. Drive</w:t>
             </w:r>
           </w:p>
         </w:tc>
@@ -3446,248 +3495,6 @@
               <w:right w:w="80" w:type="dxa"/>
             </w:tcMar>
             <w:shd w:val="clear" w:color="auto" w:fill="FFFFFF"/>
-            <w:vAlign w:val="center"/>
-          </w:tcPr>
-          <w:p>
-            <w:pPr>
-              <w:spacing w:before="0" w:after="0" w:line="259" w:lineRule="auto"/>
-              <w:jc w:val="left"/>
-              <w:widowControl/>
-              <w:keepNext/>
-            </w:pPr>
-            <w:r/>
-            <w:r>
-              <w:rPr>
-                <w:rFonts w:ascii="Poppins" w:hAnsi="Poppins" w:cs="Poppins" w:eastAsia="Poppins"/>
-                <w:b w:val="0"/>
-                <w:i w:val="0"/>
-                <w:color w:val="1B3325"/>
-                <w:sz w:val="20"/>
-              </w:rPr>
-              <w:t>Ficha de la persona. Asignación a un cliente o a un proceso. Actividad con inicio, fin y estado. Historial que permanece al cerrar el día.</w:t>
-            </w:r>
-          </w:p>
-        </w:tc>
-      </w:tr>
-      <w:tr>
-        <w:trPr>
-          <w:cantSplit/>
-        </w:trPr>
-        <w:tc>
-          <w:tcPr>
-            <w:tcW w:type="dxa" w:w="2800"/>
-            <w:tcBorders>
-              <w:top w:val="single" w:sz="4" w:space="0" w:color="1B3325"/>
-              <w:left w:val="single" w:sz="4" w:space="0" w:color="1B3325"/>
-              <w:bottom w:val="single" w:sz="4" w:space="0" w:color="1B3325"/>
-              <w:right w:val="single" w:sz="4" w:space="0" w:color="1B3325"/>
-            </w:tcBorders>
-            <w:tcMar>
-              <w:top w:w="40" w:type="dxa"/>
-              <w:left w:w="80" w:type="dxa"/>
-              <w:bottom w:w="40" w:type="dxa"/>
-              <w:right w:w="80" w:type="dxa"/>
-            </w:tcMar>
-            <w:shd w:val="clear" w:color="auto" w:fill="F7FBF8"/>
-            <w:vAlign w:val="center"/>
-          </w:tcPr>
-          <w:p>
-            <w:pPr>
-              <w:spacing w:before="0" w:after="0" w:line="259" w:lineRule="auto"/>
-              <w:jc w:val="left"/>
-              <w:widowControl/>
-              <w:keepNext/>
-            </w:pPr>
-            <w:r/>
-            <w:r>
-              <w:rPr>
-                <w:rFonts w:ascii="Poppins" w:hAnsi="Poppins" w:cs="Poppins" w:eastAsia="Poppins"/>
-                <w:b w:val="0"/>
-                <w:i w:val="0"/>
-                <w:color w:val="1B3325"/>
-                <w:sz w:val="20"/>
-              </w:rPr>
-              <w:t>4. Asistencia</w:t>
-            </w:r>
-          </w:p>
-        </w:tc>
-        <w:tc>
-          <w:tcPr>
-            <w:tcW w:type="dxa" w:w="6800"/>
-            <w:tcBorders>
-              <w:top w:val="single" w:sz="4" w:space="0" w:color="1B3325"/>
-              <w:left w:val="single" w:sz="4" w:space="0" w:color="1B3325"/>
-              <w:bottom w:val="single" w:sz="4" w:space="0" w:color="1B3325"/>
-              <w:right w:val="single" w:sz="4" w:space="0" w:color="1B3325"/>
-            </w:tcBorders>
-            <w:tcMar>
-              <w:top w:w="40" w:type="dxa"/>
-              <w:left w:w="80" w:type="dxa"/>
-              <w:bottom w:w="40" w:type="dxa"/>
-              <w:right w:w="80" w:type="dxa"/>
-            </w:tcMar>
-            <w:shd w:val="clear" w:color="auto" w:fill="F7FBF8"/>
-            <w:vAlign w:val="center"/>
-          </w:tcPr>
-          <w:p>
-            <w:pPr>
-              <w:spacing w:before="0" w:after="0" w:line="259" w:lineRule="auto"/>
-              <w:jc w:val="left"/>
-              <w:widowControl/>
-              <w:keepNext/>
-            </w:pPr>
-            <w:r/>
-            <w:r>
-              <w:rPr>
-                <w:rFonts w:ascii="Poppins" w:hAnsi="Poppins" w:cs="Poppins" w:eastAsia="Poppins"/>
-                <w:b w:val="0"/>
-                <w:i w:val="0"/>
-                <w:color w:val="1B3325"/>
-                <w:sz w:val="20"/>
-              </w:rPr>
-              <w:t>Llegada, inicio y fin de almuerzo, descansos y salida. Línea de tiempo por trabajador. Lista del día para el supervisor.</w:t>
-            </w:r>
-          </w:p>
-        </w:tc>
-      </w:tr>
-      <w:tr>
-        <w:trPr>
-          <w:cantSplit/>
-        </w:trPr>
-        <w:tc>
-          <w:tcPr>
-            <w:tcW w:type="dxa" w:w="2800"/>
-            <w:tcBorders>
-              <w:top w:val="single" w:sz="4" w:space="0" w:color="1B3325"/>
-              <w:left w:val="single" w:sz="4" w:space="0" w:color="1B3325"/>
-              <w:bottom w:val="single" w:sz="4" w:space="0" w:color="1B3325"/>
-              <w:right w:val="single" w:sz="4" w:space="0" w:color="1B3325"/>
-            </w:tcBorders>
-            <w:tcMar>
-              <w:top w:w="40" w:type="dxa"/>
-              <w:left w:w="80" w:type="dxa"/>
-              <w:bottom w:w="40" w:type="dxa"/>
-              <w:right w:w="80" w:type="dxa"/>
-            </w:tcMar>
-            <w:shd w:val="clear" w:color="auto" w:fill="FFFFFF"/>
-            <w:vAlign w:val="center"/>
-          </w:tcPr>
-          <w:p>
-            <w:pPr>
-              <w:spacing w:before="0" w:after="0" w:line="259" w:lineRule="auto"/>
-              <w:jc w:val="left"/>
-              <w:widowControl/>
-              <w:keepNext/>
-            </w:pPr>
-            <w:r/>
-            <w:r>
-              <w:rPr>
-                <w:rFonts w:ascii="Poppins" w:hAnsi="Poppins" w:cs="Poppins" w:eastAsia="Poppins"/>
-                <w:b w:val="0"/>
-                <w:i w:val="0"/>
-                <w:color w:val="1B3325"/>
-                <w:sz w:val="20"/>
-              </w:rPr>
-              <w:t>5. Reportes</w:t>
-            </w:r>
-          </w:p>
-        </w:tc>
-        <w:tc>
-          <w:tcPr>
-            <w:tcW w:type="dxa" w:w="6800"/>
-            <w:tcBorders>
-              <w:top w:val="single" w:sz="4" w:space="0" w:color="1B3325"/>
-              <w:left w:val="single" w:sz="4" w:space="0" w:color="1B3325"/>
-              <w:bottom w:val="single" w:sz="4" w:space="0" w:color="1B3325"/>
-              <w:right w:val="single" w:sz="4" w:space="0" w:color="1B3325"/>
-            </w:tcBorders>
-            <w:tcMar>
-              <w:top w:w="40" w:type="dxa"/>
-              <w:left w:w="80" w:type="dxa"/>
-              <w:bottom w:w="40" w:type="dxa"/>
-              <w:right w:w="80" w:type="dxa"/>
-            </w:tcMar>
-            <w:shd w:val="clear" w:color="auto" w:fill="FFFFFF"/>
-            <w:vAlign w:val="center"/>
-          </w:tcPr>
-          <w:p>
-            <w:pPr>
-              <w:spacing w:before="0" w:after="0" w:line="259" w:lineRule="auto"/>
-              <w:jc w:val="left"/>
-              <w:widowControl/>
-              <w:keepNext/>
-            </w:pPr>
-            <w:r/>
-            <w:r>
-              <w:rPr>
-                <w:rFonts w:ascii="Poppins" w:hAnsi="Poppins" w:cs="Poppins" w:eastAsia="Poppins"/>
-                <w:b w:val="0"/>
-                <w:i w:val="0"/>
-                <w:color w:val="1B3325"/>
-                <w:sz w:val="20"/>
-              </w:rPr>
-              <w:t>Puntualidad, duración de almuerzo y descansos, carga por persona y avance comercial. Exportación de la consulta. Viajan con el módulo al que corresponden.</w:t>
-            </w:r>
-          </w:p>
-        </w:tc>
-      </w:tr>
-      <w:tr>
-        <w:trPr>
-          <w:cantSplit/>
-        </w:trPr>
-        <w:tc>
-          <w:tcPr>
-            <w:tcW w:type="dxa" w:w="2800"/>
-            <w:tcBorders>
-              <w:top w:val="single" w:sz="4" w:space="0" w:color="1B3325"/>
-              <w:left w:val="single" w:sz="4" w:space="0" w:color="1B3325"/>
-              <w:bottom w:val="single" w:sz="4" w:space="0" w:color="1B3325"/>
-              <w:right w:val="single" w:sz="4" w:space="0" w:color="1B3325"/>
-            </w:tcBorders>
-            <w:tcMar>
-              <w:top w:w="40" w:type="dxa"/>
-              <w:left w:w="80" w:type="dxa"/>
-              <w:bottom w:w="40" w:type="dxa"/>
-              <w:right w:w="80" w:type="dxa"/>
-            </w:tcMar>
-            <w:shd w:val="clear" w:color="auto" w:fill="F7FBF8"/>
-            <w:vAlign w:val="center"/>
-          </w:tcPr>
-          <w:p>
-            <w:pPr>
-              <w:spacing w:before="0" w:after="0" w:line="259" w:lineRule="auto"/>
-              <w:jc w:val="left"/>
-              <w:widowControl/>
-            </w:pPr>
-            <w:r/>
-            <w:r>
-              <w:rPr>
-                <w:rFonts w:ascii="Poppins" w:hAnsi="Poppins" w:cs="Poppins" w:eastAsia="Poppins"/>
-                <w:b w:val="0"/>
-                <w:i w:val="0"/>
-                <w:color w:val="1B3325"/>
-                <w:sz w:val="20"/>
-              </w:rPr>
-              <w:t>6. Drive</w:t>
-            </w:r>
-          </w:p>
-        </w:tc>
-        <w:tc>
-          <w:tcPr>
-            <w:tcW w:type="dxa" w:w="6800"/>
-            <w:tcBorders>
-              <w:top w:val="single" w:sz="4" w:space="0" w:color="1B3325"/>
-              <w:left w:val="single" w:sz="4" w:space="0" w:color="1B3325"/>
-              <w:bottom w:val="single" w:sz="4" w:space="0" w:color="1B3325"/>
-              <w:right w:val="single" w:sz="4" w:space="0" w:color="1B3325"/>
-            </w:tcBorders>
-            <w:tcMar>
-              <w:top w:w="40" w:type="dxa"/>
-              <w:left w:w="80" w:type="dxa"/>
-              <w:bottom w:w="40" w:type="dxa"/>
-              <w:right w:w="80" w:type="dxa"/>
-            </w:tcMar>
-            <w:shd w:val="clear" w:color="auto" w:fill="F7FBF8"/>
             <w:vAlign w:val="center"/>
           </w:tcPr>
           <w:p>
@@ -11631,7 +11438,7 @@
           <w:color w:val="1B3325"/>
           <w:sz w:val="26"/>
         </w:rPr>
-        <w:t xml:space="preserve">La sección 11 cobra el sistema completo a $20.000 por usuario al mes. Para 30 usuarios son $600.000. Frente a la licencia regional de Odoo Standard para esas 30 personas, el sistema completo queda $254.297 más bajo, y la puesta en marcha de </w:t>
+        <w:t xml:space="preserve">Cada módulo cuesta $20.000 por usuario al mes. Un solo módulo, para 30 usuarios, son $600.000. Eso queda $254.297 por debajo de la licencia regional de Odoo Standard para 30 usuarios, y la puesta en marcha de ese módulo va incluida. Los tres módulos juntos son $60.000 por usuario, $1.800.000 al mes para 30 personas. Esa suma queda $945.703 por encima de la sola licencia de Odoo, porque Odoo cobra una vez por todas las aplicaciones y </w:t>
       </w:r>
       <w:r>
         <w:rPr>
@@ -11651,7 +11458,24 @@
           <w:color w:val="1B3325"/>
           <w:sz w:val="26"/>
         </w:rPr>
-        <w:t xml:space="preserve"> va incluida. Frente a Bitrix24 Professional con pago anual, 30 usuarios de </w:t>
+        <w:t xml:space="preserve"> cobra cada módulo.</w:t>
+      </w:r>
+    </w:p>
+    <w:p>
+      <w:pPr>
+        <w:spacing w:before="0" w:after="160" w:line="259" w:lineRule="auto"/>
+        <w:jc w:val="both"/>
+        <w:widowControl/>
+      </w:pPr>
+      <w:r>
+        <w:rPr>
+          <w:rFonts w:ascii="Poppins" w:hAnsi="Poppins" w:cs="Poppins" w:eastAsia="Poppins"/>
+          <w:b w:val="0"/>
+          <w:i w:val="0"/>
+          <w:color w:val="1B3325"/>
+          <w:sz w:val="26"/>
+        </w:rPr>
+        <w:t xml:space="preserve">El Drive, como módulo suelto, queda en $20.000 por usuario. Zoho WorkDrive Team, solo archivos, equivale a $14.318 por usuario. SharePoint Plan 1 equivale a $15.909. Google Workspace Business Standard, en la lista de Colombia, cuesta $58.400 por usuario, casi el valor de los tres módulos de </w:t>
       </w:r>
       <w:r>
         <w:rPr>
@@ -11671,7 +11495,7 @@
           <w:color w:val="1B3325"/>
           <w:sz w:val="26"/>
         </w:rPr>
-        <w:t xml:space="preserve"> quedan $33.166 más bajos. A partir de 32 usuarios el fijo de Bitrix24, que no sube hasta los 100, vuelve a quedar por debajo: 40 usuarios de </w:t>
+        <w:t xml:space="preserve"> juntos ($60.000), e incluye 2 TB por persona, correo y documentos. El Drive de </w:t>
       </w:r>
       <w:r>
         <w:rPr>
@@ -11691,7 +11515,7 @@
           <w:color w:val="1B3325"/>
           <w:sz w:val="26"/>
         </w:rPr>
-        <w:t xml:space="preserve"> son $800.000 y Professional sigue en $633.166.</w:t>
+        <w:t xml:space="preserve"> entrega una intranet de 2 TB para toda la cuenta, no 2 TB por cabeza.</w:t>
       </w:r>
     </w:p>
     <w:p>
@@ -11708,64 +11532,7 @@
           <w:color w:val="1B3325"/>
           <w:sz w:val="26"/>
         </w:rPr>
-        <w:t xml:space="preserve">El módulo Drive, suelto, queda en $8.000 por usuario. Zoho WorkDrive Team, solo archivos, equivale a $14.318 por usuario y reparte varios terabytes según el tamaño del equipo. Google Workspace Business Standard, en la lista de Colombia, cuesta $58.400 por usuario e incluye 2 TB por persona, correo y documentos. El Drive de </w:t>
-      </w:r>
-      <w:r>
-        <w:rPr>
-          <w:rFonts w:ascii="Poppins" w:hAnsi="Poppins" w:cs="Poppins" w:eastAsia="Poppins"/>
-          <w:b/>
-          <w:i w:val="0"/>
-          <w:color w:val="1B3325"/>
-          <w:sz w:val="26"/>
-        </w:rPr>
-        <w:t>RecoTime</w:t>
-      </w:r>
-      <w:r>
-        <w:rPr>
-          <w:rFonts w:ascii="Poppins" w:hAnsi="Poppins" w:cs="Poppins" w:eastAsia="Poppins"/>
-          <w:b w:val="0"/>
-          <w:i w:val="0"/>
-          <w:color w:val="1B3325"/>
-          <w:sz w:val="26"/>
-        </w:rPr>
-        <w:t xml:space="preserve"> no reemplaza ese correo ni entrega 2 TB por cabeza: entrega una intranet de 2 TB para toda la cuenta, dentro del mismo usuario del </w:t>
-      </w:r>
-      <w:r>
-        <w:rPr>
-          <w:rFonts w:ascii="Poppins" w:hAnsi="Poppins" w:cs="Poppins" w:eastAsia="Poppins"/>
-          <w:b/>
-          <w:i w:val="0"/>
-          <w:color w:val="1B3325"/>
-          <w:sz w:val="26"/>
-        </w:rPr>
-        <w:t>CRM</w:t>
-      </w:r>
-      <w:r>
-        <w:rPr>
-          <w:rFonts w:ascii="Poppins" w:hAnsi="Poppins" w:cs="Poppins" w:eastAsia="Poppins"/>
-          <w:b w:val="0"/>
-          <w:i w:val="0"/>
-          <w:color w:val="1B3325"/>
-          <w:sz w:val="26"/>
-        </w:rPr>
-        <w:t xml:space="preserve"> y de la asistencia.</w:t>
-      </w:r>
-    </w:p>
-    <w:p>
-      <w:pPr>
-        <w:spacing w:before="0" w:after="160" w:line="259" w:lineRule="auto"/>
-        <w:jc w:val="both"/>
-        <w:widowControl/>
-      </w:pPr>
-      <w:r>
-        <w:rPr>
-          <w:rFonts w:ascii="Poppins" w:hAnsi="Poppins" w:cs="Poppins" w:eastAsia="Poppins"/>
-          <w:b w:val="0"/>
-          <w:i w:val="0"/>
-          <w:color w:val="1B3325"/>
-          <w:sz w:val="26"/>
-        </w:rPr>
-        <w:t>La VPS no entra en los $20.000. El cliente la paga a Hostinger y también pone el dominio. La referencia de $500.000 al año corresponde a la renovación del KVM 1, $466.800. Ese plan trae 50 GB de disco. La cuota de 2 TB del Drive es el techo del software. Mientras el disco de la VPS sea menor, el espacio usable es el del disco.</w:t>
+        <w:t>La VPS no entra en los $20.000 de cada módulo. El cliente la paga a Hostinger y también pone el dominio. La referencia de $500.000 al año corresponde a la renovación del KVM 1, $466.800. Ese plan trae 50 GB de disco. La cuota de 2 TB del Drive es el techo del software. Mientras el disco de la VPS sea menor, el espacio usable es el del disco.</w:t>
       </w:r>
     </w:p>
     <w:p>
@@ -13421,7 +13188,7 @@
           <w:color w:val="1B3325"/>
           <w:sz w:val="26"/>
         </w:rPr>
-        <w:t>11.1. Sistema completo</w:t>
+        <w:t>11.1. Precio por módulo</w:t>
       </w:r>
     </w:p>
     <w:p>
@@ -13438,47 +13205,7 @@
           <w:color w:val="1B3325"/>
           <w:sz w:val="26"/>
         </w:rPr>
-        <w:t xml:space="preserve">El sistema completo cuesta $20.000 por usuario activo al mes. Incluye </w:t>
-      </w:r>
-      <w:r>
-        <w:rPr>
-          <w:rFonts w:ascii="Poppins" w:hAnsi="Poppins" w:cs="Poppins" w:eastAsia="Poppins"/>
-          <w:b/>
-          <w:i w:val="0"/>
-          <w:color w:val="1B3325"/>
-          <w:sz w:val="26"/>
-        </w:rPr>
-        <w:t>CRM</w:t>
-      </w:r>
-      <w:r>
-        <w:rPr>
-          <w:rFonts w:ascii="Poppins" w:hAnsi="Poppins" w:cs="Poppins" w:eastAsia="Poppins"/>
-          <w:b w:val="0"/>
-          <w:i w:val="0"/>
-          <w:color w:val="1B3325"/>
-          <w:sz w:val="26"/>
-        </w:rPr>
-        <w:t xml:space="preserve">, </w:t>
-      </w:r>
-      <w:r>
-        <w:rPr>
-          <w:rFonts w:ascii="Poppins" w:hAnsi="Poppins" w:cs="Poppins" w:eastAsia="Poppins"/>
-          <w:b/>
-          <w:i w:val="0"/>
-          <w:color w:val="1B3325"/>
-          <w:sz w:val="26"/>
-        </w:rPr>
-        <w:t>ERP</w:t>
-      </w:r>
-      <w:r>
-        <w:rPr>
-          <w:rFonts w:ascii="Poppins" w:hAnsi="Poppins" w:cs="Poppins" w:eastAsia="Poppins"/>
-          <w:b w:val="0"/>
-          <w:i w:val="0"/>
-          <w:color w:val="1B3325"/>
-          <w:sz w:val="26"/>
-        </w:rPr>
-        <w:t xml:space="preserve"> de gestión, trazabilidad, asistencia, reportes y Drive, con la cuota de 2 TB para toda la cuenta. La suma de los cinco módulos sueltos es $37.000. El completo queda por debajo de esa suma a propósito: quien necesita la operación entera paga $20.000, no $37.000.</w:t>
+        <w:t>Cada módulo cuesta $20.000 por usuario activo al mes. Los tres juntos cuestan $60.000 por usuario: es la suma, sin un descuento aparte. Quien toma un módulo paga $20.000. Quien toma los tres paga $60.000.</w:t>
       </w:r>
     </w:p>
     <w:tbl>
@@ -13679,6 +13406,7 @@
               <w:spacing w:before="0" w:after="0" w:line="259" w:lineRule="auto"/>
               <w:jc w:val="left"/>
               <w:widowControl/>
+              <w:keepNext/>
             </w:pPr>
             <w:r/>
             <w:r>
@@ -13689,7 +13417,7 @@
                 <w:color w:val="1B3325"/>
                 <w:sz w:val="20"/>
               </w:rPr>
-              <w:t>Sistema completo</w:t>
+              <w:t>Un módulo</w:t>
             </w:r>
           </w:p>
         </w:tc>
@@ -13716,6 +13444,7 @@
               <w:spacing w:before="0" w:after="0" w:line="259" w:lineRule="auto"/>
               <w:jc w:val="center"/>
               <w:widowControl/>
+              <w:keepNext/>
             </w:pPr>
             <w:r/>
             <w:r>
@@ -13753,6 +13482,7 @@
               <w:spacing w:before="0" w:after="0" w:line="259" w:lineRule="auto"/>
               <w:jc w:val="center"/>
               <w:widowControl/>
+              <w:keepNext/>
             </w:pPr>
             <w:r/>
             <w:r>
@@ -13790,6 +13520,7 @@
               <w:spacing w:before="0" w:after="0" w:line="259" w:lineRule="auto"/>
               <w:jc w:val="center"/>
               <w:widowControl/>
+              <w:keepNext/>
             </w:pPr>
             <w:r/>
             <w:r>
@@ -13801,6 +13532,316 @@
                 <w:sz w:val="20"/>
               </w:rPr>
               <w:t>$440.000</w:t>
+            </w:r>
+          </w:p>
+        </w:tc>
+      </w:tr>
+      <w:tr>
+        <w:trPr>
+          <w:cantSplit/>
+        </w:trPr>
+        <w:tc>
+          <w:tcPr>
+            <w:tcW w:type="dxa" w:w="2400"/>
+            <w:tcBorders>
+              <w:top w:val="single" w:sz="4" w:space="0" w:color="1B3325"/>
+              <w:left w:val="single" w:sz="4" w:space="0" w:color="1B3325"/>
+              <w:bottom w:val="single" w:sz="4" w:space="0" w:color="1B3325"/>
+              <w:right w:val="single" w:sz="4" w:space="0" w:color="1B3325"/>
+            </w:tcBorders>
+            <w:tcMar>
+              <w:top w:w="40" w:type="dxa"/>
+              <w:left w:w="80" w:type="dxa"/>
+              <w:bottom w:w="40" w:type="dxa"/>
+              <w:right w:w="80" w:type="dxa"/>
+            </w:tcMar>
+            <w:shd w:val="clear" w:color="auto" w:fill="F7FBF8"/>
+            <w:vAlign w:val="center"/>
+          </w:tcPr>
+          <w:p>
+            <w:pPr>
+              <w:spacing w:before="0" w:after="0" w:line="259" w:lineRule="auto"/>
+              <w:jc w:val="left"/>
+              <w:widowControl/>
+              <w:keepNext/>
+            </w:pPr>
+            <w:r/>
+            <w:r>
+              <w:rPr>
+                <w:rFonts w:ascii="Poppins" w:hAnsi="Poppins" w:cs="Poppins" w:eastAsia="Poppins"/>
+                <w:b w:val="0"/>
+                <w:i w:val="0"/>
+                <w:color w:val="1B3325"/>
+                <w:sz w:val="20"/>
+              </w:rPr>
+              <w:t>Dos módulos</w:t>
+            </w:r>
+          </w:p>
+        </w:tc>
+        <w:tc>
+          <w:tcPr>
+            <w:tcW w:type="dxa" w:w="2400"/>
+            <w:tcBorders>
+              <w:top w:val="single" w:sz="4" w:space="0" w:color="1B3325"/>
+              <w:left w:val="single" w:sz="4" w:space="0" w:color="1B3325"/>
+              <w:bottom w:val="single" w:sz="4" w:space="0" w:color="1B3325"/>
+              <w:right w:val="single" w:sz="4" w:space="0" w:color="1B3325"/>
+            </w:tcBorders>
+            <w:tcMar>
+              <w:top w:w="40" w:type="dxa"/>
+              <w:left w:w="80" w:type="dxa"/>
+              <w:bottom w:w="40" w:type="dxa"/>
+              <w:right w:w="80" w:type="dxa"/>
+            </w:tcMar>
+            <w:shd w:val="clear" w:color="auto" w:fill="F7FBF8"/>
+            <w:vAlign w:val="center"/>
+          </w:tcPr>
+          <w:p>
+            <w:pPr>
+              <w:spacing w:before="0" w:after="0" w:line="259" w:lineRule="auto"/>
+              <w:jc w:val="center"/>
+              <w:widowControl/>
+              <w:keepNext/>
+            </w:pPr>
+            <w:r/>
+            <w:r>
+              <w:rPr>
+                <w:rFonts w:ascii="Poppins" w:hAnsi="Poppins" w:cs="Poppins" w:eastAsia="Poppins"/>
+                <w:b w:val="0"/>
+                <w:i w:val="0"/>
+                <w:color w:val="1B3325"/>
+                <w:sz w:val="20"/>
+              </w:rPr>
+              <w:t>$40.000</w:t>
+            </w:r>
+          </w:p>
+        </w:tc>
+        <w:tc>
+          <w:tcPr>
+            <w:tcW w:type="dxa" w:w="2400"/>
+            <w:tcBorders>
+              <w:top w:val="single" w:sz="4" w:space="0" w:color="1B3325"/>
+              <w:left w:val="single" w:sz="4" w:space="0" w:color="1B3325"/>
+              <w:bottom w:val="single" w:sz="4" w:space="0" w:color="1B3325"/>
+              <w:right w:val="single" w:sz="4" w:space="0" w:color="1B3325"/>
+            </w:tcBorders>
+            <w:tcMar>
+              <w:top w:w="40" w:type="dxa"/>
+              <w:left w:w="80" w:type="dxa"/>
+              <w:bottom w:w="40" w:type="dxa"/>
+              <w:right w:w="80" w:type="dxa"/>
+            </w:tcMar>
+            <w:shd w:val="clear" w:color="auto" w:fill="F7FBF8"/>
+            <w:vAlign w:val="center"/>
+          </w:tcPr>
+          <w:p>
+            <w:pPr>
+              <w:spacing w:before="0" w:after="0" w:line="259" w:lineRule="auto"/>
+              <w:jc w:val="center"/>
+              <w:widowControl/>
+              <w:keepNext/>
+            </w:pPr>
+            <w:r/>
+            <w:r>
+              <w:rPr>
+                <w:rFonts w:ascii="Poppins" w:hAnsi="Poppins" w:cs="Poppins" w:eastAsia="Poppins"/>
+                <w:b w:val="0"/>
+                <w:i w:val="0"/>
+                <w:color w:val="1B3325"/>
+                <w:sz w:val="20"/>
+              </w:rPr>
+              <w:t>$400.000</w:t>
+            </w:r>
+          </w:p>
+        </w:tc>
+        <w:tc>
+          <w:tcPr>
+            <w:tcW w:type="dxa" w:w="2400"/>
+            <w:tcBorders>
+              <w:top w:val="single" w:sz="4" w:space="0" w:color="1B3325"/>
+              <w:left w:val="single" w:sz="4" w:space="0" w:color="1B3325"/>
+              <w:bottom w:val="single" w:sz="4" w:space="0" w:color="1B3325"/>
+              <w:right w:val="single" w:sz="4" w:space="0" w:color="1B3325"/>
+            </w:tcBorders>
+            <w:tcMar>
+              <w:top w:w="40" w:type="dxa"/>
+              <w:left w:w="80" w:type="dxa"/>
+              <w:bottom w:w="40" w:type="dxa"/>
+              <w:right w:w="80" w:type="dxa"/>
+            </w:tcMar>
+            <w:shd w:val="clear" w:color="auto" w:fill="F7FBF8"/>
+            <w:vAlign w:val="center"/>
+          </w:tcPr>
+          <w:p>
+            <w:pPr>
+              <w:spacing w:before="0" w:after="0" w:line="259" w:lineRule="auto"/>
+              <w:jc w:val="center"/>
+              <w:widowControl/>
+              <w:keepNext/>
+            </w:pPr>
+            <w:r/>
+            <w:r>
+              <w:rPr>
+                <w:rFonts w:ascii="Poppins" w:hAnsi="Poppins" w:cs="Poppins" w:eastAsia="Poppins"/>
+                <w:b w:val="0"/>
+                <w:i w:val="0"/>
+                <w:color w:val="1B3325"/>
+                <w:sz w:val="20"/>
+              </w:rPr>
+              <w:t>$880.000</w:t>
+            </w:r>
+          </w:p>
+        </w:tc>
+      </w:tr>
+      <w:tr>
+        <w:trPr>
+          <w:cantSplit/>
+        </w:trPr>
+        <w:tc>
+          <w:tcPr>
+            <w:tcW w:type="dxa" w:w="2400"/>
+            <w:tcBorders>
+              <w:top w:val="single" w:sz="4" w:space="0" w:color="1B3325"/>
+              <w:left w:val="single" w:sz="4" w:space="0" w:color="1B3325"/>
+              <w:bottom w:val="single" w:sz="4" w:space="0" w:color="1B3325"/>
+              <w:right w:val="single" w:sz="4" w:space="0" w:color="1B3325"/>
+            </w:tcBorders>
+            <w:tcMar>
+              <w:top w:w="40" w:type="dxa"/>
+              <w:left w:w="80" w:type="dxa"/>
+              <w:bottom w:w="40" w:type="dxa"/>
+              <w:right w:w="80" w:type="dxa"/>
+            </w:tcMar>
+            <w:shd w:val="clear" w:color="auto" w:fill="FFFFFF"/>
+            <w:vAlign w:val="center"/>
+          </w:tcPr>
+          <w:p>
+            <w:pPr>
+              <w:spacing w:before="0" w:after="0" w:line="259" w:lineRule="auto"/>
+              <w:jc w:val="left"/>
+              <w:widowControl/>
+            </w:pPr>
+            <w:r/>
+            <w:r>
+              <w:rPr>
+                <w:rFonts w:ascii="Poppins" w:hAnsi="Poppins" w:cs="Poppins" w:eastAsia="Poppins"/>
+                <w:b w:val="0"/>
+                <w:i w:val="0"/>
+                <w:color w:val="1B3325"/>
+                <w:sz w:val="20"/>
+              </w:rPr>
+              <w:t>Los tres módulos</w:t>
+            </w:r>
+          </w:p>
+        </w:tc>
+        <w:tc>
+          <w:tcPr>
+            <w:tcW w:type="dxa" w:w="2400"/>
+            <w:tcBorders>
+              <w:top w:val="single" w:sz="4" w:space="0" w:color="1B3325"/>
+              <w:left w:val="single" w:sz="4" w:space="0" w:color="1B3325"/>
+              <w:bottom w:val="single" w:sz="4" w:space="0" w:color="1B3325"/>
+              <w:right w:val="single" w:sz="4" w:space="0" w:color="1B3325"/>
+            </w:tcBorders>
+            <w:tcMar>
+              <w:top w:w="40" w:type="dxa"/>
+              <w:left w:w="80" w:type="dxa"/>
+              <w:bottom w:w="40" w:type="dxa"/>
+              <w:right w:w="80" w:type="dxa"/>
+            </w:tcMar>
+            <w:shd w:val="clear" w:color="auto" w:fill="FFFFFF"/>
+            <w:vAlign w:val="center"/>
+          </w:tcPr>
+          <w:p>
+            <w:pPr>
+              <w:spacing w:before="0" w:after="0" w:line="259" w:lineRule="auto"/>
+              <w:jc w:val="center"/>
+              <w:widowControl/>
+            </w:pPr>
+            <w:r/>
+            <w:r>
+              <w:rPr>
+                <w:rFonts w:ascii="Poppins" w:hAnsi="Poppins" w:cs="Poppins" w:eastAsia="Poppins"/>
+                <w:b w:val="0"/>
+                <w:i w:val="0"/>
+                <w:color w:val="1B3325"/>
+                <w:sz w:val="20"/>
+              </w:rPr>
+              <w:t>$60.000</w:t>
+            </w:r>
+          </w:p>
+        </w:tc>
+        <w:tc>
+          <w:tcPr>
+            <w:tcW w:type="dxa" w:w="2400"/>
+            <w:tcBorders>
+              <w:top w:val="single" w:sz="4" w:space="0" w:color="1B3325"/>
+              <w:left w:val="single" w:sz="4" w:space="0" w:color="1B3325"/>
+              <w:bottom w:val="single" w:sz="4" w:space="0" w:color="1B3325"/>
+              <w:right w:val="single" w:sz="4" w:space="0" w:color="1B3325"/>
+            </w:tcBorders>
+            <w:tcMar>
+              <w:top w:w="40" w:type="dxa"/>
+              <w:left w:w="80" w:type="dxa"/>
+              <w:bottom w:w="40" w:type="dxa"/>
+              <w:right w:w="80" w:type="dxa"/>
+            </w:tcMar>
+            <w:shd w:val="clear" w:color="auto" w:fill="FFFFFF"/>
+            <w:vAlign w:val="center"/>
+          </w:tcPr>
+          <w:p>
+            <w:pPr>
+              <w:spacing w:before="0" w:after="0" w:line="259" w:lineRule="auto"/>
+              <w:jc w:val="center"/>
+              <w:widowControl/>
+            </w:pPr>
+            <w:r/>
+            <w:r>
+              <w:rPr>
+                <w:rFonts w:ascii="Poppins" w:hAnsi="Poppins" w:cs="Poppins" w:eastAsia="Poppins"/>
+                <w:b w:val="0"/>
+                <w:i w:val="0"/>
+                <w:color w:val="1B3325"/>
+                <w:sz w:val="20"/>
+              </w:rPr>
+              <w:t>$600.000</w:t>
+            </w:r>
+          </w:p>
+        </w:tc>
+        <w:tc>
+          <w:tcPr>
+            <w:tcW w:type="dxa" w:w="2400"/>
+            <w:tcBorders>
+              <w:top w:val="single" w:sz="4" w:space="0" w:color="1B3325"/>
+              <w:left w:val="single" w:sz="4" w:space="0" w:color="1B3325"/>
+              <w:bottom w:val="single" w:sz="4" w:space="0" w:color="1B3325"/>
+              <w:right w:val="single" w:sz="4" w:space="0" w:color="1B3325"/>
+            </w:tcBorders>
+            <w:tcMar>
+              <w:top w:w="40" w:type="dxa"/>
+              <w:left w:w="80" w:type="dxa"/>
+              <w:bottom w:w="40" w:type="dxa"/>
+              <w:right w:w="80" w:type="dxa"/>
+            </w:tcMar>
+            <w:shd w:val="clear" w:color="auto" w:fill="FFFFFF"/>
+            <w:vAlign w:val="center"/>
+          </w:tcPr>
+          <w:p>
+            <w:pPr>
+              <w:spacing w:before="0" w:after="0" w:line="259" w:lineRule="auto"/>
+              <w:jc w:val="center"/>
+              <w:widowControl/>
+            </w:pPr>
+            <w:r/>
+            <w:r>
+              <w:rPr>
+                <w:rFonts w:ascii="Poppins" w:hAnsi="Poppins" w:cs="Poppins" w:eastAsia="Poppins"/>
+                <w:b w:val="0"/>
+                <w:i w:val="0"/>
+                <w:color w:val="1B3325"/>
+                <w:sz w:val="20"/>
+              </w:rPr>
+              <w:t>$1.320.000</w:t>
             </w:r>
           </w:p>
         </w:tc>
@@ -13827,7 +13868,7 @@
           <w:color w:val="1B3325"/>
           <w:sz w:val="22"/>
         </w:rPr>
-        <w:t>Anualidad por usuario = $20.000 × 10 = $200.000, y cubre 12 meses. Equivale a $16.667 al mes ($200.000 ÷ 12, redondeado). Vitalicia por usuario = $20.000 × 22 = $440.000. El soporte opcional, después de los 3 meses de garantía, es el 40 % de la mensualidad por usuario: $8.000 en el sistema completo.</w:t>
+        <w:t>Anualidad por usuario = mensualidad × 10, y cubre 12 meses. Un módulo al año son $200.000 por usuario, equivalentes a $16.667 al mes. Los tres módulos al año son $600.000 por usuario. La vitalicia es la mensualidad × 22: $440.000 por usuario en un módulo y $1.320.000 en los tres. El soporte opcional, después de los 3 meses de garantía, es el 40 % de lo que el cliente paga por usuario.</w:t>
       </w:r>
     </w:p>
     <w:p>
@@ -13845,7 +13886,7 @@
           <w:color w:val="1B3325"/>
           <w:sz w:val="26"/>
         </w:rPr>
-        <w:t>11.2. Módulos sueltos</w:t>
+        <w:t>11.2. Los tres módulos, sueltos o juntos</w:t>
       </w:r>
     </w:p>
     <w:p>
@@ -13862,7 +13903,7 @@
           <w:color w:val="1B3325"/>
           <w:sz w:val="26"/>
         </w:rPr>
-        <w:t>Si el cliente quiere una parte, cada módulo se cobra por usuario activo. Los reportes del módulo van incluidos. Drive suelto incluye la misma cuota de 2 TB de la cuenta.</w:t>
+        <w:t>El precio de cada módulo es el mismo. El cliente elige uno, dos o los tres. Los reportes de cada módulo van con ese módulo. La cuota de 2 TB va solo con el Drive, así se compre suelto o con los demás.</w:t>
       </w:r>
     </w:p>
     <w:tbl>
@@ -13873,10 +13914,10 @@
         <w:tblLook w:firstColumn="1" w:firstRow="1" w:lastColumn="0" w:lastRow="0" w:noHBand="0" w:noVBand="1" w:val="04A0"/>
       </w:tblPr>
       <w:tblGrid>
-        <w:gridCol w:w="2400"/>
-        <w:gridCol w:w="2400"/>
-        <w:gridCol w:w="2400"/>
-        <w:gridCol w:w="2400"/>
+        <w:gridCol w:w="2800"/>
+        <w:gridCol w:w="2200"/>
+        <w:gridCol w:w="2300"/>
+        <w:gridCol w:w="2300"/>
       </w:tblGrid>
       <w:tr>
         <w:trPr>
@@ -13885,7 +13926,7 @@
         </w:trPr>
         <w:tc>
           <w:tcPr>
-            <w:tcW w:type="dxa" w:w="2400"/>
+            <w:tcW w:type="dxa" w:w="2800"/>
             <w:tcBorders>
               <w:top w:val="single" w:sz="4" w:space="0" w:color="1B3325"/>
               <w:left w:val="single" w:sz="4" w:space="0" w:color="1B3325"/>
@@ -13917,13 +13958,13 @@
                 <w:color w:val="FFFFFF"/>
                 <w:sz w:val="18"/>
               </w:rPr>
-              <w:t>Módulo suelto</w:t>
+              <w:t>Módulo</w:t>
             </w:r>
           </w:p>
         </w:tc>
         <w:tc>
           <w:tcPr>
-            <w:tcW w:type="dxa" w:w="2400"/>
+            <w:tcW w:type="dxa" w:w="2200"/>
             <w:tcBorders>
               <w:top w:val="single" w:sz="4" w:space="0" w:color="1B3325"/>
               <w:left w:val="single" w:sz="4" w:space="0" w:color="1B3325"/>
@@ -13961,7 +14002,7 @@
         </w:tc>
         <w:tc>
           <w:tcPr>
-            <w:tcW w:type="dxa" w:w="2400"/>
+            <w:tcW w:type="dxa" w:w="2300"/>
             <w:tcBorders>
               <w:top w:val="single" w:sz="4" w:space="0" w:color="1B3325"/>
               <w:left w:val="single" w:sz="4" w:space="0" w:color="1B3325"/>
@@ -13999,7 +14040,7 @@
         </w:tc>
         <w:tc>
           <w:tcPr>
-            <w:tcW w:type="dxa" w:w="2400"/>
+            <w:tcW w:type="dxa" w:w="2300"/>
             <w:tcBorders>
               <w:top w:val="single" w:sz="4" w:space="0" w:color="1B3325"/>
               <w:left w:val="single" w:sz="4" w:space="0" w:color="1B3325"/>
@@ -14042,7 +14083,7 @@
         </w:trPr>
         <w:tc>
           <w:tcPr>
-            <w:tcW w:type="dxa" w:w="2400"/>
+            <w:tcW w:type="dxa" w:w="2800"/>
             <w:tcBorders>
               <w:top w:val="single" w:sz="4" w:space="0" w:color="1B3325"/>
               <w:left w:val="single" w:sz="4" w:space="0" w:color="1B3325"/>
@@ -14069,6 +14110,16 @@
             <w:r>
               <w:rPr>
                 <w:rFonts w:ascii="Poppins" w:hAnsi="Poppins" w:cs="Poppins" w:eastAsia="Poppins"/>
+                <w:b w:val="0"/>
+                <w:i w:val="0"/>
+                <w:color w:val="1B3325"/>
+                <w:sz w:val="18"/>
+              </w:rPr>
+              <w:t xml:space="preserve">1. </w:t>
+            </w:r>
+            <w:r>
+              <w:rPr>
+                <w:rFonts w:ascii="Poppins" w:hAnsi="Poppins" w:cs="Poppins" w:eastAsia="Poppins"/>
                 <w:b/>
                 <w:i w:val="0"/>
                 <w:color w:val="1B3325"/>
@@ -14076,11 +14127,41 @@
               </w:rPr>
               <w:t>CRM</w:t>
             </w:r>
+            <w:r>
+              <w:rPr>
+                <w:rFonts w:ascii="Poppins" w:hAnsi="Poppins" w:cs="Poppins" w:eastAsia="Poppins"/>
+                <w:b w:val="0"/>
+                <w:i w:val="0"/>
+                <w:color w:val="1B3325"/>
+                <w:sz w:val="18"/>
+              </w:rPr>
+              <w:t xml:space="preserve"> y </w:t>
+            </w:r>
+            <w:r>
+              <w:rPr>
+                <w:rFonts w:ascii="Poppins" w:hAnsi="Poppins" w:cs="Poppins" w:eastAsia="Poppins"/>
+                <w:b/>
+                <w:i w:val="0"/>
+                <w:color w:val="1B3325"/>
+                <w:sz w:val="18"/>
+              </w:rPr>
+              <w:t>ERP</w:t>
+            </w:r>
+            <w:r>
+              <w:rPr>
+                <w:rFonts w:ascii="Poppins" w:hAnsi="Poppins" w:cs="Poppins" w:eastAsia="Poppins"/>
+                <w:b w:val="0"/>
+                <w:i w:val="0"/>
+                <w:color w:val="1B3325"/>
+                <w:sz w:val="18"/>
+              </w:rPr>
+              <w:t xml:space="preserve"> de gestión</w:t>
+            </w:r>
           </w:p>
         </w:tc>
         <w:tc>
           <w:tcPr>
-            <w:tcW w:type="dxa" w:w="2400"/>
+            <w:tcW w:type="dxa" w:w="2200"/>
             <w:tcBorders>
               <w:top w:val="single" w:sz="4" w:space="0" w:color="1B3325"/>
               <w:left w:val="single" w:sz="4" w:space="0" w:color="1B3325"/>
@@ -14112,13 +14193,13 @@
                 <w:color w:val="1B3325"/>
                 <w:sz w:val="18"/>
               </w:rPr>
-              <w:t>$8.000</w:t>
+              <w:t>$20.000</w:t>
             </w:r>
           </w:p>
         </w:tc>
         <w:tc>
           <w:tcPr>
-            <w:tcW w:type="dxa" w:w="2400"/>
+            <w:tcW w:type="dxa" w:w="2300"/>
             <w:tcBorders>
               <w:top w:val="single" w:sz="4" w:space="0" w:color="1B3325"/>
               <w:left w:val="single" w:sz="4" w:space="0" w:color="1B3325"/>
@@ -14150,13 +14231,13 @@
                 <w:color w:val="1B3325"/>
                 <w:sz w:val="18"/>
               </w:rPr>
-              <w:t>$80.000</w:t>
+              <w:t>$200.000</w:t>
             </w:r>
           </w:p>
         </w:tc>
         <w:tc>
           <w:tcPr>
-            <w:tcW w:type="dxa" w:w="2400"/>
+            <w:tcW w:type="dxa" w:w="2300"/>
             <w:tcBorders>
               <w:top w:val="single" w:sz="4" w:space="0" w:color="1B3325"/>
               <w:left w:val="single" w:sz="4" w:space="0" w:color="1B3325"/>
@@ -14188,7 +14269,7 @@
                 <w:color w:val="1B3325"/>
                 <w:sz w:val="18"/>
               </w:rPr>
-              <w:t>$176.000</w:t>
+              <w:t>$440.000</w:t>
             </w:r>
           </w:p>
         </w:tc>
@@ -14199,7 +14280,7 @@
         </w:trPr>
         <w:tc>
           <w:tcPr>
-            <w:tcW w:type="dxa" w:w="2400"/>
+            <w:tcW w:type="dxa" w:w="2800"/>
             <w:tcBorders>
               <w:top w:val="single" w:sz="4" w:space="0" w:color="1B3325"/>
               <w:left w:val="single" w:sz="4" w:space="0" w:color="1B3325"/>
@@ -14226,28 +14307,18 @@
             <w:r>
               <w:rPr>
                 <w:rFonts w:ascii="Poppins" w:hAnsi="Poppins" w:cs="Poppins" w:eastAsia="Poppins"/>
-                <w:b/>
-                <w:i w:val="0"/>
-                <w:color w:val="1B3325"/>
-                <w:sz w:val="18"/>
-              </w:rPr>
-              <w:t>ERP</w:t>
-            </w:r>
-            <w:r>
-              <w:rPr>
-                <w:rFonts w:ascii="Poppins" w:hAnsi="Poppins" w:cs="Poppins" w:eastAsia="Poppins"/>
                 <w:b w:val="0"/>
                 <w:i w:val="0"/>
                 <w:color w:val="1B3325"/>
                 <w:sz w:val="18"/>
               </w:rPr>
-              <w:t xml:space="preserve"> de gestión</w:t>
+              <w:t>2. Asistencia</w:t>
             </w:r>
           </w:p>
         </w:tc>
         <w:tc>
           <w:tcPr>
-            <w:tcW w:type="dxa" w:w="2400"/>
+            <w:tcW w:type="dxa" w:w="2200"/>
             <w:tcBorders>
               <w:top w:val="single" w:sz="4" w:space="0" w:color="1B3325"/>
               <w:left w:val="single" w:sz="4" w:space="0" w:color="1B3325"/>
@@ -14279,13 +14350,13 @@
                 <w:color w:val="1B3325"/>
                 <w:sz w:val="18"/>
               </w:rPr>
-              <w:t>$8.000</w:t>
+              <w:t>$20.000</w:t>
             </w:r>
           </w:p>
         </w:tc>
         <w:tc>
           <w:tcPr>
-            <w:tcW w:type="dxa" w:w="2400"/>
+            <w:tcW w:type="dxa" w:w="2300"/>
             <w:tcBorders>
               <w:top w:val="single" w:sz="4" w:space="0" w:color="1B3325"/>
               <w:left w:val="single" w:sz="4" w:space="0" w:color="1B3325"/>
@@ -14317,13 +14388,13 @@
                 <w:color w:val="1B3325"/>
                 <w:sz w:val="18"/>
               </w:rPr>
-              <w:t>$80.000</w:t>
+              <w:t>$200.000</w:t>
             </w:r>
           </w:p>
         </w:tc>
         <w:tc>
           <w:tcPr>
-            <w:tcW w:type="dxa" w:w="2400"/>
+            <w:tcW w:type="dxa" w:w="2300"/>
             <w:tcBorders>
               <w:top w:val="single" w:sz="4" w:space="0" w:color="1B3325"/>
               <w:left w:val="single" w:sz="4" w:space="0" w:color="1B3325"/>
@@ -14355,7 +14426,7 @@
                 <w:color w:val="1B3325"/>
                 <w:sz w:val="18"/>
               </w:rPr>
-              <w:t>$176.000</w:t>
+              <w:t>$440.000</w:t>
             </w:r>
           </w:p>
         </w:tc>
@@ -14366,7 +14437,7 @@
         </w:trPr>
         <w:tc>
           <w:tcPr>
-            <w:tcW w:type="dxa" w:w="2400"/>
+            <w:tcW w:type="dxa" w:w="2800"/>
             <w:tcBorders>
               <w:top w:val="single" w:sz="4" w:space="0" w:color="1B3325"/>
               <w:left w:val="single" w:sz="4" w:space="0" w:color="1B3325"/>
@@ -14398,13 +14469,13 @@
                 <w:color w:val="1B3325"/>
                 <w:sz w:val="18"/>
               </w:rPr>
-              <w:t>Trazabilidad</w:t>
+              <w:t>3. Drive</w:t>
             </w:r>
           </w:p>
         </w:tc>
         <w:tc>
           <w:tcPr>
-            <w:tcW w:type="dxa" w:w="2400"/>
+            <w:tcW w:type="dxa" w:w="2200"/>
             <w:tcBorders>
               <w:top w:val="single" w:sz="4" w:space="0" w:color="1B3325"/>
               <w:left w:val="single" w:sz="4" w:space="0" w:color="1B3325"/>
@@ -14436,13 +14507,13 @@
                 <w:color w:val="1B3325"/>
                 <w:sz w:val="18"/>
               </w:rPr>
-              <w:t>$6.000</w:t>
+              <w:t>$20.000</w:t>
             </w:r>
           </w:p>
         </w:tc>
         <w:tc>
           <w:tcPr>
-            <w:tcW w:type="dxa" w:w="2400"/>
+            <w:tcW w:type="dxa" w:w="2300"/>
             <w:tcBorders>
               <w:top w:val="single" w:sz="4" w:space="0" w:color="1B3325"/>
               <w:left w:val="single" w:sz="4" w:space="0" w:color="1B3325"/>
@@ -14474,13 +14545,13 @@
                 <w:color w:val="1B3325"/>
                 <w:sz w:val="18"/>
               </w:rPr>
-              <w:t>$60.000</w:t>
+              <w:t>$200.000</w:t>
             </w:r>
           </w:p>
         </w:tc>
         <w:tc>
           <w:tcPr>
-            <w:tcW w:type="dxa" w:w="2400"/>
+            <w:tcW w:type="dxa" w:w="2300"/>
             <w:tcBorders>
               <w:top w:val="single" w:sz="4" w:space="0" w:color="1B3325"/>
               <w:left w:val="single" w:sz="4" w:space="0" w:color="1B3325"/>
@@ -14512,7 +14583,7 @@
                 <w:color w:val="1B3325"/>
                 <w:sz w:val="18"/>
               </w:rPr>
-              <w:t>$132.000</w:t>
+              <w:t>$440.000</w:t>
             </w:r>
           </w:p>
         </w:tc>
@@ -14523,7 +14594,7 @@
         </w:trPr>
         <w:tc>
           <w:tcPr>
-            <w:tcW w:type="dxa" w:w="2400"/>
+            <w:tcW w:type="dxa" w:w="2800"/>
             <w:tcBorders>
               <w:top w:val="single" w:sz="4" w:space="0" w:color="1B3325"/>
               <w:left w:val="single" w:sz="4" w:space="0" w:color="1B3325"/>
@@ -14544,7 +14615,6 @@
               <w:spacing w:before="0" w:after="0" w:line="259" w:lineRule="auto"/>
               <w:jc w:val="left"/>
               <w:widowControl/>
-              <w:keepNext/>
             </w:pPr>
             <w:r/>
             <w:r>
@@ -14555,13 +14625,13 @@
                 <w:color w:val="1B3325"/>
                 <w:sz w:val="18"/>
               </w:rPr>
-              <w:t>Asistencia</w:t>
+              <w:t>Los tres juntos</w:t>
             </w:r>
           </w:p>
         </w:tc>
         <w:tc>
           <w:tcPr>
-            <w:tcW w:type="dxa" w:w="2400"/>
+            <w:tcW w:type="dxa" w:w="2200"/>
             <w:tcBorders>
               <w:top w:val="single" w:sz="4" w:space="0" w:color="1B3325"/>
               <w:left w:val="single" w:sz="4" w:space="0" w:color="1B3325"/>
@@ -14582,7 +14652,6 @@
               <w:spacing w:before="0" w:after="0" w:line="259" w:lineRule="auto"/>
               <w:jc w:val="center"/>
               <w:widowControl/>
-              <w:keepNext/>
             </w:pPr>
             <w:r/>
             <w:r>
@@ -14593,13 +14662,13 @@
                 <w:color w:val="1B3325"/>
                 <w:sz w:val="18"/>
               </w:rPr>
-              <w:t>$7.000</w:t>
+              <w:t>$60.000</w:t>
             </w:r>
           </w:p>
         </w:tc>
         <w:tc>
           <w:tcPr>
-            <w:tcW w:type="dxa" w:w="2400"/>
+            <w:tcW w:type="dxa" w:w="2300"/>
             <w:tcBorders>
               <w:top w:val="single" w:sz="4" w:space="0" w:color="1B3325"/>
               <w:left w:val="single" w:sz="4" w:space="0" w:color="1B3325"/>
@@ -14620,7 +14689,6 @@
               <w:spacing w:before="0" w:after="0" w:line="259" w:lineRule="auto"/>
               <w:jc w:val="center"/>
               <w:widowControl/>
-              <w:keepNext/>
             </w:pPr>
             <w:r/>
             <w:r>
@@ -14631,13 +14699,13 @@
                 <w:color w:val="1B3325"/>
                 <w:sz w:val="18"/>
               </w:rPr>
-              <w:t>$70.000</w:t>
+              <w:t>$600.000</w:t>
             </w:r>
           </w:p>
         </w:tc>
         <w:tc>
           <w:tcPr>
-            <w:tcW w:type="dxa" w:w="2400"/>
+            <w:tcW w:type="dxa" w:w="2300"/>
             <w:tcBorders>
               <w:top w:val="single" w:sz="4" w:space="0" w:color="1B3325"/>
               <w:left w:val="single" w:sz="4" w:space="0" w:color="1B3325"/>
@@ -14658,7 +14726,6 @@
               <w:spacing w:before="0" w:after="0" w:line="259" w:lineRule="auto"/>
               <w:jc w:val="center"/>
               <w:widowControl/>
-              <w:keepNext/>
             </w:pPr>
             <w:r/>
             <w:r>
@@ -14669,474 +14736,7 @@
                 <w:color w:val="1B3325"/>
                 <w:sz w:val="18"/>
               </w:rPr>
-              <w:t>$154.000</w:t>
-            </w:r>
-          </w:p>
-        </w:tc>
-      </w:tr>
-      <w:tr>
-        <w:trPr>
-          <w:cantSplit/>
-        </w:trPr>
-        <w:tc>
-          <w:tcPr>
-            <w:tcW w:type="dxa" w:w="2400"/>
-            <w:tcBorders>
-              <w:top w:val="single" w:sz="4" w:space="0" w:color="1B3325"/>
-              <w:left w:val="single" w:sz="4" w:space="0" w:color="1B3325"/>
-              <w:bottom w:val="single" w:sz="4" w:space="0" w:color="1B3325"/>
-              <w:right w:val="single" w:sz="4" w:space="0" w:color="1B3325"/>
-            </w:tcBorders>
-            <w:tcMar>
-              <w:top w:w="40" w:type="dxa"/>
-              <w:left w:w="80" w:type="dxa"/>
-              <w:bottom w:w="40" w:type="dxa"/>
-              <w:right w:w="80" w:type="dxa"/>
-            </w:tcMar>
-            <w:shd w:val="clear" w:color="auto" w:fill="FFFFFF"/>
-            <w:vAlign w:val="center"/>
-          </w:tcPr>
-          <w:p>
-            <w:pPr>
-              <w:spacing w:before="0" w:after="0" w:line="259" w:lineRule="auto"/>
-              <w:jc w:val="left"/>
-              <w:widowControl/>
-              <w:keepNext/>
-            </w:pPr>
-            <w:r/>
-            <w:r>
-              <w:rPr>
-                <w:rFonts w:ascii="Poppins" w:hAnsi="Poppins" w:cs="Poppins" w:eastAsia="Poppins"/>
-                <w:b w:val="0"/>
-                <w:i w:val="0"/>
-                <w:color w:val="1B3325"/>
-                <w:sz w:val="18"/>
-              </w:rPr>
-              <w:t>Drive</w:t>
-            </w:r>
-          </w:p>
-        </w:tc>
-        <w:tc>
-          <w:tcPr>
-            <w:tcW w:type="dxa" w:w="2400"/>
-            <w:tcBorders>
-              <w:top w:val="single" w:sz="4" w:space="0" w:color="1B3325"/>
-              <w:left w:val="single" w:sz="4" w:space="0" w:color="1B3325"/>
-              <w:bottom w:val="single" w:sz="4" w:space="0" w:color="1B3325"/>
-              <w:right w:val="single" w:sz="4" w:space="0" w:color="1B3325"/>
-            </w:tcBorders>
-            <w:tcMar>
-              <w:top w:w="40" w:type="dxa"/>
-              <w:left w:w="80" w:type="dxa"/>
-              <w:bottom w:w="40" w:type="dxa"/>
-              <w:right w:w="80" w:type="dxa"/>
-            </w:tcMar>
-            <w:shd w:val="clear" w:color="auto" w:fill="FFFFFF"/>
-            <w:vAlign w:val="center"/>
-          </w:tcPr>
-          <w:p>
-            <w:pPr>
-              <w:spacing w:before="0" w:after="0" w:line="259" w:lineRule="auto"/>
-              <w:jc w:val="center"/>
-              <w:widowControl/>
-              <w:keepNext/>
-            </w:pPr>
-            <w:r/>
-            <w:r>
-              <w:rPr>
-                <w:rFonts w:ascii="Poppins" w:hAnsi="Poppins" w:cs="Poppins" w:eastAsia="Poppins"/>
-                <w:b w:val="0"/>
-                <w:i w:val="0"/>
-                <w:color w:val="1B3325"/>
-                <w:sz w:val="18"/>
-              </w:rPr>
-              <w:t>$8.000</w:t>
-            </w:r>
-          </w:p>
-        </w:tc>
-        <w:tc>
-          <w:tcPr>
-            <w:tcW w:type="dxa" w:w="2400"/>
-            <w:tcBorders>
-              <w:top w:val="single" w:sz="4" w:space="0" w:color="1B3325"/>
-              <w:left w:val="single" w:sz="4" w:space="0" w:color="1B3325"/>
-              <w:bottom w:val="single" w:sz="4" w:space="0" w:color="1B3325"/>
-              <w:right w:val="single" w:sz="4" w:space="0" w:color="1B3325"/>
-            </w:tcBorders>
-            <w:tcMar>
-              <w:top w:w="40" w:type="dxa"/>
-              <w:left w:w="80" w:type="dxa"/>
-              <w:bottom w:w="40" w:type="dxa"/>
-              <w:right w:w="80" w:type="dxa"/>
-            </w:tcMar>
-            <w:shd w:val="clear" w:color="auto" w:fill="FFFFFF"/>
-            <w:vAlign w:val="center"/>
-          </w:tcPr>
-          <w:p>
-            <w:pPr>
-              <w:spacing w:before="0" w:after="0" w:line="259" w:lineRule="auto"/>
-              <w:jc w:val="center"/>
-              <w:widowControl/>
-              <w:keepNext/>
-            </w:pPr>
-            <w:r/>
-            <w:r>
-              <w:rPr>
-                <w:rFonts w:ascii="Poppins" w:hAnsi="Poppins" w:cs="Poppins" w:eastAsia="Poppins"/>
-                <w:b w:val="0"/>
-                <w:i w:val="0"/>
-                <w:color w:val="1B3325"/>
-                <w:sz w:val="18"/>
-              </w:rPr>
-              <w:t>$80.000</w:t>
-            </w:r>
-          </w:p>
-        </w:tc>
-        <w:tc>
-          <w:tcPr>
-            <w:tcW w:type="dxa" w:w="2400"/>
-            <w:tcBorders>
-              <w:top w:val="single" w:sz="4" w:space="0" w:color="1B3325"/>
-              <w:left w:val="single" w:sz="4" w:space="0" w:color="1B3325"/>
-              <w:bottom w:val="single" w:sz="4" w:space="0" w:color="1B3325"/>
-              <w:right w:val="single" w:sz="4" w:space="0" w:color="1B3325"/>
-            </w:tcBorders>
-            <w:tcMar>
-              <w:top w:w="40" w:type="dxa"/>
-              <w:left w:w="80" w:type="dxa"/>
-              <w:bottom w:w="40" w:type="dxa"/>
-              <w:right w:w="80" w:type="dxa"/>
-            </w:tcMar>
-            <w:shd w:val="clear" w:color="auto" w:fill="FFFFFF"/>
-            <w:vAlign w:val="center"/>
-          </w:tcPr>
-          <w:p>
-            <w:pPr>
-              <w:spacing w:before="0" w:after="0" w:line="259" w:lineRule="auto"/>
-              <w:jc w:val="center"/>
-              <w:widowControl/>
-              <w:keepNext/>
-            </w:pPr>
-            <w:r/>
-            <w:r>
-              <w:rPr>
-                <w:rFonts w:ascii="Poppins" w:hAnsi="Poppins" w:cs="Poppins" w:eastAsia="Poppins"/>
-                <w:b w:val="0"/>
-                <w:i w:val="0"/>
-                <w:color w:val="1B3325"/>
-                <w:sz w:val="18"/>
-              </w:rPr>
-              <w:t>$176.000</w:t>
-            </w:r>
-          </w:p>
-        </w:tc>
-      </w:tr>
-      <w:tr>
-        <w:trPr>
-          <w:cantSplit/>
-        </w:trPr>
-        <w:tc>
-          <w:tcPr>
-            <w:tcW w:type="dxa" w:w="2400"/>
-            <w:tcBorders>
-              <w:top w:val="single" w:sz="4" w:space="0" w:color="1B3325"/>
-              <w:left w:val="single" w:sz="4" w:space="0" w:color="1B3325"/>
-              <w:bottom w:val="single" w:sz="4" w:space="0" w:color="1B3325"/>
-              <w:right w:val="single" w:sz="4" w:space="0" w:color="1B3325"/>
-            </w:tcBorders>
-            <w:tcMar>
-              <w:top w:w="40" w:type="dxa"/>
-              <w:left w:w="80" w:type="dxa"/>
-              <w:bottom w:w="40" w:type="dxa"/>
-              <w:right w:w="80" w:type="dxa"/>
-            </w:tcMar>
-            <w:shd w:val="clear" w:color="auto" w:fill="F7FBF8"/>
-            <w:vAlign w:val="center"/>
-          </w:tcPr>
-          <w:p>
-            <w:pPr>
-              <w:spacing w:before="0" w:after="0" w:line="259" w:lineRule="auto"/>
-              <w:jc w:val="left"/>
-              <w:widowControl/>
-              <w:keepNext/>
-            </w:pPr>
-            <w:r/>
-            <w:r>
-              <w:rPr>
-                <w:rFonts w:ascii="Poppins" w:hAnsi="Poppins" w:cs="Poppins" w:eastAsia="Poppins"/>
-                <w:b w:val="0"/>
-                <w:i w:val="0"/>
-                <w:color w:val="1B3325"/>
-                <w:sz w:val="18"/>
-              </w:rPr>
-              <w:t>Suma de los cinco</w:t>
-            </w:r>
-          </w:p>
-        </w:tc>
-        <w:tc>
-          <w:tcPr>
-            <w:tcW w:type="dxa" w:w="2400"/>
-            <w:tcBorders>
-              <w:top w:val="single" w:sz="4" w:space="0" w:color="1B3325"/>
-              <w:left w:val="single" w:sz="4" w:space="0" w:color="1B3325"/>
-              <w:bottom w:val="single" w:sz="4" w:space="0" w:color="1B3325"/>
-              <w:right w:val="single" w:sz="4" w:space="0" w:color="1B3325"/>
-            </w:tcBorders>
-            <w:tcMar>
-              <w:top w:w="40" w:type="dxa"/>
-              <w:left w:w="80" w:type="dxa"/>
-              <w:bottom w:w="40" w:type="dxa"/>
-              <w:right w:w="80" w:type="dxa"/>
-            </w:tcMar>
-            <w:shd w:val="clear" w:color="auto" w:fill="F7FBF8"/>
-            <w:vAlign w:val="center"/>
-          </w:tcPr>
-          <w:p>
-            <w:pPr>
-              <w:spacing w:before="0" w:after="0" w:line="259" w:lineRule="auto"/>
-              <w:jc w:val="center"/>
-              <w:widowControl/>
-              <w:keepNext/>
-            </w:pPr>
-            <w:r/>
-            <w:r>
-              <w:rPr>
-                <w:rFonts w:ascii="Poppins" w:hAnsi="Poppins" w:cs="Poppins" w:eastAsia="Poppins"/>
-                <w:b w:val="0"/>
-                <w:i w:val="0"/>
-                <w:color w:val="1B3325"/>
-                <w:sz w:val="18"/>
-              </w:rPr>
-              <w:t>$37.000</w:t>
-            </w:r>
-          </w:p>
-        </w:tc>
-        <w:tc>
-          <w:tcPr>
-            <w:tcW w:type="dxa" w:w="2400"/>
-            <w:tcBorders>
-              <w:top w:val="single" w:sz="4" w:space="0" w:color="1B3325"/>
-              <w:left w:val="single" w:sz="4" w:space="0" w:color="1B3325"/>
-              <w:bottom w:val="single" w:sz="4" w:space="0" w:color="1B3325"/>
-              <w:right w:val="single" w:sz="4" w:space="0" w:color="1B3325"/>
-            </w:tcBorders>
-            <w:tcMar>
-              <w:top w:w="40" w:type="dxa"/>
-              <w:left w:w="80" w:type="dxa"/>
-              <w:bottom w:w="40" w:type="dxa"/>
-              <w:right w:w="80" w:type="dxa"/>
-            </w:tcMar>
-            <w:shd w:val="clear" w:color="auto" w:fill="F7FBF8"/>
-            <w:vAlign w:val="center"/>
-          </w:tcPr>
-          <w:p>
-            <w:pPr>
-              <w:spacing w:before="0" w:after="0" w:line="259" w:lineRule="auto"/>
-              <w:jc w:val="center"/>
-              <w:widowControl/>
-              <w:keepNext/>
-            </w:pPr>
-            <w:r/>
-            <w:r>
-              <w:rPr>
-                <w:rFonts w:ascii="Poppins" w:hAnsi="Poppins" w:cs="Poppins" w:eastAsia="Poppins"/>
-                <w:b w:val="0"/>
-                <w:i w:val="0"/>
-                <w:color w:val="1B3325"/>
-                <w:sz w:val="18"/>
-              </w:rPr>
-              <w:t>$370.000</w:t>
-            </w:r>
-          </w:p>
-        </w:tc>
-        <w:tc>
-          <w:tcPr>
-            <w:tcW w:type="dxa" w:w="2400"/>
-            <w:tcBorders>
-              <w:top w:val="single" w:sz="4" w:space="0" w:color="1B3325"/>
-              <w:left w:val="single" w:sz="4" w:space="0" w:color="1B3325"/>
-              <w:bottom w:val="single" w:sz="4" w:space="0" w:color="1B3325"/>
-              <w:right w:val="single" w:sz="4" w:space="0" w:color="1B3325"/>
-            </w:tcBorders>
-            <w:tcMar>
-              <w:top w:w="40" w:type="dxa"/>
-              <w:left w:w="80" w:type="dxa"/>
-              <w:bottom w:w="40" w:type="dxa"/>
-              <w:right w:w="80" w:type="dxa"/>
-            </w:tcMar>
-            <w:shd w:val="clear" w:color="auto" w:fill="F7FBF8"/>
-            <w:vAlign w:val="center"/>
-          </w:tcPr>
-          <w:p>
-            <w:pPr>
-              <w:spacing w:before="0" w:after="0" w:line="259" w:lineRule="auto"/>
-              <w:jc w:val="center"/>
-              <w:widowControl/>
-              <w:keepNext/>
-            </w:pPr>
-            <w:r/>
-            <w:r>
-              <w:rPr>
-                <w:rFonts w:ascii="Poppins" w:hAnsi="Poppins" w:cs="Poppins" w:eastAsia="Poppins"/>
-                <w:b w:val="0"/>
-                <w:i w:val="0"/>
-                <w:color w:val="1B3325"/>
-                <w:sz w:val="18"/>
-              </w:rPr>
-              <w:t>$814.000</w:t>
-            </w:r>
-          </w:p>
-        </w:tc>
-      </w:tr>
-      <w:tr>
-        <w:trPr>
-          <w:cantSplit/>
-        </w:trPr>
-        <w:tc>
-          <w:tcPr>
-            <w:tcW w:type="dxa" w:w="2400"/>
-            <w:tcBorders>
-              <w:top w:val="single" w:sz="4" w:space="0" w:color="1B3325"/>
-              <w:left w:val="single" w:sz="4" w:space="0" w:color="1B3325"/>
-              <w:bottom w:val="single" w:sz="4" w:space="0" w:color="1B3325"/>
-              <w:right w:val="single" w:sz="4" w:space="0" w:color="1B3325"/>
-            </w:tcBorders>
-            <w:tcMar>
-              <w:top w:w="40" w:type="dxa"/>
-              <w:left w:w="80" w:type="dxa"/>
-              <w:bottom w:w="40" w:type="dxa"/>
-              <w:right w:w="80" w:type="dxa"/>
-            </w:tcMar>
-            <w:shd w:val="clear" w:color="auto" w:fill="FFFFFF"/>
-            <w:vAlign w:val="center"/>
-          </w:tcPr>
-          <w:p>
-            <w:pPr>
-              <w:spacing w:before="0" w:after="0" w:line="259" w:lineRule="auto"/>
-              <w:jc w:val="left"/>
-              <w:widowControl/>
-            </w:pPr>
-            <w:r/>
-            <w:r>
-              <w:rPr>
-                <w:rFonts w:ascii="Poppins" w:hAnsi="Poppins" w:cs="Poppins" w:eastAsia="Poppins"/>
-                <w:b w:val="0"/>
-                <w:i w:val="0"/>
-                <w:color w:val="1B3325"/>
-                <w:sz w:val="18"/>
-              </w:rPr>
-              <w:t>Sistema completo</w:t>
-            </w:r>
-          </w:p>
-        </w:tc>
-        <w:tc>
-          <w:tcPr>
-            <w:tcW w:type="dxa" w:w="2400"/>
-            <w:tcBorders>
-              <w:top w:val="single" w:sz="4" w:space="0" w:color="1B3325"/>
-              <w:left w:val="single" w:sz="4" w:space="0" w:color="1B3325"/>
-              <w:bottom w:val="single" w:sz="4" w:space="0" w:color="1B3325"/>
-              <w:right w:val="single" w:sz="4" w:space="0" w:color="1B3325"/>
-            </w:tcBorders>
-            <w:tcMar>
-              <w:top w:w="40" w:type="dxa"/>
-              <w:left w:w="80" w:type="dxa"/>
-              <w:bottom w:w="40" w:type="dxa"/>
-              <w:right w:w="80" w:type="dxa"/>
-            </w:tcMar>
-            <w:shd w:val="clear" w:color="auto" w:fill="FFFFFF"/>
-            <w:vAlign w:val="center"/>
-          </w:tcPr>
-          <w:p>
-            <w:pPr>
-              <w:spacing w:before="0" w:after="0" w:line="259" w:lineRule="auto"/>
-              <w:jc w:val="center"/>
-              <w:widowControl/>
-            </w:pPr>
-            <w:r/>
-            <w:r>
-              <w:rPr>
-                <w:rFonts w:ascii="Poppins" w:hAnsi="Poppins" w:cs="Poppins" w:eastAsia="Poppins"/>
-                <w:b w:val="0"/>
-                <w:i w:val="0"/>
-                <w:color w:val="1B3325"/>
-                <w:sz w:val="18"/>
-              </w:rPr>
-              <w:t>$20.000</w:t>
-            </w:r>
-          </w:p>
-        </w:tc>
-        <w:tc>
-          <w:tcPr>
-            <w:tcW w:type="dxa" w:w="2400"/>
-            <w:tcBorders>
-              <w:top w:val="single" w:sz="4" w:space="0" w:color="1B3325"/>
-              <w:left w:val="single" w:sz="4" w:space="0" w:color="1B3325"/>
-              <w:bottom w:val="single" w:sz="4" w:space="0" w:color="1B3325"/>
-              <w:right w:val="single" w:sz="4" w:space="0" w:color="1B3325"/>
-            </w:tcBorders>
-            <w:tcMar>
-              <w:top w:w="40" w:type="dxa"/>
-              <w:left w:w="80" w:type="dxa"/>
-              <w:bottom w:w="40" w:type="dxa"/>
-              <w:right w:w="80" w:type="dxa"/>
-            </w:tcMar>
-            <w:shd w:val="clear" w:color="auto" w:fill="FFFFFF"/>
-            <w:vAlign w:val="center"/>
-          </w:tcPr>
-          <w:p>
-            <w:pPr>
-              <w:spacing w:before="0" w:after="0" w:line="259" w:lineRule="auto"/>
-              <w:jc w:val="center"/>
-              <w:widowControl/>
-            </w:pPr>
-            <w:r/>
-            <w:r>
-              <w:rPr>
-                <w:rFonts w:ascii="Poppins" w:hAnsi="Poppins" w:cs="Poppins" w:eastAsia="Poppins"/>
-                <w:b w:val="0"/>
-                <w:i w:val="0"/>
-                <w:color w:val="1B3325"/>
-                <w:sz w:val="18"/>
-              </w:rPr>
-              <w:t>$200.000</w:t>
-            </w:r>
-          </w:p>
-        </w:tc>
-        <w:tc>
-          <w:tcPr>
-            <w:tcW w:type="dxa" w:w="2400"/>
-            <w:tcBorders>
-              <w:top w:val="single" w:sz="4" w:space="0" w:color="1B3325"/>
-              <w:left w:val="single" w:sz="4" w:space="0" w:color="1B3325"/>
-              <w:bottom w:val="single" w:sz="4" w:space="0" w:color="1B3325"/>
-              <w:right w:val="single" w:sz="4" w:space="0" w:color="1B3325"/>
-            </w:tcBorders>
-            <w:tcMar>
-              <w:top w:w="40" w:type="dxa"/>
-              <w:left w:w="80" w:type="dxa"/>
-              <w:bottom w:w="40" w:type="dxa"/>
-              <w:right w:w="80" w:type="dxa"/>
-            </w:tcMar>
-            <w:shd w:val="clear" w:color="auto" w:fill="FFFFFF"/>
-            <w:vAlign w:val="center"/>
-          </w:tcPr>
-          <w:p>
-            <w:pPr>
-              <w:spacing w:before="0" w:after="0" w:line="259" w:lineRule="auto"/>
-              <w:jc w:val="center"/>
-              <w:widowControl/>
-            </w:pPr>
-            <w:r/>
-            <w:r>
-              <w:rPr>
-                <w:rFonts w:ascii="Poppins" w:hAnsi="Poppins" w:cs="Poppins" w:eastAsia="Poppins"/>
-                <w:b w:val="0"/>
-                <w:i w:val="0"/>
-                <w:color w:val="1B3325"/>
-                <w:sz w:val="18"/>
-              </w:rPr>
-              <w:t>$440.000</w:t>
+              <w:t>$1.320.000</w:t>
             </w:r>
           </w:p>
         </w:tc>
@@ -15163,67 +14763,7 @@
           <w:color w:val="1B3325"/>
           <w:sz w:val="22"/>
         </w:rPr>
-        <w:t xml:space="preserve">Si la suma de los módulos que el cliente elige llega a $20.000 o la supera, se cobra el sistema completo y se entregan los cinco. Dos módulos quedan por debajo de ese tope. Tres módulos, en las combinaciones de esta tabla, lo cruzan. Ejemplo: </w:t>
-      </w:r>
-      <w:r>
-        <w:rPr>
-          <w:rFonts w:ascii="Poppins" w:hAnsi="Poppins" w:cs="Poppins" w:eastAsia="Poppins"/>
-          <w:b/>
-          <w:i w:val="0"/>
-          <w:color w:val="1B3325"/>
-          <w:sz w:val="22"/>
-        </w:rPr>
-        <w:t>CRM</w:t>
-      </w:r>
-      <w:r>
-        <w:rPr>
-          <w:rFonts w:ascii="Poppins" w:hAnsi="Poppins" w:cs="Poppins" w:eastAsia="Poppins"/>
-          <w:b w:val="0"/>
-          <w:i w:val="0"/>
-          <w:color w:val="1B3325"/>
-          <w:sz w:val="22"/>
-        </w:rPr>
-        <w:t xml:space="preserve"> y Drive suman $16.000 por usuario. </w:t>
-      </w:r>
-      <w:r>
-        <w:rPr>
-          <w:rFonts w:ascii="Poppins" w:hAnsi="Poppins" w:cs="Poppins" w:eastAsia="Poppins"/>
-          <w:b/>
-          <w:i w:val="0"/>
-          <w:color w:val="1B3325"/>
-          <w:sz w:val="22"/>
-        </w:rPr>
-        <w:t>CRM</w:t>
-      </w:r>
-      <w:r>
-        <w:rPr>
-          <w:rFonts w:ascii="Poppins" w:hAnsi="Poppins" w:cs="Poppins" w:eastAsia="Poppins"/>
-          <w:b w:val="0"/>
-          <w:i w:val="0"/>
-          <w:color w:val="1B3325"/>
-          <w:sz w:val="22"/>
-        </w:rPr>
-        <w:t xml:space="preserve">, </w:t>
-      </w:r>
-      <w:r>
-        <w:rPr>
-          <w:rFonts w:ascii="Poppins" w:hAnsi="Poppins" w:cs="Poppins" w:eastAsia="Poppins"/>
-          <w:b/>
-          <w:i w:val="0"/>
-          <w:color w:val="1B3325"/>
-          <w:sz w:val="22"/>
-        </w:rPr>
-        <w:t>ERP</w:t>
-      </w:r>
-      <w:r>
-        <w:rPr>
-          <w:rFonts w:ascii="Poppins" w:hAnsi="Poppins" w:cs="Poppins" w:eastAsia="Poppins"/>
-          <w:b w:val="0"/>
-          <w:i w:val="0"/>
-          <w:color w:val="1B3325"/>
-          <w:sz w:val="22"/>
-        </w:rPr>
-        <w:t xml:space="preserve"> y asistencia suman $23.000, así que el cliente paga $20.000 y recibe todo.</w:t>
+        <w:t>No hay un precio de paquete distinto de la suma. Un módulo son $20.000 por usuario. Dos son $40.000. Los tres son $60.000. Para 30 usuarios, un módulo son $600.000 al mes y los tres son $1.800.000 al mes.</w:t>
       </w:r>
     </w:p>
     <w:p>
@@ -16855,6 +16395,7 @@
               <w:spacing w:before="0" w:after="0" w:line="259" w:lineRule="auto"/>
               <w:jc w:val="left"/>
               <w:widowControl/>
+              <w:keepNext/>
             </w:pPr>
             <w:r/>
             <w:r>
@@ -16875,7 +16416,27 @@
                 <w:color w:val="1B3325"/>
                 <w:sz w:val="16"/>
               </w:rPr>
-              <w:t xml:space="preserve"> de clientes y oportunidades</w:t>
+              <w:t xml:space="preserve">, </w:t>
+            </w:r>
+            <w:r>
+              <w:rPr>
+                <w:rFonts w:ascii="Poppins" w:hAnsi="Poppins" w:cs="Poppins" w:eastAsia="Poppins"/>
+                <w:b/>
+                <w:i w:val="0"/>
+                <w:color w:val="1B3325"/>
+                <w:sz w:val="16"/>
+              </w:rPr>
+              <w:t>ERP</w:t>
+            </w:r>
+            <w:r>
+              <w:rPr>
+                <w:rFonts w:ascii="Poppins" w:hAnsi="Poppins" w:cs="Poppins" w:eastAsia="Poppins"/>
+                <w:b w:val="0"/>
+                <w:i w:val="0"/>
+                <w:color w:val="1B3325"/>
+                <w:sz w:val="16"/>
+              </w:rPr>
+              <w:t xml:space="preserve"> y trazabilidad</w:t>
             </w:r>
           </w:p>
         </w:tc>
@@ -16902,6 +16463,7 @@
               <w:spacing w:before="0" w:after="0" w:line="259" w:lineRule="auto"/>
               <w:jc w:val="left"/>
               <w:widowControl/>
+              <w:keepNext/>
             </w:pPr>
             <w:r/>
             <w:r>
@@ -16912,7 +16474,7 @@
                 <w:color w:val="1B3325"/>
                 <w:sz w:val="16"/>
               </w:rPr>
-              <w:t>Incluido en el completo y vendible suelto</w:t>
+              <w:t>Módulo 1, suelto o con los demás</w:t>
             </w:r>
           </w:p>
         </w:tc>
@@ -16939,6 +16501,7 @@
               <w:spacing w:before="0" w:after="0" w:line="259" w:lineRule="auto"/>
               <w:jc w:val="left"/>
               <w:widowControl/>
+              <w:keepNext/>
             </w:pPr>
             <w:r/>
             <w:r>
@@ -17001,248 +16564,7 @@
               <w:spacing w:before="0" w:after="0" w:line="259" w:lineRule="auto"/>
               <w:jc w:val="left"/>
               <w:widowControl/>
-            </w:pPr>
-            <w:r/>
-            <w:r>
-              <w:rPr>
-                <w:rFonts w:ascii="Poppins" w:hAnsi="Poppins" w:cs="Poppins" w:eastAsia="Poppins"/>
-                <w:b/>
-                <w:i w:val="0"/>
-                <w:color w:val="1B3325"/>
-                <w:sz w:val="16"/>
-              </w:rPr>
-              <w:t>ERP</w:t>
-            </w:r>
-            <w:r>
-              <w:rPr>
-                <w:rFonts w:ascii="Poppins" w:hAnsi="Poppins" w:cs="Poppins" w:eastAsia="Poppins"/>
-                <w:b w:val="0"/>
-                <w:i w:val="0"/>
-                <w:color w:val="1B3325"/>
-                <w:sz w:val="16"/>
-              </w:rPr>
-              <w:t xml:space="preserve"> de gestión: áreas, cargos y procesos</w:t>
-            </w:r>
-          </w:p>
-        </w:tc>
-        <w:tc>
-          <w:tcPr>
-            <w:tcW w:type="dxa" w:w="3300"/>
-            <w:tcBorders>
-              <w:top w:val="single" w:sz="4" w:space="0" w:color="1B3325"/>
-              <w:left w:val="single" w:sz="4" w:space="0" w:color="1B3325"/>
-              <w:bottom w:val="single" w:sz="4" w:space="0" w:color="1B3325"/>
-              <w:right w:val="single" w:sz="4" w:space="0" w:color="1B3325"/>
-            </w:tcBorders>
-            <w:tcMar>
-              <w:top w:w="40" w:type="dxa"/>
-              <w:left w:w="80" w:type="dxa"/>
-              <w:bottom w:w="40" w:type="dxa"/>
-              <w:right w:w="80" w:type="dxa"/>
-            </w:tcMar>
-            <w:shd w:val="clear" w:color="auto" w:fill="F7FBF8"/>
-            <w:vAlign w:val="center"/>
-          </w:tcPr>
-          <w:p>
-            <w:pPr>
-              <w:spacing w:before="0" w:after="0" w:line="259" w:lineRule="auto"/>
-              <w:jc w:val="left"/>
-              <w:widowControl/>
-            </w:pPr>
-            <w:r/>
-            <w:r>
-              <w:rPr>
-                <w:rFonts w:ascii="Poppins" w:hAnsi="Poppins" w:cs="Poppins" w:eastAsia="Poppins"/>
-                <w:b w:val="0"/>
-                <w:i w:val="0"/>
-                <w:color w:val="1B3325"/>
-                <w:sz w:val="16"/>
-              </w:rPr>
-              <w:t>Incluido en el completo y vendible suelto</w:t>
-            </w:r>
-          </w:p>
-        </w:tc>
-        <w:tc>
-          <w:tcPr>
-            <w:tcW w:type="dxa" w:w="4000"/>
-            <w:tcBorders>
-              <w:top w:val="single" w:sz="4" w:space="0" w:color="1B3325"/>
-              <w:left w:val="single" w:sz="4" w:space="0" w:color="1B3325"/>
-              <w:bottom w:val="single" w:sz="4" w:space="0" w:color="1B3325"/>
-              <w:right w:val="single" w:sz="4" w:space="0" w:color="1B3325"/>
-            </w:tcBorders>
-            <w:tcMar>
-              <w:top w:w="40" w:type="dxa"/>
-              <w:left w:w="80" w:type="dxa"/>
-              <w:bottom w:w="40" w:type="dxa"/>
-              <w:right w:w="80" w:type="dxa"/>
-            </w:tcMar>
-            <w:shd w:val="clear" w:color="auto" w:fill="F7FBF8"/>
-            <w:vAlign w:val="center"/>
-          </w:tcPr>
-          <w:p>
-            <w:pPr>
-              <w:spacing w:before="0" w:after="0" w:line="259" w:lineRule="auto"/>
-              <w:jc w:val="left"/>
-              <w:widowControl/>
-            </w:pPr>
-            <w:r/>
-            <w:r>
-              <w:rPr>
-                <w:rFonts w:ascii="Poppins" w:hAnsi="Poppins" w:cs="Poppins" w:eastAsia="Poppins"/>
-                <w:b w:val="0"/>
-                <w:i w:val="0"/>
-                <w:color w:val="1B3325"/>
-                <w:sz w:val="16"/>
-              </w:rPr>
-              <w:t>Odoo y Business Central, en una suite más amplia.</w:t>
-            </w:r>
-          </w:p>
-        </w:tc>
-      </w:tr>
-      <w:tr>
-        <w:trPr>
-          <w:cantSplit/>
-        </w:trPr>
-        <w:tc>
-          <w:tcPr>
-            <w:tcW w:type="dxa" w:w="2300"/>
-            <w:tcBorders>
-              <w:top w:val="single" w:sz="4" w:space="0" w:color="1B3325"/>
-              <w:left w:val="single" w:sz="4" w:space="0" w:color="1B3325"/>
-              <w:bottom w:val="single" w:sz="4" w:space="0" w:color="1B3325"/>
-              <w:right w:val="single" w:sz="4" w:space="0" w:color="1B3325"/>
-            </w:tcBorders>
-            <w:tcMar>
-              <w:top w:w="40" w:type="dxa"/>
-              <w:left w:w="80" w:type="dxa"/>
-              <w:bottom w:w="40" w:type="dxa"/>
-              <w:right w:w="80" w:type="dxa"/>
-            </w:tcMar>
-            <w:shd w:val="clear" w:color="auto" w:fill="FFFFFF"/>
-            <w:vAlign w:val="center"/>
-          </w:tcPr>
-          <w:p>
-            <w:pPr>
-              <w:spacing w:before="0" w:after="0" w:line="259" w:lineRule="auto"/>
-              <w:jc w:val="left"/>
-              <w:widowControl/>
-            </w:pPr>
-            <w:r/>
-            <w:r>
-              <w:rPr>
-                <w:rFonts w:ascii="Poppins" w:hAnsi="Poppins" w:cs="Poppins" w:eastAsia="Poppins"/>
-                <w:b w:val="0"/>
-                <w:i w:val="0"/>
-                <w:color w:val="1B3325"/>
-                <w:sz w:val="16"/>
-              </w:rPr>
-              <w:t>Trazabilidad del trabajador</w:t>
-            </w:r>
-          </w:p>
-        </w:tc>
-        <w:tc>
-          <w:tcPr>
-            <w:tcW w:type="dxa" w:w="3300"/>
-            <w:tcBorders>
-              <w:top w:val="single" w:sz="4" w:space="0" w:color="1B3325"/>
-              <w:left w:val="single" w:sz="4" w:space="0" w:color="1B3325"/>
-              <w:bottom w:val="single" w:sz="4" w:space="0" w:color="1B3325"/>
-              <w:right w:val="single" w:sz="4" w:space="0" w:color="1B3325"/>
-            </w:tcBorders>
-            <w:tcMar>
-              <w:top w:w="40" w:type="dxa"/>
-              <w:left w:w="80" w:type="dxa"/>
-              <w:bottom w:w="40" w:type="dxa"/>
-              <w:right w:w="80" w:type="dxa"/>
-            </w:tcMar>
-            <w:shd w:val="clear" w:color="auto" w:fill="FFFFFF"/>
-            <w:vAlign w:val="center"/>
-          </w:tcPr>
-          <w:p>
-            <w:pPr>
-              <w:spacing w:before="0" w:after="0" w:line="259" w:lineRule="auto"/>
-              <w:jc w:val="left"/>
-              <w:widowControl/>
-            </w:pPr>
-            <w:r/>
-            <w:r>
-              <w:rPr>
-                <w:rFonts w:ascii="Poppins" w:hAnsi="Poppins" w:cs="Poppins" w:eastAsia="Poppins"/>
-                <w:b w:val="0"/>
-                <w:i w:val="0"/>
-                <w:color w:val="1B3325"/>
-                <w:sz w:val="16"/>
-              </w:rPr>
-              <w:t>Incluida, con actividad y estado</w:t>
-            </w:r>
-          </w:p>
-        </w:tc>
-        <w:tc>
-          <w:tcPr>
-            <w:tcW w:type="dxa" w:w="4000"/>
-            <w:tcBorders>
-              <w:top w:val="single" w:sz="4" w:space="0" w:color="1B3325"/>
-              <w:left w:val="single" w:sz="4" w:space="0" w:color="1B3325"/>
-              <w:bottom w:val="single" w:sz="4" w:space="0" w:color="1B3325"/>
-              <w:right w:val="single" w:sz="4" w:space="0" w:color="1B3325"/>
-            </w:tcBorders>
-            <w:tcMar>
-              <w:top w:w="40" w:type="dxa"/>
-              <w:left w:w="80" w:type="dxa"/>
-              <w:bottom w:w="40" w:type="dxa"/>
-              <w:right w:w="80" w:type="dxa"/>
-            </w:tcMar>
-            <w:shd w:val="clear" w:color="auto" w:fill="FFFFFF"/>
-            <w:vAlign w:val="center"/>
-          </w:tcPr>
-          <w:p>
-            <w:pPr>
-              <w:spacing w:before="0" w:after="0" w:line="259" w:lineRule="auto"/>
-              <w:jc w:val="left"/>
-              <w:widowControl/>
-            </w:pPr>
-            <w:r/>
-            <w:r>
-              <w:rPr>
-                <w:rFonts w:ascii="Poppins" w:hAnsi="Poppins" w:cs="Poppins" w:eastAsia="Poppins"/>
-                <w:b w:val="0"/>
-                <w:i w:val="0"/>
-                <w:color w:val="1B3325"/>
-                <w:sz w:val="16"/>
-              </w:rPr>
-              <w:t>Odoo RR. HH. y Buk la acercan. No es el centro de Bitrix24 Standard.</w:t>
-            </w:r>
-          </w:p>
-        </w:tc>
-      </w:tr>
-      <w:tr>
-        <w:trPr>
-          <w:cantSplit/>
-        </w:trPr>
-        <w:tc>
-          <w:tcPr>
-            <w:tcW w:type="dxa" w:w="2300"/>
-            <w:tcBorders>
-              <w:top w:val="single" w:sz="4" w:space="0" w:color="1B3325"/>
-              <w:left w:val="single" w:sz="4" w:space="0" w:color="1B3325"/>
-              <w:bottom w:val="single" w:sz="4" w:space="0" w:color="1B3325"/>
-              <w:right w:val="single" w:sz="4" w:space="0" w:color="1B3325"/>
-            </w:tcBorders>
-            <w:tcMar>
-              <w:top w:w="40" w:type="dxa"/>
-              <w:left w:w="80" w:type="dxa"/>
-              <w:bottom w:w="40" w:type="dxa"/>
-              <w:right w:w="80" w:type="dxa"/>
-            </w:tcMar>
-            <w:shd w:val="clear" w:color="auto" w:fill="F7FBF8"/>
-            <w:vAlign w:val="center"/>
-          </w:tcPr>
-          <w:p>
-            <w:pPr>
-              <w:spacing w:before="0" w:after="0" w:line="259" w:lineRule="auto"/>
-              <w:jc w:val="left"/>
-              <w:widowControl/>
+              <w:keepNext/>
             </w:pPr>
             <w:r/>
             <w:r>
@@ -17280,6 +16602,7 @@
               <w:spacing w:before="0" w:after="0" w:line="259" w:lineRule="auto"/>
               <w:jc w:val="left"/>
               <w:widowControl/>
+              <w:keepNext/>
             </w:pPr>
             <w:r/>
             <w:r>
@@ -17290,7 +16613,7 @@
                 <w:color w:val="1B3325"/>
                 <w:sz w:val="16"/>
               </w:rPr>
-              <w:t>Incluidos, en la línea del día</w:t>
+              <w:t>Módulo 2, suelto o con los demás</w:t>
             </w:r>
           </w:p>
         </w:tc>
@@ -17317,6 +16640,7 @@
               <w:spacing w:before="0" w:after="0" w:line="259" w:lineRule="auto"/>
               <w:jc w:val="left"/>
               <w:widowControl/>
+              <w:keepNext/>
             </w:pPr>
             <w:r/>
             <w:r>
@@ -17327,7 +16651,7 @@
                 <w:color w:val="1B3325"/>
                 <w:sz w:val="16"/>
               </w:rPr>
-              <w:t>Odoo Asistencias, Zoho People y Factorial registran tiempo.</w:t>
+              <w:t>Odoo Asistencias, Zoho People y Factorial.</w:t>
             </w:r>
           </w:p>
         </w:tc>
@@ -17359,6 +16683,7 @@
               <w:spacing w:before="0" w:after="0" w:line="259" w:lineRule="auto"/>
               <w:jc w:val="left"/>
               <w:widowControl/>
+              <w:keepNext/>
             </w:pPr>
             <w:r/>
             <w:r>
@@ -17396,6 +16721,7 @@
               <w:spacing w:before="0" w:after="0" w:line="259" w:lineRule="auto"/>
               <w:jc w:val="left"/>
               <w:widowControl/>
+              <w:keepNext/>
             </w:pPr>
             <w:r/>
             <w:r>
@@ -17406,7 +16732,7 @@
                 <w:color w:val="1B3325"/>
                 <w:sz w:val="16"/>
               </w:rPr>
-              <w:t>Incluido en el completo y vendible suelto</w:t>
+              <w:t>Módulo 3, suelto o con los demás</w:t>
             </w:r>
           </w:p>
         </w:tc>
@@ -17433,6 +16759,7 @@
               <w:spacing w:before="0" w:after="0" w:line="259" w:lineRule="auto"/>
               <w:jc w:val="left"/>
               <w:widowControl/>
+              <w:keepNext/>
             </w:pPr>
             <w:r/>
             <w:r>
@@ -17443,7 +16770,7 @@
                 <w:color w:val="1B3325"/>
                 <w:sz w:val="16"/>
               </w:rPr>
-              <w:t>Google Workspace, Zoho WorkDrive y SharePoint. Ellos entregan más disco por persona.</w:t>
+              <w:t>Google Workspace, Zoho WorkDrive y SharePoint.</w:t>
             </w:r>
           </w:p>
         </w:tc>
@@ -17475,6 +16802,7 @@
               <w:spacing w:before="0" w:after="0" w:line="259" w:lineRule="auto"/>
               <w:jc w:val="left"/>
               <w:widowControl/>
+              <w:keepNext/>
             </w:pPr>
             <w:r/>
             <w:r>
@@ -17512,6 +16840,7 @@
               <w:spacing w:before="0" w:after="0" w:line="259" w:lineRule="auto"/>
               <w:jc w:val="left"/>
               <w:widowControl/>
+              <w:keepNext/>
             </w:pPr>
             <w:r/>
             <w:r>
@@ -17549,6 +16878,7 @@
               <w:spacing w:before="0" w:after="0" w:line="259" w:lineRule="auto"/>
               <w:jc w:val="left"/>
               <w:widowControl/>
+              <w:keepNext/>
             </w:pPr>
             <w:r/>
             <w:r>
@@ -17591,6 +16921,7 @@
               <w:spacing w:before="0" w:after="0" w:line="259" w:lineRule="auto"/>
               <w:jc w:val="left"/>
               <w:widowControl/>
+              <w:keepNext/>
             </w:pPr>
             <w:r/>
             <w:r>
@@ -17628,6 +16959,7 @@
               <w:spacing w:before="0" w:after="0" w:line="259" w:lineRule="auto"/>
               <w:jc w:val="left"/>
               <w:widowControl/>
+              <w:keepNext/>
             </w:pPr>
             <w:r/>
             <w:r>
@@ -17675,6 +17007,7 @@
               <w:spacing w:before="0" w:after="0" w:line="259" w:lineRule="auto"/>
               <w:jc w:val="left"/>
               <w:widowControl/>
+              <w:keepNext/>
             </w:pPr>
             <w:r/>
             <w:r>
@@ -17717,6 +17050,7 @@
               <w:spacing w:before="0" w:after="0" w:line="259" w:lineRule="auto"/>
               <w:jc w:val="left"/>
               <w:widowControl/>
+              <w:keepNext/>
             </w:pPr>
             <w:r/>
             <w:r>
@@ -17754,6 +17088,7 @@
               <w:spacing w:before="0" w:after="0" w:line="259" w:lineRule="auto"/>
               <w:jc w:val="left"/>
               <w:widowControl/>
+              <w:keepNext/>
             </w:pPr>
             <w:r/>
             <w:r>
@@ -17791,6 +17126,7 @@
               <w:spacing w:before="0" w:after="0" w:line="259" w:lineRule="auto"/>
               <w:jc w:val="left"/>
               <w:widowControl/>
+              <w:keepNext/>
             </w:pPr>
             <w:r/>
             <w:r>
@@ -17962,7 +17298,7 @@
           <w:color w:val="1B3325"/>
           <w:sz w:val="26"/>
         </w:rPr>
-        <w:t xml:space="preserve">Empresa de 30 usuarios activos con el sistema completo, a $20.000 por usuario. La VPS y el dominio no van en la factura de </w:t>
+        <w:t xml:space="preserve">Empresa de 30 usuarios activos con los tres módulos, a $60.000 por usuario. La VPS y el dominio no van en la factura de </w:t>
       </w:r>
       <w:r>
         <w:rPr>
@@ -18232,7 +17568,7 @@
                 <w:color w:val="1B3325"/>
                 <w:sz w:val="16"/>
               </w:rPr>
-              <w:t>$600.000</w:t>
+              <w:t>$1.800.000</w:t>
             </w:r>
           </w:p>
         </w:tc>
@@ -18270,7 +17606,7 @@
                 <w:color w:val="1B3325"/>
                 <w:sz w:val="16"/>
               </w:rPr>
-              <w:t>$600.000 cada mes</w:t>
+              <w:t>$1.800.000 cada mes</w:t>
             </w:r>
           </w:p>
         </w:tc>
@@ -18308,7 +17644,7 @@
                 <w:color w:val="1B3325"/>
                 <w:sz w:val="16"/>
               </w:rPr>
-              <w:t>$7.200.000</w:t>
+              <w:t>$21.600.000</w:t>
             </w:r>
           </w:p>
         </w:tc>
@@ -18389,7 +17725,7 @@
                 <w:color w:val="1B3325"/>
                 <w:sz w:val="16"/>
               </w:rPr>
-              <w:t>$6.000.000</w:t>
+              <w:t>$18.000.000</w:t>
             </w:r>
           </w:p>
         </w:tc>
@@ -18427,7 +17763,7 @@
                 <w:color w:val="1B3325"/>
                 <w:sz w:val="16"/>
               </w:rPr>
-              <w:t>$6.000.000 al renovar</w:t>
+              <w:t>$18.000.000 al renovar</w:t>
             </w:r>
           </w:p>
         </w:tc>
@@ -18465,7 +17801,7 @@
                 <w:color w:val="1B3325"/>
                 <w:sz w:val="16"/>
               </w:rPr>
-              <w:t>$6.000.000</w:t>
+              <w:t>$18.000.000</w:t>
             </w:r>
           </w:p>
         </w:tc>
@@ -18546,7 +17882,7 @@
                 <w:color w:val="1B3325"/>
                 <w:sz w:val="16"/>
               </w:rPr>
-              <w:t>$6.600.000 (50 %)</w:t>
+              <w:t>$19.800.000 (50 %)</w:t>
             </w:r>
           </w:p>
         </w:tc>
@@ -18584,7 +17920,7 @@
                 <w:color w:val="1B3325"/>
                 <w:sz w:val="16"/>
               </w:rPr>
-              <w:t>$6.600.000 a la entrega</w:t>
+              <w:t>$19.800.000 a la entrega</w:t>
             </w:r>
           </w:p>
         </w:tc>
@@ -18622,7 +17958,7 @@
                 <w:color w:val="1B3325"/>
                 <w:sz w:val="16"/>
               </w:rPr>
-              <w:t>$13.200.000</w:t>
+              <w:t>$39.600.000</w:t>
             </w:r>
           </w:p>
         </w:tc>
@@ -18701,7 +18037,7 @@
                 <w:color w:val="1B3325"/>
                 <w:sz w:val="16"/>
               </w:rPr>
-              <w:t>$6.600.000 (50 %)</w:t>
+              <w:t>$19.800.000 (50 %)</w:t>
             </w:r>
           </w:p>
         </w:tc>
@@ -18738,7 +18074,7 @@
                 <w:color w:val="1B3325"/>
                 <w:sz w:val="16"/>
               </w:rPr>
-              <w:t>Segundo 50 % a la entrega y $240.000 al mes desde el mes 4</w:t>
+              <w:t>Segundo 50 % a la entrega y $720.000 al mes desde el mes 4</w:t>
             </w:r>
           </w:p>
         </w:tc>
@@ -18775,7 +18111,7 @@
                 <w:color w:val="1B3325"/>
                 <w:sz w:val="16"/>
               </w:rPr>
-              <w:t>$15.360.000</w:t>
+              <w:t>$46.080.000</w:t>
             </w:r>
           </w:p>
         </w:tc>
@@ -18802,7 +18138,7 @@
           <w:color w:val="1B3325"/>
           <w:sz w:val="22"/>
         </w:rPr>
-        <w:t>Los dos pagos de la licencia vitalicia caen en el primer año: $13.200.000. El soporte opcional son nueve meses si el arranque es en enero: 9 × $240.000 = $2.160.000. Sumados a la licencia dan $15.360.000. La VPS KVM 1, si se renueva todo el año, suma $466.800 que el cliente paga a Hostinger, fuera de esta tabla.</w:t>
+        <w:t>Los dos pagos de la licencia vitalicia caen en el primer año: $39.600.000. El soporte opcional son nueve meses si el arranque es en enero: 9 × $720.000 = $6.480.000. Sumados a la licencia dan $46.080.000. La VPS KVM 1, si se renueva todo el año, suma $466.800 que el cliente paga a Hostinger, fuera de esta tabla.</w:t>
       </w:r>
     </w:p>
     <w:p>
@@ -18819,7 +18155,7 @@
           <w:color w:val="1B3325"/>
           <w:sz w:val="26"/>
         </w:rPr>
-        <w:t xml:space="preserve">Si esa empresa toma solo asistencia y Drive, paga $15.000 por usuario: $450.000 al mes. La suma no llega a $20.000, así que no se convierte en sistema completo. Si agrega el </w:t>
+        <w:t xml:space="preserve">Si esa empresa toma un solo módulo, paga $20.000 por usuario: $600.000 al mes, o $6.000.000 en la anualidad. Dos módulos son $1.200.000 al mes. La licencia regional de Odoo Standard sigue en $28.477 por usuario, $854.297 al mes para 30 usuarios, sin implementación. Los tres módulos de </w:t>
       </w:r>
       <w:r>
         <w:rPr>
@@ -18829,7 +18165,7 @@
           <w:color w:val="1B3325"/>
           <w:sz w:val="26"/>
         </w:rPr>
-        <w:t>CRM</w:t>
+        <w:t>RecoTime</w:t>
       </w:r>
       <w:r>
         <w:rPr>
@@ -18839,7 +18175,7 @@
           <w:color w:val="1B3325"/>
           <w:sz w:val="26"/>
         </w:rPr>
-        <w:t>, la suma pasa a $23.000 y entonces paga $20.000 por usuario y recibe los cinco módulos. La licencia regional de Odoo Standard sigue en $28.477 por usuario, $854.297 al mes para 30 usuarios, sin implementación.</w:t>
+        <w:t>, $1.800.000 al mes, quedan por encima de esa licencia y cerca de Google Workspace Business Standard para 30 usuarios, $1.752.000 al mes.</w:t>
       </w:r>
     </w:p>
     <w:p>
@@ -19659,7 +18995,7 @@
                 <w:color w:val="1B3325"/>
                 <w:sz w:val="20"/>
               </w:rPr>
-              <w:t>Se cobra por usuario activo. Si la suma de módulos sueltos llega a $20.000, pasa al sistema completo.</w:t>
+              <w:t>Se cobra por usuario activo y por módulo contratado. Un módulo nuevo se suma a $20.000 por usuario.</w:t>
             </w:r>
           </w:p>
         </w:tc>
@@ -20239,7 +19575,7 @@
           <w:color w:val="1B3325"/>
           <w:sz w:val="26"/>
         </w:rPr>
-        <w:t>Aprobar el sistema completo a $20.000 por usuario activo al mes, y los módulos sueltos de la sección 11.2, con la regla de que al llegar a $20.000 se entrega todo.</w:t>
+        <w:t>Aprobar los tres módulos a $20.000 por usuario activo al mes cada uno. Los tres juntos son $60.000 por usuario, que es la suma.</w:t>
       </w:r>
     </w:p>
     <w:p>
@@ -20267,7 +19603,7 @@
           <w:color w:val="1B3325"/>
           <w:sz w:val="26"/>
         </w:rPr>
-        <w:t xml:space="preserve">Confirmar que $20.000 cubre </w:t>
+        <w:t xml:space="preserve">Confirmar el reparto: el módulo 1 reúne </w:t>
       </w:r>
       <w:r>
         <w:rPr>
@@ -20307,7 +19643,7 @@
           <w:color w:val="1B3325"/>
           <w:sz w:val="26"/>
         </w:rPr>
-        <w:t xml:space="preserve"> de gestión, trazabilidad, asistencia, reportes y Drive. Para 30 usuarios son $600.000 al mes, por debajo de la licencia regional de Odoo Standard.</w:t>
+        <w:t xml:space="preserve"> de gestión y trazabilidad; el módulo 2 es la asistencia; el módulo 3 es el Drive. Para 30 usuarios, un módulo son $600.000 al mes y los tres son $1.800.000.</w:t>
       </w:r>
     </w:p>
     <w:p>

</xml_diff>

<commit_message>
Agregar la lectura de viabilidad de los 20.000 por módulo frente al mercado.
Co-authored-by: Jhon123Javier <Jhon123Javier@users.noreply.github.com>
</commit_message>
<xml_diff>
--- a/documentos/recotime/Informe The Company Dev - Perfil RecoTime.docx
+++ b/documentos/recotime/Informe The Company Dev - Perfil RecoTime.docx
@@ -732,7 +732,7 @@
           <w:color w:val="1B3325"/>
           <w:sz w:val="26"/>
         </w:rPr>
-        <w:t xml:space="preserve">La recomendación es cobrar $20.000 por usuario activo al mes en cada módulo. Son tres: </w:t>
+        <w:t xml:space="preserve">La directriz es cobrar $20.000 por usuario activo al mes en cada módulo. Son tres: </w:t>
       </w:r>
       <w:r>
         <w:rPr>
@@ -772,7 +772,7 @@
           <w:color w:val="1B3325"/>
           <w:sz w:val="26"/>
         </w:rPr>
-        <w:t xml:space="preserve"> de gestión, asistencia, y Drive. Un módulo, en 30 usuarios, son $600.000 al mes. Los tres juntos son $60.000 por usuario, $1.800.000 al mes. La licencia regional de Odoo Standard queda en $28.477 por usuario. La VPS y el dominio los paga el cliente: la renovación del KVM 1 sale en $466.800 al año.</w:t>
+        <w:t xml:space="preserve"> de gestión, asistencia, y Drive. Un módulo, en 30 usuarios, son $600.000 al mes. Los tres juntos son $60.000 por usuario, $1.800.000 al mes. La sección 10 compara esa directriz con el mercado: un módulo cabe; los tres juntos quedan por encima de una suite que cobra una sola licencia. La VPS y el dominio los paga el cliente: la renovación del KVM 1 sale en $466.800 al año.</w:t>
       </w:r>
     </w:p>
     <w:p>
@@ -11426,6 +11426,24 @@
     </w:p>
     <w:p>
       <w:pPr>
+        <w:spacing w:before="160" w:after="40" w:line="259" w:lineRule="auto"/>
+        <w:jc w:val="left"/>
+        <w:keepNext/>
+        <w:widowControl/>
+      </w:pPr>
+      <w:r>
+        <w:rPr>
+          <w:rFonts w:ascii="Poppins" w:hAnsi="Poppins" w:cs="Poppins" w:eastAsia="Poppins"/>
+          <w:b/>
+          <w:i w:val="0"/>
+          <w:color w:val="1B3325"/>
+          <w:sz w:val="26"/>
+        </w:rPr>
+        <w:t>10.1. Viabilidad de los $20.000 por módulo</w:t>
+      </w:r>
+    </w:p>
+    <w:p>
+      <w:pPr>
         <w:spacing w:before="0" w:after="160" w:line="259" w:lineRule="auto"/>
         <w:jc w:val="both"/>
         <w:widowControl/>
@@ -11438,7 +11456,7 @@
           <w:color w:val="1B3325"/>
           <w:sz w:val="26"/>
         </w:rPr>
-        <w:t xml:space="preserve">Cada módulo cuesta $20.000 por usuario al mes. Un solo módulo, para 30 usuarios, son $600.000. Eso queda $254.297 por debajo de la licencia regional de Odoo Standard para 30 usuarios, y la puesta en marcha de ese módulo va incluida. Los tres módulos juntos son $60.000 por usuario, $1.800.000 al mes para 30 personas. Esa suma queda $945.703 por encima de la sola licencia de Odoo, porque Odoo cobra una vez por todas las aplicaciones y </w:t>
+        <w:t xml:space="preserve">Esta tabla pone la directriz comercial al lado del mercado de la sección 9. Los pesos de las referencias en dólares son cálculo de este informe con la TRM de $3.181,74. «Viable» significa que el valor de </w:t>
       </w:r>
       <w:r>
         <w:rPr>
@@ -11458,7 +11476,1375 @@
           <w:color w:val="1B3325"/>
           <w:sz w:val="26"/>
         </w:rPr>
-        <w:t xml:space="preserve"> cobra cada módulo.</w:t>
+        <w:t xml:space="preserve"> cabe en el orden de esa referencia. «Apretado» significa que el mercado publica algo más bajo para un producto más estrecho. «Alto» significa que la factura de </w:t>
+      </w:r>
+      <w:r>
+        <w:rPr>
+          <w:rFonts w:ascii="Poppins" w:hAnsi="Poppins" w:cs="Poppins" w:eastAsia="Poppins"/>
+          <w:b/>
+          <w:i w:val="0"/>
+          <w:color w:val="1B3325"/>
+          <w:sz w:val="26"/>
+        </w:rPr>
+        <w:t>RecoTime</w:t>
+      </w:r>
+      <w:r>
+        <w:rPr>
+          <w:rFonts w:ascii="Poppins" w:hAnsi="Poppins" w:cs="Poppins" w:eastAsia="Poppins"/>
+          <w:b w:val="0"/>
+          <w:i w:val="0"/>
+          <w:color w:val="1B3325"/>
+          <w:sz w:val="26"/>
+        </w:rPr>
+        <w:t xml:space="preserve"> supera a una suite que cobra una sola vez.</w:t>
+      </w:r>
+    </w:p>
+    <w:tbl>
+      <w:tblPr>
+        <w:tblW w:type="dxa" w:w="9600"/>
+        <w:jc w:val="center"/>
+        <w:tblLayout w:type="fixed"/>
+        <w:tblLook w:firstColumn="1" w:firstRow="1" w:lastColumn="0" w:lastRow="0" w:noHBand="0" w:noVBand="1" w:val="04A0"/>
+      </w:tblPr>
+      <w:tblGrid>
+        <w:gridCol w:w="2500"/>
+        <w:gridCol w:w="2400"/>
+        <w:gridCol w:w="2400"/>
+        <w:gridCol w:w="2300"/>
+      </w:tblGrid>
+      <w:tr>
+        <w:trPr>
+          <w:tblHeader/>
+          <w:cantSplit/>
+        </w:trPr>
+        <w:tc>
+          <w:tcPr>
+            <w:tcW w:type="dxa" w:w="2500"/>
+            <w:tcBorders>
+              <w:top w:val="single" w:sz="4" w:space="0" w:color="1B3325"/>
+              <w:left w:val="single" w:sz="4" w:space="0" w:color="1B3325"/>
+              <w:bottom w:val="single" w:sz="4" w:space="0" w:color="1B3325"/>
+              <w:right w:val="single" w:sz="4" w:space="0" w:color="1B3325"/>
+            </w:tcBorders>
+            <w:tcMar>
+              <w:top w:w="40" w:type="dxa"/>
+              <w:left w:w="80" w:type="dxa"/>
+              <w:bottom w:w="40" w:type="dxa"/>
+              <w:right w:w="80" w:type="dxa"/>
+            </w:tcMar>
+            <w:shd w:val="clear" w:color="auto" w:fill="1B3325"/>
+            <w:vAlign w:val="center"/>
+          </w:tcPr>
+          <w:p>
+            <w:pPr>
+              <w:spacing w:before="0" w:after="0" w:line="259" w:lineRule="auto"/>
+              <w:jc w:val="center"/>
+              <w:widowControl/>
+              <w:keepNext/>
+            </w:pPr>
+            <w:r/>
+            <w:r>
+              <w:rPr>
+                <w:rFonts w:ascii="Poppins" w:hAnsi="Poppins" w:cs="Poppins" w:eastAsia="Poppins"/>
+                <w:b/>
+                <w:i w:val="0"/>
+                <w:color w:val="FFFFFF"/>
+                <w:sz w:val="16"/>
+              </w:rPr>
+              <w:t>Comparación</w:t>
+            </w:r>
+          </w:p>
+        </w:tc>
+        <w:tc>
+          <w:tcPr>
+            <w:tcW w:type="dxa" w:w="2400"/>
+            <w:tcBorders>
+              <w:top w:val="single" w:sz="4" w:space="0" w:color="1B3325"/>
+              <w:left w:val="single" w:sz="4" w:space="0" w:color="1B3325"/>
+              <w:bottom w:val="single" w:sz="4" w:space="0" w:color="1B3325"/>
+              <w:right w:val="single" w:sz="4" w:space="0" w:color="1B3325"/>
+            </w:tcBorders>
+            <w:tcMar>
+              <w:top w:w="40" w:type="dxa"/>
+              <w:left w:w="80" w:type="dxa"/>
+              <w:bottom w:w="40" w:type="dxa"/>
+              <w:right w:w="80" w:type="dxa"/>
+            </w:tcMar>
+            <w:shd w:val="clear" w:color="auto" w:fill="1B3325"/>
+            <w:vAlign w:val="center"/>
+          </w:tcPr>
+          <w:p>
+            <w:pPr>
+              <w:spacing w:before="0" w:after="0" w:line="259" w:lineRule="auto"/>
+              <w:jc w:val="center"/>
+              <w:widowControl/>
+              <w:keepNext/>
+            </w:pPr>
+            <w:r/>
+            <w:r>
+              <w:rPr>
+                <w:rFonts w:ascii="Poppins" w:hAnsi="Poppins" w:cs="Poppins" w:eastAsia="Poppins"/>
+                <w:b/>
+                <w:i w:val="0"/>
+                <w:color w:val="FFFFFF"/>
+                <w:sz w:val="16"/>
+              </w:rPr>
+              <w:t>Mercado</w:t>
+            </w:r>
+          </w:p>
+        </w:tc>
+        <w:tc>
+          <w:tcPr>
+            <w:tcW w:type="dxa" w:w="2400"/>
+            <w:tcBorders>
+              <w:top w:val="single" w:sz="4" w:space="0" w:color="1B3325"/>
+              <w:left w:val="single" w:sz="4" w:space="0" w:color="1B3325"/>
+              <w:bottom w:val="single" w:sz="4" w:space="0" w:color="1B3325"/>
+              <w:right w:val="single" w:sz="4" w:space="0" w:color="1B3325"/>
+            </w:tcBorders>
+            <w:tcMar>
+              <w:top w:w="40" w:type="dxa"/>
+              <w:left w:w="80" w:type="dxa"/>
+              <w:bottom w:w="40" w:type="dxa"/>
+              <w:right w:w="80" w:type="dxa"/>
+            </w:tcMar>
+            <w:shd w:val="clear" w:color="auto" w:fill="1B3325"/>
+            <w:vAlign w:val="center"/>
+          </w:tcPr>
+          <w:p>
+            <w:pPr>
+              <w:spacing w:before="0" w:after="0" w:line="259" w:lineRule="auto"/>
+              <w:jc w:val="center"/>
+              <w:widowControl/>
+              <w:keepNext/>
+            </w:pPr>
+            <w:r/>
+            <w:r>
+              <w:rPr>
+                <w:rFonts w:ascii="Poppins" w:hAnsi="Poppins" w:cs="Poppins" w:eastAsia="Poppins"/>
+                <w:b/>
+                <w:i w:val="0"/>
+                <w:color w:val="FFFFFF"/>
+                <w:sz w:val="16"/>
+              </w:rPr>
+              <w:t>RecoTime</w:t>
+            </w:r>
+          </w:p>
+        </w:tc>
+        <w:tc>
+          <w:tcPr>
+            <w:tcW w:type="dxa" w:w="2300"/>
+            <w:tcBorders>
+              <w:top w:val="single" w:sz="4" w:space="0" w:color="1B3325"/>
+              <w:left w:val="single" w:sz="4" w:space="0" w:color="1B3325"/>
+              <w:bottom w:val="single" w:sz="4" w:space="0" w:color="1B3325"/>
+              <w:right w:val="single" w:sz="4" w:space="0" w:color="1B3325"/>
+            </w:tcBorders>
+            <w:tcMar>
+              <w:top w:w="40" w:type="dxa"/>
+              <w:left w:w="80" w:type="dxa"/>
+              <w:bottom w:w="40" w:type="dxa"/>
+              <w:right w:w="80" w:type="dxa"/>
+            </w:tcMar>
+            <w:shd w:val="clear" w:color="auto" w:fill="1B3325"/>
+            <w:vAlign w:val="center"/>
+          </w:tcPr>
+          <w:p>
+            <w:pPr>
+              <w:spacing w:before="0" w:after="0" w:line="259" w:lineRule="auto"/>
+              <w:jc w:val="center"/>
+              <w:widowControl/>
+              <w:keepNext/>
+            </w:pPr>
+            <w:r/>
+            <w:r>
+              <w:rPr>
+                <w:rFonts w:ascii="Poppins" w:hAnsi="Poppins" w:cs="Poppins" w:eastAsia="Poppins"/>
+                <w:b/>
+                <w:i w:val="0"/>
+                <w:color w:val="FFFFFF"/>
+                <w:sz w:val="16"/>
+              </w:rPr>
+              <w:t>Lectura</w:t>
+            </w:r>
+          </w:p>
+        </w:tc>
+      </w:tr>
+      <w:tr>
+        <w:trPr>
+          <w:cantSplit/>
+        </w:trPr>
+        <w:tc>
+          <w:tcPr>
+            <w:tcW w:type="dxa" w:w="2500"/>
+            <w:tcBorders>
+              <w:top w:val="single" w:sz="4" w:space="0" w:color="1B3325"/>
+              <w:left w:val="single" w:sz="4" w:space="0" w:color="1B3325"/>
+              <w:bottom w:val="single" w:sz="4" w:space="0" w:color="1B3325"/>
+              <w:right w:val="single" w:sz="4" w:space="0" w:color="1B3325"/>
+            </w:tcBorders>
+            <w:tcMar>
+              <w:top w:w="40" w:type="dxa"/>
+              <w:left w:w="80" w:type="dxa"/>
+              <w:bottom w:w="40" w:type="dxa"/>
+              <w:right w:w="80" w:type="dxa"/>
+            </w:tcMar>
+            <w:shd w:val="clear" w:color="auto" w:fill="FFFFFF"/>
+            <w:vAlign w:val="center"/>
+          </w:tcPr>
+          <w:p>
+            <w:pPr>
+              <w:spacing w:before="0" w:after="0" w:line="259" w:lineRule="auto"/>
+              <w:jc w:val="left"/>
+              <w:widowControl/>
+              <w:keepNext/>
+            </w:pPr>
+            <w:r/>
+            <w:r>
+              <w:rPr>
+                <w:rFonts w:ascii="Poppins" w:hAnsi="Poppins" w:cs="Poppins" w:eastAsia="Poppins"/>
+                <w:b w:val="0"/>
+                <w:i w:val="0"/>
+                <w:color w:val="1B3325"/>
+                <w:sz w:val="16"/>
+              </w:rPr>
+              <w:t>Un módulo frente a Odoo Standard en Colombia</w:t>
+            </w:r>
+          </w:p>
+        </w:tc>
+        <w:tc>
+          <w:tcPr>
+            <w:tcW w:type="dxa" w:w="2400"/>
+            <w:tcBorders>
+              <w:top w:val="single" w:sz="4" w:space="0" w:color="1B3325"/>
+              <w:left w:val="single" w:sz="4" w:space="0" w:color="1B3325"/>
+              <w:bottom w:val="single" w:sz="4" w:space="0" w:color="1B3325"/>
+              <w:right w:val="single" w:sz="4" w:space="0" w:color="1B3325"/>
+            </w:tcBorders>
+            <w:tcMar>
+              <w:top w:w="40" w:type="dxa"/>
+              <w:left w:w="80" w:type="dxa"/>
+              <w:bottom w:w="40" w:type="dxa"/>
+              <w:right w:w="80" w:type="dxa"/>
+            </w:tcMar>
+            <w:shd w:val="clear" w:color="auto" w:fill="FFFFFF"/>
+            <w:vAlign w:val="center"/>
+          </w:tcPr>
+          <w:p>
+            <w:pPr>
+              <w:spacing w:before="0" w:after="0" w:line="259" w:lineRule="auto"/>
+              <w:jc w:val="left"/>
+              <w:widowControl/>
+              <w:keepNext/>
+            </w:pPr>
+            <w:r/>
+            <w:r>
+              <w:rPr>
+                <w:rFonts w:ascii="Poppins" w:hAnsi="Poppins" w:cs="Poppins" w:eastAsia="Poppins"/>
+                <w:b w:val="0"/>
+                <w:i w:val="0"/>
+                <w:color w:val="1B3325"/>
+                <w:sz w:val="16"/>
+              </w:rPr>
+              <w:t>$28.477 por usuario, solo licencia</w:t>
+            </w:r>
+          </w:p>
+        </w:tc>
+        <w:tc>
+          <w:tcPr>
+            <w:tcW w:type="dxa" w:w="2400"/>
+            <w:tcBorders>
+              <w:top w:val="single" w:sz="4" w:space="0" w:color="1B3325"/>
+              <w:left w:val="single" w:sz="4" w:space="0" w:color="1B3325"/>
+              <w:bottom w:val="single" w:sz="4" w:space="0" w:color="1B3325"/>
+              <w:right w:val="single" w:sz="4" w:space="0" w:color="1B3325"/>
+            </w:tcBorders>
+            <w:tcMar>
+              <w:top w:w="40" w:type="dxa"/>
+              <w:left w:w="80" w:type="dxa"/>
+              <w:bottom w:w="40" w:type="dxa"/>
+              <w:right w:w="80" w:type="dxa"/>
+            </w:tcMar>
+            <w:shd w:val="clear" w:color="auto" w:fill="FFFFFF"/>
+            <w:vAlign w:val="center"/>
+          </w:tcPr>
+          <w:p>
+            <w:pPr>
+              <w:spacing w:before="0" w:after="0" w:line="259" w:lineRule="auto"/>
+              <w:jc w:val="left"/>
+              <w:widowControl/>
+              <w:keepNext/>
+            </w:pPr>
+            <w:r/>
+            <w:r>
+              <w:rPr>
+                <w:rFonts w:ascii="Poppins" w:hAnsi="Poppins" w:cs="Poppins" w:eastAsia="Poppins"/>
+                <w:b w:val="0"/>
+                <w:i w:val="0"/>
+                <w:color w:val="1B3325"/>
+                <w:sz w:val="16"/>
+              </w:rPr>
+              <w:t>$20.000 por usuario, puesta en marcha incluida</w:t>
+            </w:r>
+          </w:p>
+        </w:tc>
+        <w:tc>
+          <w:tcPr>
+            <w:tcW w:type="dxa" w:w="2300"/>
+            <w:tcBorders>
+              <w:top w:val="single" w:sz="4" w:space="0" w:color="1B3325"/>
+              <w:left w:val="single" w:sz="4" w:space="0" w:color="1B3325"/>
+              <w:bottom w:val="single" w:sz="4" w:space="0" w:color="1B3325"/>
+              <w:right w:val="single" w:sz="4" w:space="0" w:color="1B3325"/>
+            </w:tcBorders>
+            <w:tcMar>
+              <w:top w:w="40" w:type="dxa"/>
+              <w:left w:w="80" w:type="dxa"/>
+              <w:bottom w:w="40" w:type="dxa"/>
+              <w:right w:w="80" w:type="dxa"/>
+            </w:tcMar>
+            <w:shd w:val="clear" w:color="auto" w:fill="FFFFFF"/>
+            <w:vAlign w:val="center"/>
+          </w:tcPr>
+          <w:p>
+            <w:pPr>
+              <w:spacing w:before="0" w:after="0" w:line="259" w:lineRule="auto"/>
+              <w:jc w:val="left"/>
+              <w:widowControl/>
+              <w:keepNext/>
+            </w:pPr>
+            <w:r/>
+            <w:r>
+              <w:rPr>
+                <w:rFonts w:ascii="Poppins" w:hAnsi="Poppins" w:cs="Poppins" w:eastAsia="Poppins"/>
+                <w:b w:val="0"/>
+                <w:i w:val="0"/>
+                <w:color w:val="1B3325"/>
+                <w:sz w:val="16"/>
+              </w:rPr>
+              <w:t>Viable. Queda $8.477 debajo.</w:t>
+            </w:r>
+          </w:p>
+        </w:tc>
+      </w:tr>
+      <w:tr>
+        <w:trPr>
+          <w:cantSplit/>
+        </w:trPr>
+        <w:tc>
+          <w:tcPr>
+            <w:tcW w:type="dxa" w:w="2500"/>
+            <w:tcBorders>
+              <w:top w:val="single" w:sz="4" w:space="0" w:color="1B3325"/>
+              <w:left w:val="single" w:sz="4" w:space="0" w:color="1B3325"/>
+              <w:bottom w:val="single" w:sz="4" w:space="0" w:color="1B3325"/>
+              <w:right w:val="single" w:sz="4" w:space="0" w:color="1B3325"/>
+            </w:tcBorders>
+            <w:tcMar>
+              <w:top w:w="40" w:type="dxa"/>
+              <w:left w:w="80" w:type="dxa"/>
+              <w:bottom w:w="40" w:type="dxa"/>
+              <w:right w:w="80" w:type="dxa"/>
+            </w:tcMar>
+            <w:shd w:val="clear" w:color="auto" w:fill="F7FBF8"/>
+            <w:vAlign w:val="center"/>
+          </w:tcPr>
+          <w:p>
+            <w:pPr>
+              <w:spacing w:before="0" w:after="0" w:line="259" w:lineRule="auto"/>
+              <w:jc w:val="left"/>
+              <w:widowControl/>
+              <w:keepNext/>
+            </w:pPr>
+            <w:r/>
+            <w:r>
+              <w:rPr>
+                <w:rFonts w:ascii="Poppins" w:hAnsi="Poppins" w:cs="Poppins" w:eastAsia="Poppins"/>
+                <w:b w:val="0"/>
+                <w:i w:val="0"/>
+                <w:color w:val="1B3325"/>
+                <w:sz w:val="16"/>
+              </w:rPr>
+              <w:t>Un módulo, 30 usuarios, frente a Bitrix24 Professional</w:t>
+            </w:r>
+          </w:p>
+        </w:tc>
+        <w:tc>
+          <w:tcPr>
+            <w:tcW w:type="dxa" w:w="2400"/>
+            <w:tcBorders>
+              <w:top w:val="single" w:sz="4" w:space="0" w:color="1B3325"/>
+              <w:left w:val="single" w:sz="4" w:space="0" w:color="1B3325"/>
+              <w:bottom w:val="single" w:sz="4" w:space="0" w:color="1B3325"/>
+              <w:right w:val="single" w:sz="4" w:space="0" w:color="1B3325"/>
+            </w:tcBorders>
+            <w:tcMar>
+              <w:top w:w="40" w:type="dxa"/>
+              <w:left w:w="80" w:type="dxa"/>
+              <w:bottom w:w="40" w:type="dxa"/>
+              <w:right w:w="80" w:type="dxa"/>
+            </w:tcMar>
+            <w:shd w:val="clear" w:color="auto" w:fill="F7FBF8"/>
+            <w:vAlign w:val="center"/>
+          </w:tcPr>
+          <w:p>
+            <w:pPr>
+              <w:spacing w:before="0" w:after="0" w:line="259" w:lineRule="auto"/>
+              <w:jc w:val="left"/>
+              <w:widowControl/>
+              <w:keepNext/>
+            </w:pPr>
+            <w:r/>
+            <w:r>
+              <w:rPr>
+                <w:rFonts w:ascii="Poppins" w:hAnsi="Poppins" w:cs="Poppins" w:eastAsia="Poppins"/>
+                <w:b w:val="0"/>
+                <w:i w:val="0"/>
+                <w:color w:val="1B3325"/>
+                <w:sz w:val="16"/>
+              </w:rPr>
+              <w:t>$633.166 al mes, tope de 100 usuarios</w:t>
+            </w:r>
+          </w:p>
+        </w:tc>
+        <w:tc>
+          <w:tcPr>
+            <w:tcW w:type="dxa" w:w="2400"/>
+            <w:tcBorders>
+              <w:top w:val="single" w:sz="4" w:space="0" w:color="1B3325"/>
+              <w:left w:val="single" w:sz="4" w:space="0" w:color="1B3325"/>
+              <w:bottom w:val="single" w:sz="4" w:space="0" w:color="1B3325"/>
+              <w:right w:val="single" w:sz="4" w:space="0" w:color="1B3325"/>
+            </w:tcBorders>
+            <w:tcMar>
+              <w:top w:w="40" w:type="dxa"/>
+              <w:left w:w="80" w:type="dxa"/>
+              <w:bottom w:w="40" w:type="dxa"/>
+              <w:right w:w="80" w:type="dxa"/>
+            </w:tcMar>
+            <w:shd w:val="clear" w:color="auto" w:fill="F7FBF8"/>
+            <w:vAlign w:val="center"/>
+          </w:tcPr>
+          <w:p>
+            <w:pPr>
+              <w:spacing w:before="0" w:after="0" w:line="259" w:lineRule="auto"/>
+              <w:jc w:val="left"/>
+              <w:widowControl/>
+              <w:keepNext/>
+            </w:pPr>
+            <w:r/>
+            <w:r>
+              <w:rPr>
+                <w:rFonts w:ascii="Poppins" w:hAnsi="Poppins" w:cs="Poppins" w:eastAsia="Poppins"/>
+                <w:b w:val="0"/>
+                <w:i w:val="0"/>
+                <w:color w:val="1B3325"/>
+                <w:sz w:val="16"/>
+              </w:rPr>
+              <w:t>$600.000 al mes</w:t>
+            </w:r>
+          </w:p>
+        </w:tc>
+        <w:tc>
+          <w:tcPr>
+            <w:tcW w:type="dxa" w:w="2300"/>
+            <w:tcBorders>
+              <w:top w:val="single" w:sz="4" w:space="0" w:color="1B3325"/>
+              <w:left w:val="single" w:sz="4" w:space="0" w:color="1B3325"/>
+              <w:bottom w:val="single" w:sz="4" w:space="0" w:color="1B3325"/>
+              <w:right w:val="single" w:sz="4" w:space="0" w:color="1B3325"/>
+            </w:tcBorders>
+            <w:tcMar>
+              <w:top w:w="40" w:type="dxa"/>
+              <w:left w:w="80" w:type="dxa"/>
+              <w:bottom w:w="40" w:type="dxa"/>
+              <w:right w:w="80" w:type="dxa"/>
+            </w:tcMar>
+            <w:shd w:val="clear" w:color="auto" w:fill="F7FBF8"/>
+            <w:vAlign w:val="center"/>
+          </w:tcPr>
+          <w:p>
+            <w:pPr>
+              <w:spacing w:before="0" w:after="0" w:line="259" w:lineRule="auto"/>
+              <w:jc w:val="left"/>
+              <w:widowControl/>
+              <w:keepNext/>
+            </w:pPr>
+            <w:r/>
+            <w:r>
+              <w:rPr>
+                <w:rFonts w:ascii="Poppins" w:hAnsi="Poppins" w:cs="Poppins" w:eastAsia="Poppins"/>
+                <w:b w:val="0"/>
+                <w:i w:val="0"/>
+                <w:color w:val="1B3325"/>
+                <w:sz w:val="16"/>
+              </w:rPr>
+              <w:t>Viable. Mismo orden para un equipo de 30.</w:t>
+            </w:r>
+          </w:p>
+        </w:tc>
+      </w:tr>
+      <w:tr>
+        <w:trPr>
+          <w:cantSplit/>
+        </w:trPr>
+        <w:tc>
+          <w:tcPr>
+            <w:tcW w:type="dxa" w:w="2500"/>
+            <w:tcBorders>
+              <w:top w:val="single" w:sz="4" w:space="0" w:color="1B3325"/>
+              <w:left w:val="single" w:sz="4" w:space="0" w:color="1B3325"/>
+              <w:bottom w:val="single" w:sz="4" w:space="0" w:color="1B3325"/>
+              <w:right w:val="single" w:sz="4" w:space="0" w:color="1B3325"/>
+            </w:tcBorders>
+            <w:tcMar>
+              <w:top w:w="40" w:type="dxa"/>
+              <w:left w:w="80" w:type="dxa"/>
+              <w:bottom w:w="40" w:type="dxa"/>
+              <w:right w:w="80" w:type="dxa"/>
+            </w:tcMar>
+            <w:shd w:val="clear" w:color="auto" w:fill="FFFFFF"/>
+            <w:vAlign w:val="center"/>
+          </w:tcPr>
+          <w:p>
+            <w:pPr>
+              <w:spacing w:before="0" w:after="0" w:line="259" w:lineRule="auto"/>
+              <w:jc w:val="left"/>
+              <w:widowControl/>
+              <w:keepNext/>
+            </w:pPr>
+            <w:r/>
+            <w:r>
+              <w:rPr>
+                <w:rFonts w:ascii="Poppins" w:hAnsi="Poppins" w:cs="Poppins" w:eastAsia="Poppins"/>
+                <w:b w:val="0"/>
+                <w:i w:val="0"/>
+                <w:color w:val="1B3325"/>
+                <w:sz w:val="16"/>
+              </w:rPr>
+              <w:t>Drive suelto frente a Zoho WorkDrive Team</w:t>
+            </w:r>
+          </w:p>
+        </w:tc>
+        <w:tc>
+          <w:tcPr>
+            <w:tcW w:type="dxa" w:w="2400"/>
+            <w:tcBorders>
+              <w:top w:val="single" w:sz="4" w:space="0" w:color="1B3325"/>
+              <w:left w:val="single" w:sz="4" w:space="0" w:color="1B3325"/>
+              <w:bottom w:val="single" w:sz="4" w:space="0" w:color="1B3325"/>
+              <w:right w:val="single" w:sz="4" w:space="0" w:color="1B3325"/>
+            </w:tcBorders>
+            <w:tcMar>
+              <w:top w:w="40" w:type="dxa"/>
+              <w:left w:w="80" w:type="dxa"/>
+              <w:bottom w:w="40" w:type="dxa"/>
+              <w:right w:w="80" w:type="dxa"/>
+            </w:tcMar>
+            <w:shd w:val="clear" w:color="auto" w:fill="FFFFFF"/>
+            <w:vAlign w:val="center"/>
+          </w:tcPr>
+          <w:p>
+            <w:pPr>
+              <w:spacing w:before="0" w:after="0" w:line="259" w:lineRule="auto"/>
+              <w:jc w:val="left"/>
+              <w:widowControl/>
+              <w:keepNext/>
+            </w:pPr>
+            <w:r/>
+            <w:r>
+              <w:rPr>
+                <w:rFonts w:ascii="Poppins" w:hAnsi="Poppins" w:cs="Poppins" w:eastAsia="Poppins"/>
+                <w:b w:val="0"/>
+                <w:i w:val="0"/>
+                <w:color w:val="1B3325"/>
+                <w:sz w:val="16"/>
+              </w:rPr>
+              <w:t>$14.318 por usuario, solo archivos</w:t>
+            </w:r>
+          </w:p>
+        </w:tc>
+        <w:tc>
+          <w:tcPr>
+            <w:tcW w:type="dxa" w:w="2400"/>
+            <w:tcBorders>
+              <w:top w:val="single" w:sz="4" w:space="0" w:color="1B3325"/>
+              <w:left w:val="single" w:sz="4" w:space="0" w:color="1B3325"/>
+              <w:bottom w:val="single" w:sz="4" w:space="0" w:color="1B3325"/>
+              <w:right w:val="single" w:sz="4" w:space="0" w:color="1B3325"/>
+            </w:tcBorders>
+            <w:tcMar>
+              <w:top w:w="40" w:type="dxa"/>
+              <w:left w:w="80" w:type="dxa"/>
+              <w:bottom w:w="40" w:type="dxa"/>
+              <w:right w:w="80" w:type="dxa"/>
+            </w:tcMar>
+            <w:shd w:val="clear" w:color="auto" w:fill="FFFFFF"/>
+            <w:vAlign w:val="center"/>
+          </w:tcPr>
+          <w:p>
+            <w:pPr>
+              <w:spacing w:before="0" w:after="0" w:line="259" w:lineRule="auto"/>
+              <w:jc w:val="left"/>
+              <w:widowControl/>
+              <w:keepNext/>
+            </w:pPr>
+            <w:r/>
+            <w:r>
+              <w:rPr>
+                <w:rFonts w:ascii="Poppins" w:hAnsi="Poppins" w:cs="Poppins" w:eastAsia="Poppins"/>
+                <w:b w:val="0"/>
+                <w:i w:val="0"/>
+                <w:color w:val="1B3325"/>
+                <w:sz w:val="16"/>
+              </w:rPr>
+              <w:t>$20.000 por usuario</w:t>
+            </w:r>
+          </w:p>
+        </w:tc>
+        <w:tc>
+          <w:tcPr>
+            <w:tcW w:type="dxa" w:w="2300"/>
+            <w:tcBorders>
+              <w:top w:val="single" w:sz="4" w:space="0" w:color="1B3325"/>
+              <w:left w:val="single" w:sz="4" w:space="0" w:color="1B3325"/>
+              <w:bottom w:val="single" w:sz="4" w:space="0" w:color="1B3325"/>
+              <w:right w:val="single" w:sz="4" w:space="0" w:color="1B3325"/>
+            </w:tcBorders>
+            <w:tcMar>
+              <w:top w:w="40" w:type="dxa"/>
+              <w:left w:w="80" w:type="dxa"/>
+              <w:bottom w:w="40" w:type="dxa"/>
+              <w:right w:w="80" w:type="dxa"/>
+            </w:tcMar>
+            <w:shd w:val="clear" w:color="auto" w:fill="FFFFFF"/>
+            <w:vAlign w:val="center"/>
+          </w:tcPr>
+          <w:p>
+            <w:pPr>
+              <w:spacing w:before="0" w:after="0" w:line="259" w:lineRule="auto"/>
+              <w:jc w:val="left"/>
+              <w:widowControl/>
+              <w:keepNext/>
+            </w:pPr>
+            <w:r/>
+            <w:r>
+              <w:rPr>
+                <w:rFonts w:ascii="Poppins" w:hAnsi="Poppins" w:cs="Poppins" w:eastAsia="Poppins"/>
+                <w:b w:val="0"/>
+                <w:i w:val="0"/>
+                <w:color w:val="1B3325"/>
+                <w:sz w:val="16"/>
+              </w:rPr>
+              <w:t>Apretado. WorkDrive publica menos y reparte más espacio.</w:t>
+            </w:r>
+          </w:p>
+        </w:tc>
+      </w:tr>
+      <w:tr>
+        <w:trPr>
+          <w:cantSplit/>
+        </w:trPr>
+        <w:tc>
+          <w:tcPr>
+            <w:tcW w:type="dxa" w:w="2500"/>
+            <w:tcBorders>
+              <w:top w:val="single" w:sz="4" w:space="0" w:color="1B3325"/>
+              <w:left w:val="single" w:sz="4" w:space="0" w:color="1B3325"/>
+              <w:bottom w:val="single" w:sz="4" w:space="0" w:color="1B3325"/>
+              <w:right w:val="single" w:sz="4" w:space="0" w:color="1B3325"/>
+            </w:tcBorders>
+            <w:tcMar>
+              <w:top w:w="40" w:type="dxa"/>
+              <w:left w:w="80" w:type="dxa"/>
+              <w:bottom w:w="40" w:type="dxa"/>
+              <w:right w:w="80" w:type="dxa"/>
+            </w:tcMar>
+            <w:shd w:val="clear" w:color="auto" w:fill="F7FBF8"/>
+            <w:vAlign w:val="center"/>
+          </w:tcPr>
+          <w:p>
+            <w:pPr>
+              <w:spacing w:before="0" w:after="0" w:line="259" w:lineRule="auto"/>
+              <w:jc w:val="left"/>
+              <w:widowControl/>
+              <w:keepNext/>
+            </w:pPr>
+            <w:r/>
+            <w:r>
+              <w:rPr>
+                <w:rFonts w:ascii="Poppins" w:hAnsi="Poppins" w:cs="Poppins" w:eastAsia="Poppins"/>
+                <w:b w:val="0"/>
+                <w:i w:val="0"/>
+                <w:color w:val="1B3325"/>
+                <w:sz w:val="16"/>
+              </w:rPr>
+              <w:t>Drive suelto frente a SharePoint Plan 1</w:t>
+            </w:r>
+          </w:p>
+        </w:tc>
+        <w:tc>
+          <w:tcPr>
+            <w:tcW w:type="dxa" w:w="2400"/>
+            <w:tcBorders>
+              <w:top w:val="single" w:sz="4" w:space="0" w:color="1B3325"/>
+              <w:left w:val="single" w:sz="4" w:space="0" w:color="1B3325"/>
+              <w:bottom w:val="single" w:sz="4" w:space="0" w:color="1B3325"/>
+              <w:right w:val="single" w:sz="4" w:space="0" w:color="1B3325"/>
+            </w:tcBorders>
+            <w:tcMar>
+              <w:top w:w="40" w:type="dxa"/>
+              <w:left w:w="80" w:type="dxa"/>
+              <w:bottom w:w="40" w:type="dxa"/>
+              <w:right w:w="80" w:type="dxa"/>
+            </w:tcMar>
+            <w:shd w:val="clear" w:color="auto" w:fill="F7FBF8"/>
+            <w:vAlign w:val="center"/>
+          </w:tcPr>
+          <w:p>
+            <w:pPr>
+              <w:spacing w:before="0" w:after="0" w:line="259" w:lineRule="auto"/>
+              <w:jc w:val="left"/>
+              <w:widowControl/>
+              <w:keepNext/>
+            </w:pPr>
+            <w:r/>
+            <w:r>
+              <w:rPr>
+                <w:rFonts w:ascii="Poppins" w:hAnsi="Poppins" w:cs="Poppins" w:eastAsia="Poppins"/>
+                <w:b w:val="0"/>
+                <w:i w:val="0"/>
+                <w:color w:val="1B3325"/>
+                <w:sz w:val="16"/>
+              </w:rPr>
+              <w:t>$15.909 por usuario</w:t>
+            </w:r>
+          </w:p>
+        </w:tc>
+        <w:tc>
+          <w:tcPr>
+            <w:tcW w:type="dxa" w:w="2400"/>
+            <w:tcBorders>
+              <w:top w:val="single" w:sz="4" w:space="0" w:color="1B3325"/>
+              <w:left w:val="single" w:sz="4" w:space="0" w:color="1B3325"/>
+              <w:bottom w:val="single" w:sz="4" w:space="0" w:color="1B3325"/>
+              <w:right w:val="single" w:sz="4" w:space="0" w:color="1B3325"/>
+            </w:tcBorders>
+            <w:tcMar>
+              <w:top w:w="40" w:type="dxa"/>
+              <w:left w:w="80" w:type="dxa"/>
+              <w:bottom w:w="40" w:type="dxa"/>
+              <w:right w:w="80" w:type="dxa"/>
+            </w:tcMar>
+            <w:shd w:val="clear" w:color="auto" w:fill="F7FBF8"/>
+            <w:vAlign w:val="center"/>
+          </w:tcPr>
+          <w:p>
+            <w:pPr>
+              <w:spacing w:before="0" w:after="0" w:line="259" w:lineRule="auto"/>
+              <w:jc w:val="left"/>
+              <w:widowControl/>
+              <w:keepNext/>
+            </w:pPr>
+            <w:r/>
+            <w:r>
+              <w:rPr>
+                <w:rFonts w:ascii="Poppins" w:hAnsi="Poppins" w:cs="Poppins" w:eastAsia="Poppins"/>
+                <w:b w:val="0"/>
+                <w:i w:val="0"/>
+                <w:color w:val="1B3325"/>
+                <w:sz w:val="16"/>
+              </w:rPr>
+              <w:t>$20.000 por usuario</w:t>
+            </w:r>
+          </w:p>
+        </w:tc>
+        <w:tc>
+          <w:tcPr>
+            <w:tcW w:type="dxa" w:w="2300"/>
+            <w:tcBorders>
+              <w:top w:val="single" w:sz="4" w:space="0" w:color="1B3325"/>
+              <w:left w:val="single" w:sz="4" w:space="0" w:color="1B3325"/>
+              <w:bottom w:val="single" w:sz="4" w:space="0" w:color="1B3325"/>
+              <w:right w:val="single" w:sz="4" w:space="0" w:color="1B3325"/>
+            </w:tcBorders>
+            <w:tcMar>
+              <w:top w:w="40" w:type="dxa"/>
+              <w:left w:w="80" w:type="dxa"/>
+              <w:bottom w:w="40" w:type="dxa"/>
+              <w:right w:w="80" w:type="dxa"/>
+            </w:tcMar>
+            <w:shd w:val="clear" w:color="auto" w:fill="F7FBF8"/>
+            <w:vAlign w:val="center"/>
+          </w:tcPr>
+          <w:p>
+            <w:pPr>
+              <w:spacing w:before="0" w:after="0" w:line="259" w:lineRule="auto"/>
+              <w:jc w:val="left"/>
+              <w:widowControl/>
+              <w:keepNext/>
+            </w:pPr>
+            <w:r/>
+            <w:r>
+              <w:rPr>
+                <w:rFonts w:ascii="Poppins" w:hAnsi="Poppins" w:cs="Poppins" w:eastAsia="Poppins"/>
+                <w:b w:val="0"/>
+                <w:i w:val="0"/>
+                <w:color w:val="1B3325"/>
+                <w:sz w:val="16"/>
+              </w:rPr>
+              <w:t>Apretado. SharePoint es solo la intranet de archivos.</w:t>
+            </w:r>
+          </w:p>
+        </w:tc>
+      </w:tr>
+      <w:tr>
+        <w:trPr>
+          <w:cantSplit/>
+        </w:trPr>
+        <w:tc>
+          <w:tcPr>
+            <w:tcW w:type="dxa" w:w="2500"/>
+            <w:tcBorders>
+              <w:top w:val="single" w:sz="4" w:space="0" w:color="1B3325"/>
+              <w:left w:val="single" w:sz="4" w:space="0" w:color="1B3325"/>
+              <w:bottom w:val="single" w:sz="4" w:space="0" w:color="1B3325"/>
+              <w:right w:val="single" w:sz="4" w:space="0" w:color="1B3325"/>
+            </w:tcBorders>
+            <w:tcMar>
+              <w:top w:w="40" w:type="dxa"/>
+              <w:left w:w="80" w:type="dxa"/>
+              <w:bottom w:w="40" w:type="dxa"/>
+              <w:right w:w="80" w:type="dxa"/>
+            </w:tcMar>
+            <w:shd w:val="clear" w:color="auto" w:fill="FFFFFF"/>
+            <w:vAlign w:val="center"/>
+          </w:tcPr>
+          <w:p>
+            <w:pPr>
+              <w:spacing w:before="0" w:after="0" w:line="259" w:lineRule="auto"/>
+              <w:jc w:val="left"/>
+              <w:widowControl/>
+              <w:keepNext/>
+            </w:pPr>
+            <w:r/>
+            <w:r>
+              <w:rPr>
+                <w:rFonts w:ascii="Poppins" w:hAnsi="Poppins" w:cs="Poppins" w:eastAsia="Poppins"/>
+                <w:b w:val="0"/>
+                <w:i w:val="0"/>
+                <w:color w:val="1B3325"/>
+                <w:sz w:val="16"/>
+              </w:rPr>
+              <w:t>Los tres módulos frente a Odoo Standard, 30 usuarios</w:t>
+            </w:r>
+          </w:p>
+        </w:tc>
+        <w:tc>
+          <w:tcPr>
+            <w:tcW w:type="dxa" w:w="2400"/>
+            <w:tcBorders>
+              <w:top w:val="single" w:sz="4" w:space="0" w:color="1B3325"/>
+              <w:left w:val="single" w:sz="4" w:space="0" w:color="1B3325"/>
+              <w:bottom w:val="single" w:sz="4" w:space="0" w:color="1B3325"/>
+              <w:right w:val="single" w:sz="4" w:space="0" w:color="1B3325"/>
+            </w:tcBorders>
+            <w:tcMar>
+              <w:top w:w="40" w:type="dxa"/>
+              <w:left w:w="80" w:type="dxa"/>
+              <w:bottom w:w="40" w:type="dxa"/>
+              <w:right w:w="80" w:type="dxa"/>
+            </w:tcMar>
+            <w:shd w:val="clear" w:color="auto" w:fill="FFFFFF"/>
+            <w:vAlign w:val="center"/>
+          </w:tcPr>
+          <w:p>
+            <w:pPr>
+              <w:spacing w:before="0" w:after="0" w:line="259" w:lineRule="auto"/>
+              <w:jc w:val="left"/>
+              <w:widowControl/>
+              <w:keepNext/>
+            </w:pPr>
+            <w:r/>
+            <w:r>
+              <w:rPr>
+                <w:rFonts w:ascii="Poppins" w:hAnsi="Poppins" w:cs="Poppins" w:eastAsia="Poppins"/>
+                <w:b w:val="0"/>
+                <w:i w:val="0"/>
+                <w:color w:val="1B3325"/>
+                <w:sz w:val="16"/>
+              </w:rPr>
+              <w:t>$854.297 al mes, solo licencia</w:t>
+            </w:r>
+          </w:p>
+        </w:tc>
+        <w:tc>
+          <w:tcPr>
+            <w:tcW w:type="dxa" w:w="2400"/>
+            <w:tcBorders>
+              <w:top w:val="single" w:sz="4" w:space="0" w:color="1B3325"/>
+              <w:left w:val="single" w:sz="4" w:space="0" w:color="1B3325"/>
+              <w:bottom w:val="single" w:sz="4" w:space="0" w:color="1B3325"/>
+              <w:right w:val="single" w:sz="4" w:space="0" w:color="1B3325"/>
+            </w:tcBorders>
+            <w:tcMar>
+              <w:top w:w="40" w:type="dxa"/>
+              <w:left w:w="80" w:type="dxa"/>
+              <w:bottom w:w="40" w:type="dxa"/>
+              <w:right w:w="80" w:type="dxa"/>
+            </w:tcMar>
+            <w:shd w:val="clear" w:color="auto" w:fill="FFFFFF"/>
+            <w:vAlign w:val="center"/>
+          </w:tcPr>
+          <w:p>
+            <w:pPr>
+              <w:spacing w:before="0" w:after="0" w:line="259" w:lineRule="auto"/>
+              <w:jc w:val="left"/>
+              <w:widowControl/>
+              <w:keepNext/>
+            </w:pPr>
+            <w:r/>
+            <w:r>
+              <w:rPr>
+                <w:rFonts w:ascii="Poppins" w:hAnsi="Poppins" w:cs="Poppins" w:eastAsia="Poppins"/>
+                <w:b w:val="0"/>
+                <w:i w:val="0"/>
+                <w:color w:val="1B3325"/>
+                <w:sz w:val="16"/>
+              </w:rPr>
+              <w:t>$1.800.000 al mes</w:t>
+            </w:r>
+          </w:p>
+        </w:tc>
+        <w:tc>
+          <w:tcPr>
+            <w:tcW w:type="dxa" w:w="2300"/>
+            <w:tcBorders>
+              <w:top w:val="single" w:sz="4" w:space="0" w:color="1B3325"/>
+              <w:left w:val="single" w:sz="4" w:space="0" w:color="1B3325"/>
+              <w:bottom w:val="single" w:sz="4" w:space="0" w:color="1B3325"/>
+              <w:right w:val="single" w:sz="4" w:space="0" w:color="1B3325"/>
+            </w:tcBorders>
+            <w:tcMar>
+              <w:top w:w="40" w:type="dxa"/>
+              <w:left w:w="80" w:type="dxa"/>
+              <w:bottom w:w="40" w:type="dxa"/>
+              <w:right w:w="80" w:type="dxa"/>
+            </w:tcMar>
+            <w:shd w:val="clear" w:color="auto" w:fill="FFFFFF"/>
+            <w:vAlign w:val="center"/>
+          </w:tcPr>
+          <w:p>
+            <w:pPr>
+              <w:spacing w:before="0" w:after="0" w:line="259" w:lineRule="auto"/>
+              <w:jc w:val="left"/>
+              <w:widowControl/>
+              <w:keepNext/>
+            </w:pPr>
+            <w:r/>
+            <w:r>
+              <w:rPr>
+                <w:rFonts w:ascii="Poppins" w:hAnsi="Poppins" w:cs="Poppins" w:eastAsia="Poppins"/>
+                <w:b w:val="0"/>
+                <w:i w:val="0"/>
+                <w:color w:val="1B3325"/>
+                <w:sz w:val="16"/>
+              </w:rPr>
+              <w:t>Alto. Odoo cobra una vez por todas las aplicaciones.</w:t>
+            </w:r>
+          </w:p>
+        </w:tc>
+      </w:tr>
+      <w:tr>
+        <w:trPr>
+          <w:cantSplit/>
+        </w:trPr>
+        <w:tc>
+          <w:tcPr>
+            <w:tcW w:type="dxa" w:w="2500"/>
+            <w:tcBorders>
+              <w:top w:val="single" w:sz="4" w:space="0" w:color="1B3325"/>
+              <w:left w:val="single" w:sz="4" w:space="0" w:color="1B3325"/>
+              <w:bottom w:val="single" w:sz="4" w:space="0" w:color="1B3325"/>
+              <w:right w:val="single" w:sz="4" w:space="0" w:color="1B3325"/>
+            </w:tcBorders>
+            <w:tcMar>
+              <w:top w:w="40" w:type="dxa"/>
+              <w:left w:w="80" w:type="dxa"/>
+              <w:bottom w:w="40" w:type="dxa"/>
+              <w:right w:w="80" w:type="dxa"/>
+            </w:tcMar>
+            <w:shd w:val="clear" w:color="auto" w:fill="F7FBF8"/>
+            <w:vAlign w:val="center"/>
+          </w:tcPr>
+          <w:p>
+            <w:pPr>
+              <w:spacing w:before="0" w:after="0" w:line="259" w:lineRule="auto"/>
+              <w:jc w:val="left"/>
+              <w:widowControl/>
+              <w:keepNext/>
+            </w:pPr>
+            <w:r/>
+            <w:r>
+              <w:rPr>
+                <w:rFonts w:ascii="Poppins" w:hAnsi="Poppins" w:cs="Poppins" w:eastAsia="Poppins"/>
+                <w:b w:val="0"/>
+                <w:i w:val="0"/>
+                <w:color w:val="1B3325"/>
+                <w:sz w:val="16"/>
+              </w:rPr>
+              <w:t>Los tres módulos frente a Google Workspace Standard</w:t>
+            </w:r>
+          </w:p>
+        </w:tc>
+        <w:tc>
+          <w:tcPr>
+            <w:tcW w:type="dxa" w:w="2400"/>
+            <w:tcBorders>
+              <w:top w:val="single" w:sz="4" w:space="0" w:color="1B3325"/>
+              <w:left w:val="single" w:sz="4" w:space="0" w:color="1B3325"/>
+              <w:bottom w:val="single" w:sz="4" w:space="0" w:color="1B3325"/>
+              <w:right w:val="single" w:sz="4" w:space="0" w:color="1B3325"/>
+            </w:tcBorders>
+            <w:tcMar>
+              <w:top w:w="40" w:type="dxa"/>
+              <w:left w:w="80" w:type="dxa"/>
+              <w:bottom w:w="40" w:type="dxa"/>
+              <w:right w:w="80" w:type="dxa"/>
+            </w:tcMar>
+            <w:shd w:val="clear" w:color="auto" w:fill="F7FBF8"/>
+            <w:vAlign w:val="center"/>
+          </w:tcPr>
+          <w:p>
+            <w:pPr>
+              <w:spacing w:before="0" w:after="0" w:line="259" w:lineRule="auto"/>
+              <w:jc w:val="left"/>
+              <w:widowControl/>
+              <w:keepNext/>
+            </w:pPr>
+            <w:r/>
+            <w:r>
+              <w:rPr>
+                <w:rFonts w:ascii="Poppins" w:hAnsi="Poppins" w:cs="Poppins" w:eastAsia="Poppins"/>
+                <w:b w:val="0"/>
+                <w:i w:val="0"/>
+                <w:color w:val="1B3325"/>
+                <w:sz w:val="16"/>
+              </w:rPr>
+              <w:t>$58.400 por usuario en Colombia</w:t>
+            </w:r>
+          </w:p>
+        </w:tc>
+        <w:tc>
+          <w:tcPr>
+            <w:tcW w:type="dxa" w:w="2400"/>
+            <w:tcBorders>
+              <w:top w:val="single" w:sz="4" w:space="0" w:color="1B3325"/>
+              <w:left w:val="single" w:sz="4" w:space="0" w:color="1B3325"/>
+              <w:bottom w:val="single" w:sz="4" w:space="0" w:color="1B3325"/>
+              <w:right w:val="single" w:sz="4" w:space="0" w:color="1B3325"/>
+            </w:tcBorders>
+            <w:tcMar>
+              <w:top w:w="40" w:type="dxa"/>
+              <w:left w:w="80" w:type="dxa"/>
+              <w:bottom w:w="40" w:type="dxa"/>
+              <w:right w:w="80" w:type="dxa"/>
+            </w:tcMar>
+            <w:shd w:val="clear" w:color="auto" w:fill="F7FBF8"/>
+            <w:vAlign w:val="center"/>
+          </w:tcPr>
+          <w:p>
+            <w:pPr>
+              <w:spacing w:before="0" w:after="0" w:line="259" w:lineRule="auto"/>
+              <w:jc w:val="left"/>
+              <w:widowControl/>
+              <w:keepNext/>
+            </w:pPr>
+            <w:r/>
+            <w:r>
+              <w:rPr>
+                <w:rFonts w:ascii="Poppins" w:hAnsi="Poppins" w:cs="Poppins" w:eastAsia="Poppins"/>
+                <w:b w:val="0"/>
+                <w:i w:val="0"/>
+                <w:color w:val="1B3325"/>
+                <w:sz w:val="16"/>
+              </w:rPr>
+              <w:t>$60.000 por usuario</w:t>
+            </w:r>
+          </w:p>
+        </w:tc>
+        <w:tc>
+          <w:tcPr>
+            <w:tcW w:type="dxa" w:w="2300"/>
+            <w:tcBorders>
+              <w:top w:val="single" w:sz="4" w:space="0" w:color="1B3325"/>
+              <w:left w:val="single" w:sz="4" w:space="0" w:color="1B3325"/>
+              <w:bottom w:val="single" w:sz="4" w:space="0" w:color="1B3325"/>
+              <w:right w:val="single" w:sz="4" w:space="0" w:color="1B3325"/>
+            </w:tcBorders>
+            <w:tcMar>
+              <w:top w:w="40" w:type="dxa"/>
+              <w:left w:w="80" w:type="dxa"/>
+              <w:bottom w:w="40" w:type="dxa"/>
+              <w:right w:w="80" w:type="dxa"/>
+            </w:tcMar>
+            <w:shd w:val="clear" w:color="auto" w:fill="F7FBF8"/>
+            <w:vAlign w:val="center"/>
+          </w:tcPr>
+          <w:p>
+            <w:pPr>
+              <w:spacing w:before="0" w:after="0" w:line="259" w:lineRule="auto"/>
+              <w:jc w:val="left"/>
+              <w:widowControl/>
+              <w:keepNext/>
+            </w:pPr>
+            <w:r/>
+            <w:r>
+              <w:rPr>
+                <w:rFonts w:ascii="Poppins" w:hAnsi="Poppins" w:cs="Poppins" w:eastAsia="Poppins"/>
+                <w:b w:val="0"/>
+                <w:i w:val="0"/>
+                <w:color w:val="1B3325"/>
+                <w:sz w:val="16"/>
+              </w:rPr>
+              <w:t>Cerca en la factura. Google da correo y 2 TB por persona.</w:t>
+            </w:r>
+          </w:p>
+        </w:tc>
+      </w:tr>
+      <w:tr>
+        <w:trPr>
+          <w:cantSplit/>
+        </w:trPr>
+        <w:tc>
+          <w:tcPr>
+            <w:tcW w:type="dxa" w:w="2500"/>
+            <w:tcBorders>
+              <w:top w:val="single" w:sz="4" w:space="0" w:color="1B3325"/>
+              <w:left w:val="single" w:sz="4" w:space="0" w:color="1B3325"/>
+              <w:bottom w:val="single" w:sz="4" w:space="0" w:color="1B3325"/>
+              <w:right w:val="single" w:sz="4" w:space="0" w:color="1B3325"/>
+            </w:tcBorders>
+            <w:tcMar>
+              <w:top w:w="40" w:type="dxa"/>
+              <w:left w:w="80" w:type="dxa"/>
+              <w:bottom w:w="40" w:type="dxa"/>
+              <w:right w:w="80" w:type="dxa"/>
+            </w:tcMar>
+            <w:shd w:val="clear" w:color="auto" w:fill="FFFFFF"/>
+            <w:vAlign w:val="center"/>
+          </w:tcPr>
+          <w:p>
+            <w:pPr>
+              <w:spacing w:before="0" w:after="0" w:line="259" w:lineRule="auto"/>
+              <w:jc w:val="left"/>
+              <w:widowControl/>
+            </w:pPr>
+            <w:r/>
+            <w:r>
+              <w:rPr>
+                <w:rFonts w:ascii="Poppins" w:hAnsi="Poppins" w:cs="Poppins" w:eastAsia="Poppins"/>
+                <w:b w:val="0"/>
+                <w:i w:val="0"/>
+                <w:color w:val="1B3325"/>
+                <w:sz w:val="16"/>
+              </w:rPr>
+              <w:t>Cuota de 2 TB frente al KVM 1 de Hostinger</w:t>
+            </w:r>
+          </w:p>
+        </w:tc>
+        <w:tc>
+          <w:tcPr>
+            <w:tcW w:type="dxa" w:w="2400"/>
+            <w:tcBorders>
+              <w:top w:val="single" w:sz="4" w:space="0" w:color="1B3325"/>
+              <w:left w:val="single" w:sz="4" w:space="0" w:color="1B3325"/>
+              <w:bottom w:val="single" w:sz="4" w:space="0" w:color="1B3325"/>
+              <w:right w:val="single" w:sz="4" w:space="0" w:color="1B3325"/>
+            </w:tcBorders>
+            <w:tcMar>
+              <w:top w:w="40" w:type="dxa"/>
+              <w:left w:w="80" w:type="dxa"/>
+              <w:bottom w:w="40" w:type="dxa"/>
+              <w:right w:w="80" w:type="dxa"/>
+            </w:tcMar>
+            <w:shd w:val="clear" w:color="auto" w:fill="FFFFFF"/>
+            <w:vAlign w:val="center"/>
+          </w:tcPr>
+          <w:p>
+            <w:pPr>
+              <w:spacing w:before="0" w:after="0" w:line="259" w:lineRule="auto"/>
+              <w:jc w:val="left"/>
+              <w:widowControl/>
+            </w:pPr>
+            <w:r/>
+            <w:r>
+              <w:rPr>
+                <w:rFonts w:ascii="Poppins" w:hAnsi="Poppins" w:cs="Poppins" w:eastAsia="Poppins"/>
+                <w:b w:val="0"/>
+                <w:i w:val="0"/>
+                <w:color w:val="1B3325"/>
+                <w:sz w:val="16"/>
+              </w:rPr>
+              <w:t>50 GB por $466.800 al año</w:t>
+            </w:r>
+          </w:p>
+        </w:tc>
+        <w:tc>
+          <w:tcPr>
+            <w:tcW w:type="dxa" w:w="2400"/>
+            <w:tcBorders>
+              <w:top w:val="single" w:sz="4" w:space="0" w:color="1B3325"/>
+              <w:left w:val="single" w:sz="4" w:space="0" w:color="1B3325"/>
+              <w:bottom w:val="single" w:sz="4" w:space="0" w:color="1B3325"/>
+              <w:right w:val="single" w:sz="4" w:space="0" w:color="1B3325"/>
+            </w:tcBorders>
+            <w:tcMar>
+              <w:top w:w="40" w:type="dxa"/>
+              <w:left w:w="80" w:type="dxa"/>
+              <w:bottom w:w="40" w:type="dxa"/>
+              <w:right w:w="80" w:type="dxa"/>
+            </w:tcMar>
+            <w:shd w:val="clear" w:color="auto" w:fill="FFFFFF"/>
+            <w:vAlign w:val="center"/>
+          </w:tcPr>
+          <w:p>
+            <w:pPr>
+              <w:spacing w:before="0" w:after="0" w:line="259" w:lineRule="auto"/>
+              <w:jc w:val="left"/>
+              <w:widowControl/>
+            </w:pPr>
+            <w:r/>
+            <w:r>
+              <w:rPr>
+                <w:rFonts w:ascii="Poppins" w:hAnsi="Poppins" w:cs="Poppins" w:eastAsia="Poppins"/>
+                <w:b w:val="0"/>
+                <w:i w:val="0"/>
+                <w:color w:val="1B3325"/>
+                <w:sz w:val="16"/>
+              </w:rPr>
+              <w:t>Cuota de software de 2 TB</w:t>
+            </w:r>
+          </w:p>
+        </w:tc>
+        <w:tc>
+          <w:tcPr>
+            <w:tcW w:type="dxa" w:w="2300"/>
+            <w:tcBorders>
+              <w:top w:val="single" w:sz="4" w:space="0" w:color="1B3325"/>
+              <w:left w:val="single" w:sz="4" w:space="0" w:color="1B3325"/>
+              <w:bottom w:val="single" w:sz="4" w:space="0" w:color="1B3325"/>
+              <w:right w:val="single" w:sz="4" w:space="0" w:color="1B3325"/>
+            </w:tcBorders>
+            <w:tcMar>
+              <w:top w:w="40" w:type="dxa"/>
+              <w:left w:w="80" w:type="dxa"/>
+              <w:bottom w:w="40" w:type="dxa"/>
+              <w:right w:w="80" w:type="dxa"/>
+            </w:tcMar>
+            <w:shd w:val="clear" w:color="auto" w:fill="FFFFFF"/>
+            <w:vAlign w:val="center"/>
+          </w:tcPr>
+          <w:p>
+            <w:pPr>
+              <w:spacing w:before="0" w:after="0" w:line="259" w:lineRule="auto"/>
+              <w:jc w:val="left"/>
+              <w:widowControl/>
+            </w:pPr>
+            <w:r/>
+            <w:r>
+              <w:rPr>
+                <w:rFonts w:ascii="Poppins" w:hAnsi="Poppins" w:cs="Poppins" w:eastAsia="Poppins"/>
+                <w:b w:val="0"/>
+                <w:i w:val="0"/>
+                <w:color w:val="1B3325"/>
+                <w:sz w:val="16"/>
+              </w:rPr>
+              <w:t>El disco de esa VPS no alcanza para la cuota.</w:t>
+            </w:r>
+          </w:p>
+        </w:tc>
+      </w:tr>
+    </w:tbl>
+    <w:p>
+      <w:pPr>
+        <w:spacing w:before="0" w:after="40" w:line="259" w:lineRule="auto"/>
+        <w:jc w:val="left"/>
+        <w:widowControl/>
+      </w:pPr>
+    </w:p>
+    <w:p>
+      <w:pPr>
+        <w:spacing w:before="0" w:after="160" w:line="259" w:lineRule="auto"/>
+        <w:jc w:val="both"/>
+        <w:widowControl/>
+      </w:pPr>
+      <w:r>
+        <w:rPr>
+          <w:rFonts w:ascii="Poppins" w:hAnsi="Poppins" w:cs="Poppins" w:eastAsia="Poppins"/>
+          <w:b w:val="0"/>
+          <w:i w:val="0"/>
+          <w:color w:val="1B3325"/>
+          <w:sz w:val="26"/>
+        </w:rPr>
+        <w:t>La directriz de $20.000 por módulo es viable cuando el cliente compra uno. En 30 usuarios son $600.000 al mes, $254.297 por debajo de la licencia regional de Odoo y en el mismo orden que Bitrix24 Professional. El Drive suelto queda por encima de Zoho WorkDrive y de SharePoint, que son solo archivos.</w:t>
+      </w:r>
+    </w:p>
+    <w:p>
+      <w:pPr>
+        <w:spacing w:before="0" w:after="160" w:line="259" w:lineRule="auto"/>
+        <w:jc w:val="both"/>
+        <w:widowControl/>
+      </w:pPr>
+      <w:r>
+        <w:rPr>
+          <w:rFonts w:ascii="Poppins" w:hAnsi="Poppins" w:cs="Poppins" w:eastAsia="Poppins"/>
+          <w:b w:val="0"/>
+          <w:i w:val="0"/>
+          <w:color w:val="1B3325"/>
+          <w:sz w:val="26"/>
+        </w:rPr>
+        <w:t xml:space="preserve">Los tres módulos juntos, $60.000 por usuario y $1.800.000 al mes en 30 personas, quedan $945.703 por encima de la sola licencia de Odoo. Esa suite cobra una vez y trae </w:t>
+      </w:r>
+      <w:r>
+        <w:rPr>
+          <w:rFonts w:ascii="Poppins" w:hAnsi="Poppins" w:cs="Poppins" w:eastAsia="Poppins"/>
+          <w:b/>
+          <w:i w:val="0"/>
+          <w:color w:val="1B3325"/>
+          <w:sz w:val="26"/>
+        </w:rPr>
+        <w:t>CRM</w:t>
+      </w:r>
+      <w:r>
+        <w:rPr>
+          <w:rFonts w:ascii="Poppins" w:hAnsi="Poppins" w:cs="Poppins" w:eastAsia="Poppins"/>
+          <w:b w:val="0"/>
+          <w:i w:val="0"/>
+          <w:color w:val="1B3325"/>
+          <w:sz w:val="26"/>
+        </w:rPr>
+        <w:t xml:space="preserve">, personas y archivos. </w:t>
+      </w:r>
+      <w:r>
+        <w:rPr>
+          <w:rFonts w:ascii="Poppins" w:hAnsi="Poppins" w:cs="Poppins" w:eastAsia="Poppins"/>
+          <w:b/>
+          <w:i w:val="0"/>
+          <w:color w:val="1B3325"/>
+          <w:sz w:val="26"/>
+        </w:rPr>
+        <w:t>RecoTime</w:t>
+      </w:r>
+      <w:r>
+        <w:rPr>
+          <w:rFonts w:ascii="Poppins" w:hAnsi="Poppins" w:cs="Poppins" w:eastAsia="Poppins"/>
+          <w:b w:val="0"/>
+          <w:i w:val="0"/>
+          <w:color w:val="1B3325"/>
+          <w:sz w:val="26"/>
+        </w:rPr>
+        <w:t xml:space="preserve"> se defiende si el cliente valora la puesta en marcha incluida y puede empezar por un módulo. Si compara la factura de los tres contra Odoo o contra Bitrix24, el precio completo se ve alto.</w:t>
       </w:r>
     </w:p>
     <w:p>
@@ -19671,7 +21057,7 @@
           <w:color w:val="1B3325"/>
           <w:sz w:val="26"/>
         </w:rPr>
-        <w:t>Confirmar cómo se explica la cuota de 2 TB: es el techo del Drive, y el KVM 1 de Hostinger, cuya renovación anual queda en $466.800, trae 50 GB de disco. Ningún plan de esa lista llega a 2 TB.</w:t>
+        <w:t>Leer la sección 10.1 antes de usar la tabla con un cliente: un módulo a $20.000 es viable frente a Odoo y Bitrix24; los tres juntos quedan altos frente a una suite de una sola licencia; la cuota de 2 TB no cabe en el disco de 50 GB del KVM 1.</w:t>
       </w:r>
     </w:p>
     <w:p>

</xml_diff>

<commit_message>
Acoplar los precios de RecoTime al mercado y dejar la VPS a cargo del cliente.
Co-authored-by: Jhon123Javier <Jhon123Javier@users.noreply.github.com>
</commit_message>
<xml_diff>
--- a/documentos/recotime/Informe The Company Dev - Perfil RecoTime.docx
+++ b/documentos/recotime/Informe The Company Dev - Perfil RecoTime.docx
@@ -700,12 +700,42 @@
             <w:r>
               <w:rPr>
                 <w:rFonts w:ascii="Poppins" w:hAnsi="Poppins" w:cs="Poppins" w:eastAsia="Poppins"/>
-                <w:b w:val="0"/>
+                <w:b/>
                 <w:i w:val="0"/>
                 <w:color w:val="1B3325"/>
                 <w:sz w:val="20"/>
               </w:rPr>
-              <w:t>Cada módulo: $20.000 por usuario. Los tres juntos: $60.000.</w:t>
+              <w:t>CRM</w:t>
+            </w:r>
+            <w:r>
+              <w:rPr>
+                <w:rFonts w:ascii="Poppins" w:hAnsi="Poppins" w:cs="Poppins" w:eastAsia="Poppins"/>
+                <w:b w:val="0"/>
+                <w:i w:val="0"/>
+                <w:color w:val="1B3325"/>
+                <w:sz w:val="20"/>
+              </w:rPr>
+              <w:t xml:space="preserve"> y </w:t>
+            </w:r>
+            <w:r>
+              <w:rPr>
+                <w:rFonts w:ascii="Poppins" w:hAnsi="Poppins" w:cs="Poppins" w:eastAsia="Poppins"/>
+                <w:b/>
+                <w:i w:val="0"/>
+                <w:color w:val="1B3325"/>
+                <w:sz w:val="20"/>
+              </w:rPr>
+              <w:t>ERP</w:t>
+            </w:r>
+            <w:r>
+              <w:rPr>
+                <w:rFonts w:ascii="Poppins" w:hAnsi="Poppins" w:cs="Poppins" w:eastAsia="Poppins"/>
+                <w:b w:val="0"/>
+                <w:i w:val="0"/>
+                <w:color w:val="1B3325"/>
+                <w:sz w:val="20"/>
+              </w:rPr>
+              <w:t xml:space="preserve"> $15.000. Asistencia $8.000. Drive $10.000. Los tres: $33.000.</w:t>
             </w:r>
           </w:p>
         </w:tc>
@@ -732,7 +762,7 @@
           <w:color w:val="1B3325"/>
           <w:sz w:val="26"/>
         </w:rPr>
-        <w:t xml:space="preserve">La directriz es cobrar $20.000 por usuario activo al mes en cada módulo. Son tres: </w:t>
+        <w:t xml:space="preserve">La directriz de $20.000 por módulo dejaba los tres en $60.000 por usuario, por encima de una suite que cobra una sola licencia. El precio que este informe recomienda es $15.000 para </w:t>
       </w:r>
       <w:r>
         <w:rPr>
@@ -772,7 +802,47 @@
           <w:color w:val="1B3325"/>
           <w:sz w:val="26"/>
         </w:rPr>
-        <w:t xml:space="preserve"> de gestión, asistencia, y Drive. Un módulo, en 30 usuarios, son $600.000 al mes. Los tres juntos son $60.000 por usuario, $1.800.000 al mes. La sección 10 compara esa directriz con el mercado: un módulo cabe; los tres juntos quedan por encima de una suite que cobra una sola licencia. La VPS y el dominio los paga el cliente: la renovación del KVM 1 sale en $466.800 al año.</w:t>
+        <w:t xml:space="preserve">, $8.000 para asistencia y $10.000 para Drive. Los tres juntos son $33.000 por usuario, $990.000 al mes en 30 personas. La licencia de Odoo Standard en Colombia queda en $28.477 por usuario. </w:t>
+      </w:r>
+      <w:r>
+        <w:rPr>
+          <w:rFonts w:ascii="Poppins" w:hAnsi="Poppins" w:cs="Poppins" w:eastAsia="Poppins"/>
+          <w:b/>
+          <w:i w:val="0"/>
+          <w:color w:val="1B3325"/>
+          <w:sz w:val="26"/>
+        </w:rPr>
+        <w:t xml:space="preserve">La VPS la coloca el cliente. </w:t>
+      </w:r>
+      <w:r>
+        <w:rPr>
+          <w:rFonts w:ascii="Poppins" w:hAnsi="Poppins" w:cs="Poppins" w:eastAsia="Poppins"/>
+          <w:b w:val="0"/>
+          <w:i w:val="0"/>
+          <w:color w:val="1B3325"/>
+          <w:sz w:val="26"/>
+        </w:rPr>
+        <w:t xml:space="preserve">La contrata, la paga, entrega el acceso y la renueva. El dominio también lo coloca el cliente. La mensualidad de </w:t>
+      </w:r>
+      <w:r>
+        <w:rPr>
+          <w:rFonts w:ascii="Poppins" w:hAnsi="Poppins" w:cs="Poppins" w:eastAsia="Poppins"/>
+          <w:b/>
+          <w:i w:val="0"/>
+          <w:color w:val="1B3325"/>
+          <w:sz w:val="26"/>
+        </w:rPr>
+        <w:t>RecoTime</w:t>
+      </w:r>
+      <w:r>
+        <w:rPr>
+          <w:rFonts w:ascii="Poppins" w:hAnsi="Poppins" w:cs="Poppins" w:eastAsia="Poppins"/>
+          <w:b w:val="0"/>
+          <w:i w:val="0"/>
+          <w:color w:val="1B3325"/>
+          <w:sz w:val="26"/>
+        </w:rPr>
+        <w:t xml:space="preserve"> no incluye servidor. La renovación del KVM 1 de Hostinger sale en $466.800 al año y trae 50 GB de disco.</w:t>
       </w:r>
     </w:p>
     <w:p>
@@ -3612,7 +3682,7 @@
           <w:color w:val="1B3325"/>
           <w:sz w:val="26"/>
         </w:rPr>
-        <w:t>. La VPS y el dominio no se cotizan aquí: los contrata el cliente.</w:t>
+        <w:t>. La VPS y el dominio no se cotizan aquí: los coloca el cliente.</w:t>
       </w:r>
     </w:p>
     <w:p>
@@ -10112,7 +10182,27 @@
           <w:color w:val="1B3325"/>
           <w:sz w:val="22"/>
         </w:rPr>
-        <w:t>Renovación al año = renovación al mes × 12, cálculo de este informe. KVM 1 se renueva en $466.800 al año. Es la cifra que se acerca a los $500.000 al año que la operación usa como referencia de la VPS. La oferta del primer periodo, a $19.900 al mes, son $238.800 si se mantienen doce meses. Hostinger puede cambiar la campaña. El dominio no va en esta tabla: lo contrata el cliente, y el precio depende de la extensión.</w:t>
+        <w:t xml:space="preserve">Renovación al año = renovación al mes × 12, cálculo de este informe. KVM 1 se renueva en $466.800 al año. Es la cifra que se acerca a los $500.000 al año que la operación usa como referencia. La oferta del primer periodo, a $19.900 al mes, son $238.800 si se mantienen doce meses. Hostinger puede cambiar la campaña. Esta tabla es referencia: la VPS la coloca el cliente y no se factura dentro de </w:t>
+      </w:r>
+      <w:r>
+        <w:rPr>
+          <w:rFonts w:ascii="Poppins" w:hAnsi="Poppins" w:cs="Poppins" w:eastAsia="Poppins"/>
+          <w:b/>
+          <w:i w:val="0"/>
+          <w:color w:val="1B3325"/>
+          <w:sz w:val="22"/>
+        </w:rPr>
+        <w:t>RecoTime</w:t>
+      </w:r>
+      <w:r>
+        <w:rPr>
+          <w:rFonts w:ascii="Poppins" w:hAnsi="Poppins" w:cs="Poppins" w:eastAsia="Poppins"/>
+          <w:b w:val="0"/>
+          <w:i w:val="0"/>
+          <w:color w:val="1B3325"/>
+          <w:sz w:val="22"/>
+        </w:rPr>
+        <w:t>. El dominio tampoco va aquí.</w:t>
       </w:r>
     </w:p>
     <w:p>
@@ -10324,12 +10414,22 @@
             <w:r>
               <w:rPr>
                 <w:rFonts w:ascii="Poppins" w:hAnsi="Poppins" w:cs="Poppins" w:eastAsia="Poppins"/>
-                <w:b w:val="0"/>
+                <w:b/>
                 <w:i w:val="0"/>
                 <w:color w:val="1B3325"/>
                 <w:sz w:val="16"/>
               </w:rPr>
-              <w:t>Odoo Standard, tarifa Colombia</w:t>
+              <w:t>RecoTime</w:t>
+            </w:r>
+            <w:r>
+              <w:rPr>
+                <w:rFonts w:ascii="Poppins" w:hAnsi="Poppins" w:cs="Poppins" w:eastAsia="Poppins"/>
+                <w:b w:val="0"/>
+                <w:i w:val="0"/>
+                <w:color w:val="1B3325"/>
+                <w:sz w:val="16"/>
+              </w:rPr>
+              <w:t>, los tres módulos</w:t>
             </w:r>
           </w:p>
         </w:tc>
@@ -10366,7 +10466,7 @@
                 <w:color w:val="1B3325"/>
                 <w:sz w:val="16"/>
               </w:rPr>
-              <w:t>$854.297</w:t>
+              <w:t>$990.000</w:t>
             </w:r>
           </w:p>
         </w:tc>
@@ -10403,7 +10503,7 @@
                 <w:color w:val="1B3325"/>
                 <w:sz w:val="16"/>
               </w:rPr>
-              <w:t>30 usuarios a US$ 8,95. Todas las apps. Implementación aparte.</w:t>
+              <w:t>30 × $33.000. Puesta en marcha incluida. La VPS la coloca el cliente.</w:t>
             </w:r>
           </w:p>
         </w:tc>
@@ -10440,12 +10540,52 @@
             <w:r>
               <w:rPr>
                 <w:rFonts w:ascii="Poppins" w:hAnsi="Poppins" w:cs="Poppins" w:eastAsia="Poppins"/>
-                <w:b w:val="0"/>
+                <w:b/>
                 <w:i w:val="0"/>
                 <w:color w:val="1B3325"/>
                 <w:sz w:val="16"/>
               </w:rPr>
-              <w:t>Odoo Personalizado, primer año Colombia</w:t>
+              <w:t>RecoTime</w:t>
+            </w:r>
+            <w:r>
+              <w:rPr>
+                <w:rFonts w:ascii="Poppins" w:hAnsi="Poppins" w:cs="Poppins" w:eastAsia="Poppins"/>
+                <w:b w:val="0"/>
+                <w:i w:val="0"/>
+                <w:color w:val="1B3325"/>
+                <w:sz w:val="16"/>
+              </w:rPr>
+              <w:t xml:space="preserve">, solo </w:t>
+            </w:r>
+            <w:r>
+              <w:rPr>
+                <w:rFonts w:ascii="Poppins" w:hAnsi="Poppins" w:cs="Poppins" w:eastAsia="Poppins"/>
+                <w:b/>
+                <w:i w:val="0"/>
+                <w:color w:val="1B3325"/>
+                <w:sz w:val="16"/>
+              </w:rPr>
+              <w:t>CRM</w:t>
+            </w:r>
+            <w:r>
+              <w:rPr>
+                <w:rFonts w:ascii="Poppins" w:hAnsi="Poppins" w:cs="Poppins" w:eastAsia="Poppins"/>
+                <w:b w:val="0"/>
+                <w:i w:val="0"/>
+                <w:color w:val="1B3325"/>
+                <w:sz w:val="16"/>
+              </w:rPr>
+              <w:t xml:space="preserve"> y </w:t>
+            </w:r>
+            <w:r>
+              <w:rPr>
+                <w:rFonts w:ascii="Poppins" w:hAnsi="Poppins" w:cs="Poppins" w:eastAsia="Poppins"/>
+                <w:b/>
+                <w:i w:val="0"/>
+                <w:color w:val="1B3325"/>
+                <w:sz w:val="16"/>
+              </w:rPr>
+              <w:t>ERP</w:t>
             </w:r>
           </w:p>
         </w:tc>
@@ -10482,7 +10622,7 @@
                 <w:color w:val="1B3325"/>
                 <w:sz w:val="16"/>
               </w:rPr>
-              <w:t>$1.279.059</w:t>
+              <w:t>$450.000</w:t>
             </w:r>
           </w:p>
         </w:tc>
@@ -10519,7 +10659,7 @@
                 <w:color w:val="1B3325"/>
                 <w:sz w:val="16"/>
               </w:rPr>
-              <w:t>30 usuarios a US$ 13,40. Studio, API y multiempresa.</w:t>
+              <w:t>30 × $15.000. Asistencia y Drive se suman si el cliente los toma.</w:t>
             </w:r>
           </w:p>
         </w:tc>
@@ -10561,7 +10701,7 @@
                 <w:color w:val="1B3325"/>
                 <w:sz w:val="16"/>
               </w:rPr>
-              <w:t>Odoo Standard, lista de EE. UU. al renovar</w:t>
+              <w:t>Odoo Standard, tarifa Colombia</w:t>
             </w:r>
           </w:p>
         </w:tc>
@@ -10598,7 +10738,7 @@
                 <w:color w:val="1B3325"/>
                 <w:sz w:val="16"/>
               </w:rPr>
-              <w:t>$2.968.563</w:t>
+              <w:t>$854.297</w:t>
             </w:r>
           </w:p>
         </w:tc>
@@ -10635,7 +10775,7 @@
                 <w:color w:val="1B3325"/>
                 <w:sz w:val="16"/>
               </w:rPr>
-              <w:t>La misma suscripción si el precio que aplica es el de Estados Unidos.</w:t>
+              <w:t>30 usuarios a US$ 8,95. Todas las apps. Implementación aparte.</w:t>
             </w:r>
           </w:p>
         </w:tc>
@@ -10677,7 +10817,7 @@
                 <w:color w:val="1B3325"/>
                 <w:sz w:val="16"/>
               </w:rPr>
-              <w:t>Bitrix24 Standard, pago anual</w:t>
+              <w:t>Odoo Personalizado, primer año Colombia</w:t>
             </w:r>
           </w:p>
         </w:tc>
@@ -10714,7 +10854,7 @@
                 <w:color w:val="1B3325"/>
                 <w:sz w:val="16"/>
               </w:rPr>
-              <w:t>$314.992</w:t>
+              <w:t>$1.279.059</w:t>
             </w:r>
           </w:p>
         </w:tc>
@@ -10751,27 +10891,7 @@
                 <w:color w:val="1B3325"/>
                 <w:sz w:val="16"/>
               </w:rPr>
-              <w:t xml:space="preserve">Tope de 50 usuarios. </w:t>
-            </w:r>
-            <w:r>
-              <w:rPr>
-                <w:rFonts w:ascii="Poppins" w:hAnsi="Poppins" w:cs="Poppins" w:eastAsia="Poppins"/>
-                <w:b/>
-                <w:i w:val="0"/>
-                <w:color w:val="1B3325"/>
-                <w:sz w:val="16"/>
-              </w:rPr>
-              <w:t>CRM</w:t>
-            </w:r>
-            <w:r>
-              <w:rPr>
-                <w:rFonts w:ascii="Poppins" w:hAnsi="Poppins" w:cs="Poppins" w:eastAsia="Poppins"/>
-                <w:b w:val="0"/>
-                <w:i w:val="0"/>
-                <w:color w:val="1B3325"/>
-                <w:sz w:val="16"/>
-              </w:rPr>
-              <w:t xml:space="preserve"> y tareas. Sin las horas de empleado de Professional.</w:t>
+              <w:t>30 usuarios a US$ 13,40. Studio, API y multiempresa.</w:t>
             </w:r>
           </w:p>
         </w:tc>
@@ -10813,7 +10933,7 @@
                 <w:color w:val="1B3325"/>
                 <w:sz w:val="16"/>
               </w:rPr>
-              <w:t>Bitrix24 Professional, pago anual</w:t>
+              <w:t>Odoo Standard, lista de EE. UU. al renovar</w:t>
             </w:r>
           </w:p>
         </w:tc>
@@ -10850,7 +10970,7 @@
                 <w:color w:val="1B3325"/>
                 <w:sz w:val="16"/>
               </w:rPr>
-              <w:t>$633.166</w:t>
+              <w:t>$2.968.563</w:t>
             </w:r>
           </w:p>
         </w:tc>
@@ -10887,7 +11007,7 @@
                 <w:color w:val="1B3325"/>
                 <w:sz w:val="16"/>
               </w:rPr>
-              <w:t>Tope de 100 usuarios. Incluye RR. HH. y horas del empleado. El partner va aparte.</w:t>
+              <w:t>La misma suscripción si el precio que aplica es el de Estados Unidos.</w:t>
             </w:r>
           </w:p>
         </w:tc>
@@ -10929,27 +11049,7 @@
                 <w:color w:val="1B3325"/>
                 <w:sz w:val="16"/>
               </w:rPr>
-              <w:t xml:space="preserve">Zoho </w:t>
-            </w:r>
-            <w:r>
-              <w:rPr>
-                <w:rFonts w:ascii="Poppins" w:hAnsi="Poppins" w:cs="Poppins" w:eastAsia="Poppins"/>
-                <w:b/>
-                <w:i w:val="0"/>
-                <w:color w:val="1B3325"/>
-                <w:sz w:val="16"/>
-              </w:rPr>
-              <w:t>CRM</w:t>
-            </w:r>
-            <w:r>
-              <w:rPr>
-                <w:rFonts w:ascii="Poppins" w:hAnsi="Poppins" w:cs="Poppins" w:eastAsia="Poppins"/>
-                <w:b w:val="0"/>
-                <w:i w:val="0"/>
-                <w:color w:val="1B3325"/>
-                <w:sz w:val="16"/>
-              </w:rPr>
-              <w:t xml:space="preserve"> y People, lectura 2026</w:t>
+              <w:t>Bitrix24 Standard, pago anual</w:t>
             </w:r>
           </w:p>
         </w:tc>
@@ -10986,7 +11086,7 @@
                 <w:color w:val="1B3325"/>
                 <w:sz w:val="16"/>
               </w:rPr>
-              <w:t>$652.257</w:t>
+              <w:t>$314.992</w:t>
             </w:r>
           </w:p>
         </w:tc>
@@ -11023,7 +11123,7 @@
                 <w:color w:val="1B3325"/>
                 <w:sz w:val="16"/>
               </w:rPr>
-              <w:t xml:space="preserve">5 asientos de </w:t>
+              <w:t xml:space="preserve">Tope de 50 usuarios. </w:t>
             </w:r>
             <w:r>
               <w:rPr>
@@ -11043,7 +11143,7 @@
                 <w:color w:val="1B3325"/>
                 <w:sz w:val="16"/>
               </w:rPr>
-              <w:t xml:space="preserve"> Professional y 30 de People Essential. Dos productos.</w:t>
+              <w:t xml:space="preserve"> y tareas. Sin las horas de empleado de Professional.</w:t>
             </w:r>
           </w:p>
         </w:tc>
@@ -11085,7 +11185,7 @@
                 <w:color w:val="1B3325"/>
                 <w:sz w:val="16"/>
               </w:rPr>
-              <w:t>Factorial, punto de partida</w:t>
+              <w:t>Bitrix24 Professional, pago anual</w:t>
             </w:r>
           </w:p>
         </w:tc>
@@ -11122,7 +11222,7 @@
                 <w:color w:val="1B3325"/>
                 <w:sz w:val="16"/>
               </w:rPr>
-              <w:t>$763.618</w:t>
+              <w:t>$633.166</w:t>
             </w:r>
           </w:p>
         </w:tc>
@@ -11159,7 +11259,7 @@
                 <w:color w:val="1B3325"/>
                 <w:sz w:val="16"/>
               </w:rPr>
-              <w:t>30 × US$ 8. El módulo de tiempo se cotiza encima.</w:t>
+              <w:t>Tope de 100 usuarios. Incluye RR. HH. y horas del empleado. El partner va aparte.</w:t>
             </w:r>
           </w:p>
         </w:tc>
@@ -11201,7 +11301,27 @@
                 <w:color w:val="1B3325"/>
                 <w:sz w:val="16"/>
               </w:rPr>
-              <w:t>Business Central Essentials</w:t>
+              <w:t xml:space="preserve">Zoho </w:t>
+            </w:r>
+            <w:r>
+              <w:rPr>
+                <w:rFonts w:ascii="Poppins" w:hAnsi="Poppins" w:cs="Poppins" w:eastAsia="Poppins"/>
+                <w:b/>
+                <w:i w:val="0"/>
+                <w:color w:val="1B3325"/>
+                <w:sz w:val="16"/>
+              </w:rPr>
+              <w:t>CRM</w:t>
+            </w:r>
+            <w:r>
+              <w:rPr>
+                <w:rFonts w:ascii="Poppins" w:hAnsi="Poppins" w:cs="Poppins" w:eastAsia="Poppins"/>
+                <w:b w:val="0"/>
+                <w:i w:val="0"/>
+                <w:color w:val="1B3325"/>
+                <w:sz w:val="16"/>
+              </w:rPr>
+              <w:t xml:space="preserve"> y People, lectura 2026</w:t>
             </w:r>
           </w:p>
         </w:tc>
@@ -11238,7 +11358,7 @@
                 <w:color w:val="1B3325"/>
                 <w:sz w:val="16"/>
               </w:rPr>
-              <w:t>$7.636.176</w:t>
+              <w:t>$652.257</w:t>
             </w:r>
           </w:p>
         </w:tc>
@@ -11275,7 +11395,7 @@
                 <w:color w:val="1B3325"/>
                 <w:sz w:val="16"/>
               </w:rPr>
-              <w:t xml:space="preserve">30 × US$ 80. </w:t>
+              <w:t xml:space="preserve">5 asientos de </w:t>
             </w:r>
             <w:r>
               <w:rPr>
@@ -11285,7 +11405,7 @@
                 <w:color w:val="1B3325"/>
                 <w:sz w:val="16"/>
               </w:rPr>
-              <w:t>ERP</w:t>
+              <w:t>CRM</w:t>
             </w:r>
             <w:r>
               <w:rPr>
@@ -11295,7 +11415,7 @@
                 <w:color w:val="1B3325"/>
                 <w:sz w:val="16"/>
               </w:rPr>
-              <w:t xml:space="preserve"> de finanzas y operación. Partner aparte.</w:t>
+              <w:t xml:space="preserve"> Professional y 30 de People Essential. Dos productos.</w:t>
             </w:r>
           </w:p>
         </w:tc>
@@ -11337,7 +11457,7 @@
                 <w:color w:val="1B3325"/>
                 <w:sz w:val="16"/>
               </w:rPr>
-              <w:t>Alegra Nómina, 11 a 20 empleados</w:t>
+              <w:t>Factorial, punto de partida</w:t>
             </w:r>
           </w:p>
         </w:tc>
@@ -11374,7 +11494,7 @@
                 <w:color w:val="1B3325"/>
                 <w:sz w:val="16"/>
               </w:rPr>
-              <w:t>$69.000</w:t>
+              <w:t>$763.618</w:t>
             </w:r>
           </w:p>
         </w:tc>
@@ -11411,6 +11531,258 @@
                 <w:color w:val="1B3325"/>
                 <w:sz w:val="16"/>
               </w:rPr>
+              <w:t>30 × US$ 8. El módulo de tiempo se cotiza encima.</w:t>
+            </w:r>
+          </w:p>
+        </w:tc>
+      </w:tr>
+      <w:tr>
+        <w:trPr>
+          <w:cantSplit/>
+        </w:trPr>
+        <w:tc>
+          <w:tcPr>
+            <w:tcW w:type="dxa" w:w="2800"/>
+            <w:tcBorders>
+              <w:top w:val="single" w:sz="4" w:space="0" w:color="1B3325"/>
+              <w:left w:val="single" w:sz="4" w:space="0" w:color="1B3325"/>
+              <w:bottom w:val="single" w:sz="4" w:space="0" w:color="1B3325"/>
+              <w:right w:val="single" w:sz="4" w:space="0" w:color="1B3325"/>
+            </w:tcBorders>
+            <w:tcMar>
+              <w:top w:w="40" w:type="dxa"/>
+              <w:left w:w="80" w:type="dxa"/>
+              <w:bottom w:w="40" w:type="dxa"/>
+              <w:right w:w="80" w:type="dxa"/>
+            </w:tcMar>
+            <w:shd w:val="clear" w:color="auto" w:fill="F7FBF8"/>
+            <w:vAlign w:val="center"/>
+          </w:tcPr>
+          <w:p>
+            <w:pPr>
+              <w:spacing w:before="0" w:after="0" w:line="259" w:lineRule="auto"/>
+              <w:jc w:val="left"/>
+              <w:widowControl/>
+            </w:pPr>
+            <w:r/>
+            <w:r>
+              <w:rPr>
+                <w:rFonts w:ascii="Poppins" w:hAnsi="Poppins" w:cs="Poppins" w:eastAsia="Poppins"/>
+                <w:b w:val="0"/>
+                <w:i w:val="0"/>
+                <w:color w:val="1B3325"/>
+                <w:sz w:val="16"/>
+              </w:rPr>
+              <w:t>Business Central Essentials</w:t>
+            </w:r>
+          </w:p>
+        </w:tc>
+        <w:tc>
+          <w:tcPr>
+            <w:tcW w:type="dxa" w:w="1900"/>
+            <w:tcBorders>
+              <w:top w:val="single" w:sz="4" w:space="0" w:color="1B3325"/>
+              <w:left w:val="single" w:sz="4" w:space="0" w:color="1B3325"/>
+              <w:bottom w:val="single" w:sz="4" w:space="0" w:color="1B3325"/>
+              <w:right w:val="single" w:sz="4" w:space="0" w:color="1B3325"/>
+            </w:tcBorders>
+            <w:tcMar>
+              <w:top w:w="40" w:type="dxa"/>
+              <w:left w:w="80" w:type="dxa"/>
+              <w:bottom w:w="40" w:type="dxa"/>
+              <w:right w:w="80" w:type="dxa"/>
+            </w:tcMar>
+            <w:shd w:val="clear" w:color="auto" w:fill="F7FBF8"/>
+            <w:vAlign w:val="center"/>
+          </w:tcPr>
+          <w:p>
+            <w:pPr>
+              <w:spacing w:before="0" w:after="0" w:line="259" w:lineRule="auto"/>
+              <w:jc w:val="center"/>
+              <w:widowControl/>
+            </w:pPr>
+            <w:r/>
+            <w:r>
+              <w:rPr>
+                <w:rFonts w:ascii="Poppins" w:hAnsi="Poppins" w:cs="Poppins" w:eastAsia="Poppins"/>
+                <w:b w:val="0"/>
+                <w:i w:val="0"/>
+                <w:color w:val="1B3325"/>
+                <w:sz w:val="16"/>
+              </w:rPr>
+              <w:t>$7.636.176</w:t>
+            </w:r>
+          </w:p>
+        </w:tc>
+        <w:tc>
+          <w:tcPr>
+            <w:tcW w:type="dxa" w:w="4900"/>
+            <w:tcBorders>
+              <w:top w:val="single" w:sz="4" w:space="0" w:color="1B3325"/>
+              <w:left w:val="single" w:sz="4" w:space="0" w:color="1B3325"/>
+              <w:bottom w:val="single" w:sz="4" w:space="0" w:color="1B3325"/>
+              <w:right w:val="single" w:sz="4" w:space="0" w:color="1B3325"/>
+            </w:tcBorders>
+            <w:tcMar>
+              <w:top w:w="40" w:type="dxa"/>
+              <w:left w:w="80" w:type="dxa"/>
+              <w:bottom w:w="40" w:type="dxa"/>
+              <w:right w:w="80" w:type="dxa"/>
+            </w:tcMar>
+            <w:shd w:val="clear" w:color="auto" w:fill="F7FBF8"/>
+            <w:vAlign w:val="center"/>
+          </w:tcPr>
+          <w:p>
+            <w:pPr>
+              <w:spacing w:before="0" w:after="0" w:line="259" w:lineRule="auto"/>
+              <w:jc w:val="left"/>
+              <w:widowControl/>
+            </w:pPr>
+            <w:r/>
+            <w:r>
+              <w:rPr>
+                <w:rFonts w:ascii="Poppins" w:hAnsi="Poppins" w:cs="Poppins" w:eastAsia="Poppins"/>
+                <w:b w:val="0"/>
+                <w:i w:val="0"/>
+                <w:color w:val="1B3325"/>
+                <w:sz w:val="16"/>
+              </w:rPr>
+              <w:t xml:space="preserve">30 × US$ 80. </w:t>
+            </w:r>
+            <w:r>
+              <w:rPr>
+                <w:rFonts w:ascii="Poppins" w:hAnsi="Poppins" w:cs="Poppins" w:eastAsia="Poppins"/>
+                <w:b/>
+                <w:i w:val="0"/>
+                <w:color w:val="1B3325"/>
+                <w:sz w:val="16"/>
+              </w:rPr>
+              <w:t>ERP</w:t>
+            </w:r>
+            <w:r>
+              <w:rPr>
+                <w:rFonts w:ascii="Poppins" w:hAnsi="Poppins" w:cs="Poppins" w:eastAsia="Poppins"/>
+                <w:b w:val="0"/>
+                <w:i w:val="0"/>
+                <w:color w:val="1B3325"/>
+                <w:sz w:val="16"/>
+              </w:rPr>
+              <w:t xml:space="preserve"> de finanzas y operación. Partner aparte.</w:t>
+            </w:r>
+          </w:p>
+        </w:tc>
+      </w:tr>
+      <w:tr>
+        <w:trPr>
+          <w:cantSplit/>
+        </w:trPr>
+        <w:tc>
+          <w:tcPr>
+            <w:tcW w:type="dxa" w:w="2800"/>
+            <w:tcBorders>
+              <w:top w:val="single" w:sz="4" w:space="0" w:color="1B3325"/>
+              <w:left w:val="single" w:sz="4" w:space="0" w:color="1B3325"/>
+              <w:bottom w:val="single" w:sz="4" w:space="0" w:color="1B3325"/>
+              <w:right w:val="single" w:sz="4" w:space="0" w:color="1B3325"/>
+            </w:tcBorders>
+            <w:tcMar>
+              <w:top w:w="40" w:type="dxa"/>
+              <w:left w:w="80" w:type="dxa"/>
+              <w:bottom w:w="40" w:type="dxa"/>
+              <w:right w:w="80" w:type="dxa"/>
+            </w:tcMar>
+            <w:shd w:val="clear" w:color="auto" w:fill="FFFFFF"/>
+            <w:vAlign w:val="center"/>
+          </w:tcPr>
+          <w:p>
+            <w:pPr>
+              <w:spacing w:before="0" w:after="0" w:line="259" w:lineRule="auto"/>
+              <w:jc w:val="left"/>
+              <w:widowControl/>
+            </w:pPr>
+            <w:r/>
+            <w:r>
+              <w:rPr>
+                <w:rFonts w:ascii="Poppins" w:hAnsi="Poppins" w:cs="Poppins" w:eastAsia="Poppins"/>
+                <w:b w:val="0"/>
+                <w:i w:val="0"/>
+                <w:color w:val="1B3325"/>
+                <w:sz w:val="16"/>
+              </w:rPr>
+              <w:t>Alegra Nómina, 11 a 20 empleados</w:t>
+            </w:r>
+          </w:p>
+        </w:tc>
+        <w:tc>
+          <w:tcPr>
+            <w:tcW w:type="dxa" w:w="1900"/>
+            <w:tcBorders>
+              <w:top w:val="single" w:sz="4" w:space="0" w:color="1B3325"/>
+              <w:left w:val="single" w:sz="4" w:space="0" w:color="1B3325"/>
+              <w:bottom w:val="single" w:sz="4" w:space="0" w:color="1B3325"/>
+              <w:right w:val="single" w:sz="4" w:space="0" w:color="1B3325"/>
+            </w:tcBorders>
+            <w:tcMar>
+              <w:top w:w="40" w:type="dxa"/>
+              <w:left w:w="80" w:type="dxa"/>
+              <w:bottom w:w="40" w:type="dxa"/>
+              <w:right w:w="80" w:type="dxa"/>
+            </w:tcMar>
+            <w:shd w:val="clear" w:color="auto" w:fill="FFFFFF"/>
+            <w:vAlign w:val="center"/>
+          </w:tcPr>
+          <w:p>
+            <w:pPr>
+              <w:spacing w:before="0" w:after="0" w:line="259" w:lineRule="auto"/>
+              <w:jc w:val="center"/>
+              <w:widowControl/>
+            </w:pPr>
+            <w:r/>
+            <w:r>
+              <w:rPr>
+                <w:rFonts w:ascii="Poppins" w:hAnsi="Poppins" w:cs="Poppins" w:eastAsia="Poppins"/>
+                <w:b w:val="0"/>
+                <w:i w:val="0"/>
+                <w:color w:val="1B3325"/>
+                <w:sz w:val="16"/>
+              </w:rPr>
+              <w:t>$69.000</w:t>
+            </w:r>
+          </w:p>
+        </w:tc>
+        <w:tc>
+          <w:tcPr>
+            <w:tcW w:type="dxa" w:w="4900"/>
+            <w:tcBorders>
+              <w:top w:val="single" w:sz="4" w:space="0" w:color="1B3325"/>
+              <w:left w:val="single" w:sz="4" w:space="0" w:color="1B3325"/>
+              <w:bottom w:val="single" w:sz="4" w:space="0" w:color="1B3325"/>
+              <w:right w:val="single" w:sz="4" w:space="0" w:color="1B3325"/>
+            </w:tcBorders>
+            <w:tcMar>
+              <w:top w:w="40" w:type="dxa"/>
+              <w:left w:w="80" w:type="dxa"/>
+              <w:bottom w:w="40" w:type="dxa"/>
+              <w:right w:w="80" w:type="dxa"/>
+            </w:tcMar>
+            <w:shd w:val="clear" w:color="auto" w:fill="FFFFFF"/>
+            <w:vAlign w:val="center"/>
+          </w:tcPr>
+          <w:p>
+            <w:pPr>
+              <w:spacing w:before="0" w:after="0" w:line="259" w:lineRule="auto"/>
+              <w:jc w:val="left"/>
+              <w:widowControl/>
+            </w:pPr>
+            <w:r/>
+            <w:r>
+              <w:rPr>
+                <w:rFonts w:ascii="Poppins" w:hAnsi="Poppins" w:cs="Poppins" w:eastAsia="Poppins"/>
+                <w:b w:val="0"/>
+                <w:i w:val="0"/>
+                <w:color w:val="1B3325"/>
+                <w:sz w:val="16"/>
+              </w:rPr>
               <w:t>Nómina electrónica y liquidación. Otro problema, otro sistema.</w:t>
             </w:r>
           </w:p>
@@ -11439,7 +11811,7 @@
           <w:color w:val="1B3325"/>
           <w:sz w:val="26"/>
         </w:rPr>
-        <w:t>10.1. Viabilidad de los $20.000 por módulo</w:t>
+        <w:t>10.1. Precio acoplado al mercado</w:t>
       </w:r>
     </w:p>
     <w:p>
@@ -11456,47 +11828,7 @@
           <w:color w:val="1B3325"/>
           <w:sz w:val="26"/>
         </w:rPr>
-        <w:t xml:space="preserve">Esta tabla pone la directriz comercial al lado del mercado de la sección 9. Los pesos de las referencias en dólares son cálculo de este informe con la TRM de $3.181,74. «Viable» significa que el valor de </w:t>
-      </w:r>
-      <w:r>
-        <w:rPr>
-          <w:rFonts w:ascii="Poppins" w:hAnsi="Poppins" w:cs="Poppins" w:eastAsia="Poppins"/>
-          <w:b/>
-          <w:i w:val="0"/>
-          <w:color w:val="1B3325"/>
-          <w:sz w:val="26"/>
-        </w:rPr>
-        <w:t>RecoTime</w:t>
-      </w:r>
-      <w:r>
-        <w:rPr>
-          <w:rFonts w:ascii="Poppins" w:hAnsi="Poppins" w:cs="Poppins" w:eastAsia="Poppins"/>
-          <w:b w:val="0"/>
-          <w:i w:val="0"/>
-          <w:color w:val="1B3325"/>
-          <w:sz w:val="26"/>
-        </w:rPr>
-        <w:t xml:space="preserve"> cabe en el orden de esa referencia. «Apretado» significa que el mercado publica algo más bajo para un producto más estrecho. «Alto» significa que la factura de </w:t>
-      </w:r>
-      <w:r>
-        <w:rPr>
-          <w:rFonts w:ascii="Poppins" w:hAnsi="Poppins" w:cs="Poppins" w:eastAsia="Poppins"/>
-          <w:b/>
-          <w:i w:val="0"/>
-          <w:color w:val="1B3325"/>
-          <w:sz w:val="26"/>
-        </w:rPr>
-        <w:t>RecoTime</w:t>
-      </w:r>
-      <w:r>
-        <w:rPr>
-          <w:rFonts w:ascii="Poppins" w:hAnsi="Poppins" w:cs="Poppins" w:eastAsia="Poppins"/>
-          <w:b w:val="0"/>
-          <w:i w:val="0"/>
-          <w:color w:val="1B3325"/>
-          <w:sz w:val="26"/>
-        </w:rPr>
-        <w:t xml:space="preserve"> supera a una suite que cobra una sola vez.</w:t>
+        <w:t>La directriz de $20.000 por módulo sumaba $60.000 por usuario. Para 30 personas eso eran $1.800.000 al mes, por encima de la licencia de Odoo Standard en Colombia. El ajuste deja cada módulo en el orden de su propia referencia y los tres juntos entre las dos licencias de Odoo. Los pesos de las referencias en dólares son cálculo de este informe con la TRM de $3.181,74. La puesta en marcha va incluida en estos valores. La VPS no va: la coloca el cliente.</w:t>
       </w:r>
     </w:p>
     <w:tbl>
@@ -11507,16 +11839,92 @@
         <w:tblLook w:firstColumn="1" w:firstRow="1" w:lastColumn="0" w:lastRow="0" w:noHBand="0" w:noVBand="1" w:val="04A0"/>
       </w:tblPr>
       <w:tblGrid>
+        <w:gridCol w:w="2100"/>
+        <w:gridCol w:w="2800"/>
         <w:gridCol w:w="2500"/>
-        <w:gridCol w:w="2400"/>
-        <w:gridCol w:w="2400"/>
-        <w:gridCol w:w="2300"/>
+        <w:gridCol w:w="2200"/>
       </w:tblGrid>
       <w:tr>
         <w:trPr>
           <w:tblHeader/>
           <w:cantSplit/>
         </w:trPr>
+        <w:tc>
+          <w:tcPr>
+            <w:tcW w:type="dxa" w:w="2100"/>
+            <w:tcBorders>
+              <w:top w:val="single" w:sz="4" w:space="0" w:color="1B3325"/>
+              <w:left w:val="single" w:sz="4" w:space="0" w:color="1B3325"/>
+              <w:bottom w:val="single" w:sz="4" w:space="0" w:color="1B3325"/>
+              <w:right w:val="single" w:sz="4" w:space="0" w:color="1B3325"/>
+            </w:tcBorders>
+            <w:tcMar>
+              <w:top w:w="40" w:type="dxa"/>
+              <w:left w:w="80" w:type="dxa"/>
+              <w:bottom w:w="40" w:type="dxa"/>
+              <w:right w:w="80" w:type="dxa"/>
+            </w:tcMar>
+            <w:shd w:val="clear" w:color="auto" w:fill="1B3325"/>
+            <w:vAlign w:val="center"/>
+          </w:tcPr>
+          <w:p>
+            <w:pPr>
+              <w:spacing w:before="0" w:after="0" w:line="259" w:lineRule="auto"/>
+              <w:jc w:val="center"/>
+              <w:widowControl/>
+              <w:keepNext/>
+            </w:pPr>
+            <w:r/>
+            <w:r>
+              <w:rPr>
+                <w:rFonts w:ascii="Poppins" w:hAnsi="Poppins" w:cs="Poppins" w:eastAsia="Poppins"/>
+                <w:b/>
+                <w:i w:val="0"/>
+                <w:color w:val="FFFFFF"/>
+                <w:sz w:val="16"/>
+              </w:rPr>
+              <w:t>Pieza</w:t>
+            </w:r>
+          </w:p>
+        </w:tc>
+        <w:tc>
+          <w:tcPr>
+            <w:tcW w:type="dxa" w:w="2800"/>
+            <w:tcBorders>
+              <w:top w:val="single" w:sz="4" w:space="0" w:color="1B3325"/>
+              <w:left w:val="single" w:sz="4" w:space="0" w:color="1B3325"/>
+              <w:bottom w:val="single" w:sz="4" w:space="0" w:color="1B3325"/>
+              <w:right w:val="single" w:sz="4" w:space="0" w:color="1B3325"/>
+            </w:tcBorders>
+            <w:tcMar>
+              <w:top w:w="40" w:type="dxa"/>
+              <w:left w:w="80" w:type="dxa"/>
+              <w:bottom w:w="40" w:type="dxa"/>
+              <w:right w:w="80" w:type="dxa"/>
+            </w:tcMar>
+            <w:shd w:val="clear" w:color="auto" w:fill="1B3325"/>
+            <w:vAlign w:val="center"/>
+          </w:tcPr>
+          <w:p>
+            <w:pPr>
+              <w:spacing w:before="0" w:after="0" w:line="259" w:lineRule="auto"/>
+              <w:jc w:val="center"/>
+              <w:widowControl/>
+              <w:keepNext/>
+            </w:pPr>
+            <w:r/>
+            <w:r>
+              <w:rPr>
+                <w:rFonts w:ascii="Poppins" w:hAnsi="Poppins" w:cs="Poppins" w:eastAsia="Poppins"/>
+                <w:b/>
+                <w:i w:val="0"/>
+                <w:color w:val="FFFFFF"/>
+                <w:sz w:val="16"/>
+              </w:rPr>
+              <w:t>Referencia de mercado</w:t>
+            </w:r>
+          </w:p>
+        </w:tc>
         <w:tc>
           <w:tcPr>
             <w:tcW w:type="dxa" w:w="2500"/>
@@ -11551,13 +11959,13 @@
                 <w:color w:val="FFFFFF"/>
                 <w:sz w:val="16"/>
               </w:rPr>
-              <w:t>Comparación</w:t>
+              <w:t>RecoTime</w:t>
             </w:r>
           </w:p>
         </w:tc>
         <w:tc>
           <w:tcPr>
-            <w:tcW w:type="dxa" w:w="2400"/>
+            <w:tcW w:type="dxa" w:w="2200"/>
             <w:tcBorders>
               <w:top w:val="single" w:sz="4" w:space="0" w:color="1B3325"/>
               <w:left w:val="single" w:sz="4" w:space="0" w:color="1B3325"/>
@@ -11589,13 +11997,18 @@
                 <w:color w:val="FFFFFF"/>
                 <w:sz w:val="16"/>
               </w:rPr>
-              <w:t>Mercado</w:t>
+              <w:t>Lectura</w:t>
             </w:r>
           </w:p>
         </w:tc>
+      </w:tr>
+      <w:tr>
+        <w:trPr>
+          <w:cantSplit/>
+        </w:trPr>
         <w:tc>
           <w:tcPr>
-            <w:tcW w:type="dxa" w:w="2400"/>
+            <w:tcW w:type="dxa" w:w="2100"/>
             <w:tcBorders>
               <w:top w:val="single" w:sz="4" w:space="0" w:color="1B3325"/>
               <w:left w:val="single" w:sz="4" w:space="0" w:color="1B3325"/>
@@ -11608,13 +12021,13 @@
               <w:bottom w:w="40" w:type="dxa"/>
               <w:right w:w="80" w:type="dxa"/>
             </w:tcMar>
-            <w:shd w:val="clear" w:color="auto" w:fill="1B3325"/>
+            <w:shd w:val="clear" w:color="auto" w:fill="FFFFFF"/>
             <w:vAlign w:val="center"/>
           </w:tcPr>
           <w:p>
             <w:pPr>
               <w:spacing w:before="0" w:after="0" w:line="259" w:lineRule="auto"/>
-              <w:jc w:val="center"/>
+              <w:jc w:val="left"/>
               <w:widowControl/>
               <w:keepNext/>
             </w:pPr>
@@ -11624,16 +12037,46 @@
                 <w:rFonts w:ascii="Poppins" w:hAnsi="Poppins" w:cs="Poppins" w:eastAsia="Poppins"/>
                 <w:b/>
                 <w:i w:val="0"/>
-                <w:color w:val="FFFFFF"/>
+                <w:color w:val="1B3325"/>
                 <w:sz w:val="16"/>
               </w:rPr>
-              <w:t>RecoTime</w:t>
+              <w:t>CRM</w:t>
+            </w:r>
+            <w:r>
+              <w:rPr>
+                <w:rFonts w:ascii="Poppins" w:hAnsi="Poppins" w:cs="Poppins" w:eastAsia="Poppins"/>
+                <w:b w:val="0"/>
+                <w:i w:val="0"/>
+                <w:color w:val="1B3325"/>
+                <w:sz w:val="16"/>
+              </w:rPr>
+              <w:t xml:space="preserve"> y </w:t>
+            </w:r>
+            <w:r>
+              <w:rPr>
+                <w:rFonts w:ascii="Poppins" w:hAnsi="Poppins" w:cs="Poppins" w:eastAsia="Poppins"/>
+                <w:b/>
+                <w:i w:val="0"/>
+                <w:color w:val="1B3325"/>
+                <w:sz w:val="16"/>
+              </w:rPr>
+              <w:t>ERP</w:t>
+            </w:r>
+            <w:r>
+              <w:rPr>
+                <w:rFonts w:ascii="Poppins" w:hAnsi="Poppins" w:cs="Poppins" w:eastAsia="Poppins"/>
+                <w:b w:val="0"/>
+                <w:i w:val="0"/>
+                <w:color w:val="1B3325"/>
+                <w:sz w:val="16"/>
+              </w:rPr>
+              <w:t xml:space="preserve"> de gestión</w:t>
             </w:r>
           </w:p>
         </w:tc>
         <w:tc>
           <w:tcPr>
-            <w:tcW w:type="dxa" w:w="2300"/>
+            <w:tcW w:type="dxa" w:w="2800"/>
             <w:tcBorders>
               <w:top w:val="single" w:sz="4" w:space="0" w:color="1B3325"/>
               <w:left w:val="single" w:sz="4" w:space="0" w:color="1B3325"/>
@@ -11646,13 +12089,13 @@
               <w:bottom w:w="40" w:type="dxa"/>
               <w:right w:w="80" w:type="dxa"/>
             </w:tcMar>
-            <w:shd w:val="clear" w:color="auto" w:fill="1B3325"/>
+            <w:shd w:val="clear" w:color="auto" w:fill="FFFFFF"/>
             <w:vAlign w:val="center"/>
           </w:tcPr>
           <w:p>
             <w:pPr>
               <w:spacing w:before="0" w:after="0" w:line="259" w:lineRule="auto"/>
-              <w:jc w:val="center"/>
+              <w:jc w:val="left"/>
               <w:widowControl/>
               <w:keepNext/>
             </w:pPr>
@@ -11660,20 +12103,15 @@
             <w:r>
               <w:rPr>
                 <w:rFonts w:ascii="Poppins" w:hAnsi="Poppins" w:cs="Poppins" w:eastAsia="Poppins"/>
-                <w:b/>
-                <w:i w:val="0"/>
-                <w:color w:val="FFFFFF"/>
+                <w:b w:val="0"/>
+                <w:i w:val="0"/>
+                <w:color w:val="1B3325"/>
                 <w:sz w:val="16"/>
               </w:rPr>
-              <w:t>Lectura</w:t>
+              <w:t>Odoo Standard, Colombia: $28.477 por usuario, solo licencia</w:t>
             </w:r>
           </w:p>
         </w:tc>
-      </w:tr>
-      <w:tr>
-        <w:trPr>
-          <w:cantSplit/>
-        </w:trPr>
         <w:tc>
           <w:tcPr>
             <w:tcW w:type="dxa" w:w="2500"/>
@@ -11708,13 +12146,13 @@
                 <w:color w:val="1B3325"/>
                 <w:sz w:val="16"/>
               </w:rPr>
-              <w:t>Un módulo frente a Odoo Standard en Colombia</w:t>
+              <w:t>$15.000 por usuario, puesta en marcha incluida</w:t>
             </w:r>
           </w:p>
         </w:tc>
         <w:tc>
           <w:tcPr>
-            <w:tcW w:type="dxa" w:w="2400"/>
+            <w:tcW w:type="dxa" w:w="2200"/>
             <w:tcBorders>
               <w:top w:val="single" w:sz="4" w:space="0" w:color="1B3325"/>
               <w:left w:val="single" w:sz="4" w:space="0" w:color="1B3325"/>
@@ -11746,13 +12184,18 @@
                 <w:color w:val="1B3325"/>
                 <w:sz w:val="16"/>
               </w:rPr>
-              <w:t>$28.477 por usuario, solo licencia</w:t>
+              <w:t>Cabe. $13.477 por debajo de esa licencia.</w:t>
             </w:r>
           </w:p>
         </w:tc>
+      </w:tr>
+      <w:tr>
+        <w:trPr>
+          <w:cantSplit/>
+        </w:trPr>
         <w:tc>
           <w:tcPr>
-            <w:tcW w:type="dxa" w:w="2400"/>
+            <w:tcW w:type="dxa" w:w="2100"/>
             <w:tcBorders>
               <w:top w:val="single" w:sz="4" w:space="0" w:color="1B3325"/>
               <w:left w:val="single" w:sz="4" w:space="0" w:color="1B3325"/>
@@ -11765,7 +12208,7 @@
               <w:bottom w:w="40" w:type="dxa"/>
               <w:right w:w="80" w:type="dxa"/>
             </w:tcMar>
-            <w:shd w:val="clear" w:color="auto" w:fill="FFFFFF"/>
+            <w:shd w:val="clear" w:color="auto" w:fill="F7FBF8"/>
             <w:vAlign w:val="center"/>
           </w:tcPr>
           <w:p>
@@ -11784,13 +12227,13 @@
                 <w:color w:val="1B3325"/>
                 <w:sz w:val="16"/>
               </w:rPr>
-              <w:t>$20.000 por usuario, puesta en marcha incluida</w:t>
+              <w:t>Asistencia</w:t>
             </w:r>
           </w:p>
         </w:tc>
         <w:tc>
           <w:tcPr>
-            <w:tcW w:type="dxa" w:w="2300"/>
+            <w:tcW w:type="dxa" w:w="2800"/>
             <w:tcBorders>
               <w:top w:val="single" w:sz="4" w:space="0" w:color="1B3325"/>
               <w:left w:val="single" w:sz="4" w:space="0" w:color="1B3325"/>
@@ -11803,7 +12246,7 @@
               <w:bottom w:w="40" w:type="dxa"/>
               <w:right w:w="80" w:type="dxa"/>
             </w:tcMar>
-            <w:shd w:val="clear" w:color="auto" w:fill="FFFFFF"/>
+            <w:shd w:val="clear" w:color="auto" w:fill="F7FBF8"/>
             <w:vAlign w:val="center"/>
           </w:tcPr>
           <w:p>
@@ -11822,15 +12265,10 @@
                 <w:color w:val="1B3325"/>
                 <w:sz w:val="16"/>
               </w:rPr>
-              <w:t>Viable. Queda $8.477 debajo.</w:t>
+              <w:t>Factorial desde $25.454 por usuario. El tiempo se cotiza encima.</w:t>
             </w:r>
           </w:p>
         </w:tc>
-      </w:tr>
-      <w:tr>
-        <w:trPr>
-          <w:cantSplit/>
-        </w:trPr>
         <w:tc>
           <w:tcPr>
             <w:tcW w:type="dxa" w:w="2500"/>
@@ -11865,13 +12303,13 @@
                 <w:color w:val="1B3325"/>
                 <w:sz w:val="16"/>
               </w:rPr>
-              <w:t>Un módulo, 30 usuarios, frente a Bitrix24 Professional</w:t>
+              <w:t>$8.000 por usuario</w:t>
             </w:r>
           </w:p>
         </w:tc>
         <w:tc>
           <w:tcPr>
-            <w:tcW w:type="dxa" w:w="2400"/>
+            <w:tcW w:type="dxa" w:w="2200"/>
             <w:tcBorders>
               <w:top w:val="single" w:sz="4" w:space="0" w:color="1B3325"/>
               <w:left w:val="single" w:sz="4" w:space="0" w:color="1B3325"/>
@@ -11903,13 +12341,18 @@
                 <w:color w:val="1B3325"/>
                 <w:sz w:val="16"/>
               </w:rPr>
-              <w:t>$633.166 al mes, tope de 100 usuarios</w:t>
+              <w:t>Cabe. Cubre llegada, almuerzo, descansos y salida.</w:t>
             </w:r>
           </w:p>
         </w:tc>
+      </w:tr>
+      <w:tr>
+        <w:trPr>
+          <w:cantSplit/>
+        </w:trPr>
         <w:tc>
           <w:tcPr>
-            <w:tcW w:type="dxa" w:w="2400"/>
+            <w:tcW w:type="dxa" w:w="2100"/>
             <w:tcBorders>
               <w:top w:val="single" w:sz="4" w:space="0" w:color="1B3325"/>
               <w:left w:val="single" w:sz="4" w:space="0" w:color="1B3325"/>
@@ -11922,7 +12365,7 @@
               <w:bottom w:w="40" w:type="dxa"/>
               <w:right w:w="80" w:type="dxa"/>
             </w:tcMar>
-            <w:shd w:val="clear" w:color="auto" w:fill="F7FBF8"/>
+            <w:shd w:val="clear" w:color="auto" w:fill="FFFFFF"/>
             <w:vAlign w:val="center"/>
           </w:tcPr>
           <w:p>
@@ -11941,13 +12384,13 @@
                 <w:color w:val="1B3325"/>
                 <w:sz w:val="16"/>
               </w:rPr>
-              <w:t>$600.000 al mes</w:t>
+              <w:t>Drive</w:t>
             </w:r>
           </w:p>
         </w:tc>
         <w:tc>
           <w:tcPr>
-            <w:tcW w:type="dxa" w:w="2300"/>
+            <w:tcW w:type="dxa" w:w="2800"/>
             <w:tcBorders>
               <w:top w:val="single" w:sz="4" w:space="0" w:color="1B3325"/>
               <w:left w:val="single" w:sz="4" w:space="0" w:color="1B3325"/>
@@ -11960,7 +12403,7 @@
               <w:bottom w:w="40" w:type="dxa"/>
               <w:right w:w="80" w:type="dxa"/>
             </w:tcMar>
-            <w:shd w:val="clear" w:color="auto" w:fill="F7FBF8"/>
+            <w:shd w:val="clear" w:color="auto" w:fill="FFFFFF"/>
             <w:vAlign w:val="center"/>
           </w:tcPr>
           <w:p>
@@ -11979,15 +12422,10 @@
                 <w:color w:val="1B3325"/>
                 <w:sz w:val="16"/>
               </w:rPr>
-              <w:t>Viable. Mismo orden para un equipo de 30.</w:t>
+              <w:t>WorkDrive Team $14.318. SharePoint Plan 1 $15.909.</w:t>
             </w:r>
           </w:p>
         </w:tc>
-      </w:tr>
-      <w:tr>
-        <w:trPr>
-          <w:cantSplit/>
-        </w:trPr>
         <w:tc>
           <w:tcPr>
             <w:tcW w:type="dxa" w:w="2500"/>
@@ -12022,13 +12460,13 @@
                 <w:color w:val="1B3325"/>
                 <w:sz w:val="16"/>
               </w:rPr>
-              <w:t>Drive suelto frente a Zoho WorkDrive Team</w:t>
+              <w:t>$10.000 por usuario</w:t>
             </w:r>
           </w:p>
         </w:tc>
         <w:tc>
           <w:tcPr>
-            <w:tcW w:type="dxa" w:w="2400"/>
+            <w:tcW w:type="dxa" w:w="2200"/>
             <w:tcBorders>
               <w:top w:val="single" w:sz="4" w:space="0" w:color="1B3325"/>
               <w:left w:val="single" w:sz="4" w:space="0" w:color="1B3325"/>
@@ -12060,13 +12498,18 @@
                 <w:color w:val="1B3325"/>
                 <w:sz w:val="16"/>
               </w:rPr>
-              <w:t>$14.318 por usuario, solo archivos</w:t>
+              <w:t>Cabe. Por debajo de las dos referencias de archivos.</w:t>
             </w:r>
           </w:p>
         </w:tc>
+      </w:tr>
+      <w:tr>
+        <w:trPr>
+          <w:cantSplit/>
+        </w:trPr>
         <w:tc>
           <w:tcPr>
-            <w:tcW w:type="dxa" w:w="2400"/>
+            <w:tcW w:type="dxa" w:w="2100"/>
             <w:tcBorders>
               <w:top w:val="single" w:sz="4" w:space="0" w:color="1B3325"/>
               <w:left w:val="single" w:sz="4" w:space="0" w:color="1B3325"/>
@@ -12079,7 +12522,7 @@
               <w:bottom w:w="40" w:type="dxa"/>
               <w:right w:w="80" w:type="dxa"/>
             </w:tcMar>
-            <w:shd w:val="clear" w:color="auto" w:fill="FFFFFF"/>
+            <w:shd w:val="clear" w:color="auto" w:fill="F7FBF8"/>
             <w:vAlign w:val="center"/>
           </w:tcPr>
           <w:p>
@@ -12098,13 +12541,13 @@
                 <w:color w:val="1B3325"/>
                 <w:sz w:val="16"/>
               </w:rPr>
-              <w:t>$20.000 por usuario</w:t>
+              <w:t>Los tres módulos</w:t>
             </w:r>
           </w:p>
         </w:tc>
         <w:tc>
           <w:tcPr>
-            <w:tcW w:type="dxa" w:w="2300"/>
+            <w:tcW w:type="dxa" w:w="2800"/>
             <w:tcBorders>
               <w:top w:val="single" w:sz="4" w:space="0" w:color="1B3325"/>
               <w:left w:val="single" w:sz="4" w:space="0" w:color="1B3325"/>
@@ -12117,7 +12560,7 @@
               <w:bottom w:w="40" w:type="dxa"/>
               <w:right w:w="80" w:type="dxa"/>
             </w:tcMar>
-            <w:shd w:val="clear" w:color="auto" w:fill="FFFFFF"/>
+            <w:shd w:val="clear" w:color="auto" w:fill="F7FBF8"/>
             <w:vAlign w:val="center"/>
           </w:tcPr>
           <w:p>
@@ -12136,15 +12579,10 @@
                 <w:color w:val="1B3325"/>
                 <w:sz w:val="16"/>
               </w:rPr>
-              <w:t>Apretado. WorkDrive publica menos y reparte más espacio.</w:t>
+              <w:t>Odoo Standard $28.477. Personalizado de primer año $42.635.</w:t>
             </w:r>
           </w:p>
         </w:tc>
-      </w:tr>
-      <w:tr>
-        <w:trPr>
-          <w:cantSplit/>
-        </w:trPr>
         <w:tc>
           <w:tcPr>
             <w:tcW w:type="dxa" w:w="2500"/>
@@ -12179,13 +12617,13 @@
                 <w:color w:val="1B3325"/>
                 <w:sz w:val="16"/>
               </w:rPr>
-              <w:t>Drive suelto frente a SharePoint Plan 1</w:t>
+              <w:t>$33.000 por usuario</w:t>
             </w:r>
           </w:p>
         </w:tc>
         <w:tc>
           <w:tcPr>
-            <w:tcW w:type="dxa" w:w="2400"/>
+            <w:tcW w:type="dxa" w:w="2200"/>
             <w:tcBorders>
               <w:top w:val="single" w:sz="4" w:space="0" w:color="1B3325"/>
               <w:left w:val="single" w:sz="4" w:space="0" w:color="1B3325"/>
@@ -12217,13 +12655,18 @@
                 <w:color w:val="1B3325"/>
                 <w:sz w:val="16"/>
               </w:rPr>
-              <w:t>$15.909 por usuario</w:t>
+              <w:t>Cabe entre las dos licencias. La puesta en marcha va incluida.</w:t>
             </w:r>
           </w:p>
         </w:tc>
+      </w:tr>
+      <w:tr>
+        <w:trPr>
+          <w:cantSplit/>
+        </w:trPr>
         <w:tc>
           <w:tcPr>
-            <w:tcW w:type="dxa" w:w="2400"/>
+            <w:tcW w:type="dxa" w:w="2100"/>
             <w:tcBorders>
               <w:top w:val="single" w:sz="4" w:space="0" w:color="1B3325"/>
               <w:left w:val="single" w:sz="4" w:space="0" w:color="1B3325"/>
@@ -12236,7 +12679,7 @@
               <w:bottom w:w="40" w:type="dxa"/>
               <w:right w:w="80" w:type="dxa"/>
             </w:tcMar>
-            <w:shd w:val="clear" w:color="auto" w:fill="F7FBF8"/>
+            <w:shd w:val="clear" w:color="auto" w:fill="FFFFFF"/>
             <w:vAlign w:val="center"/>
           </w:tcPr>
           <w:p>
@@ -12255,13 +12698,13 @@
                 <w:color w:val="1B3325"/>
                 <w:sz w:val="16"/>
               </w:rPr>
-              <w:t>$20.000 por usuario</w:t>
+              <w:t>30 usuarios, los tres</w:t>
             </w:r>
           </w:p>
         </w:tc>
         <w:tc>
           <w:tcPr>
-            <w:tcW w:type="dxa" w:w="2300"/>
+            <w:tcW w:type="dxa" w:w="2800"/>
             <w:tcBorders>
               <w:top w:val="single" w:sz="4" w:space="0" w:color="1B3325"/>
               <w:left w:val="single" w:sz="4" w:space="0" w:color="1B3325"/>
@@ -12274,7 +12717,7 @@
               <w:bottom w:w="40" w:type="dxa"/>
               <w:right w:w="80" w:type="dxa"/>
             </w:tcMar>
-            <w:shd w:val="clear" w:color="auto" w:fill="F7FBF8"/>
+            <w:shd w:val="clear" w:color="auto" w:fill="FFFFFF"/>
             <w:vAlign w:val="center"/>
           </w:tcPr>
           <w:p>
@@ -12293,15 +12736,10 @@
                 <w:color w:val="1B3325"/>
                 <w:sz w:val="16"/>
               </w:rPr>
-              <w:t>Apretado. SharePoint es solo la intranet de archivos.</w:t>
+              <w:t>Odoo Standard $854.297 al mes, solo licencia</w:t>
             </w:r>
           </w:p>
         </w:tc>
-      </w:tr>
-      <w:tr>
-        <w:trPr>
-          <w:cantSplit/>
-        </w:trPr>
         <w:tc>
           <w:tcPr>
             <w:tcW w:type="dxa" w:w="2500"/>
@@ -12336,13 +12774,13 @@
                 <w:color w:val="1B3325"/>
                 <w:sz w:val="16"/>
               </w:rPr>
-              <w:t>Los tres módulos frente a Odoo Standard, 30 usuarios</w:t>
+              <w:t>$990.000 al mes</w:t>
             </w:r>
           </w:p>
         </w:tc>
         <w:tc>
           <w:tcPr>
-            <w:tcW w:type="dxa" w:w="2400"/>
+            <w:tcW w:type="dxa" w:w="2200"/>
             <w:tcBorders>
               <w:top w:val="single" w:sz="4" w:space="0" w:color="1B3325"/>
               <w:left w:val="single" w:sz="4" w:space="0" w:color="1B3325"/>
@@ -12374,13 +12812,18 @@
                 <w:color w:val="1B3325"/>
                 <w:sz w:val="16"/>
               </w:rPr>
-              <w:t>$854.297 al mes, solo licencia</w:t>
+              <w:t>$135.703 de diferencia. En Odoo la implementación se paga aparte.</w:t>
             </w:r>
           </w:p>
         </w:tc>
+      </w:tr>
+      <w:tr>
+        <w:trPr>
+          <w:cantSplit/>
+        </w:trPr>
         <w:tc>
           <w:tcPr>
-            <w:tcW w:type="dxa" w:w="2400"/>
+            <w:tcW w:type="dxa" w:w="2100"/>
             <w:tcBorders>
               <w:top w:val="single" w:sz="4" w:space="0" w:color="1B3325"/>
               <w:left w:val="single" w:sz="4" w:space="0" w:color="1B3325"/>
@@ -12393,7 +12836,7 @@
               <w:bottom w:w="40" w:type="dxa"/>
               <w:right w:w="80" w:type="dxa"/>
             </w:tcMar>
-            <w:shd w:val="clear" w:color="auto" w:fill="FFFFFF"/>
+            <w:shd w:val="clear" w:color="auto" w:fill="F7FBF8"/>
             <w:vAlign w:val="center"/>
           </w:tcPr>
           <w:p>
@@ -12412,13 +12855,13 @@
                 <w:color w:val="1B3325"/>
                 <w:sz w:val="16"/>
               </w:rPr>
-              <w:t>$1.800.000 al mes</w:t>
+              <w:t>30 usuarios frente a Bitrix24 Professional</w:t>
             </w:r>
           </w:p>
         </w:tc>
         <w:tc>
           <w:tcPr>
-            <w:tcW w:type="dxa" w:w="2300"/>
+            <w:tcW w:type="dxa" w:w="2800"/>
             <w:tcBorders>
               <w:top w:val="single" w:sz="4" w:space="0" w:color="1B3325"/>
               <w:left w:val="single" w:sz="4" w:space="0" w:color="1B3325"/>
@@ -12431,7 +12874,7 @@
               <w:bottom w:w="40" w:type="dxa"/>
               <w:right w:w="80" w:type="dxa"/>
             </w:tcMar>
-            <w:shd w:val="clear" w:color="auto" w:fill="FFFFFF"/>
+            <w:shd w:val="clear" w:color="auto" w:fill="F7FBF8"/>
             <w:vAlign w:val="center"/>
           </w:tcPr>
           <w:p>
@@ -12450,15 +12893,10 @@
                 <w:color w:val="1B3325"/>
                 <w:sz w:val="16"/>
               </w:rPr>
-              <w:t>Alto. Odoo cobra una vez por todas las aplicaciones.</w:t>
+              <w:t>$633.166 al mes, tope de 100 usuarios</w:t>
             </w:r>
           </w:p>
         </w:tc>
-      </w:tr>
-      <w:tr>
-        <w:trPr>
-          <w:cantSplit/>
-        </w:trPr>
         <w:tc>
           <w:tcPr>
             <w:tcW w:type="dxa" w:w="2500"/>
@@ -12493,13 +12931,13 @@
                 <w:color w:val="1B3325"/>
                 <w:sz w:val="16"/>
               </w:rPr>
-              <w:t>Los tres módulos frente a Google Workspace Standard</w:t>
+              <w:t>$990.000 al mes</w:t>
             </w:r>
           </w:p>
         </w:tc>
         <w:tc>
           <w:tcPr>
-            <w:tcW w:type="dxa" w:w="2400"/>
+            <w:tcW w:type="dxa" w:w="2200"/>
             <w:tcBorders>
               <w:top w:val="single" w:sz="4" w:space="0" w:color="1B3325"/>
               <w:left w:val="single" w:sz="4" w:space="0" w:color="1B3325"/>
@@ -12531,13 +12969,38 @@
                 <w:color w:val="1B3325"/>
                 <w:sz w:val="16"/>
               </w:rPr>
-              <w:t>$58.400 por usuario en Colombia</w:t>
+              <w:t xml:space="preserve">Bitrix cobra un fijo. Hasta 19 usuarios, </w:t>
+            </w:r>
+            <w:r>
+              <w:rPr>
+                <w:rFonts w:ascii="Poppins" w:hAnsi="Poppins" w:cs="Poppins" w:eastAsia="Poppins"/>
+                <w:b/>
+                <w:i w:val="0"/>
+                <w:color w:val="1B3325"/>
+                <w:sz w:val="16"/>
+              </w:rPr>
+              <w:t>RecoTime</w:t>
+            </w:r>
+            <w:r>
+              <w:rPr>
+                <w:rFonts w:ascii="Poppins" w:hAnsi="Poppins" w:cs="Poppins" w:eastAsia="Poppins"/>
+                <w:b w:val="0"/>
+                <w:i w:val="0"/>
+                <w:color w:val="1B3325"/>
+                <w:sz w:val="16"/>
+              </w:rPr>
+              <w:t xml:space="preserve"> completo queda más bajo.</w:t>
             </w:r>
           </w:p>
         </w:tc>
+      </w:tr>
+      <w:tr>
+        <w:trPr>
+          <w:cantSplit/>
+        </w:trPr>
         <w:tc>
           <w:tcPr>
-            <w:tcW w:type="dxa" w:w="2400"/>
+            <w:tcW w:type="dxa" w:w="2100"/>
             <w:tcBorders>
               <w:top w:val="single" w:sz="4" w:space="0" w:color="1B3325"/>
               <w:left w:val="single" w:sz="4" w:space="0" w:color="1B3325"/>
@@ -12550,7 +13013,7 @@
               <w:bottom w:w="40" w:type="dxa"/>
               <w:right w:w="80" w:type="dxa"/>
             </w:tcMar>
-            <w:shd w:val="clear" w:color="auto" w:fill="F7FBF8"/>
+            <w:shd w:val="clear" w:color="auto" w:fill="FFFFFF"/>
             <w:vAlign w:val="center"/>
           </w:tcPr>
           <w:p>
@@ -12558,7 +13021,6 @@
               <w:spacing w:before="0" w:after="0" w:line="259" w:lineRule="auto"/>
               <w:jc w:val="left"/>
               <w:widowControl/>
-              <w:keepNext/>
             </w:pPr>
             <w:r/>
             <w:r>
@@ -12569,13 +13031,13 @@
                 <w:color w:val="1B3325"/>
                 <w:sz w:val="16"/>
               </w:rPr>
-              <w:t>$60.000 por usuario</w:t>
+              <w:t>VPS y dominio</w:t>
             </w:r>
           </w:p>
         </w:tc>
         <w:tc>
           <w:tcPr>
-            <w:tcW w:type="dxa" w:w="2300"/>
+            <w:tcW w:type="dxa" w:w="2800"/>
             <w:tcBorders>
               <w:top w:val="single" w:sz="4" w:space="0" w:color="1B3325"/>
               <w:left w:val="single" w:sz="4" w:space="0" w:color="1B3325"/>
@@ -12588,7 +13050,7 @@
               <w:bottom w:w="40" w:type="dxa"/>
               <w:right w:w="80" w:type="dxa"/>
             </w:tcMar>
-            <w:shd w:val="clear" w:color="auto" w:fill="F7FBF8"/>
+            <w:shd w:val="clear" w:color="auto" w:fill="FFFFFF"/>
             <w:vAlign w:val="center"/>
           </w:tcPr>
           <w:p>
@@ -12596,7 +13058,6 @@
               <w:spacing w:before="0" w:after="0" w:line="259" w:lineRule="auto"/>
               <w:jc w:val="left"/>
               <w:widowControl/>
-              <w:keepNext/>
             </w:pPr>
             <w:r/>
             <w:r>
@@ -12607,15 +13068,10 @@
                 <w:color w:val="1B3325"/>
                 <w:sz w:val="16"/>
               </w:rPr>
-              <w:t>Cerca en la factura. Google da correo y 2 TB por persona.</w:t>
+              <w:t>KVM 1: 50 GB por $466.800 al año</w:t>
             </w:r>
           </w:p>
         </w:tc>
-      </w:tr>
-      <w:tr>
-        <w:trPr>
-          <w:cantSplit/>
-        </w:trPr>
         <w:tc>
           <w:tcPr>
             <w:tcW w:type="dxa" w:w="2500"/>
@@ -12649,13 +13105,13 @@
                 <w:color w:val="1B3325"/>
                 <w:sz w:val="16"/>
               </w:rPr>
-              <w:t>Cuota de 2 TB frente al KVM 1 de Hostinger</w:t>
+              <w:t>Fuera de la mensualidad</w:t>
             </w:r>
           </w:p>
         </w:tc>
         <w:tc>
           <w:tcPr>
-            <w:tcW w:type="dxa" w:w="2400"/>
+            <w:tcW w:type="dxa" w:w="2200"/>
             <w:tcBorders>
               <w:top w:val="single" w:sz="4" w:space="0" w:color="1B3325"/>
               <w:left w:val="single" w:sz="4" w:space="0" w:color="1B3325"/>
@@ -12686,81 +13142,7 @@
                 <w:color w:val="1B3325"/>
                 <w:sz w:val="16"/>
               </w:rPr>
-              <w:t>50 GB por $466.800 al año</w:t>
-            </w:r>
-          </w:p>
-        </w:tc>
-        <w:tc>
-          <w:tcPr>
-            <w:tcW w:type="dxa" w:w="2400"/>
-            <w:tcBorders>
-              <w:top w:val="single" w:sz="4" w:space="0" w:color="1B3325"/>
-              <w:left w:val="single" w:sz="4" w:space="0" w:color="1B3325"/>
-              <w:bottom w:val="single" w:sz="4" w:space="0" w:color="1B3325"/>
-              <w:right w:val="single" w:sz="4" w:space="0" w:color="1B3325"/>
-            </w:tcBorders>
-            <w:tcMar>
-              <w:top w:w="40" w:type="dxa"/>
-              <w:left w:w="80" w:type="dxa"/>
-              <w:bottom w:w="40" w:type="dxa"/>
-              <w:right w:w="80" w:type="dxa"/>
-            </w:tcMar>
-            <w:shd w:val="clear" w:color="auto" w:fill="FFFFFF"/>
-            <w:vAlign w:val="center"/>
-          </w:tcPr>
-          <w:p>
-            <w:pPr>
-              <w:spacing w:before="0" w:after="0" w:line="259" w:lineRule="auto"/>
-              <w:jc w:val="left"/>
-              <w:widowControl/>
-            </w:pPr>
-            <w:r/>
-            <w:r>
-              <w:rPr>
-                <w:rFonts w:ascii="Poppins" w:hAnsi="Poppins" w:cs="Poppins" w:eastAsia="Poppins"/>
-                <w:b w:val="0"/>
-                <w:i w:val="0"/>
-                <w:color w:val="1B3325"/>
-                <w:sz w:val="16"/>
-              </w:rPr>
-              <w:t>Cuota de software de 2 TB</w:t>
-            </w:r>
-          </w:p>
-        </w:tc>
-        <w:tc>
-          <w:tcPr>
-            <w:tcW w:type="dxa" w:w="2300"/>
-            <w:tcBorders>
-              <w:top w:val="single" w:sz="4" w:space="0" w:color="1B3325"/>
-              <w:left w:val="single" w:sz="4" w:space="0" w:color="1B3325"/>
-              <w:bottom w:val="single" w:sz="4" w:space="0" w:color="1B3325"/>
-              <w:right w:val="single" w:sz="4" w:space="0" w:color="1B3325"/>
-            </w:tcBorders>
-            <w:tcMar>
-              <w:top w:w="40" w:type="dxa"/>
-              <w:left w:w="80" w:type="dxa"/>
-              <w:bottom w:w="40" w:type="dxa"/>
-              <w:right w:w="80" w:type="dxa"/>
-            </w:tcMar>
-            <w:shd w:val="clear" w:color="auto" w:fill="FFFFFF"/>
-            <w:vAlign w:val="center"/>
-          </w:tcPr>
-          <w:p>
-            <w:pPr>
-              <w:spacing w:before="0" w:after="0" w:line="259" w:lineRule="auto"/>
-              <w:jc w:val="left"/>
-              <w:widowControl/>
-            </w:pPr>
-            <w:r/>
-            <w:r>
-              <w:rPr>
-                <w:rFonts w:ascii="Poppins" w:hAnsi="Poppins" w:cs="Poppins" w:eastAsia="Poppins"/>
-                <w:b w:val="0"/>
-                <w:i w:val="0"/>
-                <w:color w:val="1B3325"/>
-                <w:sz w:val="16"/>
-              </w:rPr>
-              <w:t>El disco de esa VPS no alcanza para la cuota.</w:t>
+              <w:t>Los coloca el cliente. La cuota de 2 TB no amplía ese disco.</w:t>
             </w:r>
           </w:p>
         </w:tc>
@@ -12787,44 +13169,7 @@
           <w:color w:val="1B3325"/>
           <w:sz w:val="26"/>
         </w:rPr>
-        <w:t>La directriz de $20.000 por módulo es viable cuando el cliente compra uno. En 30 usuarios son $600.000 al mes, $254.297 por debajo de la licencia regional de Odoo y en el mismo orden que Bitrix24 Professional. El Drive suelto queda por encima de Zoho WorkDrive y de SharePoint, que son solo archivos.</w:t>
-      </w:r>
-    </w:p>
-    <w:p>
-      <w:pPr>
-        <w:spacing w:before="0" w:after="160" w:line="259" w:lineRule="auto"/>
-        <w:jc w:val="both"/>
-        <w:widowControl/>
-      </w:pPr>
-      <w:r>
-        <w:rPr>
-          <w:rFonts w:ascii="Poppins" w:hAnsi="Poppins" w:cs="Poppins" w:eastAsia="Poppins"/>
-          <w:b w:val="0"/>
-          <w:i w:val="0"/>
-          <w:color w:val="1B3325"/>
-          <w:sz w:val="26"/>
-        </w:rPr>
-        <w:t xml:space="preserve">Los tres módulos juntos, $60.000 por usuario y $1.800.000 al mes en 30 personas, quedan $945.703 por encima de la sola licencia de Odoo. Esa suite cobra una vez y trae </w:t>
-      </w:r>
-      <w:r>
-        <w:rPr>
-          <w:rFonts w:ascii="Poppins" w:hAnsi="Poppins" w:cs="Poppins" w:eastAsia="Poppins"/>
-          <w:b/>
-          <w:i w:val="0"/>
-          <w:color w:val="1B3325"/>
-          <w:sz w:val="26"/>
-        </w:rPr>
-        <w:t>CRM</w:t>
-      </w:r>
-      <w:r>
-        <w:rPr>
-          <w:rFonts w:ascii="Poppins" w:hAnsi="Poppins" w:cs="Poppins" w:eastAsia="Poppins"/>
-          <w:b w:val="0"/>
-          <w:i w:val="0"/>
-          <w:color w:val="1B3325"/>
-          <w:sz w:val="26"/>
-        </w:rPr>
-        <w:t xml:space="preserve">, personas y archivos. </w:t>
+        <w:t xml:space="preserve">El Drive queda en $10.000 por usuario. Zoho WorkDrive Team, solo archivos, equivale a $14.318 por usuario. SharePoint Plan 1 equivale a $15.909. Google Workspace Business Standard, en la lista de Colombia, cuesta $58.400 por usuario e incluye correo, documentos y 2 TB por persona. Los tres módulos de </w:t>
       </w:r>
       <w:r>
         <w:rPr>
@@ -12844,24 +13189,7 @@
           <w:color w:val="1B3325"/>
           <w:sz w:val="26"/>
         </w:rPr>
-        <w:t xml:space="preserve"> se defiende si el cliente valora la puesta en marcha incluida y puede empezar por un módulo. Si compara la factura de los tres contra Odoo o contra Bitrix24, el precio completo se ve alto.</w:t>
-      </w:r>
-    </w:p>
-    <w:p>
-      <w:pPr>
-        <w:spacing w:before="0" w:after="160" w:line="259" w:lineRule="auto"/>
-        <w:jc w:val="both"/>
-        <w:widowControl/>
-      </w:pPr>
-      <w:r>
-        <w:rPr>
-          <w:rFonts w:ascii="Poppins" w:hAnsi="Poppins" w:cs="Poppins" w:eastAsia="Poppins"/>
-          <w:b w:val="0"/>
-          <w:i w:val="0"/>
-          <w:color w:val="1B3325"/>
-          <w:sz w:val="26"/>
-        </w:rPr>
-        <w:t xml:space="preserve">El Drive, como módulo suelto, queda en $20.000 por usuario. Zoho WorkDrive Team, solo archivos, equivale a $14.318 por usuario. SharePoint Plan 1 equivale a $15.909. Google Workspace Business Standard, en la lista de Colombia, cuesta $58.400 por usuario, casi el valor de los tres módulos de </w:t>
+        <w:t xml:space="preserve"> juntos son $33.000 por usuario. El Drive de </w:t>
       </w:r>
       <w:r>
         <w:rPr>
@@ -12881,7 +13209,44 @@
           <w:color w:val="1B3325"/>
           <w:sz w:val="26"/>
         </w:rPr>
-        <w:t xml:space="preserve"> juntos ($60.000), e incluye 2 TB por persona, correo y documentos. El Drive de </w:t>
+        <w:t xml:space="preserve"> es una intranet de 2 TB para toda la cuenta, no 2 TB por cabeza.</w:t>
+      </w:r>
+    </w:p>
+    <w:p>
+      <w:pPr>
+        <w:spacing w:before="0" w:after="160" w:line="259" w:lineRule="auto"/>
+        <w:jc w:val="both"/>
+        <w:widowControl/>
+      </w:pPr>
+      <w:r>
+        <w:rPr>
+          <w:rFonts w:ascii="Poppins" w:hAnsi="Poppins" w:cs="Poppins" w:eastAsia="Poppins"/>
+          <w:b w:val="0"/>
+          <w:i w:val="0"/>
+          <w:color w:val="1B3325"/>
+          <w:sz w:val="26"/>
+        </w:rPr>
+        <w:t xml:space="preserve">La mensualidad no incluye servidor. La VPS la coloca el cliente: la contrata en Hostinger, la paga, entrega el acceso a </w:t>
+      </w:r>
+      <w:r>
+        <w:rPr>
+          <w:rFonts w:ascii="Poppins" w:hAnsi="Poppins" w:cs="Poppins" w:eastAsia="Poppins"/>
+          <w:b/>
+          <w:i w:val="0"/>
+          <w:color w:val="1B3325"/>
+          <w:sz w:val="26"/>
+        </w:rPr>
+        <w:t>THE COMPANY DEV</w:t>
+      </w:r>
+      <w:r>
+        <w:rPr>
+          <w:rFonts w:ascii="Poppins" w:hAnsi="Poppins" w:cs="Poppins" w:eastAsia="Poppins"/>
+          <w:b w:val="0"/>
+          <w:i w:val="0"/>
+          <w:color w:val="1B3325"/>
+          <w:sz w:val="26"/>
+        </w:rPr>
+        <w:t xml:space="preserve"> y la renueva. El dominio también lo coloca el cliente. La instalación de </w:t>
       </w:r>
       <w:r>
         <w:rPr>
@@ -12901,24 +13266,7 @@
           <w:color w:val="1B3325"/>
           <w:sz w:val="26"/>
         </w:rPr>
-        <w:t xml:space="preserve"> entrega una intranet de 2 TB para toda la cuenta, no 2 TB por cabeza.</w:t>
-      </w:r>
-    </w:p>
-    <w:p>
-      <w:pPr>
-        <w:spacing w:before="0" w:after="160" w:line="259" w:lineRule="auto"/>
-        <w:jc w:val="both"/>
-        <w:widowControl/>
-      </w:pPr>
-      <w:r>
-        <w:rPr>
-          <w:rFonts w:ascii="Poppins" w:hAnsi="Poppins" w:cs="Poppins" w:eastAsia="Poppins"/>
-          <w:b w:val="0"/>
-          <w:i w:val="0"/>
-          <w:color w:val="1B3325"/>
-          <w:sz w:val="26"/>
-        </w:rPr>
-        <w:t>La VPS no entra en los $20.000 de cada módulo. El cliente la paga a Hostinger y también pone el dominio. La referencia de $500.000 al año corresponde a la renovación del KVM 1, $466.800. Ese plan trae 50 GB de disco. La cuota de 2 TB del Drive es el techo del software. Mientras el disco de la VPS sea menor, el espacio usable es el del disco.</w:t>
+        <w:t xml:space="preserve"> se hace en esa VPS y no se factura como hosting. La referencia de $500.000 al año corresponde a la renovación del KVM 1, $466.800. Ese plan trae 50 GB de disco. La cuota de 2 TB del Drive es el techo del software. El espacio usable es el disco de la VPS que el cliente haya colocado.</w:t>
       </w:r>
     </w:p>
     <w:p>
@@ -13000,7 +13348,7 @@
           <w:color w:val="1B3325"/>
           <w:sz w:val="26"/>
         </w:rPr>
-        <w:t xml:space="preserve"> se ofrece en tres modalidades y en dos formas de armar el alcance: el sistema completo o los módulos sueltos. En ninguna modalidad se cobra una implementación aparte. La configuración, la puesta en marcha y la capacitación por rol están incluidas. El precio es por usuario activo al mes. La VPS de Hostinger y el dominio los contrata el cliente y no van dentro de estos valores.</w:t>
+        <w:t xml:space="preserve"> se ofrece en tres modalidades y por módulos. En ninguna modalidad se cobra una implementación aparte. La configuración, la puesta en marcha y la capacitación por rol están incluidas. El precio es por usuario activo al mes y es la suma de los módulos que el cliente tome. La VPS no entra en ese precio: la coloca el cliente. También coloca el dominio.</w:t>
       </w:r>
     </w:p>
     <w:tbl>
@@ -14013,7 +14361,7 @@
                 <w:color w:val="1B3325"/>
                 <w:sz w:val="16"/>
               </w:rPr>
-              <w:t>Del cliente</w:t>
+              <w:t>Los coloca el cliente</w:t>
             </w:r>
           </w:p>
         </w:tc>
@@ -14050,7 +14398,7 @@
                 <w:color w:val="1B3325"/>
                 <w:sz w:val="16"/>
               </w:rPr>
-              <w:t>Del cliente</w:t>
+              <w:t>Los coloca el cliente</w:t>
             </w:r>
           </w:p>
         </w:tc>
@@ -14087,7 +14435,7 @@
                 <w:color w:val="1B3325"/>
                 <w:sz w:val="16"/>
               </w:rPr>
-              <w:t>Del cliente</w:t>
+              <w:t>Los coloca el cliente</w:t>
             </w:r>
           </w:p>
         </w:tc>
@@ -14574,7 +14922,7 @@
           <w:color w:val="1B3325"/>
           <w:sz w:val="26"/>
         </w:rPr>
-        <w:t>11.1. Precio por módulo</w:t>
+        <w:t>11.1. Precio de cada módulo</w:t>
       </w:r>
     </w:p>
     <w:p>
@@ -14591,705 +14939,7 @@
           <w:color w:val="1B3325"/>
           <w:sz w:val="26"/>
         </w:rPr>
-        <w:t>Cada módulo cuesta $20.000 por usuario activo al mes. Los tres juntos cuestan $60.000 por usuario: es la suma, sin un descuento aparte. Quien toma un módulo paga $20.000. Quien toma los tres paga $60.000.</w:t>
-      </w:r>
-    </w:p>
-    <w:tbl>
-      <w:tblPr>
-        <w:tblW w:type="dxa" w:w="9600"/>
-        <w:jc w:val="center"/>
-        <w:tblLayout w:type="fixed"/>
-        <w:tblLook w:firstColumn="1" w:firstRow="1" w:lastColumn="0" w:lastRow="0" w:noHBand="0" w:noVBand="1" w:val="04A0"/>
-      </w:tblPr>
-      <w:tblGrid>
-        <w:gridCol w:w="2400"/>
-        <w:gridCol w:w="2400"/>
-        <w:gridCol w:w="2400"/>
-        <w:gridCol w:w="2400"/>
-      </w:tblGrid>
-      <w:tr>
-        <w:trPr>
-          <w:tblHeader/>
-          <w:cantSplit/>
-        </w:trPr>
-        <w:tc>
-          <w:tcPr>
-            <w:tcW w:type="dxa" w:w="2400"/>
-            <w:tcBorders>
-              <w:top w:val="single" w:sz="4" w:space="0" w:color="1B3325"/>
-              <w:left w:val="single" w:sz="4" w:space="0" w:color="1B3325"/>
-              <w:bottom w:val="single" w:sz="4" w:space="0" w:color="1B3325"/>
-              <w:right w:val="single" w:sz="4" w:space="0" w:color="1B3325"/>
-            </w:tcBorders>
-            <w:tcMar>
-              <w:top w:w="40" w:type="dxa"/>
-              <w:left w:w="80" w:type="dxa"/>
-              <w:bottom w:w="40" w:type="dxa"/>
-              <w:right w:w="80" w:type="dxa"/>
-            </w:tcMar>
-            <w:shd w:val="clear" w:color="auto" w:fill="1B3325"/>
-            <w:vAlign w:val="center"/>
-          </w:tcPr>
-          <w:p>
-            <w:pPr>
-              <w:spacing w:before="0" w:after="0" w:line="259" w:lineRule="auto"/>
-              <w:jc w:val="center"/>
-              <w:widowControl/>
-              <w:keepNext/>
-            </w:pPr>
-            <w:r/>
-            <w:r>
-              <w:rPr>
-                <w:rFonts w:ascii="Poppins" w:hAnsi="Poppins" w:cs="Poppins" w:eastAsia="Poppins"/>
-                <w:b/>
-                <w:i w:val="0"/>
-                <w:color w:val="FFFFFF"/>
-                <w:sz w:val="20"/>
-              </w:rPr>
-              <w:t>Forma</w:t>
-            </w:r>
-          </w:p>
-        </w:tc>
-        <w:tc>
-          <w:tcPr>
-            <w:tcW w:type="dxa" w:w="2400"/>
-            <w:tcBorders>
-              <w:top w:val="single" w:sz="4" w:space="0" w:color="1B3325"/>
-              <w:left w:val="single" w:sz="4" w:space="0" w:color="1B3325"/>
-              <w:bottom w:val="single" w:sz="4" w:space="0" w:color="1B3325"/>
-              <w:right w:val="single" w:sz="4" w:space="0" w:color="1B3325"/>
-            </w:tcBorders>
-            <w:tcMar>
-              <w:top w:w="40" w:type="dxa"/>
-              <w:left w:w="80" w:type="dxa"/>
-              <w:bottom w:w="40" w:type="dxa"/>
-              <w:right w:w="80" w:type="dxa"/>
-            </w:tcMar>
-            <w:shd w:val="clear" w:color="auto" w:fill="1B3325"/>
-            <w:vAlign w:val="center"/>
-          </w:tcPr>
-          <w:p>
-            <w:pPr>
-              <w:spacing w:before="0" w:after="0" w:line="259" w:lineRule="auto"/>
-              <w:jc w:val="center"/>
-              <w:widowControl/>
-              <w:keepNext/>
-            </w:pPr>
-            <w:r/>
-            <w:r>
-              <w:rPr>
-                <w:rFonts w:ascii="Poppins" w:hAnsi="Poppins" w:cs="Poppins" w:eastAsia="Poppins"/>
-                <w:b/>
-                <w:i w:val="0"/>
-                <w:color w:val="FFFFFF"/>
-                <w:sz w:val="20"/>
-              </w:rPr>
-              <w:t>Por usuario al mes</w:t>
-            </w:r>
-          </w:p>
-        </w:tc>
-        <w:tc>
-          <w:tcPr>
-            <w:tcW w:type="dxa" w:w="2400"/>
-            <w:tcBorders>
-              <w:top w:val="single" w:sz="4" w:space="0" w:color="1B3325"/>
-              <w:left w:val="single" w:sz="4" w:space="0" w:color="1B3325"/>
-              <w:bottom w:val="single" w:sz="4" w:space="0" w:color="1B3325"/>
-              <w:right w:val="single" w:sz="4" w:space="0" w:color="1B3325"/>
-            </w:tcBorders>
-            <w:tcMar>
-              <w:top w:w="40" w:type="dxa"/>
-              <w:left w:w="80" w:type="dxa"/>
-              <w:bottom w:w="40" w:type="dxa"/>
-              <w:right w:w="80" w:type="dxa"/>
-            </w:tcMar>
-            <w:shd w:val="clear" w:color="auto" w:fill="1B3325"/>
-            <w:vAlign w:val="center"/>
-          </w:tcPr>
-          <w:p>
-            <w:pPr>
-              <w:spacing w:before="0" w:after="0" w:line="259" w:lineRule="auto"/>
-              <w:jc w:val="center"/>
-              <w:widowControl/>
-              <w:keepNext/>
-            </w:pPr>
-            <w:r/>
-            <w:r>
-              <w:rPr>
-                <w:rFonts w:ascii="Poppins" w:hAnsi="Poppins" w:cs="Poppins" w:eastAsia="Poppins"/>
-                <w:b/>
-                <w:i w:val="0"/>
-                <w:color w:val="FFFFFF"/>
-                <w:sz w:val="20"/>
-              </w:rPr>
-              <w:t>Anualidad por usuario</w:t>
-            </w:r>
-          </w:p>
-        </w:tc>
-        <w:tc>
-          <w:tcPr>
-            <w:tcW w:type="dxa" w:w="2400"/>
-            <w:tcBorders>
-              <w:top w:val="single" w:sz="4" w:space="0" w:color="1B3325"/>
-              <w:left w:val="single" w:sz="4" w:space="0" w:color="1B3325"/>
-              <w:bottom w:val="single" w:sz="4" w:space="0" w:color="1B3325"/>
-              <w:right w:val="single" w:sz="4" w:space="0" w:color="1B3325"/>
-            </w:tcBorders>
-            <w:tcMar>
-              <w:top w:w="40" w:type="dxa"/>
-              <w:left w:w="80" w:type="dxa"/>
-              <w:bottom w:w="40" w:type="dxa"/>
-              <w:right w:w="80" w:type="dxa"/>
-            </w:tcMar>
-            <w:shd w:val="clear" w:color="auto" w:fill="1B3325"/>
-            <w:vAlign w:val="center"/>
-          </w:tcPr>
-          <w:p>
-            <w:pPr>
-              <w:spacing w:before="0" w:after="0" w:line="259" w:lineRule="auto"/>
-              <w:jc w:val="center"/>
-              <w:widowControl/>
-              <w:keepNext/>
-            </w:pPr>
-            <w:r/>
-            <w:r>
-              <w:rPr>
-                <w:rFonts w:ascii="Poppins" w:hAnsi="Poppins" w:cs="Poppins" w:eastAsia="Poppins"/>
-                <w:b/>
-                <w:i w:val="0"/>
-                <w:color w:val="FFFFFF"/>
-                <w:sz w:val="20"/>
-              </w:rPr>
-              <w:t>Vitalicia por usuario</w:t>
-            </w:r>
-          </w:p>
-        </w:tc>
-      </w:tr>
-      <w:tr>
-        <w:trPr>
-          <w:cantSplit/>
-        </w:trPr>
-        <w:tc>
-          <w:tcPr>
-            <w:tcW w:type="dxa" w:w="2400"/>
-            <w:tcBorders>
-              <w:top w:val="single" w:sz="4" w:space="0" w:color="1B3325"/>
-              <w:left w:val="single" w:sz="4" w:space="0" w:color="1B3325"/>
-              <w:bottom w:val="single" w:sz="4" w:space="0" w:color="1B3325"/>
-              <w:right w:val="single" w:sz="4" w:space="0" w:color="1B3325"/>
-            </w:tcBorders>
-            <w:tcMar>
-              <w:top w:w="40" w:type="dxa"/>
-              <w:left w:w="80" w:type="dxa"/>
-              <w:bottom w:w="40" w:type="dxa"/>
-              <w:right w:w="80" w:type="dxa"/>
-            </w:tcMar>
-            <w:shd w:val="clear" w:color="auto" w:fill="FFFFFF"/>
-            <w:vAlign w:val="center"/>
-          </w:tcPr>
-          <w:p>
-            <w:pPr>
-              <w:spacing w:before="0" w:after="0" w:line="259" w:lineRule="auto"/>
-              <w:jc w:val="left"/>
-              <w:widowControl/>
-              <w:keepNext/>
-            </w:pPr>
-            <w:r/>
-            <w:r>
-              <w:rPr>
-                <w:rFonts w:ascii="Poppins" w:hAnsi="Poppins" w:cs="Poppins" w:eastAsia="Poppins"/>
-                <w:b w:val="0"/>
-                <w:i w:val="0"/>
-                <w:color w:val="1B3325"/>
-                <w:sz w:val="20"/>
-              </w:rPr>
-              <w:t>Un módulo</w:t>
-            </w:r>
-          </w:p>
-        </w:tc>
-        <w:tc>
-          <w:tcPr>
-            <w:tcW w:type="dxa" w:w="2400"/>
-            <w:tcBorders>
-              <w:top w:val="single" w:sz="4" w:space="0" w:color="1B3325"/>
-              <w:left w:val="single" w:sz="4" w:space="0" w:color="1B3325"/>
-              <w:bottom w:val="single" w:sz="4" w:space="0" w:color="1B3325"/>
-              <w:right w:val="single" w:sz="4" w:space="0" w:color="1B3325"/>
-            </w:tcBorders>
-            <w:tcMar>
-              <w:top w:w="40" w:type="dxa"/>
-              <w:left w:w="80" w:type="dxa"/>
-              <w:bottom w:w="40" w:type="dxa"/>
-              <w:right w:w="80" w:type="dxa"/>
-            </w:tcMar>
-            <w:shd w:val="clear" w:color="auto" w:fill="FFFFFF"/>
-            <w:vAlign w:val="center"/>
-          </w:tcPr>
-          <w:p>
-            <w:pPr>
-              <w:spacing w:before="0" w:after="0" w:line="259" w:lineRule="auto"/>
-              <w:jc w:val="center"/>
-              <w:widowControl/>
-              <w:keepNext/>
-            </w:pPr>
-            <w:r/>
-            <w:r>
-              <w:rPr>
-                <w:rFonts w:ascii="Poppins" w:hAnsi="Poppins" w:cs="Poppins" w:eastAsia="Poppins"/>
-                <w:b w:val="0"/>
-                <w:i w:val="0"/>
-                <w:color w:val="1B3325"/>
-                <w:sz w:val="20"/>
-              </w:rPr>
-              <w:t>$20.000</w:t>
-            </w:r>
-          </w:p>
-        </w:tc>
-        <w:tc>
-          <w:tcPr>
-            <w:tcW w:type="dxa" w:w="2400"/>
-            <w:tcBorders>
-              <w:top w:val="single" w:sz="4" w:space="0" w:color="1B3325"/>
-              <w:left w:val="single" w:sz="4" w:space="0" w:color="1B3325"/>
-              <w:bottom w:val="single" w:sz="4" w:space="0" w:color="1B3325"/>
-              <w:right w:val="single" w:sz="4" w:space="0" w:color="1B3325"/>
-            </w:tcBorders>
-            <w:tcMar>
-              <w:top w:w="40" w:type="dxa"/>
-              <w:left w:w="80" w:type="dxa"/>
-              <w:bottom w:w="40" w:type="dxa"/>
-              <w:right w:w="80" w:type="dxa"/>
-            </w:tcMar>
-            <w:shd w:val="clear" w:color="auto" w:fill="FFFFFF"/>
-            <w:vAlign w:val="center"/>
-          </w:tcPr>
-          <w:p>
-            <w:pPr>
-              <w:spacing w:before="0" w:after="0" w:line="259" w:lineRule="auto"/>
-              <w:jc w:val="center"/>
-              <w:widowControl/>
-              <w:keepNext/>
-            </w:pPr>
-            <w:r/>
-            <w:r>
-              <w:rPr>
-                <w:rFonts w:ascii="Poppins" w:hAnsi="Poppins" w:cs="Poppins" w:eastAsia="Poppins"/>
-                <w:b w:val="0"/>
-                <w:i w:val="0"/>
-                <w:color w:val="1B3325"/>
-                <w:sz w:val="20"/>
-              </w:rPr>
-              <w:t>$200.000</w:t>
-            </w:r>
-          </w:p>
-        </w:tc>
-        <w:tc>
-          <w:tcPr>
-            <w:tcW w:type="dxa" w:w="2400"/>
-            <w:tcBorders>
-              <w:top w:val="single" w:sz="4" w:space="0" w:color="1B3325"/>
-              <w:left w:val="single" w:sz="4" w:space="0" w:color="1B3325"/>
-              <w:bottom w:val="single" w:sz="4" w:space="0" w:color="1B3325"/>
-              <w:right w:val="single" w:sz="4" w:space="0" w:color="1B3325"/>
-            </w:tcBorders>
-            <w:tcMar>
-              <w:top w:w="40" w:type="dxa"/>
-              <w:left w:w="80" w:type="dxa"/>
-              <w:bottom w:w="40" w:type="dxa"/>
-              <w:right w:w="80" w:type="dxa"/>
-            </w:tcMar>
-            <w:shd w:val="clear" w:color="auto" w:fill="FFFFFF"/>
-            <w:vAlign w:val="center"/>
-          </w:tcPr>
-          <w:p>
-            <w:pPr>
-              <w:spacing w:before="0" w:after="0" w:line="259" w:lineRule="auto"/>
-              <w:jc w:val="center"/>
-              <w:widowControl/>
-              <w:keepNext/>
-            </w:pPr>
-            <w:r/>
-            <w:r>
-              <w:rPr>
-                <w:rFonts w:ascii="Poppins" w:hAnsi="Poppins" w:cs="Poppins" w:eastAsia="Poppins"/>
-                <w:b w:val="0"/>
-                <w:i w:val="0"/>
-                <w:color w:val="1B3325"/>
-                <w:sz w:val="20"/>
-              </w:rPr>
-              <w:t>$440.000</w:t>
-            </w:r>
-          </w:p>
-        </w:tc>
-      </w:tr>
-      <w:tr>
-        <w:trPr>
-          <w:cantSplit/>
-        </w:trPr>
-        <w:tc>
-          <w:tcPr>
-            <w:tcW w:type="dxa" w:w="2400"/>
-            <w:tcBorders>
-              <w:top w:val="single" w:sz="4" w:space="0" w:color="1B3325"/>
-              <w:left w:val="single" w:sz="4" w:space="0" w:color="1B3325"/>
-              <w:bottom w:val="single" w:sz="4" w:space="0" w:color="1B3325"/>
-              <w:right w:val="single" w:sz="4" w:space="0" w:color="1B3325"/>
-            </w:tcBorders>
-            <w:tcMar>
-              <w:top w:w="40" w:type="dxa"/>
-              <w:left w:w="80" w:type="dxa"/>
-              <w:bottom w:w="40" w:type="dxa"/>
-              <w:right w:w="80" w:type="dxa"/>
-            </w:tcMar>
-            <w:shd w:val="clear" w:color="auto" w:fill="F7FBF8"/>
-            <w:vAlign w:val="center"/>
-          </w:tcPr>
-          <w:p>
-            <w:pPr>
-              <w:spacing w:before="0" w:after="0" w:line="259" w:lineRule="auto"/>
-              <w:jc w:val="left"/>
-              <w:widowControl/>
-              <w:keepNext/>
-            </w:pPr>
-            <w:r/>
-            <w:r>
-              <w:rPr>
-                <w:rFonts w:ascii="Poppins" w:hAnsi="Poppins" w:cs="Poppins" w:eastAsia="Poppins"/>
-                <w:b w:val="0"/>
-                <w:i w:val="0"/>
-                <w:color w:val="1B3325"/>
-                <w:sz w:val="20"/>
-              </w:rPr>
-              <w:t>Dos módulos</w:t>
-            </w:r>
-          </w:p>
-        </w:tc>
-        <w:tc>
-          <w:tcPr>
-            <w:tcW w:type="dxa" w:w="2400"/>
-            <w:tcBorders>
-              <w:top w:val="single" w:sz="4" w:space="0" w:color="1B3325"/>
-              <w:left w:val="single" w:sz="4" w:space="0" w:color="1B3325"/>
-              <w:bottom w:val="single" w:sz="4" w:space="0" w:color="1B3325"/>
-              <w:right w:val="single" w:sz="4" w:space="0" w:color="1B3325"/>
-            </w:tcBorders>
-            <w:tcMar>
-              <w:top w:w="40" w:type="dxa"/>
-              <w:left w:w="80" w:type="dxa"/>
-              <w:bottom w:w="40" w:type="dxa"/>
-              <w:right w:w="80" w:type="dxa"/>
-            </w:tcMar>
-            <w:shd w:val="clear" w:color="auto" w:fill="F7FBF8"/>
-            <w:vAlign w:val="center"/>
-          </w:tcPr>
-          <w:p>
-            <w:pPr>
-              <w:spacing w:before="0" w:after="0" w:line="259" w:lineRule="auto"/>
-              <w:jc w:val="center"/>
-              <w:widowControl/>
-              <w:keepNext/>
-            </w:pPr>
-            <w:r/>
-            <w:r>
-              <w:rPr>
-                <w:rFonts w:ascii="Poppins" w:hAnsi="Poppins" w:cs="Poppins" w:eastAsia="Poppins"/>
-                <w:b w:val="0"/>
-                <w:i w:val="0"/>
-                <w:color w:val="1B3325"/>
-                <w:sz w:val="20"/>
-              </w:rPr>
-              <w:t>$40.000</w:t>
-            </w:r>
-          </w:p>
-        </w:tc>
-        <w:tc>
-          <w:tcPr>
-            <w:tcW w:type="dxa" w:w="2400"/>
-            <w:tcBorders>
-              <w:top w:val="single" w:sz="4" w:space="0" w:color="1B3325"/>
-              <w:left w:val="single" w:sz="4" w:space="0" w:color="1B3325"/>
-              <w:bottom w:val="single" w:sz="4" w:space="0" w:color="1B3325"/>
-              <w:right w:val="single" w:sz="4" w:space="0" w:color="1B3325"/>
-            </w:tcBorders>
-            <w:tcMar>
-              <w:top w:w="40" w:type="dxa"/>
-              <w:left w:w="80" w:type="dxa"/>
-              <w:bottom w:w="40" w:type="dxa"/>
-              <w:right w:w="80" w:type="dxa"/>
-            </w:tcMar>
-            <w:shd w:val="clear" w:color="auto" w:fill="F7FBF8"/>
-            <w:vAlign w:val="center"/>
-          </w:tcPr>
-          <w:p>
-            <w:pPr>
-              <w:spacing w:before="0" w:after="0" w:line="259" w:lineRule="auto"/>
-              <w:jc w:val="center"/>
-              <w:widowControl/>
-              <w:keepNext/>
-            </w:pPr>
-            <w:r/>
-            <w:r>
-              <w:rPr>
-                <w:rFonts w:ascii="Poppins" w:hAnsi="Poppins" w:cs="Poppins" w:eastAsia="Poppins"/>
-                <w:b w:val="0"/>
-                <w:i w:val="0"/>
-                <w:color w:val="1B3325"/>
-                <w:sz w:val="20"/>
-              </w:rPr>
-              <w:t>$400.000</w:t>
-            </w:r>
-          </w:p>
-        </w:tc>
-        <w:tc>
-          <w:tcPr>
-            <w:tcW w:type="dxa" w:w="2400"/>
-            <w:tcBorders>
-              <w:top w:val="single" w:sz="4" w:space="0" w:color="1B3325"/>
-              <w:left w:val="single" w:sz="4" w:space="0" w:color="1B3325"/>
-              <w:bottom w:val="single" w:sz="4" w:space="0" w:color="1B3325"/>
-              <w:right w:val="single" w:sz="4" w:space="0" w:color="1B3325"/>
-            </w:tcBorders>
-            <w:tcMar>
-              <w:top w:w="40" w:type="dxa"/>
-              <w:left w:w="80" w:type="dxa"/>
-              <w:bottom w:w="40" w:type="dxa"/>
-              <w:right w:w="80" w:type="dxa"/>
-            </w:tcMar>
-            <w:shd w:val="clear" w:color="auto" w:fill="F7FBF8"/>
-            <w:vAlign w:val="center"/>
-          </w:tcPr>
-          <w:p>
-            <w:pPr>
-              <w:spacing w:before="0" w:after="0" w:line="259" w:lineRule="auto"/>
-              <w:jc w:val="center"/>
-              <w:widowControl/>
-              <w:keepNext/>
-            </w:pPr>
-            <w:r/>
-            <w:r>
-              <w:rPr>
-                <w:rFonts w:ascii="Poppins" w:hAnsi="Poppins" w:cs="Poppins" w:eastAsia="Poppins"/>
-                <w:b w:val="0"/>
-                <w:i w:val="0"/>
-                <w:color w:val="1B3325"/>
-                <w:sz w:val="20"/>
-              </w:rPr>
-              <w:t>$880.000</w:t>
-            </w:r>
-          </w:p>
-        </w:tc>
-      </w:tr>
-      <w:tr>
-        <w:trPr>
-          <w:cantSplit/>
-        </w:trPr>
-        <w:tc>
-          <w:tcPr>
-            <w:tcW w:type="dxa" w:w="2400"/>
-            <w:tcBorders>
-              <w:top w:val="single" w:sz="4" w:space="0" w:color="1B3325"/>
-              <w:left w:val="single" w:sz="4" w:space="0" w:color="1B3325"/>
-              <w:bottom w:val="single" w:sz="4" w:space="0" w:color="1B3325"/>
-              <w:right w:val="single" w:sz="4" w:space="0" w:color="1B3325"/>
-            </w:tcBorders>
-            <w:tcMar>
-              <w:top w:w="40" w:type="dxa"/>
-              <w:left w:w="80" w:type="dxa"/>
-              <w:bottom w:w="40" w:type="dxa"/>
-              <w:right w:w="80" w:type="dxa"/>
-            </w:tcMar>
-            <w:shd w:val="clear" w:color="auto" w:fill="FFFFFF"/>
-            <w:vAlign w:val="center"/>
-          </w:tcPr>
-          <w:p>
-            <w:pPr>
-              <w:spacing w:before="0" w:after="0" w:line="259" w:lineRule="auto"/>
-              <w:jc w:val="left"/>
-              <w:widowControl/>
-            </w:pPr>
-            <w:r/>
-            <w:r>
-              <w:rPr>
-                <w:rFonts w:ascii="Poppins" w:hAnsi="Poppins" w:cs="Poppins" w:eastAsia="Poppins"/>
-                <w:b w:val="0"/>
-                <w:i w:val="0"/>
-                <w:color w:val="1B3325"/>
-                <w:sz w:val="20"/>
-              </w:rPr>
-              <w:t>Los tres módulos</w:t>
-            </w:r>
-          </w:p>
-        </w:tc>
-        <w:tc>
-          <w:tcPr>
-            <w:tcW w:type="dxa" w:w="2400"/>
-            <w:tcBorders>
-              <w:top w:val="single" w:sz="4" w:space="0" w:color="1B3325"/>
-              <w:left w:val="single" w:sz="4" w:space="0" w:color="1B3325"/>
-              <w:bottom w:val="single" w:sz="4" w:space="0" w:color="1B3325"/>
-              <w:right w:val="single" w:sz="4" w:space="0" w:color="1B3325"/>
-            </w:tcBorders>
-            <w:tcMar>
-              <w:top w:w="40" w:type="dxa"/>
-              <w:left w:w="80" w:type="dxa"/>
-              <w:bottom w:w="40" w:type="dxa"/>
-              <w:right w:w="80" w:type="dxa"/>
-            </w:tcMar>
-            <w:shd w:val="clear" w:color="auto" w:fill="FFFFFF"/>
-            <w:vAlign w:val="center"/>
-          </w:tcPr>
-          <w:p>
-            <w:pPr>
-              <w:spacing w:before="0" w:after="0" w:line="259" w:lineRule="auto"/>
-              <w:jc w:val="center"/>
-              <w:widowControl/>
-            </w:pPr>
-            <w:r/>
-            <w:r>
-              <w:rPr>
-                <w:rFonts w:ascii="Poppins" w:hAnsi="Poppins" w:cs="Poppins" w:eastAsia="Poppins"/>
-                <w:b w:val="0"/>
-                <w:i w:val="0"/>
-                <w:color w:val="1B3325"/>
-                <w:sz w:val="20"/>
-              </w:rPr>
-              <w:t>$60.000</w:t>
-            </w:r>
-          </w:p>
-        </w:tc>
-        <w:tc>
-          <w:tcPr>
-            <w:tcW w:type="dxa" w:w="2400"/>
-            <w:tcBorders>
-              <w:top w:val="single" w:sz="4" w:space="0" w:color="1B3325"/>
-              <w:left w:val="single" w:sz="4" w:space="0" w:color="1B3325"/>
-              <w:bottom w:val="single" w:sz="4" w:space="0" w:color="1B3325"/>
-              <w:right w:val="single" w:sz="4" w:space="0" w:color="1B3325"/>
-            </w:tcBorders>
-            <w:tcMar>
-              <w:top w:w="40" w:type="dxa"/>
-              <w:left w:w="80" w:type="dxa"/>
-              <w:bottom w:w="40" w:type="dxa"/>
-              <w:right w:w="80" w:type="dxa"/>
-            </w:tcMar>
-            <w:shd w:val="clear" w:color="auto" w:fill="FFFFFF"/>
-            <w:vAlign w:val="center"/>
-          </w:tcPr>
-          <w:p>
-            <w:pPr>
-              <w:spacing w:before="0" w:after="0" w:line="259" w:lineRule="auto"/>
-              <w:jc w:val="center"/>
-              <w:widowControl/>
-            </w:pPr>
-            <w:r/>
-            <w:r>
-              <w:rPr>
-                <w:rFonts w:ascii="Poppins" w:hAnsi="Poppins" w:cs="Poppins" w:eastAsia="Poppins"/>
-                <w:b w:val="0"/>
-                <w:i w:val="0"/>
-                <w:color w:val="1B3325"/>
-                <w:sz w:val="20"/>
-              </w:rPr>
-              <w:t>$600.000</w:t>
-            </w:r>
-          </w:p>
-        </w:tc>
-        <w:tc>
-          <w:tcPr>
-            <w:tcW w:type="dxa" w:w="2400"/>
-            <w:tcBorders>
-              <w:top w:val="single" w:sz="4" w:space="0" w:color="1B3325"/>
-              <w:left w:val="single" w:sz="4" w:space="0" w:color="1B3325"/>
-              <w:bottom w:val="single" w:sz="4" w:space="0" w:color="1B3325"/>
-              <w:right w:val="single" w:sz="4" w:space="0" w:color="1B3325"/>
-            </w:tcBorders>
-            <w:tcMar>
-              <w:top w:w="40" w:type="dxa"/>
-              <w:left w:w="80" w:type="dxa"/>
-              <w:bottom w:w="40" w:type="dxa"/>
-              <w:right w:w="80" w:type="dxa"/>
-            </w:tcMar>
-            <w:shd w:val="clear" w:color="auto" w:fill="FFFFFF"/>
-            <w:vAlign w:val="center"/>
-          </w:tcPr>
-          <w:p>
-            <w:pPr>
-              <w:spacing w:before="0" w:after="0" w:line="259" w:lineRule="auto"/>
-              <w:jc w:val="center"/>
-              <w:widowControl/>
-            </w:pPr>
-            <w:r/>
-            <w:r>
-              <w:rPr>
-                <w:rFonts w:ascii="Poppins" w:hAnsi="Poppins" w:cs="Poppins" w:eastAsia="Poppins"/>
-                <w:b w:val="0"/>
-                <w:i w:val="0"/>
-                <w:color w:val="1B3325"/>
-                <w:sz w:val="20"/>
-              </w:rPr>
-              <w:t>$1.320.000</w:t>
-            </w:r>
-          </w:p>
-        </w:tc>
-      </w:tr>
-    </w:tbl>
-    <w:p>
-      <w:pPr>
-        <w:spacing w:before="0" w:after="40" w:line="259" w:lineRule="auto"/>
-        <w:jc w:val="left"/>
-        <w:widowControl/>
-      </w:pPr>
-    </w:p>
-    <w:p>
-      <w:pPr>
-        <w:spacing w:before="0" w:after="120" w:line="259" w:lineRule="auto"/>
-        <w:jc w:val="left"/>
-        <w:widowControl/>
-      </w:pPr>
-      <w:r>
-        <w:rPr>
-          <w:rFonts w:ascii="Poppins" w:hAnsi="Poppins" w:cs="Poppins" w:eastAsia="Poppins"/>
-          <w:b w:val="0"/>
-          <w:i w:val="0"/>
-          <w:color w:val="1B3325"/>
-          <w:sz w:val="22"/>
-        </w:rPr>
-        <w:t>Anualidad por usuario = mensualidad × 10, y cubre 12 meses. Un módulo al año son $200.000 por usuario, equivalentes a $16.667 al mes. Los tres módulos al año son $600.000 por usuario. La vitalicia es la mensualidad × 22: $440.000 por usuario en un módulo y $1.320.000 en los tres. El soporte opcional, después de los 3 meses de garantía, es el 40 % de lo que el cliente paga por usuario.</w:t>
-      </w:r>
-    </w:p>
-    <w:p>
-      <w:pPr>
-        <w:spacing w:before="160" w:after="40" w:line="259" w:lineRule="auto"/>
-        <w:jc w:val="left"/>
-        <w:keepNext/>
-        <w:widowControl/>
-      </w:pPr>
-      <w:r>
-        <w:rPr>
-          <w:rFonts w:ascii="Poppins" w:hAnsi="Poppins" w:cs="Poppins" w:eastAsia="Poppins"/>
-          <w:b/>
-          <w:i w:val="0"/>
-          <w:color w:val="1B3325"/>
-          <w:sz w:val="26"/>
-        </w:rPr>
-        <w:t>11.2. Los tres módulos, sueltos o juntos</w:t>
-      </w:r>
-    </w:p>
-    <w:p>
-      <w:pPr>
-        <w:spacing w:before="0" w:after="160" w:line="259" w:lineRule="auto"/>
-        <w:jc w:val="both"/>
-        <w:widowControl/>
-      </w:pPr>
-      <w:r>
-        <w:rPr>
-          <w:rFonts w:ascii="Poppins" w:hAnsi="Poppins" w:cs="Poppins" w:eastAsia="Poppins"/>
-          <w:b w:val="0"/>
-          <w:i w:val="0"/>
-          <w:color w:val="1B3325"/>
-          <w:sz w:val="26"/>
-        </w:rPr>
-        <w:t>El precio de cada módulo es el mismo. El cliente elige uno, dos o los tres. Los reportes de cada módulo van con ese módulo. La cuota de 2 TB va solo con el Drive, así se compre suelto o con los demás.</w:t>
+        <w:t>Cada módulo tiene su propio valor, tomado del orden de mercado de la sección 10.1. Los tres juntos cuestan $33.000 por usuario: es la suma. Quien toma un módulo paga ese módulo. Quien toma dos paga la suma de esos dos.</w:t>
       </w:r>
     </w:p>
     <w:tbl>
@@ -15579,7 +15229,7 @@
                 <w:color w:val="1B3325"/>
                 <w:sz w:val="18"/>
               </w:rPr>
-              <w:t>$20.000</w:t>
+              <w:t>$15.000</w:t>
             </w:r>
           </w:p>
         </w:tc>
@@ -15617,7 +15267,7 @@
                 <w:color w:val="1B3325"/>
                 <w:sz w:val="18"/>
               </w:rPr>
-              <w:t>$200.000</w:t>
+              <w:t>$150.000</w:t>
             </w:r>
           </w:p>
         </w:tc>
@@ -15655,7 +15305,7 @@
                 <w:color w:val="1B3325"/>
                 <w:sz w:val="18"/>
               </w:rPr>
-              <w:t>$440.000</w:t>
+              <w:t>$330.000</w:t>
             </w:r>
           </w:p>
         </w:tc>
@@ -15736,7 +15386,7 @@
                 <w:color w:val="1B3325"/>
                 <w:sz w:val="18"/>
               </w:rPr>
-              <w:t>$20.000</w:t>
+              <w:t>$8.000</w:t>
             </w:r>
           </w:p>
         </w:tc>
@@ -15774,7 +15424,7 @@
                 <w:color w:val="1B3325"/>
                 <w:sz w:val="18"/>
               </w:rPr>
-              <w:t>$200.000</w:t>
+              <w:t>$80.000</w:t>
             </w:r>
           </w:p>
         </w:tc>
@@ -15812,7 +15462,7 @@
                 <w:color w:val="1B3325"/>
                 <w:sz w:val="18"/>
               </w:rPr>
-              <w:t>$440.000</w:t>
+              <w:t>$176.000</w:t>
             </w:r>
           </w:p>
         </w:tc>
@@ -15893,7 +15543,7 @@
                 <w:color w:val="1B3325"/>
                 <w:sz w:val="18"/>
               </w:rPr>
-              <w:t>$20.000</w:t>
+              <w:t>$10.000</w:t>
             </w:r>
           </w:p>
         </w:tc>
@@ -15931,7 +15581,7 @@
                 <w:color w:val="1B3325"/>
                 <w:sz w:val="18"/>
               </w:rPr>
-              <w:t>$200.000</w:t>
+              <w:t>$100.000</w:t>
             </w:r>
           </w:p>
         </w:tc>
@@ -15969,7 +15619,7 @@
                 <w:color w:val="1B3325"/>
                 <w:sz w:val="18"/>
               </w:rPr>
-              <w:t>$440.000</w:t>
+              <w:t>$220.000</w:t>
             </w:r>
           </w:p>
         </w:tc>
@@ -16048,7 +15698,7 @@
                 <w:color w:val="1B3325"/>
                 <w:sz w:val="18"/>
               </w:rPr>
-              <w:t>$60.000</w:t>
+              <w:t>$33.000</w:t>
             </w:r>
           </w:p>
         </w:tc>
@@ -16085,7 +15735,7 @@
                 <w:color w:val="1B3325"/>
                 <w:sz w:val="18"/>
               </w:rPr>
-              <w:t>$600.000</w:t>
+              <w:t>$330.000</w:t>
             </w:r>
           </w:p>
         </w:tc>
@@ -16122,7 +15772,7 @@
                 <w:color w:val="1B3325"/>
                 <w:sz w:val="18"/>
               </w:rPr>
-              <w:t>$1.320.000</w:t>
+              <w:t>$726.000</w:t>
             </w:r>
           </w:p>
         </w:tc>
@@ -16149,7 +15799,47 @@
           <w:color w:val="1B3325"/>
           <w:sz w:val="22"/>
         </w:rPr>
-        <w:t>No hay un precio de paquete distinto de la suma. Un módulo son $20.000 por usuario. Dos son $40.000. Los tres son $60.000. Para 30 usuarios, un módulo son $600.000 al mes y los tres son $1.800.000 al mes.</w:t>
+        <w:t xml:space="preserve">Anualidad por usuario = mensualidad × 10, y cubre 12 meses. El </w:t>
+      </w:r>
+      <w:r>
+        <w:rPr>
+          <w:rFonts w:ascii="Poppins" w:hAnsi="Poppins" w:cs="Poppins" w:eastAsia="Poppins"/>
+          <w:b/>
+          <w:i w:val="0"/>
+          <w:color w:val="1B3325"/>
+          <w:sz w:val="22"/>
+        </w:rPr>
+        <w:t>CRM</w:t>
+      </w:r>
+      <w:r>
+        <w:rPr>
+          <w:rFonts w:ascii="Poppins" w:hAnsi="Poppins" w:cs="Poppins" w:eastAsia="Poppins"/>
+          <w:b w:val="0"/>
+          <w:i w:val="0"/>
+          <w:color w:val="1B3325"/>
+          <w:sz w:val="22"/>
+        </w:rPr>
+        <w:t xml:space="preserve"> y </w:t>
+      </w:r>
+      <w:r>
+        <w:rPr>
+          <w:rFonts w:ascii="Poppins" w:hAnsi="Poppins" w:cs="Poppins" w:eastAsia="Poppins"/>
+          <w:b/>
+          <w:i w:val="0"/>
+          <w:color w:val="1B3325"/>
+          <w:sz w:val="22"/>
+        </w:rPr>
+        <w:t>ERP</w:t>
+      </w:r>
+      <w:r>
+        <w:rPr>
+          <w:rFonts w:ascii="Poppins" w:hAnsi="Poppins" w:cs="Poppins" w:eastAsia="Poppins"/>
+          <w:b w:val="0"/>
+          <w:i w:val="0"/>
+          <w:color w:val="1B3325"/>
+          <w:sz w:val="22"/>
+        </w:rPr>
+        <w:t xml:space="preserve"> al año son $150.000 por usuario. La asistencia, $80.000. El Drive, $100.000. Los tres, $330.000. La vitalicia es la mensualidad × 22: $330.000, $176.000 y $220.000 por usuario, y $726.000 los tres. El soporte opcional, después de los 3 meses de garantía, es el 40 % de lo que el cliente paga por usuario.</w:t>
       </w:r>
     </w:p>
     <w:p>
@@ -16167,7 +15857,1019 @@
           <w:color w:val="1B3325"/>
           <w:sz w:val="26"/>
         </w:rPr>
-        <w:t>11.3. Qué paga el cliente por fuera</w:t>
+        <w:t>11.2. Módulos sueltos o combinados</w:t>
+      </w:r>
+    </w:p>
+    <w:p>
+      <w:pPr>
+        <w:spacing w:before="0" w:after="160" w:line="259" w:lineRule="auto"/>
+        <w:jc w:val="both"/>
+        <w:widowControl/>
+      </w:pPr>
+      <w:r>
+        <w:rPr>
+          <w:rFonts w:ascii="Poppins" w:hAnsi="Poppins" w:cs="Poppins" w:eastAsia="Poppins"/>
+          <w:b w:val="0"/>
+          <w:i w:val="0"/>
+          <w:color w:val="1B3325"/>
+          <w:sz w:val="26"/>
+        </w:rPr>
+        <w:t>El cliente elige uno, dos o los tres. Dos módulos se cobran como la suma de sus tarifas. Los reportes de cada módulo van con ese módulo. La cuota de 2 TB va solo con el Drive, así se tome suelto o con los demás. La VPS la coloca el cliente en cualquier combinación.</w:t>
+      </w:r>
+    </w:p>
+    <w:tbl>
+      <w:tblPr>
+        <w:tblW w:type="dxa" w:w="9600"/>
+        <w:jc w:val="center"/>
+        <w:tblLayout w:type="fixed"/>
+        <w:tblLook w:firstColumn="1" w:firstRow="1" w:lastColumn="0" w:lastRow="0" w:noHBand="0" w:noVBand="1" w:val="04A0"/>
+      </w:tblPr>
+      <w:tblGrid>
+        <w:gridCol w:w="2800"/>
+        <w:gridCol w:w="2200"/>
+        <w:gridCol w:w="2300"/>
+        <w:gridCol w:w="2300"/>
+      </w:tblGrid>
+      <w:tr>
+        <w:trPr>
+          <w:tblHeader/>
+          <w:cantSplit/>
+        </w:trPr>
+        <w:tc>
+          <w:tcPr>
+            <w:tcW w:type="dxa" w:w="2800"/>
+            <w:tcBorders>
+              <w:top w:val="single" w:sz="4" w:space="0" w:color="1B3325"/>
+              <w:left w:val="single" w:sz="4" w:space="0" w:color="1B3325"/>
+              <w:bottom w:val="single" w:sz="4" w:space="0" w:color="1B3325"/>
+              <w:right w:val="single" w:sz="4" w:space="0" w:color="1B3325"/>
+            </w:tcBorders>
+            <w:tcMar>
+              <w:top w:w="40" w:type="dxa"/>
+              <w:left w:w="80" w:type="dxa"/>
+              <w:bottom w:w="40" w:type="dxa"/>
+              <w:right w:w="80" w:type="dxa"/>
+            </w:tcMar>
+            <w:shd w:val="clear" w:color="auto" w:fill="1B3325"/>
+            <w:vAlign w:val="center"/>
+          </w:tcPr>
+          <w:p>
+            <w:pPr>
+              <w:spacing w:before="0" w:after="0" w:line="259" w:lineRule="auto"/>
+              <w:jc w:val="center"/>
+              <w:widowControl/>
+              <w:keepNext/>
+            </w:pPr>
+            <w:r/>
+            <w:r>
+              <w:rPr>
+                <w:rFonts w:ascii="Poppins" w:hAnsi="Poppins" w:cs="Poppins" w:eastAsia="Poppins"/>
+                <w:b/>
+                <w:i w:val="0"/>
+                <w:color w:val="FFFFFF"/>
+                <w:sz w:val="18"/>
+              </w:rPr>
+              <w:t>Combinación</w:t>
+            </w:r>
+          </w:p>
+        </w:tc>
+        <w:tc>
+          <w:tcPr>
+            <w:tcW w:type="dxa" w:w="2200"/>
+            <w:tcBorders>
+              <w:top w:val="single" w:sz="4" w:space="0" w:color="1B3325"/>
+              <w:left w:val="single" w:sz="4" w:space="0" w:color="1B3325"/>
+              <w:bottom w:val="single" w:sz="4" w:space="0" w:color="1B3325"/>
+              <w:right w:val="single" w:sz="4" w:space="0" w:color="1B3325"/>
+            </w:tcBorders>
+            <w:tcMar>
+              <w:top w:w="40" w:type="dxa"/>
+              <w:left w:w="80" w:type="dxa"/>
+              <w:bottom w:w="40" w:type="dxa"/>
+              <w:right w:w="80" w:type="dxa"/>
+            </w:tcMar>
+            <w:shd w:val="clear" w:color="auto" w:fill="1B3325"/>
+            <w:vAlign w:val="center"/>
+          </w:tcPr>
+          <w:p>
+            <w:pPr>
+              <w:spacing w:before="0" w:after="0" w:line="259" w:lineRule="auto"/>
+              <w:jc w:val="center"/>
+              <w:widowControl/>
+              <w:keepNext/>
+            </w:pPr>
+            <w:r/>
+            <w:r>
+              <w:rPr>
+                <w:rFonts w:ascii="Poppins" w:hAnsi="Poppins" w:cs="Poppins" w:eastAsia="Poppins"/>
+                <w:b/>
+                <w:i w:val="0"/>
+                <w:color w:val="FFFFFF"/>
+                <w:sz w:val="18"/>
+              </w:rPr>
+              <w:t>Por usuario al mes</w:t>
+            </w:r>
+          </w:p>
+        </w:tc>
+        <w:tc>
+          <w:tcPr>
+            <w:tcW w:type="dxa" w:w="2300"/>
+            <w:tcBorders>
+              <w:top w:val="single" w:sz="4" w:space="0" w:color="1B3325"/>
+              <w:left w:val="single" w:sz="4" w:space="0" w:color="1B3325"/>
+              <w:bottom w:val="single" w:sz="4" w:space="0" w:color="1B3325"/>
+              <w:right w:val="single" w:sz="4" w:space="0" w:color="1B3325"/>
+            </w:tcBorders>
+            <w:tcMar>
+              <w:top w:w="40" w:type="dxa"/>
+              <w:left w:w="80" w:type="dxa"/>
+              <w:bottom w:w="40" w:type="dxa"/>
+              <w:right w:w="80" w:type="dxa"/>
+            </w:tcMar>
+            <w:shd w:val="clear" w:color="auto" w:fill="1B3325"/>
+            <w:vAlign w:val="center"/>
+          </w:tcPr>
+          <w:p>
+            <w:pPr>
+              <w:spacing w:before="0" w:after="0" w:line="259" w:lineRule="auto"/>
+              <w:jc w:val="center"/>
+              <w:widowControl/>
+              <w:keepNext/>
+            </w:pPr>
+            <w:r/>
+            <w:r>
+              <w:rPr>
+                <w:rFonts w:ascii="Poppins" w:hAnsi="Poppins" w:cs="Poppins" w:eastAsia="Poppins"/>
+                <w:b/>
+                <w:i w:val="0"/>
+                <w:color w:val="FFFFFF"/>
+                <w:sz w:val="18"/>
+              </w:rPr>
+              <w:t>Anualidad por usuario</w:t>
+            </w:r>
+          </w:p>
+        </w:tc>
+        <w:tc>
+          <w:tcPr>
+            <w:tcW w:type="dxa" w:w="2300"/>
+            <w:tcBorders>
+              <w:top w:val="single" w:sz="4" w:space="0" w:color="1B3325"/>
+              <w:left w:val="single" w:sz="4" w:space="0" w:color="1B3325"/>
+              <w:bottom w:val="single" w:sz="4" w:space="0" w:color="1B3325"/>
+              <w:right w:val="single" w:sz="4" w:space="0" w:color="1B3325"/>
+            </w:tcBorders>
+            <w:tcMar>
+              <w:top w:w="40" w:type="dxa"/>
+              <w:left w:w="80" w:type="dxa"/>
+              <w:bottom w:w="40" w:type="dxa"/>
+              <w:right w:w="80" w:type="dxa"/>
+            </w:tcMar>
+            <w:shd w:val="clear" w:color="auto" w:fill="1B3325"/>
+            <w:vAlign w:val="center"/>
+          </w:tcPr>
+          <w:p>
+            <w:pPr>
+              <w:spacing w:before="0" w:after="0" w:line="259" w:lineRule="auto"/>
+              <w:jc w:val="center"/>
+              <w:widowControl/>
+              <w:keepNext/>
+            </w:pPr>
+            <w:r/>
+            <w:r>
+              <w:rPr>
+                <w:rFonts w:ascii="Poppins" w:hAnsi="Poppins" w:cs="Poppins" w:eastAsia="Poppins"/>
+                <w:b/>
+                <w:i w:val="0"/>
+                <w:color w:val="FFFFFF"/>
+                <w:sz w:val="18"/>
+              </w:rPr>
+              <w:t>Vitalicia por usuario</w:t>
+            </w:r>
+          </w:p>
+        </w:tc>
+      </w:tr>
+      <w:tr>
+        <w:trPr>
+          <w:cantSplit/>
+        </w:trPr>
+        <w:tc>
+          <w:tcPr>
+            <w:tcW w:type="dxa" w:w="2800"/>
+            <w:tcBorders>
+              <w:top w:val="single" w:sz="4" w:space="0" w:color="1B3325"/>
+              <w:left w:val="single" w:sz="4" w:space="0" w:color="1B3325"/>
+              <w:bottom w:val="single" w:sz="4" w:space="0" w:color="1B3325"/>
+              <w:right w:val="single" w:sz="4" w:space="0" w:color="1B3325"/>
+            </w:tcBorders>
+            <w:tcMar>
+              <w:top w:w="40" w:type="dxa"/>
+              <w:left w:w="80" w:type="dxa"/>
+              <w:bottom w:w="40" w:type="dxa"/>
+              <w:right w:w="80" w:type="dxa"/>
+            </w:tcMar>
+            <w:shd w:val="clear" w:color="auto" w:fill="FFFFFF"/>
+            <w:vAlign w:val="center"/>
+          </w:tcPr>
+          <w:p>
+            <w:pPr>
+              <w:spacing w:before="0" w:after="0" w:line="259" w:lineRule="auto"/>
+              <w:jc w:val="left"/>
+              <w:widowControl/>
+              <w:keepNext/>
+            </w:pPr>
+            <w:r/>
+            <w:r>
+              <w:rPr>
+                <w:rFonts w:ascii="Poppins" w:hAnsi="Poppins" w:cs="Poppins" w:eastAsia="Poppins"/>
+                <w:b/>
+                <w:i w:val="0"/>
+                <w:color w:val="1B3325"/>
+                <w:sz w:val="18"/>
+              </w:rPr>
+              <w:t>CRM</w:t>
+            </w:r>
+            <w:r>
+              <w:rPr>
+                <w:rFonts w:ascii="Poppins" w:hAnsi="Poppins" w:cs="Poppins" w:eastAsia="Poppins"/>
+                <w:b w:val="0"/>
+                <w:i w:val="0"/>
+                <w:color w:val="1B3325"/>
+                <w:sz w:val="18"/>
+              </w:rPr>
+              <w:t xml:space="preserve"> y </w:t>
+            </w:r>
+            <w:r>
+              <w:rPr>
+                <w:rFonts w:ascii="Poppins" w:hAnsi="Poppins" w:cs="Poppins" w:eastAsia="Poppins"/>
+                <w:b/>
+                <w:i w:val="0"/>
+                <w:color w:val="1B3325"/>
+                <w:sz w:val="18"/>
+              </w:rPr>
+              <w:t>ERP</w:t>
+            </w:r>
+            <w:r>
+              <w:rPr>
+                <w:rFonts w:ascii="Poppins" w:hAnsi="Poppins" w:cs="Poppins" w:eastAsia="Poppins"/>
+                <w:b w:val="0"/>
+                <w:i w:val="0"/>
+                <w:color w:val="1B3325"/>
+                <w:sz w:val="18"/>
+              </w:rPr>
+              <w:t xml:space="preserve"> + asistencia</w:t>
+            </w:r>
+          </w:p>
+        </w:tc>
+        <w:tc>
+          <w:tcPr>
+            <w:tcW w:type="dxa" w:w="2200"/>
+            <w:tcBorders>
+              <w:top w:val="single" w:sz="4" w:space="0" w:color="1B3325"/>
+              <w:left w:val="single" w:sz="4" w:space="0" w:color="1B3325"/>
+              <w:bottom w:val="single" w:sz="4" w:space="0" w:color="1B3325"/>
+              <w:right w:val="single" w:sz="4" w:space="0" w:color="1B3325"/>
+            </w:tcBorders>
+            <w:tcMar>
+              <w:top w:w="40" w:type="dxa"/>
+              <w:left w:w="80" w:type="dxa"/>
+              <w:bottom w:w="40" w:type="dxa"/>
+              <w:right w:w="80" w:type="dxa"/>
+            </w:tcMar>
+            <w:shd w:val="clear" w:color="auto" w:fill="FFFFFF"/>
+            <w:vAlign w:val="center"/>
+          </w:tcPr>
+          <w:p>
+            <w:pPr>
+              <w:spacing w:before="0" w:after="0" w:line="259" w:lineRule="auto"/>
+              <w:jc w:val="center"/>
+              <w:widowControl/>
+              <w:keepNext/>
+            </w:pPr>
+            <w:r/>
+            <w:r>
+              <w:rPr>
+                <w:rFonts w:ascii="Poppins" w:hAnsi="Poppins" w:cs="Poppins" w:eastAsia="Poppins"/>
+                <w:b w:val="0"/>
+                <w:i w:val="0"/>
+                <w:color w:val="1B3325"/>
+                <w:sz w:val="18"/>
+              </w:rPr>
+              <w:t>$23.000</w:t>
+            </w:r>
+          </w:p>
+        </w:tc>
+        <w:tc>
+          <w:tcPr>
+            <w:tcW w:type="dxa" w:w="2300"/>
+            <w:tcBorders>
+              <w:top w:val="single" w:sz="4" w:space="0" w:color="1B3325"/>
+              <w:left w:val="single" w:sz="4" w:space="0" w:color="1B3325"/>
+              <w:bottom w:val="single" w:sz="4" w:space="0" w:color="1B3325"/>
+              <w:right w:val="single" w:sz="4" w:space="0" w:color="1B3325"/>
+            </w:tcBorders>
+            <w:tcMar>
+              <w:top w:w="40" w:type="dxa"/>
+              <w:left w:w="80" w:type="dxa"/>
+              <w:bottom w:w="40" w:type="dxa"/>
+              <w:right w:w="80" w:type="dxa"/>
+            </w:tcMar>
+            <w:shd w:val="clear" w:color="auto" w:fill="FFFFFF"/>
+            <w:vAlign w:val="center"/>
+          </w:tcPr>
+          <w:p>
+            <w:pPr>
+              <w:spacing w:before="0" w:after="0" w:line="259" w:lineRule="auto"/>
+              <w:jc w:val="center"/>
+              <w:widowControl/>
+              <w:keepNext/>
+            </w:pPr>
+            <w:r/>
+            <w:r>
+              <w:rPr>
+                <w:rFonts w:ascii="Poppins" w:hAnsi="Poppins" w:cs="Poppins" w:eastAsia="Poppins"/>
+                <w:b w:val="0"/>
+                <w:i w:val="0"/>
+                <w:color w:val="1B3325"/>
+                <w:sz w:val="18"/>
+              </w:rPr>
+              <w:t>$230.000</w:t>
+            </w:r>
+          </w:p>
+        </w:tc>
+        <w:tc>
+          <w:tcPr>
+            <w:tcW w:type="dxa" w:w="2300"/>
+            <w:tcBorders>
+              <w:top w:val="single" w:sz="4" w:space="0" w:color="1B3325"/>
+              <w:left w:val="single" w:sz="4" w:space="0" w:color="1B3325"/>
+              <w:bottom w:val="single" w:sz="4" w:space="0" w:color="1B3325"/>
+              <w:right w:val="single" w:sz="4" w:space="0" w:color="1B3325"/>
+            </w:tcBorders>
+            <w:tcMar>
+              <w:top w:w="40" w:type="dxa"/>
+              <w:left w:w="80" w:type="dxa"/>
+              <w:bottom w:w="40" w:type="dxa"/>
+              <w:right w:w="80" w:type="dxa"/>
+            </w:tcMar>
+            <w:shd w:val="clear" w:color="auto" w:fill="FFFFFF"/>
+            <w:vAlign w:val="center"/>
+          </w:tcPr>
+          <w:p>
+            <w:pPr>
+              <w:spacing w:before="0" w:after="0" w:line="259" w:lineRule="auto"/>
+              <w:jc w:val="center"/>
+              <w:widowControl/>
+              <w:keepNext/>
+            </w:pPr>
+            <w:r/>
+            <w:r>
+              <w:rPr>
+                <w:rFonts w:ascii="Poppins" w:hAnsi="Poppins" w:cs="Poppins" w:eastAsia="Poppins"/>
+                <w:b w:val="0"/>
+                <w:i w:val="0"/>
+                <w:color w:val="1B3325"/>
+                <w:sz w:val="18"/>
+              </w:rPr>
+              <w:t>$506.000</w:t>
+            </w:r>
+          </w:p>
+        </w:tc>
+      </w:tr>
+      <w:tr>
+        <w:trPr>
+          <w:cantSplit/>
+        </w:trPr>
+        <w:tc>
+          <w:tcPr>
+            <w:tcW w:type="dxa" w:w="2800"/>
+            <w:tcBorders>
+              <w:top w:val="single" w:sz="4" w:space="0" w:color="1B3325"/>
+              <w:left w:val="single" w:sz="4" w:space="0" w:color="1B3325"/>
+              <w:bottom w:val="single" w:sz="4" w:space="0" w:color="1B3325"/>
+              <w:right w:val="single" w:sz="4" w:space="0" w:color="1B3325"/>
+            </w:tcBorders>
+            <w:tcMar>
+              <w:top w:w="40" w:type="dxa"/>
+              <w:left w:w="80" w:type="dxa"/>
+              <w:bottom w:w="40" w:type="dxa"/>
+              <w:right w:w="80" w:type="dxa"/>
+            </w:tcMar>
+            <w:shd w:val="clear" w:color="auto" w:fill="F7FBF8"/>
+            <w:vAlign w:val="center"/>
+          </w:tcPr>
+          <w:p>
+            <w:pPr>
+              <w:spacing w:before="0" w:after="0" w:line="259" w:lineRule="auto"/>
+              <w:jc w:val="left"/>
+              <w:widowControl/>
+              <w:keepNext/>
+            </w:pPr>
+            <w:r/>
+            <w:r>
+              <w:rPr>
+                <w:rFonts w:ascii="Poppins" w:hAnsi="Poppins" w:cs="Poppins" w:eastAsia="Poppins"/>
+                <w:b/>
+                <w:i w:val="0"/>
+                <w:color w:val="1B3325"/>
+                <w:sz w:val="18"/>
+              </w:rPr>
+              <w:t>CRM</w:t>
+            </w:r>
+            <w:r>
+              <w:rPr>
+                <w:rFonts w:ascii="Poppins" w:hAnsi="Poppins" w:cs="Poppins" w:eastAsia="Poppins"/>
+                <w:b w:val="0"/>
+                <w:i w:val="0"/>
+                <w:color w:val="1B3325"/>
+                <w:sz w:val="18"/>
+              </w:rPr>
+              <w:t xml:space="preserve"> y </w:t>
+            </w:r>
+            <w:r>
+              <w:rPr>
+                <w:rFonts w:ascii="Poppins" w:hAnsi="Poppins" w:cs="Poppins" w:eastAsia="Poppins"/>
+                <w:b/>
+                <w:i w:val="0"/>
+                <w:color w:val="1B3325"/>
+                <w:sz w:val="18"/>
+              </w:rPr>
+              <w:t>ERP</w:t>
+            </w:r>
+            <w:r>
+              <w:rPr>
+                <w:rFonts w:ascii="Poppins" w:hAnsi="Poppins" w:cs="Poppins" w:eastAsia="Poppins"/>
+                <w:b w:val="0"/>
+                <w:i w:val="0"/>
+                <w:color w:val="1B3325"/>
+                <w:sz w:val="18"/>
+              </w:rPr>
+              <w:t xml:space="preserve"> + Drive</w:t>
+            </w:r>
+          </w:p>
+        </w:tc>
+        <w:tc>
+          <w:tcPr>
+            <w:tcW w:type="dxa" w:w="2200"/>
+            <w:tcBorders>
+              <w:top w:val="single" w:sz="4" w:space="0" w:color="1B3325"/>
+              <w:left w:val="single" w:sz="4" w:space="0" w:color="1B3325"/>
+              <w:bottom w:val="single" w:sz="4" w:space="0" w:color="1B3325"/>
+              <w:right w:val="single" w:sz="4" w:space="0" w:color="1B3325"/>
+            </w:tcBorders>
+            <w:tcMar>
+              <w:top w:w="40" w:type="dxa"/>
+              <w:left w:w="80" w:type="dxa"/>
+              <w:bottom w:w="40" w:type="dxa"/>
+              <w:right w:w="80" w:type="dxa"/>
+            </w:tcMar>
+            <w:shd w:val="clear" w:color="auto" w:fill="F7FBF8"/>
+            <w:vAlign w:val="center"/>
+          </w:tcPr>
+          <w:p>
+            <w:pPr>
+              <w:spacing w:before="0" w:after="0" w:line="259" w:lineRule="auto"/>
+              <w:jc w:val="center"/>
+              <w:widowControl/>
+              <w:keepNext/>
+            </w:pPr>
+            <w:r/>
+            <w:r>
+              <w:rPr>
+                <w:rFonts w:ascii="Poppins" w:hAnsi="Poppins" w:cs="Poppins" w:eastAsia="Poppins"/>
+                <w:b w:val="0"/>
+                <w:i w:val="0"/>
+                <w:color w:val="1B3325"/>
+                <w:sz w:val="18"/>
+              </w:rPr>
+              <w:t>$25.000</w:t>
+            </w:r>
+          </w:p>
+        </w:tc>
+        <w:tc>
+          <w:tcPr>
+            <w:tcW w:type="dxa" w:w="2300"/>
+            <w:tcBorders>
+              <w:top w:val="single" w:sz="4" w:space="0" w:color="1B3325"/>
+              <w:left w:val="single" w:sz="4" w:space="0" w:color="1B3325"/>
+              <w:bottom w:val="single" w:sz="4" w:space="0" w:color="1B3325"/>
+              <w:right w:val="single" w:sz="4" w:space="0" w:color="1B3325"/>
+            </w:tcBorders>
+            <w:tcMar>
+              <w:top w:w="40" w:type="dxa"/>
+              <w:left w:w="80" w:type="dxa"/>
+              <w:bottom w:w="40" w:type="dxa"/>
+              <w:right w:w="80" w:type="dxa"/>
+            </w:tcMar>
+            <w:shd w:val="clear" w:color="auto" w:fill="F7FBF8"/>
+            <w:vAlign w:val="center"/>
+          </w:tcPr>
+          <w:p>
+            <w:pPr>
+              <w:spacing w:before="0" w:after="0" w:line="259" w:lineRule="auto"/>
+              <w:jc w:val="center"/>
+              <w:widowControl/>
+              <w:keepNext/>
+            </w:pPr>
+            <w:r/>
+            <w:r>
+              <w:rPr>
+                <w:rFonts w:ascii="Poppins" w:hAnsi="Poppins" w:cs="Poppins" w:eastAsia="Poppins"/>
+                <w:b w:val="0"/>
+                <w:i w:val="0"/>
+                <w:color w:val="1B3325"/>
+                <w:sz w:val="18"/>
+              </w:rPr>
+              <w:t>$250.000</w:t>
+            </w:r>
+          </w:p>
+        </w:tc>
+        <w:tc>
+          <w:tcPr>
+            <w:tcW w:type="dxa" w:w="2300"/>
+            <w:tcBorders>
+              <w:top w:val="single" w:sz="4" w:space="0" w:color="1B3325"/>
+              <w:left w:val="single" w:sz="4" w:space="0" w:color="1B3325"/>
+              <w:bottom w:val="single" w:sz="4" w:space="0" w:color="1B3325"/>
+              <w:right w:val="single" w:sz="4" w:space="0" w:color="1B3325"/>
+            </w:tcBorders>
+            <w:tcMar>
+              <w:top w:w="40" w:type="dxa"/>
+              <w:left w:w="80" w:type="dxa"/>
+              <w:bottom w:w="40" w:type="dxa"/>
+              <w:right w:w="80" w:type="dxa"/>
+            </w:tcMar>
+            <w:shd w:val="clear" w:color="auto" w:fill="F7FBF8"/>
+            <w:vAlign w:val="center"/>
+          </w:tcPr>
+          <w:p>
+            <w:pPr>
+              <w:spacing w:before="0" w:after="0" w:line="259" w:lineRule="auto"/>
+              <w:jc w:val="center"/>
+              <w:widowControl/>
+              <w:keepNext/>
+            </w:pPr>
+            <w:r/>
+            <w:r>
+              <w:rPr>
+                <w:rFonts w:ascii="Poppins" w:hAnsi="Poppins" w:cs="Poppins" w:eastAsia="Poppins"/>
+                <w:b w:val="0"/>
+                <w:i w:val="0"/>
+                <w:color w:val="1B3325"/>
+                <w:sz w:val="18"/>
+              </w:rPr>
+              <w:t>$550.000</w:t>
+            </w:r>
+          </w:p>
+        </w:tc>
+      </w:tr>
+      <w:tr>
+        <w:trPr>
+          <w:cantSplit/>
+        </w:trPr>
+        <w:tc>
+          <w:tcPr>
+            <w:tcW w:type="dxa" w:w="2800"/>
+            <w:tcBorders>
+              <w:top w:val="single" w:sz="4" w:space="0" w:color="1B3325"/>
+              <w:left w:val="single" w:sz="4" w:space="0" w:color="1B3325"/>
+              <w:bottom w:val="single" w:sz="4" w:space="0" w:color="1B3325"/>
+              <w:right w:val="single" w:sz="4" w:space="0" w:color="1B3325"/>
+            </w:tcBorders>
+            <w:tcMar>
+              <w:top w:w="40" w:type="dxa"/>
+              <w:left w:w="80" w:type="dxa"/>
+              <w:bottom w:w="40" w:type="dxa"/>
+              <w:right w:w="80" w:type="dxa"/>
+            </w:tcMar>
+            <w:shd w:val="clear" w:color="auto" w:fill="FFFFFF"/>
+            <w:vAlign w:val="center"/>
+          </w:tcPr>
+          <w:p>
+            <w:pPr>
+              <w:spacing w:before="0" w:after="0" w:line="259" w:lineRule="auto"/>
+              <w:jc w:val="left"/>
+              <w:widowControl/>
+              <w:keepNext/>
+            </w:pPr>
+            <w:r/>
+            <w:r>
+              <w:rPr>
+                <w:rFonts w:ascii="Poppins" w:hAnsi="Poppins" w:cs="Poppins" w:eastAsia="Poppins"/>
+                <w:b w:val="0"/>
+                <w:i w:val="0"/>
+                <w:color w:val="1B3325"/>
+                <w:sz w:val="18"/>
+              </w:rPr>
+              <w:t>Asistencia + Drive</w:t>
+            </w:r>
+          </w:p>
+        </w:tc>
+        <w:tc>
+          <w:tcPr>
+            <w:tcW w:type="dxa" w:w="2200"/>
+            <w:tcBorders>
+              <w:top w:val="single" w:sz="4" w:space="0" w:color="1B3325"/>
+              <w:left w:val="single" w:sz="4" w:space="0" w:color="1B3325"/>
+              <w:bottom w:val="single" w:sz="4" w:space="0" w:color="1B3325"/>
+              <w:right w:val="single" w:sz="4" w:space="0" w:color="1B3325"/>
+            </w:tcBorders>
+            <w:tcMar>
+              <w:top w:w="40" w:type="dxa"/>
+              <w:left w:w="80" w:type="dxa"/>
+              <w:bottom w:w="40" w:type="dxa"/>
+              <w:right w:w="80" w:type="dxa"/>
+            </w:tcMar>
+            <w:shd w:val="clear" w:color="auto" w:fill="FFFFFF"/>
+            <w:vAlign w:val="center"/>
+          </w:tcPr>
+          <w:p>
+            <w:pPr>
+              <w:spacing w:before="0" w:after="0" w:line="259" w:lineRule="auto"/>
+              <w:jc w:val="center"/>
+              <w:widowControl/>
+              <w:keepNext/>
+            </w:pPr>
+            <w:r/>
+            <w:r>
+              <w:rPr>
+                <w:rFonts w:ascii="Poppins" w:hAnsi="Poppins" w:cs="Poppins" w:eastAsia="Poppins"/>
+                <w:b w:val="0"/>
+                <w:i w:val="0"/>
+                <w:color w:val="1B3325"/>
+                <w:sz w:val="18"/>
+              </w:rPr>
+              <w:t>$18.000</w:t>
+            </w:r>
+          </w:p>
+        </w:tc>
+        <w:tc>
+          <w:tcPr>
+            <w:tcW w:type="dxa" w:w="2300"/>
+            <w:tcBorders>
+              <w:top w:val="single" w:sz="4" w:space="0" w:color="1B3325"/>
+              <w:left w:val="single" w:sz="4" w:space="0" w:color="1B3325"/>
+              <w:bottom w:val="single" w:sz="4" w:space="0" w:color="1B3325"/>
+              <w:right w:val="single" w:sz="4" w:space="0" w:color="1B3325"/>
+            </w:tcBorders>
+            <w:tcMar>
+              <w:top w:w="40" w:type="dxa"/>
+              <w:left w:w="80" w:type="dxa"/>
+              <w:bottom w:w="40" w:type="dxa"/>
+              <w:right w:w="80" w:type="dxa"/>
+            </w:tcMar>
+            <w:shd w:val="clear" w:color="auto" w:fill="FFFFFF"/>
+            <w:vAlign w:val="center"/>
+          </w:tcPr>
+          <w:p>
+            <w:pPr>
+              <w:spacing w:before="0" w:after="0" w:line="259" w:lineRule="auto"/>
+              <w:jc w:val="center"/>
+              <w:widowControl/>
+              <w:keepNext/>
+            </w:pPr>
+            <w:r/>
+            <w:r>
+              <w:rPr>
+                <w:rFonts w:ascii="Poppins" w:hAnsi="Poppins" w:cs="Poppins" w:eastAsia="Poppins"/>
+                <w:b w:val="0"/>
+                <w:i w:val="0"/>
+                <w:color w:val="1B3325"/>
+                <w:sz w:val="18"/>
+              </w:rPr>
+              <w:t>$180.000</w:t>
+            </w:r>
+          </w:p>
+        </w:tc>
+        <w:tc>
+          <w:tcPr>
+            <w:tcW w:type="dxa" w:w="2300"/>
+            <w:tcBorders>
+              <w:top w:val="single" w:sz="4" w:space="0" w:color="1B3325"/>
+              <w:left w:val="single" w:sz="4" w:space="0" w:color="1B3325"/>
+              <w:bottom w:val="single" w:sz="4" w:space="0" w:color="1B3325"/>
+              <w:right w:val="single" w:sz="4" w:space="0" w:color="1B3325"/>
+            </w:tcBorders>
+            <w:tcMar>
+              <w:top w:w="40" w:type="dxa"/>
+              <w:left w:w="80" w:type="dxa"/>
+              <w:bottom w:w="40" w:type="dxa"/>
+              <w:right w:w="80" w:type="dxa"/>
+            </w:tcMar>
+            <w:shd w:val="clear" w:color="auto" w:fill="FFFFFF"/>
+            <w:vAlign w:val="center"/>
+          </w:tcPr>
+          <w:p>
+            <w:pPr>
+              <w:spacing w:before="0" w:after="0" w:line="259" w:lineRule="auto"/>
+              <w:jc w:val="center"/>
+              <w:widowControl/>
+              <w:keepNext/>
+            </w:pPr>
+            <w:r/>
+            <w:r>
+              <w:rPr>
+                <w:rFonts w:ascii="Poppins" w:hAnsi="Poppins" w:cs="Poppins" w:eastAsia="Poppins"/>
+                <w:b w:val="0"/>
+                <w:i w:val="0"/>
+                <w:color w:val="1B3325"/>
+                <w:sz w:val="18"/>
+              </w:rPr>
+              <w:t>$396.000</w:t>
+            </w:r>
+          </w:p>
+        </w:tc>
+      </w:tr>
+      <w:tr>
+        <w:trPr>
+          <w:cantSplit/>
+        </w:trPr>
+        <w:tc>
+          <w:tcPr>
+            <w:tcW w:type="dxa" w:w="2800"/>
+            <w:tcBorders>
+              <w:top w:val="single" w:sz="4" w:space="0" w:color="1B3325"/>
+              <w:left w:val="single" w:sz="4" w:space="0" w:color="1B3325"/>
+              <w:bottom w:val="single" w:sz="4" w:space="0" w:color="1B3325"/>
+              <w:right w:val="single" w:sz="4" w:space="0" w:color="1B3325"/>
+            </w:tcBorders>
+            <w:tcMar>
+              <w:top w:w="40" w:type="dxa"/>
+              <w:left w:w="80" w:type="dxa"/>
+              <w:bottom w:w="40" w:type="dxa"/>
+              <w:right w:w="80" w:type="dxa"/>
+            </w:tcMar>
+            <w:shd w:val="clear" w:color="auto" w:fill="F7FBF8"/>
+            <w:vAlign w:val="center"/>
+          </w:tcPr>
+          <w:p>
+            <w:pPr>
+              <w:spacing w:before="0" w:after="0" w:line="259" w:lineRule="auto"/>
+              <w:jc w:val="left"/>
+              <w:widowControl/>
+            </w:pPr>
+            <w:r/>
+            <w:r>
+              <w:rPr>
+                <w:rFonts w:ascii="Poppins" w:hAnsi="Poppins" w:cs="Poppins" w:eastAsia="Poppins"/>
+                <w:b w:val="0"/>
+                <w:i w:val="0"/>
+                <w:color w:val="1B3325"/>
+                <w:sz w:val="18"/>
+              </w:rPr>
+              <w:t>Los tres módulos</w:t>
+            </w:r>
+          </w:p>
+        </w:tc>
+        <w:tc>
+          <w:tcPr>
+            <w:tcW w:type="dxa" w:w="2200"/>
+            <w:tcBorders>
+              <w:top w:val="single" w:sz="4" w:space="0" w:color="1B3325"/>
+              <w:left w:val="single" w:sz="4" w:space="0" w:color="1B3325"/>
+              <w:bottom w:val="single" w:sz="4" w:space="0" w:color="1B3325"/>
+              <w:right w:val="single" w:sz="4" w:space="0" w:color="1B3325"/>
+            </w:tcBorders>
+            <w:tcMar>
+              <w:top w:w="40" w:type="dxa"/>
+              <w:left w:w="80" w:type="dxa"/>
+              <w:bottom w:w="40" w:type="dxa"/>
+              <w:right w:w="80" w:type="dxa"/>
+            </w:tcMar>
+            <w:shd w:val="clear" w:color="auto" w:fill="F7FBF8"/>
+            <w:vAlign w:val="center"/>
+          </w:tcPr>
+          <w:p>
+            <w:pPr>
+              <w:spacing w:before="0" w:after="0" w:line="259" w:lineRule="auto"/>
+              <w:jc w:val="center"/>
+              <w:widowControl/>
+            </w:pPr>
+            <w:r/>
+            <w:r>
+              <w:rPr>
+                <w:rFonts w:ascii="Poppins" w:hAnsi="Poppins" w:cs="Poppins" w:eastAsia="Poppins"/>
+                <w:b w:val="0"/>
+                <w:i w:val="0"/>
+                <w:color w:val="1B3325"/>
+                <w:sz w:val="18"/>
+              </w:rPr>
+              <w:t>$33.000</w:t>
+            </w:r>
+          </w:p>
+        </w:tc>
+        <w:tc>
+          <w:tcPr>
+            <w:tcW w:type="dxa" w:w="2300"/>
+            <w:tcBorders>
+              <w:top w:val="single" w:sz="4" w:space="0" w:color="1B3325"/>
+              <w:left w:val="single" w:sz="4" w:space="0" w:color="1B3325"/>
+              <w:bottom w:val="single" w:sz="4" w:space="0" w:color="1B3325"/>
+              <w:right w:val="single" w:sz="4" w:space="0" w:color="1B3325"/>
+            </w:tcBorders>
+            <w:tcMar>
+              <w:top w:w="40" w:type="dxa"/>
+              <w:left w:w="80" w:type="dxa"/>
+              <w:bottom w:w="40" w:type="dxa"/>
+              <w:right w:w="80" w:type="dxa"/>
+            </w:tcMar>
+            <w:shd w:val="clear" w:color="auto" w:fill="F7FBF8"/>
+            <w:vAlign w:val="center"/>
+          </w:tcPr>
+          <w:p>
+            <w:pPr>
+              <w:spacing w:before="0" w:after="0" w:line="259" w:lineRule="auto"/>
+              <w:jc w:val="center"/>
+              <w:widowControl/>
+            </w:pPr>
+            <w:r/>
+            <w:r>
+              <w:rPr>
+                <w:rFonts w:ascii="Poppins" w:hAnsi="Poppins" w:cs="Poppins" w:eastAsia="Poppins"/>
+                <w:b w:val="0"/>
+                <w:i w:val="0"/>
+                <w:color w:val="1B3325"/>
+                <w:sz w:val="18"/>
+              </w:rPr>
+              <w:t>$330.000</w:t>
+            </w:r>
+          </w:p>
+        </w:tc>
+        <w:tc>
+          <w:tcPr>
+            <w:tcW w:type="dxa" w:w="2300"/>
+            <w:tcBorders>
+              <w:top w:val="single" w:sz="4" w:space="0" w:color="1B3325"/>
+              <w:left w:val="single" w:sz="4" w:space="0" w:color="1B3325"/>
+              <w:bottom w:val="single" w:sz="4" w:space="0" w:color="1B3325"/>
+              <w:right w:val="single" w:sz="4" w:space="0" w:color="1B3325"/>
+            </w:tcBorders>
+            <w:tcMar>
+              <w:top w:w="40" w:type="dxa"/>
+              <w:left w:w="80" w:type="dxa"/>
+              <w:bottom w:w="40" w:type="dxa"/>
+              <w:right w:w="80" w:type="dxa"/>
+            </w:tcMar>
+            <w:shd w:val="clear" w:color="auto" w:fill="F7FBF8"/>
+            <w:vAlign w:val="center"/>
+          </w:tcPr>
+          <w:p>
+            <w:pPr>
+              <w:spacing w:before="0" w:after="0" w:line="259" w:lineRule="auto"/>
+              <w:jc w:val="center"/>
+              <w:widowControl/>
+            </w:pPr>
+            <w:r/>
+            <w:r>
+              <w:rPr>
+                <w:rFonts w:ascii="Poppins" w:hAnsi="Poppins" w:cs="Poppins" w:eastAsia="Poppins"/>
+                <w:b w:val="0"/>
+                <w:i w:val="0"/>
+                <w:color w:val="1B3325"/>
+                <w:sz w:val="18"/>
+              </w:rPr>
+              <w:t>$726.000</w:t>
+            </w:r>
+          </w:p>
+        </w:tc>
+      </w:tr>
+    </w:tbl>
+    <w:p>
+      <w:pPr>
+        <w:spacing w:before="0" w:after="40" w:line="259" w:lineRule="auto"/>
+        <w:jc w:val="left"/>
+        <w:widowControl/>
+      </w:pPr>
+    </w:p>
+    <w:p>
+      <w:pPr>
+        <w:spacing w:before="0" w:after="120" w:line="259" w:lineRule="auto"/>
+        <w:jc w:val="left"/>
+        <w:widowControl/>
+      </w:pPr>
+      <w:r>
+        <w:rPr>
+          <w:rFonts w:ascii="Poppins" w:hAnsi="Poppins" w:cs="Poppins" w:eastAsia="Poppins"/>
+          <w:b w:val="0"/>
+          <w:i w:val="0"/>
+          <w:color w:val="1B3325"/>
+          <w:sz w:val="22"/>
+        </w:rPr>
+        <w:t xml:space="preserve">Para 30 usuarios, el </w:t>
+      </w:r>
+      <w:r>
+        <w:rPr>
+          <w:rFonts w:ascii="Poppins" w:hAnsi="Poppins" w:cs="Poppins" w:eastAsia="Poppins"/>
+          <w:b/>
+          <w:i w:val="0"/>
+          <w:color w:val="1B3325"/>
+          <w:sz w:val="22"/>
+        </w:rPr>
+        <w:t>CRM</w:t>
+      </w:r>
+      <w:r>
+        <w:rPr>
+          <w:rFonts w:ascii="Poppins" w:hAnsi="Poppins" w:cs="Poppins" w:eastAsia="Poppins"/>
+          <w:b w:val="0"/>
+          <w:i w:val="0"/>
+          <w:color w:val="1B3325"/>
+          <w:sz w:val="22"/>
+        </w:rPr>
+        <w:t xml:space="preserve"> y </w:t>
+      </w:r>
+      <w:r>
+        <w:rPr>
+          <w:rFonts w:ascii="Poppins" w:hAnsi="Poppins" w:cs="Poppins" w:eastAsia="Poppins"/>
+          <w:b/>
+          <w:i w:val="0"/>
+          <w:color w:val="1B3325"/>
+          <w:sz w:val="22"/>
+        </w:rPr>
+        <w:t>ERP</w:t>
+      </w:r>
+      <w:r>
+        <w:rPr>
+          <w:rFonts w:ascii="Poppins" w:hAnsi="Poppins" w:cs="Poppins" w:eastAsia="Poppins"/>
+          <w:b w:val="0"/>
+          <w:i w:val="0"/>
+          <w:color w:val="1B3325"/>
+          <w:sz w:val="22"/>
+        </w:rPr>
+        <w:t xml:space="preserve"> solo son $450.000 al mes, la asistencia sola $240.000 y el Drive solo $300.000. Los tres juntos son $990.000 al mes.</w:t>
+      </w:r>
+    </w:p>
+    <w:p>
+      <w:pPr>
+        <w:spacing w:before="160" w:after="40" w:line="259" w:lineRule="auto"/>
+        <w:jc w:val="left"/>
+        <w:keepNext/>
+        <w:widowControl/>
+      </w:pPr>
+      <w:r>
+        <w:rPr>
+          <w:rFonts w:ascii="Poppins" w:hAnsi="Poppins" w:cs="Poppins" w:eastAsia="Poppins"/>
+          <w:b/>
+          <w:i w:val="0"/>
+          <w:color w:val="1B3325"/>
+          <w:sz w:val="26"/>
+        </w:rPr>
+        <w:t>11.3. La VPS y el dominio los coloca el cliente</w:t>
+      </w:r>
+    </w:p>
+    <w:p>
+      <w:pPr>
+        <w:spacing w:before="0" w:after="160" w:line="259" w:lineRule="auto"/>
+        <w:jc w:val="both"/>
+        <w:widowControl/>
+      </w:pPr>
+      <w:r>
+        <w:rPr>
+          <w:rFonts w:ascii="Poppins" w:hAnsi="Poppins" w:cs="Poppins" w:eastAsia="Poppins"/>
+          <w:b w:val="0"/>
+          <w:i w:val="0"/>
+          <w:color w:val="1B3325"/>
+          <w:sz w:val="26"/>
+        </w:rPr>
+        <w:t xml:space="preserve">La mensualidad, la anualidad y la licencia vitalicia son el software de </w:t>
+      </w:r>
+      <w:r>
+        <w:rPr>
+          <w:rFonts w:ascii="Poppins" w:hAnsi="Poppins" w:cs="Poppins" w:eastAsia="Poppins"/>
+          <w:b/>
+          <w:i w:val="0"/>
+          <w:color w:val="1B3325"/>
+          <w:sz w:val="26"/>
+        </w:rPr>
+        <w:t>RecoTime</w:t>
+      </w:r>
+      <w:r>
+        <w:rPr>
+          <w:rFonts w:ascii="Poppins" w:hAnsi="Poppins" w:cs="Poppins" w:eastAsia="Poppins"/>
+          <w:b w:val="0"/>
+          <w:i w:val="0"/>
+          <w:color w:val="1B3325"/>
+          <w:sz w:val="26"/>
+        </w:rPr>
+        <w:t xml:space="preserve">. No incluyen servidor ni dominio. La VPS la coloca el cliente antes de empezar: la contrata, la paga, entrega el acceso y la renueva. El dominio lo coloca del mismo modo. </w:t>
+      </w:r>
+      <w:r>
+        <w:rPr>
+          <w:rFonts w:ascii="Poppins" w:hAnsi="Poppins" w:cs="Poppins" w:eastAsia="Poppins"/>
+          <w:b/>
+          <w:i w:val="0"/>
+          <w:color w:val="1B3325"/>
+          <w:sz w:val="26"/>
+        </w:rPr>
+        <w:t>THE COMPANY DEV</w:t>
+      </w:r>
+      <w:r>
+        <w:rPr>
+          <w:rFonts w:ascii="Poppins" w:hAnsi="Poppins" w:cs="Poppins" w:eastAsia="Poppins"/>
+          <w:b w:val="0"/>
+          <w:i w:val="0"/>
+          <w:color w:val="1B3325"/>
+          <w:sz w:val="26"/>
+        </w:rPr>
+        <w:t xml:space="preserve"> instala el sistema en esa VPS. Si el cliente no ha colocado la VPS y el dominio, el calendario de puesta en marcha no arranca.</w:t>
       </w:r>
     </w:p>
     <w:tbl>
@@ -16259,7 +16961,7 @@
                 <w:color w:val="FFFFFF"/>
                 <w:sz w:val="16"/>
               </w:rPr>
-              <w:t>Quién lo paga</w:t>
+              <w:t>Quién lo coloca</w:t>
             </w:r>
           </w:p>
         </w:tc>
@@ -16340,7 +17042,7 @@
                 <w:color w:val="1B3325"/>
                 <w:sz w:val="16"/>
               </w:rPr>
-              <w:t>VPS Hostinger KVM 1</w:t>
+              <w:t>VPS Hostinger</w:t>
             </w:r>
           </w:p>
         </w:tc>
@@ -16388,7 +17090,7 @@
                 <w:color w:val="1B3325"/>
                 <w:sz w:val="16"/>
               </w:rPr>
-              <w:t>, a Hostinger</w:t>
+              <w:t xml:space="preserve"> la coloca</w:t>
             </w:r>
           </w:p>
         </w:tc>
@@ -16426,7 +17128,7 @@
                 <w:color w:val="1B3325"/>
                 <w:sz w:val="16"/>
               </w:rPr>
-              <w:t>Oferta $19.900 al mes. Renovación $38.900 al mes, $466.800 al año. Disco de 50 GB.</w:t>
+              <w:t>Referencia KVM 1: oferta $19.900 al mes. Renovación $38.900 al mes, $466.800 al año. Disco de 50 GB.</w:t>
             </w:r>
           </w:p>
         </w:tc>
@@ -16517,7 +17219,7 @@
                 <w:color w:val="1B3325"/>
                 <w:sz w:val="16"/>
               </w:rPr>
-              <w:t>, al registrador</w:t>
+              <w:t xml:space="preserve"> lo coloca</w:t>
             </w:r>
           </w:p>
         </w:tc>
@@ -17561,7 +18263,7 @@
                 <w:color w:val="1B3325"/>
                 <w:sz w:val="20"/>
               </w:rPr>
-              <w:t xml:space="preserve">Los paga el cliente. No se facturan dentro de </w:t>
+              <w:t xml:space="preserve">Los coloca el cliente. No se facturan dentro de </w:t>
             </w:r>
             <w:r>
               <w:rPr>
@@ -18356,7 +19058,7 @@
                 <w:color w:val="1B3325"/>
                 <w:sz w:val="16"/>
               </w:rPr>
-              <w:t xml:space="preserve">Los contrata </w:t>
+              <w:t xml:space="preserve">Los coloca </w:t>
             </w:r>
             <w:r>
               <w:rPr>
@@ -18404,7 +19106,27 @@
                 <w:color w:val="1B3325"/>
                 <w:sz w:val="16"/>
               </w:rPr>
-              <w:t>Hostinger publica el KVM. El dominio lo define el registrador.</w:t>
+              <w:t xml:space="preserve">Hostinger publica el KVM. </w:t>
+            </w:r>
+            <w:r>
+              <w:rPr>
+                <w:rFonts w:ascii="Poppins" w:hAnsi="Poppins" w:cs="Poppins" w:eastAsia="Poppins"/>
+                <w:b/>
+                <w:i w:val="0"/>
+                <w:color w:val="1B3325"/>
+                <w:sz w:val="16"/>
+              </w:rPr>
+              <w:t>RecoTime</w:t>
+            </w:r>
+            <w:r>
+              <w:rPr>
+                <w:rFonts w:ascii="Poppins" w:hAnsi="Poppins" w:cs="Poppins" w:eastAsia="Poppins"/>
+                <w:b w:val="0"/>
+                <w:i w:val="0"/>
+                <w:color w:val="1B3325"/>
+                <w:sz w:val="16"/>
+              </w:rPr>
+              <w:t xml:space="preserve"> se instala ahí y no incluye el servidor.</w:t>
             </w:r>
           </w:p>
         </w:tc>
@@ -18684,27 +19406,7 @@
           <w:color w:val="1B3325"/>
           <w:sz w:val="26"/>
         </w:rPr>
-        <w:t xml:space="preserve">Empresa de 30 usuarios activos con los tres módulos, a $60.000 por usuario. La VPS y el dominio no van en la factura de </w:t>
-      </w:r>
-      <w:r>
-        <w:rPr>
-          <w:rFonts w:ascii="Poppins" w:hAnsi="Poppins" w:cs="Poppins" w:eastAsia="Poppins"/>
-          <w:b/>
-          <w:i w:val="0"/>
-          <w:color w:val="1B3325"/>
-          <w:sz w:val="26"/>
-        </w:rPr>
-        <w:t>RecoTime</w:t>
-      </w:r>
-      <w:r>
-        <w:rPr>
-          <w:rFonts w:ascii="Poppins" w:hAnsi="Poppins" w:cs="Poppins" w:eastAsia="Poppins"/>
-          <w:b w:val="0"/>
-          <w:i w:val="0"/>
-          <w:color w:val="1B3325"/>
-          <w:sz w:val="26"/>
-        </w:rPr>
-        <w:t>. Cálculo de este informe.</w:t>
+        <w:t>Empresa de 30 usuarios activos con los tres módulos, a $33.000 por usuario. La factura es solo el software. La VPS y el dominio los coloca el cliente y no entran en estos pagos. Cálculo de este informe.</w:t>
       </w:r>
     </w:p>
     <w:tbl>
@@ -18954,7 +19656,7 @@
                 <w:color w:val="1B3325"/>
                 <w:sz w:val="16"/>
               </w:rPr>
-              <w:t>$1.800.000</w:t>
+              <w:t>$990.000</w:t>
             </w:r>
           </w:p>
         </w:tc>
@@ -18992,7 +19694,7 @@
                 <w:color w:val="1B3325"/>
                 <w:sz w:val="16"/>
               </w:rPr>
-              <w:t>$1.800.000 cada mes</w:t>
+              <w:t>$990.000 cada mes</w:t>
             </w:r>
           </w:p>
         </w:tc>
@@ -19030,7 +19732,7 @@
                 <w:color w:val="1B3325"/>
                 <w:sz w:val="16"/>
               </w:rPr>
-              <w:t>$21.600.000</w:t>
+              <w:t>$11.880.000</w:t>
             </w:r>
           </w:p>
         </w:tc>
@@ -19111,7 +19813,7 @@
                 <w:color w:val="1B3325"/>
                 <w:sz w:val="16"/>
               </w:rPr>
-              <w:t>$18.000.000</w:t>
+              <w:t>$9.900.000</w:t>
             </w:r>
           </w:p>
         </w:tc>
@@ -19149,7 +19851,7 @@
                 <w:color w:val="1B3325"/>
                 <w:sz w:val="16"/>
               </w:rPr>
-              <w:t>$18.000.000 al renovar</w:t>
+              <w:t>$9.900.000 al renovar</w:t>
             </w:r>
           </w:p>
         </w:tc>
@@ -19187,7 +19889,7 @@
                 <w:color w:val="1B3325"/>
                 <w:sz w:val="16"/>
               </w:rPr>
-              <w:t>$18.000.000</w:t>
+              <w:t>$9.900.000</w:t>
             </w:r>
           </w:p>
         </w:tc>
@@ -19268,7 +19970,7 @@
                 <w:color w:val="1B3325"/>
                 <w:sz w:val="16"/>
               </w:rPr>
-              <w:t>$19.800.000 (50 %)</w:t>
+              <w:t>$10.890.000 (50 %)</w:t>
             </w:r>
           </w:p>
         </w:tc>
@@ -19306,7 +20008,7 @@
                 <w:color w:val="1B3325"/>
                 <w:sz w:val="16"/>
               </w:rPr>
-              <w:t>$19.800.000 a la entrega</w:t>
+              <w:t>$10.890.000 a la entrega</w:t>
             </w:r>
           </w:p>
         </w:tc>
@@ -19344,7 +20046,7 @@
                 <w:color w:val="1B3325"/>
                 <w:sz w:val="16"/>
               </w:rPr>
-              <w:t>$39.600.000</w:t>
+              <w:t>$21.780.000</w:t>
             </w:r>
           </w:p>
         </w:tc>
@@ -19423,7 +20125,7 @@
                 <w:color w:val="1B3325"/>
                 <w:sz w:val="16"/>
               </w:rPr>
-              <w:t>$19.800.000 (50 %)</w:t>
+              <w:t>$10.890.000 (50 %)</w:t>
             </w:r>
           </w:p>
         </w:tc>
@@ -19460,7 +20162,7 @@
                 <w:color w:val="1B3325"/>
                 <w:sz w:val="16"/>
               </w:rPr>
-              <w:t>Segundo 50 % a la entrega y $720.000 al mes desde el mes 4</w:t>
+              <w:t>Segundo 50 % a la entrega y $396.000 al mes desde el mes 4</w:t>
             </w:r>
           </w:p>
         </w:tc>
@@ -19497,7 +20199,7 @@
                 <w:color w:val="1B3325"/>
                 <w:sz w:val="16"/>
               </w:rPr>
-              <w:t>$46.080.000</w:t>
+              <w:t>$25.344.000</w:t>
             </w:r>
           </w:p>
         </w:tc>
@@ -19524,7 +20226,7 @@
           <w:color w:val="1B3325"/>
           <w:sz w:val="22"/>
         </w:rPr>
-        <w:t>Los dos pagos de la licencia vitalicia caen en el primer año: $39.600.000. El soporte opcional son nueve meses si el arranque es en enero: 9 × $720.000 = $6.480.000. Sumados a la licencia dan $46.080.000. La VPS KVM 1, si se renueva todo el año, suma $466.800 que el cliente paga a Hostinger, fuera de esta tabla.</w:t>
+        <w:t>Los dos pagos de la licencia vitalicia caen en el primer año: $21.780.000. El soporte opcional son nueve meses si el arranque es en enero: 9 × $396.000 = $3.564.000. Sumados a la licencia dan $25.344.000. La VPS queda fuera de esta tabla: la coloca el cliente. Si renueva un KVM 1 todo el año, paga $466.800 a Hostinger.</w:t>
       </w:r>
     </w:p>
     <w:p>
@@ -19541,7 +20243,47 @@
           <w:color w:val="1B3325"/>
           <w:sz w:val="26"/>
         </w:rPr>
-        <w:t xml:space="preserve">Si esa empresa toma un solo módulo, paga $20.000 por usuario: $600.000 al mes, o $6.000.000 en la anualidad. Dos módulos son $1.200.000 al mes. La licencia regional de Odoo Standard sigue en $28.477 por usuario, $854.297 al mes para 30 usuarios, sin implementación. Los tres módulos de </w:t>
+        <w:t xml:space="preserve">Si esa empresa toma solo el </w:t>
+      </w:r>
+      <w:r>
+        <w:rPr>
+          <w:rFonts w:ascii="Poppins" w:hAnsi="Poppins" w:cs="Poppins" w:eastAsia="Poppins"/>
+          <w:b/>
+          <w:i w:val="0"/>
+          <w:color w:val="1B3325"/>
+          <w:sz w:val="26"/>
+        </w:rPr>
+        <w:t>CRM</w:t>
+      </w:r>
+      <w:r>
+        <w:rPr>
+          <w:rFonts w:ascii="Poppins" w:hAnsi="Poppins" w:cs="Poppins" w:eastAsia="Poppins"/>
+          <w:b w:val="0"/>
+          <w:i w:val="0"/>
+          <w:color w:val="1B3325"/>
+          <w:sz w:val="26"/>
+        </w:rPr>
+        <w:t xml:space="preserve"> y </w:t>
+      </w:r>
+      <w:r>
+        <w:rPr>
+          <w:rFonts w:ascii="Poppins" w:hAnsi="Poppins" w:cs="Poppins" w:eastAsia="Poppins"/>
+          <w:b/>
+          <w:i w:val="0"/>
+          <w:color w:val="1B3325"/>
+          <w:sz w:val="26"/>
+        </w:rPr>
+        <w:t>ERP</w:t>
+      </w:r>
+      <w:r>
+        <w:rPr>
+          <w:rFonts w:ascii="Poppins" w:hAnsi="Poppins" w:cs="Poppins" w:eastAsia="Poppins"/>
+          <w:b w:val="0"/>
+          <w:i w:val="0"/>
+          <w:color w:val="1B3325"/>
+          <w:sz w:val="26"/>
+        </w:rPr>
+        <w:t xml:space="preserve">, paga $15.000 por usuario: $450.000 al mes, o $4.500.000 en la anualidad. La asistencia sola son $240.000 al mes y el Drive solo $300.000. La licencia regional de Odoo Standard sigue en $28.477 por usuario, $854.297 al mes para 30 usuarios, sin implementación. Los tres módulos de </w:t>
       </w:r>
       <w:r>
         <w:rPr>
@@ -19561,7 +20303,7 @@
           <w:color w:val="1B3325"/>
           <w:sz w:val="26"/>
         </w:rPr>
-        <w:t>, $1.800.000 al mes, quedan por encima de esa licencia y cerca de Google Workspace Business Standard para 30 usuarios, $1.752.000 al mes.</w:t>
+        <w:t xml:space="preserve"> son $990.000 al mes. Google Workspace Business Standard, para las mismas 30 personas, son $1.752.000 al mes e incluyen correo y 2 TB por persona.</w:t>
       </w:r>
     </w:p>
     <w:p>
@@ -20381,7 +21123,47 @@
                 <w:color w:val="1B3325"/>
                 <w:sz w:val="20"/>
               </w:rPr>
-              <w:t>Se cobra por usuario activo y por módulo contratado. Un módulo nuevo se suma a $20.000 por usuario.</w:t>
+              <w:t xml:space="preserve">Se cobra por usuario activo y por módulo. </w:t>
+            </w:r>
+            <w:r>
+              <w:rPr>
+                <w:rFonts w:ascii="Poppins" w:hAnsi="Poppins" w:cs="Poppins" w:eastAsia="Poppins"/>
+                <w:b/>
+                <w:i w:val="0"/>
+                <w:color w:val="1B3325"/>
+                <w:sz w:val="20"/>
+              </w:rPr>
+              <w:t>CRM</w:t>
+            </w:r>
+            <w:r>
+              <w:rPr>
+                <w:rFonts w:ascii="Poppins" w:hAnsi="Poppins" w:cs="Poppins" w:eastAsia="Poppins"/>
+                <w:b w:val="0"/>
+                <w:i w:val="0"/>
+                <w:color w:val="1B3325"/>
+                <w:sz w:val="20"/>
+              </w:rPr>
+              <w:t xml:space="preserve"> y </w:t>
+            </w:r>
+            <w:r>
+              <w:rPr>
+                <w:rFonts w:ascii="Poppins" w:hAnsi="Poppins" w:cs="Poppins" w:eastAsia="Poppins"/>
+                <w:b/>
+                <w:i w:val="0"/>
+                <w:color w:val="1B3325"/>
+                <w:sz w:val="20"/>
+              </w:rPr>
+              <w:t>ERP</w:t>
+            </w:r>
+            <w:r>
+              <w:rPr>
+                <w:rFonts w:ascii="Poppins" w:hAnsi="Poppins" w:cs="Poppins" w:eastAsia="Poppins"/>
+                <w:b w:val="0"/>
+                <w:i w:val="0"/>
+                <w:color w:val="1B3325"/>
+                <w:sz w:val="20"/>
+              </w:rPr>
+              <w:t xml:space="preserve"> $15.000, asistencia $8.000, Drive $10.000.</w:t>
             </w:r>
           </w:p>
         </w:tc>
@@ -20460,7 +21242,7 @@
                 <w:color w:val="1B3325"/>
                 <w:sz w:val="20"/>
               </w:rPr>
-              <w:t xml:space="preserve">Los contrata, los paga y los renueva </w:t>
+              <w:t xml:space="preserve">Los coloca </w:t>
             </w:r>
             <w:r>
               <w:rPr>
@@ -20480,7 +21262,7 @@
                 <w:color w:val="1B3325"/>
                 <w:sz w:val="20"/>
               </w:rPr>
-              <w:t>. La cuota de 2 TB no amplía el disco de la VPS.</w:t>
+              <w:t>: los contrata, los paga, entrega el acceso y los renueva. La cuota de 2 TB no amplía el disco.</w:t>
             </w:r>
           </w:p>
         </w:tc>
@@ -20559,7 +21341,7 @@
                 <w:color w:val="1B3325"/>
                 <w:sz w:val="20"/>
               </w:rPr>
-              <w:t>El calendario de 8 a 12 semanas corre cuando llegan el organigrama, los trabajadores, los clientes, el horario, la VPS y el dominio.</w:t>
+              <w:t>El calendario de 8 a 12 semanas corre cuando el cliente ya colocó la VPS y el dominio, y entregó organigrama, trabajadores, clientes y horario.</w:t>
             </w:r>
           </w:p>
         </w:tc>
@@ -20615,7 +21397,7 @@
           <w:color w:val="1B3325"/>
           <w:sz w:val="26"/>
         </w:rPr>
-        <w:t xml:space="preserve">VPS en Hostinger y dominio: </w:t>
+        <w:t xml:space="preserve">VPS y dominio: los coloca </w:t>
       </w:r>
       <w:r>
         <w:rPr>
@@ -20635,7 +21417,7 @@
           <w:color w:val="1B3325"/>
           <w:sz w:val="26"/>
         </w:rPr>
-        <w:t xml:space="preserve"> los contrata, los paga y los renueva. </w:t>
+        <w:t xml:space="preserve">. Los contrata, los paga, entrega el acceso y los renueva. </w:t>
       </w:r>
       <w:r>
         <w:rPr>
@@ -20675,7 +21457,7 @@
           <w:color w:val="1B3325"/>
           <w:sz w:val="26"/>
         </w:rPr>
-        <w:t xml:space="preserve"> en esa VPS y no responde por caídas, lentitud, pérdida de información, vencimientos, renovaciones ni fallas del proveedor. La cuota de 2 TB del Drive es el techo del software. El espacio usable es el disco que traiga la VPS.</w:t>
+        <w:t xml:space="preserve"> en la VPS que el cliente colocó y no responde por caídas, lentitud, pérdida de información, vencimientos, renovaciones ni fallas del proveedor. La cuota de 2 TB del Drive es el techo del software. El espacio usable es el disco de esa VPS.</w:t>
       </w:r>
     </w:p>
     <w:p>
@@ -20961,7 +21743,47 @@
           <w:color w:val="1B3325"/>
           <w:sz w:val="26"/>
         </w:rPr>
-        <w:t>Aprobar los tres módulos a $20.000 por usuario activo al mes cada uno. Los tres juntos son $60.000 por usuario, que es la suma.</w:t>
+        <w:t xml:space="preserve">Aprobar el precio acoplado al mercado: </w:t>
+      </w:r>
+      <w:r>
+        <w:rPr>
+          <w:rFonts w:ascii="Poppins" w:hAnsi="Poppins" w:cs="Poppins" w:eastAsia="Poppins"/>
+          <w:b/>
+          <w:i w:val="0"/>
+          <w:color w:val="1B3325"/>
+          <w:sz w:val="26"/>
+        </w:rPr>
+        <w:t>CRM</w:t>
+      </w:r>
+      <w:r>
+        <w:rPr>
+          <w:rFonts w:ascii="Poppins" w:hAnsi="Poppins" w:cs="Poppins" w:eastAsia="Poppins"/>
+          <w:b w:val="0"/>
+          <w:i w:val="0"/>
+          <w:color w:val="1B3325"/>
+          <w:sz w:val="26"/>
+        </w:rPr>
+        <w:t xml:space="preserve"> y </w:t>
+      </w:r>
+      <w:r>
+        <w:rPr>
+          <w:rFonts w:ascii="Poppins" w:hAnsi="Poppins" w:cs="Poppins" w:eastAsia="Poppins"/>
+          <w:b/>
+          <w:i w:val="0"/>
+          <w:color w:val="1B3325"/>
+          <w:sz w:val="26"/>
+        </w:rPr>
+        <w:t>ERP</w:t>
+      </w:r>
+      <w:r>
+        <w:rPr>
+          <w:rFonts w:ascii="Poppins" w:hAnsi="Poppins" w:cs="Poppins" w:eastAsia="Poppins"/>
+          <w:b w:val="0"/>
+          <w:i w:val="0"/>
+          <w:color w:val="1B3325"/>
+          <w:sz w:val="26"/>
+        </w:rPr>
+        <w:t xml:space="preserve"> $15.000, asistencia $8.000 y Drive $10.000 por usuario activo al mes. Los tres juntos son $33.000 por usuario, que es la suma.</w:t>
       </w:r>
     </w:p>
     <w:p>
@@ -21029,7 +21851,47 @@
           <w:color w:val="1B3325"/>
           <w:sz w:val="26"/>
         </w:rPr>
-        <w:t xml:space="preserve"> de gestión y trazabilidad; el módulo 2 es la asistencia; el módulo 3 es el Drive. Para 30 usuarios, un módulo son $600.000 al mes y los tres son $1.800.000.</w:t>
+        <w:t xml:space="preserve"> de gestión y trazabilidad; el módulo 2 es la asistencia; el módulo 3 es el Drive. Para 30 usuarios, el </w:t>
+      </w:r>
+      <w:r>
+        <w:rPr>
+          <w:rFonts w:ascii="Poppins" w:hAnsi="Poppins" w:cs="Poppins" w:eastAsia="Poppins"/>
+          <w:b/>
+          <w:i w:val="0"/>
+          <w:color w:val="1B3325"/>
+          <w:sz w:val="26"/>
+        </w:rPr>
+        <w:t>CRM</w:t>
+      </w:r>
+      <w:r>
+        <w:rPr>
+          <w:rFonts w:ascii="Poppins" w:hAnsi="Poppins" w:cs="Poppins" w:eastAsia="Poppins"/>
+          <w:b w:val="0"/>
+          <w:i w:val="0"/>
+          <w:color w:val="1B3325"/>
+          <w:sz w:val="26"/>
+        </w:rPr>
+        <w:t xml:space="preserve"> y </w:t>
+      </w:r>
+      <w:r>
+        <w:rPr>
+          <w:rFonts w:ascii="Poppins" w:hAnsi="Poppins" w:cs="Poppins" w:eastAsia="Poppins"/>
+          <w:b/>
+          <w:i w:val="0"/>
+          <w:color w:val="1B3325"/>
+          <w:sz w:val="26"/>
+        </w:rPr>
+        <w:t>ERP</w:t>
+      </w:r>
+      <w:r>
+        <w:rPr>
+          <w:rFonts w:ascii="Poppins" w:hAnsi="Poppins" w:cs="Poppins" w:eastAsia="Poppins"/>
+          <w:b w:val="0"/>
+          <w:i w:val="0"/>
+          <w:color w:val="1B3325"/>
+          <w:sz w:val="26"/>
+        </w:rPr>
+        <w:t xml:space="preserve"> son $450.000 al mes y los tres módulos son $990.000.</w:t>
       </w:r>
     </w:p>
     <w:p>
@@ -21057,7 +21919,7 @@
           <w:color w:val="1B3325"/>
           <w:sz w:val="26"/>
         </w:rPr>
-        <w:t>Leer la sección 10.1 antes de usar la tabla con un cliente: un módulo a $20.000 es viable frente a Odoo y Bitrix24; los tres juntos quedan altos frente a una suite de una sola licencia; la cuota de 2 TB no cabe en el disco de 50 GB del KVM 1.</w:t>
+        <w:t>Usar la sección 10.1 con el cliente: cada módulo cabe en su referencia y los tres juntos quedan entre las dos licencias de Odoo en Colombia. La cuota de 2 TB es el techo del software; el disco usable es el de la VPS que el cliente coloque.</w:t>
       </w:r>
     </w:p>
     <w:p>
@@ -21189,7 +22051,7 @@
           <w:color w:val="1B3325"/>
           <w:sz w:val="26"/>
         </w:rPr>
-        <w:t>Dejar por escrito, en cada propuesta, que la VPS y el dominio los paga el cliente, que la nómina y la factura electrónica quedan por fuera, y que las marcas las registra el trabajador o el supervisor.</w:t>
+        <w:t>Dejar por escrito, en cada propuesta, que la VPS y el dominio los coloca el cliente, que la mensualidad es solo el software, que la nómina y la factura electrónica quedan por fuera, y que las marcas las registra el trabajador o el supervisor.</w:t>
       </w:r>
     </w:p>
     <w:p>

</xml_diff>

<commit_message>
Dejar por escrito que THE COMPANY DEV entrega los 2 TB del Drive.
Co-authored-by: Jhon123Javier <Jhon123Javier@users.noreply.github.com>
</commit_message>
<xml_diff>
--- a/documentos/recotime/Informe The Company Dev - Perfil RecoTime.docx
+++ b/documentos/recotime/Informe The Company Dev - Perfil RecoTime.docx
@@ -668,7 +668,27 @@
                 <w:color w:val="1B3325"/>
                 <w:sz w:val="20"/>
               </w:rPr>
-              <w:t>Intranet de la empresa. Cuota de 2 TB para toda la cuenta.</w:t>
+              <w:t xml:space="preserve">Intranet de la empresa. </w:t>
+            </w:r>
+            <w:r>
+              <w:rPr>
+                <w:rFonts w:ascii="Poppins" w:hAnsi="Poppins" w:cs="Poppins" w:eastAsia="Poppins"/>
+                <w:b/>
+                <w:i w:val="0"/>
+                <w:color w:val="1B3325"/>
+                <w:sz w:val="20"/>
+              </w:rPr>
+              <w:t>THE COMPANY DEV</w:t>
+            </w:r>
+            <w:r>
+              <w:rPr>
+                <w:rFonts w:ascii="Poppins" w:hAnsi="Poppins" w:cs="Poppins" w:eastAsia="Poppins"/>
+                <w:b w:val="0"/>
+                <w:i w:val="0"/>
+                <w:color w:val="1B3325"/>
+                <w:sz w:val="20"/>
+              </w:rPr>
+              <w:t xml:space="preserve"> entrega 2 TB para toda la cuenta.</w:t>
             </w:r>
           </w:p>
         </w:tc>
@@ -842,7 +862,27 @@
           <w:color w:val="1B3325"/>
           <w:sz w:val="26"/>
         </w:rPr>
-        <w:t xml:space="preserve"> no incluye servidor. La renovación del KVM 1 de Hostinger sale en $466.800 al año y trae 50 GB de disco.</w:t>
+        <w:t xml:space="preserve"> no incluye servidor. La renovación del KVM 1 de Hostinger sale en $466.800 al año. Los 2 TB del Drive los entrega </w:t>
+      </w:r>
+      <w:r>
+        <w:rPr>
+          <w:rFonts w:ascii="Poppins" w:hAnsi="Poppins" w:cs="Poppins" w:eastAsia="Poppins"/>
+          <w:b/>
+          <w:i w:val="0"/>
+          <w:color w:val="1B3325"/>
+          <w:sz w:val="26"/>
+        </w:rPr>
+        <w:t>THE COMPANY DEV</w:t>
+      </w:r>
+      <w:r>
+        <w:rPr>
+          <w:rFonts w:ascii="Poppins" w:hAnsi="Poppins" w:cs="Poppins" w:eastAsia="Poppins"/>
+          <w:b w:val="0"/>
+          <w:i w:val="0"/>
+          <w:color w:val="1B3325"/>
+          <w:sz w:val="26"/>
+        </w:rPr>
+        <w:t>.</w:t>
       </w:r>
     </w:p>
     <w:p>
@@ -1031,7 +1071,27 @@
           <w:color w:val="1B3325"/>
           <w:sz w:val="26"/>
         </w:rPr>
-        <w:t>El módulo Drive es la intranet de la empresa. Ahí se guarda la información de la gestión: documentos, manuales, actas, formatos y las carpetas de cada área. Cada persona ve lo que su rol permite. La cuota incluida es de 2 TB para toda la cuenta, compartida. No son 2 TB por usuario.</w:t>
+        <w:t xml:space="preserve">El módulo Drive es la intranet de la empresa. Ahí se guarda la información de la gestión: documentos, manuales, actas, formatos y las carpetas de cada área. Cada persona ve lo que su rol permite. </w:t>
+      </w:r>
+      <w:r>
+        <w:rPr>
+          <w:rFonts w:ascii="Poppins" w:hAnsi="Poppins" w:cs="Poppins" w:eastAsia="Poppins"/>
+          <w:b/>
+          <w:i w:val="0"/>
+          <w:color w:val="1B3325"/>
+          <w:sz w:val="26"/>
+        </w:rPr>
+        <w:t>THE COMPANY DEV</w:t>
+      </w:r>
+      <w:r>
+        <w:rPr>
+          <w:rFonts w:ascii="Poppins" w:hAnsi="Poppins" w:cs="Poppins" w:eastAsia="Poppins"/>
+          <w:b w:val="0"/>
+          <w:i w:val="0"/>
+          <w:color w:val="1B3325"/>
+          <w:sz w:val="26"/>
+        </w:rPr>
+        <w:t xml:space="preserve"> entrega los 2 TB sí o sí. Son 2 TB para toda la cuenta, no por usuario.</w:t>
       </w:r>
     </w:p>
     <w:p>
@@ -9172,7 +9232,27 @@
           <w:color w:val="1B3325"/>
           <w:sz w:val="26"/>
         </w:rPr>
-        <w:t>Fuente: hostinger.com/co/precios/vps-hosting, abierta el 14 de octubre de 2026. La página muestra una oferta al mes y una renovación. La pregunta frecuente usa la oferta: KVM 1 en $19.900, KVM 2 en $28.900, KVM 4 en $38.900 y KVM 8 en $77.900. La tarjeta de cada plan dice a cuánto se renueva. El disco publicado es NVMe y, en esta lista, no llega a 2 TB. El ancho de banda de 4 TB del KVM 1 es tráfico, no espacio para guardar archivos.</w:t>
+        <w:t xml:space="preserve">Fuente: hostinger.com/co/precios/vps-hosting, abierta el 14 de octubre de 2026. La página muestra una oferta al mes y una renovación. La pregunta frecuente usa la oferta: KVM 1 en $19.900, KVM 2 en $28.900, KVM 4 en $38.900 y KVM 8 en $77.900. La tarjeta de cada plan dice a cuánto se renueva. El disco publicado es NVMe. El ancho de banda de 4 TB del KVM 1 es tráfico, no espacio para guardar archivos. Los 2 TB del Drive no dependen de ese disco: los entrega </w:t>
+      </w:r>
+      <w:r>
+        <w:rPr>
+          <w:rFonts w:ascii="Poppins" w:hAnsi="Poppins" w:cs="Poppins" w:eastAsia="Poppins"/>
+          <w:b/>
+          <w:i w:val="0"/>
+          <w:color w:val="1B3325"/>
+          <w:sz w:val="26"/>
+        </w:rPr>
+        <w:t>THE COMPANY DEV</w:t>
+      </w:r>
+      <w:r>
+        <w:rPr>
+          <w:rFonts w:ascii="Poppins" w:hAnsi="Poppins" w:cs="Poppins" w:eastAsia="Poppins"/>
+          <w:b w:val="0"/>
+          <w:i w:val="0"/>
+          <w:color w:val="1B3325"/>
+          <w:sz w:val="26"/>
+        </w:rPr>
+        <w:t>.</w:t>
       </w:r>
     </w:p>
     <w:tbl>
@@ -13142,7 +13222,27 @@
                 <w:color w:val="1B3325"/>
                 <w:sz w:val="16"/>
               </w:rPr>
-              <w:t>Los coloca el cliente. La cuota de 2 TB no amplía ese disco.</w:t>
+              <w:t xml:space="preserve">Los coloca el cliente. Los 2 TB del Drive los entrega </w:t>
+            </w:r>
+            <w:r>
+              <w:rPr>
+                <w:rFonts w:ascii="Poppins" w:hAnsi="Poppins" w:cs="Poppins" w:eastAsia="Poppins"/>
+                <w:b/>
+                <w:i w:val="0"/>
+                <w:color w:val="1B3325"/>
+                <w:sz w:val="16"/>
+              </w:rPr>
+              <w:t>THE COMPANY DEV</w:t>
+            </w:r>
+            <w:r>
+              <w:rPr>
+                <w:rFonts w:ascii="Poppins" w:hAnsi="Poppins" w:cs="Poppins" w:eastAsia="Poppins"/>
+                <w:b w:val="0"/>
+                <w:i w:val="0"/>
+                <w:color w:val="1B3325"/>
+                <w:sz w:val="16"/>
+              </w:rPr>
+              <w:t>.</w:t>
             </w:r>
           </w:p>
         </w:tc>
@@ -13189,7 +13289,7 @@
           <w:color w:val="1B3325"/>
           <w:sz w:val="26"/>
         </w:rPr>
-        <w:t xml:space="preserve"> juntos son $33.000 por usuario. El Drive de </w:t>
+        <w:t xml:space="preserve"> juntos son $33.000 por usuario. Con el Drive, </w:t>
       </w:r>
       <w:r>
         <w:rPr>
@@ -13199,7 +13299,7 @@
           <w:color w:val="1B3325"/>
           <w:sz w:val="26"/>
         </w:rPr>
-        <w:t>RecoTime</w:t>
+        <w:t>THE COMPANY DEV</w:t>
       </w:r>
       <w:r>
         <w:rPr>
@@ -13209,7 +13309,7 @@
           <w:color w:val="1B3325"/>
           <w:sz w:val="26"/>
         </w:rPr>
-        <w:t xml:space="preserve"> es una intranet de 2 TB para toda la cuenta, no 2 TB por cabeza.</w:t>
+        <w:t xml:space="preserve"> entrega 2 TB para toda la cuenta.</w:t>
       </w:r>
     </w:p>
     <w:p>
@@ -13266,7 +13366,27 @@
           <w:color w:val="1B3325"/>
           <w:sz w:val="26"/>
         </w:rPr>
-        <w:t xml:space="preserve"> se hace en esa VPS y no se factura como hosting. La referencia de $500.000 al año corresponde a la renovación del KVM 1, $466.800. Ese plan trae 50 GB de disco. La cuota de 2 TB del Drive es el techo del software. El espacio usable es el disco de la VPS que el cliente haya colocado.</w:t>
+        <w:t xml:space="preserve"> se hace en esa VPS y no se factura como hosting. La referencia de $500.000 al año corresponde a la renovación del KVM 1, $466.800. Los 2 TB del Drive los entrega </w:t>
+      </w:r>
+      <w:r>
+        <w:rPr>
+          <w:rFonts w:ascii="Poppins" w:hAnsi="Poppins" w:cs="Poppins" w:eastAsia="Poppins"/>
+          <w:b/>
+          <w:i w:val="0"/>
+          <w:color w:val="1B3325"/>
+          <w:sz w:val="26"/>
+        </w:rPr>
+        <w:t>THE COMPANY DEV</w:t>
+      </w:r>
+      <w:r>
+        <w:rPr>
+          <w:rFonts w:ascii="Poppins" w:hAnsi="Poppins" w:cs="Poppins" w:eastAsia="Poppins"/>
+          <w:b w:val="0"/>
+          <w:i w:val="0"/>
+          <w:color w:val="1B3325"/>
+          <w:sz w:val="26"/>
+        </w:rPr>
+        <w:t>, sí o sí, con ese módulo.</w:t>
       </w:r>
     </w:p>
     <w:p>
@@ -17378,12 +17498,22 @@
             <w:r>
               <w:rPr>
                 <w:rFonts w:ascii="Poppins" w:hAnsi="Poppins" w:cs="Poppins" w:eastAsia="Poppins"/>
-                <w:b w:val="0"/>
+                <w:b/>
                 <w:i w:val="0"/>
                 <w:color w:val="1B3325"/>
                 <w:sz w:val="16"/>
               </w:rPr>
-              <w:t>Es el techo del software. El espacio usable es el disco de la VPS.</w:t>
+              <w:t>THE COMPANY DEV</w:t>
+            </w:r>
+            <w:r>
+              <w:rPr>
+                <w:rFonts w:ascii="Poppins" w:hAnsi="Poppins" w:cs="Poppins" w:eastAsia="Poppins"/>
+                <w:b w:val="0"/>
+                <w:i w:val="0"/>
+                <w:color w:val="1B3325"/>
+                <w:sz w:val="16"/>
+              </w:rPr>
+              <w:t xml:space="preserve"> los entrega sí o sí con el módulo Drive. Son 2 TB para toda la cuenta.</w:t>
             </w:r>
           </w:p>
         </w:tc>
@@ -17410,7 +17540,27 @@
           <w:color w:val="1B3325"/>
           <w:sz w:val="22"/>
         </w:rPr>
-        <w:t>KVM 8, el plan más alto de esa página, trae 400 GB y se renueva en $2.026.800 al año. Ninguna VPS de la lista pública llega a 2 TB. La propuesta al cliente debe decir que la cuota de 2 TB se usa hasta donde el disco contratado lo permita.</w:t>
+        <w:t xml:space="preserve">KVM 8, el plan más alto de esa página, se renueva en $2.026.800 al año. Esa tabla es el costo de la VPS que coloca el cliente. Los 2 TB del Drive los entrega </w:t>
+      </w:r>
+      <w:r>
+        <w:rPr>
+          <w:rFonts w:ascii="Poppins" w:hAnsi="Poppins" w:cs="Poppins" w:eastAsia="Poppins"/>
+          <w:b/>
+          <w:i w:val="0"/>
+          <w:color w:val="1B3325"/>
+          <w:sz w:val="22"/>
+        </w:rPr>
+        <w:t>THE COMPANY DEV</w:t>
+      </w:r>
+      <w:r>
+        <w:rPr>
+          <w:rFonts w:ascii="Poppins" w:hAnsi="Poppins" w:cs="Poppins" w:eastAsia="Poppins"/>
+          <w:b w:val="0"/>
+          <w:i w:val="0"/>
+          <w:color w:val="1B3325"/>
+          <w:sz w:val="22"/>
+        </w:rPr>
+        <w:t>, sí o sí.</w:t>
       </w:r>
     </w:p>
     <w:p>
@@ -18103,7 +18253,27 @@
                 <w:color w:val="1B3325"/>
                 <w:sz w:val="20"/>
               </w:rPr>
-              <w:t>Se cotiza. El disco adicional lo contrata el cliente en su VPS.</w:t>
+              <w:t xml:space="preserve">Se cotiza. Los 2 TB del Drive los entrega </w:t>
+            </w:r>
+            <w:r>
+              <w:rPr>
+                <w:rFonts w:ascii="Poppins" w:hAnsi="Poppins" w:cs="Poppins" w:eastAsia="Poppins"/>
+                <w:b/>
+                <w:i w:val="0"/>
+                <w:color w:val="1B3325"/>
+                <w:sz w:val="20"/>
+              </w:rPr>
+              <w:t>THE COMPANY DEV</w:t>
+            </w:r>
+            <w:r>
+              <w:rPr>
+                <w:rFonts w:ascii="Poppins" w:hAnsi="Poppins" w:cs="Poppins" w:eastAsia="Poppins"/>
+                <w:b w:val="0"/>
+                <w:i w:val="0"/>
+                <w:color w:val="1B3325"/>
+                <w:sz w:val="20"/>
+              </w:rPr>
+              <w:t>.</w:t>
             </w:r>
           </w:p>
         </w:tc>
@@ -21262,7 +21432,7 @@
                 <w:color w:val="1B3325"/>
                 <w:sz w:val="20"/>
               </w:rPr>
-              <w:t>: los contrata, los paga, entrega el acceso y los renueva. La cuota de 2 TB no amplía el disco.</w:t>
+              <w:t>: los contrata, los paga, entrega el acceso y los renueva.</w:t>
             </w:r>
           </w:p>
         </w:tc>
@@ -21304,7 +21474,7 @@
                 <w:color w:val="1B3325"/>
                 <w:sz w:val="20"/>
               </w:rPr>
-              <w:t>Información de la empresa</w:t>
+              <w:t>2 TB del Drive</w:t>
             </w:r>
           </w:p>
         </w:tc>
@@ -21324,6 +21494,105 @@
               <w:right w:w="80" w:type="dxa"/>
             </w:tcMar>
             <w:shd w:val="clear" w:color="auto" w:fill="FFFFFF"/>
+            <w:vAlign w:val="center"/>
+          </w:tcPr>
+          <w:p>
+            <w:pPr>
+              <w:spacing w:before="0" w:after="0" w:line="259" w:lineRule="auto"/>
+              <w:jc w:val="left"/>
+              <w:widowControl/>
+            </w:pPr>
+            <w:r/>
+            <w:r>
+              <w:rPr>
+                <w:rFonts w:ascii="Poppins" w:hAnsi="Poppins" w:cs="Poppins" w:eastAsia="Poppins"/>
+                <w:b w:val="0"/>
+                <w:i w:val="0"/>
+                <w:color w:val="1B3325"/>
+                <w:sz w:val="20"/>
+              </w:rPr>
+              <w:t xml:space="preserve">Los entrega </w:t>
+            </w:r>
+            <w:r>
+              <w:rPr>
+                <w:rFonts w:ascii="Poppins" w:hAnsi="Poppins" w:cs="Poppins" w:eastAsia="Poppins"/>
+                <w:b/>
+                <w:i w:val="0"/>
+                <w:color w:val="1B3325"/>
+                <w:sz w:val="20"/>
+              </w:rPr>
+              <w:t>THE COMPANY DEV</w:t>
+            </w:r>
+            <w:r>
+              <w:rPr>
+                <w:rFonts w:ascii="Poppins" w:hAnsi="Poppins" w:cs="Poppins" w:eastAsia="Poppins"/>
+                <w:b w:val="0"/>
+                <w:i w:val="0"/>
+                <w:color w:val="1B3325"/>
+                <w:sz w:val="20"/>
+              </w:rPr>
+              <w:t>, sí o sí, cuando el cliente toma el módulo Drive.</w:t>
+            </w:r>
+          </w:p>
+        </w:tc>
+      </w:tr>
+      <w:tr>
+        <w:trPr>
+          <w:cantSplit/>
+        </w:trPr>
+        <w:tc>
+          <w:tcPr>
+            <w:tcW w:type="dxa" w:w="2800"/>
+            <w:tcBorders>
+              <w:top w:val="single" w:sz="4" w:space="0" w:color="1B3325"/>
+              <w:left w:val="single" w:sz="4" w:space="0" w:color="1B3325"/>
+              <w:bottom w:val="single" w:sz="4" w:space="0" w:color="1B3325"/>
+              <w:right w:val="single" w:sz="4" w:space="0" w:color="1B3325"/>
+            </w:tcBorders>
+            <w:tcMar>
+              <w:top w:w="40" w:type="dxa"/>
+              <w:left w:w="80" w:type="dxa"/>
+              <w:bottom w:w="40" w:type="dxa"/>
+              <w:right w:w="80" w:type="dxa"/>
+            </w:tcMar>
+            <w:shd w:val="clear" w:color="auto" w:fill="F7FBF8"/>
+            <w:vAlign w:val="center"/>
+          </w:tcPr>
+          <w:p>
+            <w:pPr>
+              <w:spacing w:before="0" w:after="0" w:line="259" w:lineRule="auto"/>
+              <w:jc w:val="left"/>
+              <w:widowControl/>
+            </w:pPr>
+            <w:r/>
+            <w:r>
+              <w:rPr>
+                <w:rFonts w:ascii="Poppins" w:hAnsi="Poppins" w:cs="Poppins" w:eastAsia="Poppins"/>
+                <w:b w:val="0"/>
+                <w:i w:val="0"/>
+                <w:color w:val="1B3325"/>
+                <w:sz w:val="20"/>
+              </w:rPr>
+              <w:t>Información de la empresa</w:t>
+            </w:r>
+          </w:p>
+        </w:tc>
+        <w:tc>
+          <w:tcPr>
+            <w:tcW w:type="dxa" w:w="6800"/>
+            <w:tcBorders>
+              <w:top w:val="single" w:sz="4" w:space="0" w:color="1B3325"/>
+              <w:left w:val="single" w:sz="4" w:space="0" w:color="1B3325"/>
+              <w:bottom w:val="single" w:sz="4" w:space="0" w:color="1B3325"/>
+              <w:right w:val="single" w:sz="4" w:space="0" w:color="1B3325"/>
+            </w:tcBorders>
+            <w:tcMar>
+              <w:top w:w="40" w:type="dxa"/>
+              <w:left w:w="80" w:type="dxa"/>
+              <w:bottom w:w="40" w:type="dxa"/>
+              <w:right w:w="80" w:type="dxa"/>
+            </w:tcMar>
+            <w:shd w:val="clear" w:color="auto" w:fill="F7FBF8"/>
             <w:vAlign w:val="center"/>
           </w:tcPr>
           <w:p>
@@ -21457,7 +21726,27 @@
           <w:color w:val="1B3325"/>
           <w:sz w:val="26"/>
         </w:rPr>
-        <w:t xml:space="preserve"> en la VPS que el cliente colocó y no responde por caídas, lentitud, pérdida de información, vencimientos, renovaciones ni fallas del proveedor. La cuota de 2 TB del Drive es el techo del software. El espacio usable es el disco de esa VPS.</w:t>
+        <w:t xml:space="preserve"> en la VPS que el cliente colocó y no responde por caídas, lentitud, pérdida de información, vencimientos, renovaciones ni fallas del proveedor. Los 2 TB del Drive los entrega </w:t>
+      </w:r>
+      <w:r>
+        <w:rPr>
+          <w:rFonts w:ascii="Poppins" w:hAnsi="Poppins" w:cs="Poppins" w:eastAsia="Poppins"/>
+          <w:b/>
+          <w:i w:val="0"/>
+          <w:color w:val="1B3325"/>
+          <w:sz w:val="26"/>
+        </w:rPr>
+        <w:t>THE COMPANY DEV</w:t>
+      </w:r>
+      <w:r>
+        <w:rPr>
+          <w:rFonts w:ascii="Poppins" w:hAnsi="Poppins" w:cs="Poppins" w:eastAsia="Poppins"/>
+          <w:b w:val="0"/>
+          <w:i w:val="0"/>
+          <w:color w:val="1B3325"/>
+          <w:sz w:val="26"/>
+        </w:rPr>
+        <w:t>, sí o sí.</w:t>
       </w:r>
     </w:p>
     <w:p>
@@ -21919,7 +22208,27 @@
           <w:color w:val="1B3325"/>
           <w:sz w:val="26"/>
         </w:rPr>
-        <w:t>Usar la sección 10.1 con el cliente: cada módulo cabe en su referencia y los tres juntos quedan entre las dos licencias de Odoo en Colombia. La cuota de 2 TB es el techo del software; el disco usable es el de la VPS que el cliente coloque.</w:t>
+        <w:t xml:space="preserve">Usar la sección 10.1 con el cliente: cada módulo cabe en su referencia y los tres juntos quedan entre las dos licencias de Odoo en Colombia. Los 2 TB del Drive los entrega </w:t>
+      </w:r>
+      <w:r>
+        <w:rPr>
+          <w:rFonts w:ascii="Poppins" w:hAnsi="Poppins" w:cs="Poppins" w:eastAsia="Poppins"/>
+          <w:b/>
+          <w:i w:val="0"/>
+          <w:color w:val="1B3325"/>
+          <w:sz w:val="26"/>
+        </w:rPr>
+        <w:t>THE COMPANY DEV</w:t>
+      </w:r>
+      <w:r>
+        <w:rPr>
+          <w:rFonts w:ascii="Poppins" w:hAnsi="Poppins" w:cs="Poppins" w:eastAsia="Poppins"/>
+          <w:b w:val="0"/>
+          <w:i w:val="0"/>
+          <w:color w:val="1B3325"/>
+          <w:sz w:val="26"/>
+        </w:rPr>
+        <w:t>, sí o sí.</w:t>
       </w:r>
     </w:p>
     <w:p>

</xml_diff>

<commit_message>
Reescribir el resumen, la misión y la visión, y precisar el CRM y la parte social.
Co-authored-by: Jhon123Javier <Jhon123Javier@users.noreply.github.com>
</commit_message>
<xml_diff>
--- a/documentos/recotime/Informe The Company Dev - Perfil RecoTime.docx
+++ b/documentos/recotime/Informe The Company Dev - Perfil RecoTime.docx
@@ -164,37 +164,7 @@
           <w:color w:val="1B3325"/>
           <w:sz w:val="26"/>
         </w:rPr>
-        <w:t>CRM</w:t>
-      </w:r>
-      <w:r>
-        <w:rPr>
-          <w:rFonts w:ascii="Poppins" w:hAnsi="Poppins" w:cs="Poppins" w:eastAsia="Poppins"/>
-          <w:b/>
-          <w:i w:val="0"/>
-          <w:color w:val="1B3325"/>
-          <w:sz w:val="26"/>
-        </w:rPr>
-        <w:t xml:space="preserve"> y </w:t>
-      </w:r>
-      <w:r>
-        <w:rPr>
-          <w:rFonts w:ascii="Poppins" w:hAnsi="Poppins" w:cs="Poppins" w:eastAsia="Poppins"/>
-          <w:b/>
-          <w:i w:val="0"/>
-          <w:color w:val="1B3325"/>
-          <w:sz w:val="26"/>
-        </w:rPr>
-        <w:t>ERP</w:t>
-      </w:r>
-      <w:r>
-        <w:rPr>
-          <w:rFonts w:ascii="Poppins" w:hAnsi="Poppins" w:cs="Poppins" w:eastAsia="Poppins"/>
-          <w:b/>
-          <w:i w:val="0"/>
-          <w:color w:val="1B3325"/>
-          <w:sz w:val="26"/>
-        </w:rPr>
-        <w:t xml:space="preserve"> de gestión, con trazabilidad, asistencia e intranet Drive</w:t>
+        <w:t>Trazabilidad de clientes, chat interno, jornada e intranet Drive</w:t>
       </w:r>
     </w:p>
     <w:p>
@@ -246,7 +216,7 @@
           <w:color w:val="1B3325"/>
           <w:sz w:val="26"/>
         </w:rPr>
-        <w:t xml:space="preserve">Este informe presenta a la directiva el perfil de </w:t>
+        <w:t xml:space="preserve">Este informe define </w:t>
       </w:r>
       <w:r>
         <w:rPr>
@@ -266,7 +236,7 @@
           <w:color w:val="1B3325"/>
           <w:sz w:val="26"/>
         </w:rPr>
-        <w:t xml:space="preserve">, el sistema de </w:t>
+        <w:t xml:space="preserve">, fija el alcance de esta versión y sostiene el precio contra tarifas públicas leídas el 14 de octubre de 2026. Lo usa la directiva de </w:t>
       </w:r>
       <w:r>
         <w:rPr>
@@ -286,8 +256,16 @@
           <w:color w:val="1B3325"/>
           <w:sz w:val="26"/>
         </w:rPr>
-        <w:t xml:space="preserve"> que reúne el </w:t>
+        <w:t xml:space="preserve"> para aprobar la oferta. Las secciones 2 y 3 dicen para qué existe el sistema. La sección 9 trae el mercado. La sección 11 trae el precio. La sección 17 explica la parte social.</w:t>
       </w:r>
+    </w:p>
+    <w:p>
+      <w:pPr>
+        <w:spacing w:before="160" w:after="40" w:line="259" w:lineRule="auto"/>
+        <w:jc w:val="left"/>
+        <w:keepNext/>
+        <w:widowControl/>
+      </w:pPr>
       <w:r>
         <w:rPr>
           <w:rFonts w:ascii="Poppins" w:hAnsi="Poppins" w:cs="Poppins" w:eastAsia="Poppins"/>
@@ -296,7 +274,24 @@
           <w:color w:val="1B3325"/>
           <w:sz w:val="26"/>
         </w:rPr>
-        <w:t>CRM</w:t>
+        <w:t>Qué es</w:t>
+      </w:r>
+    </w:p>
+    <w:p>
+      <w:pPr>
+        <w:spacing w:before="0" w:after="160" w:line="259" w:lineRule="auto"/>
+        <w:jc w:val="both"/>
+        <w:widowControl/>
+      </w:pPr>
+      <w:r>
+        <w:rPr>
+          <w:rFonts w:ascii="Poppins" w:hAnsi="Poppins" w:cs="Poppins" w:eastAsia="Poppins"/>
+          <w:b/>
+          <w:i w:val="0"/>
+          <w:color w:val="1B3325"/>
+          <w:sz w:val="26"/>
+        </w:rPr>
+        <w:t>RecoTime</w:t>
       </w:r>
       <w:r>
         <w:rPr>
@@ -306,7 +301,7 @@
           <w:color w:val="1B3325"/>
           <w:sz w:val="26"/>
         </w:rPr>
-        <w:t xml:space="preserve"> y el </w:t>
+        <w:t xml:space="preserve"> es el sistema de gestión de la empresa. El módulo 1 lleva la trazabilidad de la gestión de cada cliente y el chat interno de la compañía, junto con el </w:t>
       </w:r>
       <w:r>
         <w:rPr>
@@ -326,44 +321,7 @@
           <w:color w:val="1B3325"/>
           <w:sz w:val="26"/>
         </w:rPr>
-        <w:t xml:space="preserve"> de gestión en una sola operación. Sirve para llevar clientes y procesos, la trazabilidad de cada trabajador, la asistencia del día y el módulo Drive, la intranet donde queda guardada la información de la empresa. También reúne los precios públicos de Odoo, Bitrix24, Google Workspace y Hostinger, y la lista que se propone aprobar: sistema completo o módulos sueltos.</w:t>
-      </w:r>
-    </w:p>
-    <w:p>
-      <w:pPr>
-        <w:spacing w:before="0" w:after="160" w:line="259" w:lineRule="auto"/>
-        <w:jc w:val="both"/>
-        <w:widowControl/>
-      </w:pPr>
-      <w:r>
-        <w:rPr>
-          <w:rFonts w:ascii="Poppins" w:hAnsi="Poppins" w:cs="Poppins" w:eastAsia="Poppins"/>
-          <w:b w:val="0"/>
-          <w:i w:val="0"/>
-          <w:color w:val="1B3325"/>
-          <w:sz w:val="26"/>
-        </w:rPr>
-        <w:t xml:space="preserve">La propuesta comercial tiene tres modalidades, con la configuración y la capacitación incluidas: suscripción mensual, anualidad y licencia vitalicia. Los valores de </w:t>
-      </w:r>
-      <w:r>
-        <w:rPr>
-          <w:rFonts w:ascii="Poppins" w:hAnsi="Poppins" w:cs="Poppins" w:eastAsia="Poppins"/>
-          <w:b/>
-          <w:i w:val="0"/>
-          <w:color w:val="1B3325"/>
-          <w:sz w:val="26"/>
-        </w:rPr>
-        <w:t>RecoTime</w:t>
-      </w:r>
-      <w:r>
-        <w:rPr>
-          <w:rFonts w:ascii="Poppins" w:hAnsi="Poppins" w:cs="Poppins" w:eastAsia="Poppins"/>
-          <w:b w:val="0"/>
-          <w:i w:val="0"/>
-          <w:color w:val="1B3325"/>
-          <w:sz w:val="26"/>
-        </w:rPr>
-        <w:t xml:space="preserve"> que aparecen desde la sección 11 son una recomendación de este informe. Los de la sección 9 son cifras leídas en páginas públicas el 14 de octubre de 2026, pasadas a pesos con la TRM de $3.181,74 de ese día.</w:t>
+        <w:t xml:space="preserve"> de áreas, cargos y procesos. El módulo 2 registra la jornada: llegada, almuerzo, descansos y salida. El módulo 3 es el Drive, la intranet de documentos. La nómina y la contabilidad quedan en el programa que la empresa ya use.</w:t>
       </w:r>
     </w:p>
     <w:tbl>
@@ -374,10 +332,9 @@
         <w:tblLook w:firstColumn="1" w:firstRow="1" w:lastColumn="0" w:lastRow="0" w:noHBand="0" w:noVBand="1" w:val="04A0"/>
       </w:tblPr>
       <w:tblGrid>
-        <w:gridCol w:w="2400"/>
-        <w:gridCol w:w="2400"/>
-        <w:gridCol w:w="2400"/>
-        <w:gridCol w:w="2400"/>
+        <w:gridCol w:w="2500"/>
+        <w:gridCol w:w="5100"/>
+        <w:gridCol w:w="2000"/>
       </w:tblGrid>
       <w:tr>
         <w:trPr>
@@ -386,7 +343,7 @@
         </w:trPr>
         <w:tc>
           <w:tcPr>
-            <w:tcW w:type="dxa" w:w="2400"/>
+            <w:tcW w:type="dxa" w:w="2500"/>
             <w:tcBorders>
               <w:top w:val="single" w:sz="4" w:space="0" w:color="1B3325"/>
               <w:left w:val="single" w:sz="4" w:space="0" w:color="1B3325"/>
@@ -416,35 +373,15 @@
                 <w:b/>
                 <w:i w:val="0"/>
                 <w:color w:val="FFFFFF"/>
-                <w:sz w:val="20"/>
-              </w:rPr>
-              <w:t>CRM</w:t>
-            </w:r>
-            <w:r>
-              <w:rPr>
-                <w:rFonts w:ascii="Poppins" w:hAnsi="Poppins" w:cs="Poppins" w:eastAsia="Poppins"/>
-                <w:b/>
-                <w:i w:val="0"/>
-                <w:color w:val="FFFFFF"/>
-                <w:sz w:val="20"/>
-              </w:rPr>
-              <w:t xml:space="preserve"> y </w:t>
-            </w:r>
-            <w:r>
-              <w:rPr>
-                <w:rFonts w:ascii="Poppins" w:hAnsi="Poppins" w:cs="Poppins" w:eastAsia="Poppins"/>
-                <w:b/>
-                <w:i w:val="0"/>
-                <w:color w:val="FFFFFF"/>
-                <w:sz w:val="20"/>
-              </w:rPr>
-              <w:t>ERP</w:t>
+                <w:sz w:val="18"/>
+              </w:rPr>
+              <w:t>Módulo</w:t>
             </w:r>
           </w:p>
         </w:tc>
         <w:tc>
           <w:tcPr>
-            <w:tcW w:type="dxa" w:w="2400"/>
+            <w:tcW w:type="dxa" w:w="5100"/>
             <w:tcBorders>
               <w:top w:val="single" w:sz="4" w:space="0" w:color="1B3325"/>
               <w:left w:val="single" w:sz="4" w:space="0" w:color="1B3325"/>
@@ -474,15 +411,15 @@
                 <w:b/>
                 <w:i w:val="0"/>
                 <w:color w:val="FFFFFF"/>
-                <w:sz w:val="20"/>
-              </w:rPr>
-              <w:t>Asistencia</w:t>
+                <w:sz w:val="18"/>
+              </w:rPr>
+              <w:t>Qué queda registrado</w:t>
             </w:r>
           </w:p>
         </w:tc>
         <w:tc>
           <w:tcPr>
-            <w:tcW w:type="dxa" w:w="2400"/>
+            <w:tcW w:type="dxa" w:w="2000"/>
             <w:tcBorders>
               <w:top w:val="single" w:sz="4" w:space="0" w:color="1B3325"/>
               <w:left w:val="single" w:sz="4" w:space="0" w:color="1B3325"/>
@@ -512,47 +449,9 @@
                 <w:b/>
                 <w:i w:val="0"/>
                 <w:color w:val="FFFFFF"/>
-                <w:sz w:val="20"/>
-              </w:rPr>
-              <w:t>Drive, 2 TB</w:t>
-            </w:r>
-          </w:p>
-        </w:tc>
-        <w:tc>
-          <w:tcPr>
-            <w:tcW w:type="dxa" w:w="2400"/>
-            <w:tcBorders>
-              <w:top w:val="single" w:sz="4" w:space="0" w:color="1B3325"/>
-              <w:left w:val="single" w:sz="4" w:space="0" w:color="1B3325"/>
-              <w:bottom w:val="single" w:sz="4" w:space="0" w:color="1B3325"/>
-              <w:right w:val="single" w:sz="4" w:space="0" w:color="1B3325"/>
-            </w:tcBorders>
-            <w:tcMar>
-              <w:top w:w="40" w:type="dxa"/>
-              <w:left w:w="80" w:type="dxa"/>
-              <w:bottom w:w="40" w:type="dxa"/>
-              <w:right w:w="80" w:type="dxa"/>
-            </w:tcMar>
-            <w:shd w:val="clear" w:color="auto" w:fill="1B3325"/>
-            <w:vAlign w:val="center"/>
-          </w:tcPr>
-          <w:p>
-            <w:pPr>
-              <w:spacing w:before="0" w:after="0" w:line="259" w:lineRule="auto"/>
-              <w:jc w:val="center"/>
-              <w:widowControl/>
-              <w:keepNext/>
-            </w:pPr>
-            <w:r/>
-            <w:r>
-              <w:rPr>
-                <w:rFonts w:ascii="Poppins" w:hAnsi="Poppins" w:cs="Poppins" w:eastAsia="Poppins"/>
-                <w:b/>
-                <w:i w:val="0"/>
-                <w:color w:val="FFFFFF"/>
-                <w:sz w:val="20"/>
-              </w:rPr>
-              <w:t>Por usuario</w:t>
+                <w:sz w:val="18"/>
+              </w:rPr>
+              <w:t>Por usuario al mes</w:t>
             </w:r>
           </w:p>
         </w:tc>
@@ -563,7 +462,7 @@
         </w:trPr>
         <w:tc>
           <w:tcPr>
-            <w:tcW w:type="dxa" w:w="2400"/>
+            <w:tcW w:type="dxa" w:w="2500"/>
             <w:tcBorders>
               <w:top w:val="single" w:sz="4" w:space="0" w:color="1B3325"/>
               <w:left w:val="single" w:sz="4" w:space="0" w:color="1B3325"/>
@@ -584,6 +483,7 @@
               <w:spacing w:before="0" w:after="0" w:line="259" w:lineRule="auto"/>
               <w:jc w:val="left"/>
               <w:widowControl/>
+              <w:keepNext/>
             </w:pPr>
             <w:r/>
             <w:r>
@@ -592,15 +492,55 @@
                 <w:b w:val="0"/>
                 <w:i w:val="0"/>
                 <w:color w:val="1B3325"/>
-                <w:sz w:val="20"/>
-              </w:rPr>
-              <w:t>Clientes, procesos, áreas y el tablero de la operación.</w:t>
+                <w:sz w:val="18"/>
+              </w:rPr>
+              <w:t xml:space="preserve">1. </w:t>
+            </w:r>
+            <w:r>
+              <w:rPr>
+                <w:rFonts w:ascii="Poppins" w:hAnsi="Poppins" w:cs="Poppins" w:eastAsia="Poppins"/>
+                <w:b/>
+                <w:i w:val="0"/>
+                <w:color w:val="1B3325"/>
+                <w:sz w:val="18"/>
+              </w:rPr>
+              <w:t>CRM</w:t>
+            </w:r>
+            <w:r>
+              <w:rPr>
+                <w:rFonts w:ascii="Poppins" w:hAnsi="Poppins" w:cs="Poppins" w:eastAsia="Poppins"/>
+                <w:b w:val="0"/>
+                <w:i w:val="0"/>
+                <w:color w:val="1B3325"/>
+                <w:sz w:val="18"/>
+              </w:rPr>
+              <w:t xml:space="preserve"> y </w:t>
+            </w:r>
+            <w:r>
+              <w:rPr>
+                <w:rFonts w:ascii="Poppins" w:hAnsi="Poppins" w:cs="Poppins" w:eastAsia="Poppins"/>
+                <w:b/>
+                <w:i w:val="0"/>
+                <w:color w:val="1B3325"/>
+                <w:sz w:val="18"/>
+              </w:rPr>
+              <w:t>ERP</w:t>
+            </w:r>
+            <w:r>
+              <w:rPr>
+                <w:rFonts w:ascii="Poppins" w:hAnsi="Poppins" w:cs="Poppins" w:eastAsia="Poppins"/>
+                <w:b w:val="0"/>
+                <w:i w:val="0"/>
+                <w:color w:val="1B3325"/>
+                <w:sz w:val="18"/>
+              </w:rPr>
+              <w:t xml:space="preserve"> de gestión</w:t>
             </w:r>
           </w:p>
         </w:tc>
         <w:tc>
           <w:tcPr>
-            <w:tcW w:type="dxa" w:w="2400"/>
+            <w:tcW w:type="dxa" w:w="5100"/>
             <w:tcBorders>
               <w:top w:val="single" w:sz="4" w:space="0" w:color="1B3325"/>
               <w:left w:val="single" w:sz="4" w:space="0" w:color="1B3325"/>
@@ -621,6 +561,7 @@
               <w:spacing w:before="0" w:after="0" w:line="259" w:lineRule="auto"/>
               <w:jc w:val="left"/>
               <w:widowControl/>
+              <w:keepNext/>
             </w:pPr>
             <w:r/>
             <w:r>
@@ -629,15 +570,177 @@
                 <w:b w:val="0"/>
                 <w:i w:val="0"/>
                 <w:color w:val="1B3325"/>
-                <w:sz w:val="20"/>
-              </w:rPr>
-              <w:t>Llegada, almuerzo, descansos y salida, persona por persona.</w:t>
+                <w:sz w:val="18"/>
+              </w:rPr>
+              <w:t>Expediente del cliente, chat interno, áreas, cargos, procesos y trazabilidad del trabajador.</w:t>
             </w:r>
           </w:p>
         </w:tc>
         <w:tc>
           <w:tcPr>
-            <w:tcW w:type="dxa" w:w="2400"/>
+            <w:tcW w:type="dxa" w:w="2000"/>
+            <w:tcBorders>
+              <w:top w:val="single" w:sz="4" w:space="0" w:color="1B3325"/>
+              <w:left w:val="single" w:sz="4" w:space="0" w:color="1B3325"/>
+              <w:bottom w:val="single" w:sz="4" w:space="0" w:color="1B3325"/>
+              <w:right w:val="single" w:sz="4" w:space="0" w:color="1B3325"/>
+            </w:tcBorders>
+            <w:tcMar>
+              <w:top w:w="40" w:type="dxa"/>
+              <w:left w:w="80" w:type="dxa"/>
+              <w:bottom w:w="40" w:type="dxa"/>
+              <w:right w:w="80" w:type="dxa"/>
+            </w:tcMar>
+            <w:shd w:val="clear" w:color="auto" w:fill="FFFFFF"/>
+            <w:vAlign w:val="center"/>
+          </w:tcPr>
+          <w:p>
+            <w:pPr>
+              <w:spacing w:before="0" w:after="0" w:line="259" w:lineRule="auto"/>
+              <w:jc w:val="center"/>
+              <w:widowControl/>
+              <w:keepNext/>
+            </w:pPr>
+            <w:r/>
+            <w:r>
+              <w:rPr>
+                <w:rFonts w:ascii="Poppins" w:hAnsi="Poppins" w:cs="Poppins" w:eastAsia="Poppins"/>
+                <w:b w:val="0"/>
+                <w:i w:val="0"/>
+                <w:color w:val="1B3325"/>
+                <w:sz w:val="18"/>
+              </w:rPr>
+              <w:t>$15.000</w:t>
+            </w:r>
+          </w:p>
+        </w:tc>
+      </w:tr>
+      <w:tr>
+        <w:trPr>
+          <w:cantSplit/>
+        </w:trPr>
+        <w:tc>
+          <w:tcPr>
+            <w:tcW w:type="dxa" w:w="2500"/>
+            <w:tcBorders>
+              <w:top w:val="single" w:sz="4" w:space="0" w:color="1B3325"/>
+              <w:left w:val="single" w:sz="4" w:space="0" w:color="1B3325"/>
+              <w:bottom w:val="single" w:sz="4" w:space="0" w:color="1B3325"/>
+              <w:right w:val="single" w:sz="4" w:space="0" w:color="1B3325"/>
+            </w:tcBorders>
+            <w:tcMar>
+              <w:top w:w="40" w:type="dxa"/>
+              <w:left w:w="80" w:type="dxa"/>
+              <w:bottom w:w="40" w:type="dxa"/>
+              <w:right w:w="80" w:type="dxa"/>
+            </w:tcMar>
+            <w:shd w:val="clear" w:color="auto" w:fill="F7FBF8"/>
+            <w:vAlign w:val="center"/>
+          </w:tcPr>
+          <w:p>
+            <w:pPr>
+              <w:spacing w:before="0" w:after="0" w:line="259" w:lineRule="auto"/>
+              <w:jc w:val="left"/>
+              <w:widowControl/>
+              <w:keepNext/>
+            </w:pPr>
+            <w:r/>
+            <w:r>
+              <w:rPr>
+                <w:rFonts w:ascii="Poppins" w:hAnsi="Poppins" w:cs="Poppins" w:eastAsia="Poppins"/>
+                <w:b w:val="0"/>
+                <w:i w:val="0"/>
+                <w:color w:val="1B3325"/>
+                <w:sz w:val="18"/>
+              </w:rPr>
+              <w:t>2. Asistencia</w:t>
+            </w:r>
+          </w:p>
+        </w:tc>
+        <w:tc>
+          <w:tcPr>
+            <w:tcW w:type="dxa" w:w="5100"/>
+            <w:tcBorders>
+              <w:top w:val="single" w:sz="4" w:space="0" w:color="1B3325"/>
+              <w:left w:val="single" w:sz="4" w:space="0" w:color="1B3325"/>
+              <w:bottom w:val="single" w:sz="4" w:space="0" w:color="1B3325"/>
+              <w:right w:val="single" w:sz="4" w:space="0" w:color="1B3325"/>
+            </w:tcBorders>
+            <w:tcMar>
+              <w:top w:w="40" w:type="dxa"/>
+              <w:left w:w="80" w:type="dxa"/>
+              <w:bottom w:w="40" w:type="dxa"/>
+              <w:right w:w="80" w:type="dxa"/>
+            </w:tcMar>
+            <w:shd w:val="clear" w:color="auto" w:fill="F7FBF8"/>
+            <w:vAlign w:val="center"/>
+          </w:tcPr>
+          <w:p>
+            <w:pPr>
+              <w:spacing w:before="0" w:after="0" w:line="259" w:lineRule="auto"/>
+              <w:jc w:val="left"/>
+              <w:widowControl/>
+              <w:keepNext/>
+            </w:pPr>
+            <w:r/>
+            <w:r>
+              <w:rPr>
+                <w:rFonts w:ascii="Poppins" w:hAnsi="Poppins" w:cs="Poppins" w:eastAsia="Poppins"/>
+                <w:b w:val="0"/>
+                <w:i w:val="0"/>
+                <w:color w:val="1B3325"/>
+                <w:sz w:val="18"/>
+              </w:rPr>
+              <w:t>Llegada, inicio y fin de almuerzo, descansos y salida, con fecha y hora.</w:t>
+            </w:r>
+          </w:p>
+        </w:tc>
+        <w:tc>
+          <w:tcPr>
+            <w:tcW w:type="dxa" w:w="2000"/>
+            <w:tcBorders>
+              <w:top w:val="single" w:sz="4" w:space="0" w:color="1B3325"/>
+              <w:left w:val="single" w:sz="4" w:space="0" w:color="1B3325"/>
+              <w:bottom w:val="single" w:sz="4" w:space="0" w:color="1B3325"/>
+              <w:right w:val="single" w:sz="4" w:space="0" w:color="1B3325"/>
+            </w:tcBorders>
+            <w:tcMar>
+              <w:top w:w="40" w:type="dxa"/>
+              <w:left w:w="80" w:type="dxa"/>
+              <w:bottom w:w="40" w:type="dxa"/>
+              <w:right w:w="80" w:type="dxa"/>
+            </w:tcMar>
+            <w:shd w:val="clear" w:color="auto" w:fill="F7FBF8"/>
+            <w:vAlign w:val="center"/>
+          </w:tcPr>
+          <w:p>
+            <w:pPr>
+              <w:spacing w:before="0" w:after="0" w:line="259" w:lineRule="auto"/>
+              <w:jc w:val="center"/>
+              <w:widowControl/>
+              <w:keepNext/>
+            </w:pPr>
+            <w:r/>
+            <w:r>
+              <w:rPr>
+                <w:rFonts w:ascii="Poppins" w:hAnsi="Poppins" w:cs="Poppins" w:eastAsia="Poppins"/>
+                <w:b w:val="0"/>
+                <w:i w:val="0"/>
+                <w:color w:val="1B3325"/>
+                <w:sz w:val="18"/>
+              </w:rPr>
+              <w:t>$8.000</w:t>
+            </w:r>
+          </w:p>
+        </w:tc>
+      </w:tr>
+      <w:tr>
+        <w:trPr>
+          <w:cantSplit/>
+        </w:trPr>
+        <w:tc>
+          <w:tcPr>
+            <w:tcW w:type="dxa" w:w="2500"/>
             <w:tcBorders>
               <w:top w:val="single" w:sz="4" w:space="0" w:color="1B3325"/>
               <w:left w:val="single" w:sz="4" w:space="0" w:color="1B3325"/>
@@ -658,6 +761,7 @@
               <w:spacing w:before="0" w:after="0" w:line="259" w:lineRule="auto"/>
               <w:jc w:val="left"/>
               <w:widowControl/>
+              <w:keepNext/>
             </w:pPr>
             <w:r/>
             <w:r>
@@ -666,35 +770,15 @@
                 <w:b w:val="0"/>
                 <w:i w:val="0"/>
                 <w:color w:val="1B3325"/>
-                <w:sz w:val="20"/>
-              </w:rPr>
-              <w:t xml:space="preserve">Intranet de la empresa. </w:t>
-            </w:r>
-            <w:r>
-              <w:rPr>
-                <w:rFonts w:ascii="Poppins" w:hAnsi="Poppins" w:cs="Poppins" w:eastAsia="Poppins"/>
-                <w:b/>
-                <w:i w:val="0"/>
-                <w:color w:val="1B3325"/>
-                <w:sz w:val="20"/>
-              </w:rPr>
-              <w:t>THE COMPANY DEV</w:t>
-            </w:r>
-            <w:r>
-              <w:rPr>
-                <w:rFonts w:ascii="Poppins" w:hAnsi="Poppins" w:cs="Poppins" w:eastAsia="Poppins"/>
-                <w:b w:val="0"/>
-                <w:i w:val="0"/>
-                <w:color w:val="1B3325"/>
-                <w:sz w:val="20"/>
-              </w:rPr>
-              <w:t xml:space="preserve"> entrega 2 TB para toda la cuenta.</w:t>
+                <w:sz w:val="18"/>
+              </w:rPr>
+              <w:t>3. Drive</w:t>
             </w:r>
           </w:p>
         </w:tc>
         <w:tc>
           <w:tcPr>
-            <w:tcW w:type="dxa" w:w="2400"/>
+            <w:tcW w:type="dxa" w:w="5100"/>
             <w:tcBorders>
               <w:top w:val="single" w:sz="4" w:space="0" w:color="1B3325"/>
               <w:left w:val="single" w:sz="4" w:space="0" w:color="1B3325"/>
@@ -715,17 +799,28 @@
               <w:spacing w:before="0" w:after="0" w:line="259" w:lineRule="auto"/>
               <w:jc w:val="left"/>
               <w:widowControl/>
+              <w:keepNext/>
             </w:pPr>
             <w:r/>
             <w:r>
               <w:rPr>
                 <w:rFonts w:ascii="Poppins" w:hAnsi="Poppins" w:cs="Poppins" w:eastAsia="Poppins"/>
+                <w:b w:val="0"/>
+                <w:i w:val="0"/>
+                <w:color w:val="1B3325"/>
+                <w:sz w:val="18"/>
+              </w:rPr>
+              <w:t xml:space="preserve">Intranet de documentos. </w:t>
+            </w:r>
+            <w:r>
+              <w:rPr>
+                <w:rFonts w:ascii="Poppins" w:hAnsi="Poppins" w:cs="Poppins" w:eastAsia="Poppins"/>
                 <w:b/>
                 <w:i w:val="0"/>
                 <w:color w:val="1B3325"/>
-                <w:sz w:val="20"/>
-              </w:rPr>
-              <w:t>CRM</w:t>
+                <w:sz w:val="18"/>
+              </w:rPr>
+              <w:t>THE COMPANY DEV</w:t>
             </w:r>
             <w:r>
               <w:rPr>
@@ -733,29 +828,163 @@
                 <w:b w:val="0"/>
                 <w:i w:val="0"/>
                 <w:color w:val="1B3325"/>
-                <w:sz w:val="20"/>
-              </w:rPr>
-              <w:t xml:space="preserve"> y </w:t>
-            </w:r>
-            <w:r>
-              <w:rPr>
-                <w:rFonts w:ascii="Poppins" w:hAnsi="Poppins" w:cs="Poppins" w:eastAsia="Poppins"/>
-                <w:b/>
+                <w:sz w:val="18"/>
+              </w:rPr>
+              <w:t xml:space="preserve"> entrega 2 TB para toda la cuenta.</w:t>
+            </w:r>
+          </w:p>
+        </w:tc>
+        <w:tc>
+          <w:tcPr>
+            <w:tcW w:type="dxa" w:w="2000"/>
+            <w:tcBorders>
+              <w:top w:val="single" w:sz="4" w:space="0" w:color="1B3325"/>
+              <w:left w:val="single" w:sz="4" w:space="0" w:color="1B3325"/>
+              <w:bottom w:val="single" w:sz="4" w:space="0" w:color="1B3325"/>
+              <w:right w:val="single" w:sz="4" w:space="0" w:color="1B3325"/>
+            </w:tcBorders>
+            <w:tcMar>
+              <w:top w:w="40" w:type="dxa"/>
+              <w:left w:w="80" w:type="dxa"/>
+              <w:bottom w:w="40" w:type="dxa"/>
+              <w:right w:w="80" w:type="dxa"/>
+            </w:tcMar>
+            <w:shd w:val="clear" w:color="auto" w:fill="FFFFFF"/>
+            <w:vAlign w:val="center"/>
+          </w:tcPr>
+          <w:p>
+            <w:pPr>
+              <w:spacing w:before="0" w:after="0" w:line="259" w:lineRule="auto"/>
+              <w:jc w:val="center"/>
+              <w:widowControl/>
+              <w:keepNext/>
+            </w:pPr>
+            <w:r/>
+            <w:r>
+              <w:rPr>
+                <w:rFonts w:ascii="Poppins" w:hAnsi="Poppins" w:cs="Poppins" w:eastAsia="Poppins"/>
+                <w:b w:val="0"/>
                 <w:i w:val="0"/>
                 <w:color w:val="1B3325"/>
-                <w:sz w:val="20"/>
-              </w:rPr>
-              <w:t>ERP</w:t>
-            </w:r>
+                <w:sz w:val="18"/>
+              </w:rPr>
+              <w:t>$10.000</w:t>
+            </w:r>
+          </w:p>
+        </w:tc>
+      </w:tr>
+      <w:tr>
+        <w:trPr>
+          <w:cantSplit/>
+        </w:trPr>
+        <w:tc>
+          <w:tcPr>
+            <w:tcW w:type="dxa" w:w="2500"/>
+            <w:tcBorders>
+              <w:top w:val="single" w:sz="4" w:space="0" w:color="1B3325"/>
+              <w:left w:val="single" w:sz="4" w:space="0" w:color="1B3325"/>
+              <w:bottom w:val="single" w:sz="4" w:space="0" w:color="1B3325"/>
+              <w:right w:val="single" w:sz="4" w:space="0" w:color="1B3325"/>
+            </w:tcBorders>
+            <w:tcMar>
+              <w:top w:w="40" w:type="dxa"/>
+              <w:left w:w="80" w:type="dxa"/>
+              <w:bottom w:w="40" w:type="dxa"/>
+              <w:right w:w="80" w:type="dxa"/>
+            </w:tcMar>
+            <w:shd w:val="clear" w:color="auto" w:fill="F7FBF8"/>
+            <w:vAlign w:val="center"/>
+          </w:tcPr>
+          <w:p>
+            <w:pPr>
+              <w:spacing w:before="0" w:after="0" w:line="259" w:lineRule="auto"/>
+              <w:jc w:val="left"/>
+              <w:widowControl/>
+            </w:pPr>
+            <w:r/>
             <w:r>
               <w:rPr>
                 <w:rFonts w:ascii="Poppins" w:hAnsi="Poppins" w:cs="Poppins" w:eastAsia="Poppins"/>
                 <w:b w:val="0"/>
                 <w:i w:val="0"/>
                 <w:color w:val="1B3325"/>
-                <w:sz w:val="20"/>
-              </w:rPr>
-              <w:t xml:space="preserve"> $15.000. Asistencia $8.000. Drive $10.000. Los tres: $33.000.</w:t>
+                <w:sz w:val="18"/>
+              </w:rPr>
+              <w:t>Los tres</w:t>
+            </w:r>
+          </w:p>
+        </w:tc>
+        <w:tc>
+          <w:tcPr>
+            <w:tcW w:type="dxa" w:w="5100"/>
+            <w:tcBorders>
+              <w:top w:val="single" w:sz="4" w:space="0" w:color="1B3325"/>
+              <w:left w:val="single" w:sz="4" w:space="0" w:color="1B3325"/>
+              <w:bottom w:val="single" w:sz="4" w:space="0" w:color="1B3325"/>
+              <w:right w:val="single" w:sz="4" w:space="0" w:color="1B3325"/>
+            </w:tcBorders>
+            <w:tcMar>
+              <w:top w:w="40" w:type="dxa"/>
+              <w:left w:w="80" w:type="dxa"/>
+              <w:bottom w:w="40" w:type="dxa"/>
+              <w:right w:w="80" w:type="dxa"/>
+            </w:tcMar>
+            <w:shd w:val="clear" w:color="auto" w:fill="F7FBF8"/>
+            <w:vAlign w:val="center"/>
+          </w:tcPr>
+          <w:p>
+            <w:pPr>
+              <w:spacing w:before="0" w:after="0" w:line="259" w:lineRule="auto"/>
+              <w:jc w:val="left"/>
+              <w:widowControl/>
+            </w:pPr>
+            <w:r/>
+            <w:r>
+              <w:rPr>
+                <w:rFonts w:ascii="Poppins" w:hAnsi="Poppins" w:cs="Poppins" w:eastAsia="Poppins"/>
+                <w:b w:val="0"/>
+                <w:i w:val="0"/>
+                <w:color w:val="1B3325"/>
+                <w:sz w:val="18"/>
+              </w:rPr>
+              <w:t>Suma de los módulos. Puesta en marcha y capacitación incluidas.</w:t>
+            </w:r>
+          </w:p>
+        </w:tc>
+        <w:tc>
+          <w:tcPr>
+            <w:tcW w:type="dxa" w:w="2000"/>
+            <w:tcBorders>
+              <w:top w:val="single" w:sz="4" w:space="0" w:color="1B3325"/>
+              <w:left w:val="single" w:sz="4" w:space="0" w:color="1B3325"/>
+              <w:bottom w:val="single" w:sz="4" w:space="0" w:color="1B3325"/>
+              <w:right w:val="single" w:sz="4" w:space="0" w:color="1B3325"/>
+            </w:tcBorders>
+            <w:tcMar>
+              <w:top w:w="40" w:type="dxa"/>
+              <w:left w:w="80" w:type="dxa"/>
+              <w:bottom w:w="40" w:type="dxa"/>
+              <w:right w:w="80" w:type="dxa"/>
+            </w:tcMar>
+            <w:shd w:val="clear" w:color="auto" w:fill="F7FBF8"/>
+            <w:vAlign w:val="center"/>
+          </w:tcPr>
+          <w:p>
+            <w:pPr>
+              <w:spacing w:before="0" w:after="0" w:line="259" w:lineRule="auto"/>
+              <w:jc w:val="center"/>
+              <w:widowControl/>
+            </w:pPr>
+            <w:r/>
+            <w:r>
+              <w:rPr>
+                <w:rFonts w:ascii="Poppins" w:hAnsi="Poppins" w:cs="Poppins" w:eastAsia="Poppins"/>
+                <w:b w:val="0"/>
+                <w:i w:val="0"/>
+                <w:color w:val="1B3325"/>
+                <w:sz w:val="18"/>
+              </w:rPr>
+              <w:t>$33.000</w:t>
             </w:r>
           </w:p>
         </w:tc>
@@ -767,6 +996,24 @@
         <w:jc w:val="left"/>
         <w:widowControl/>
       </w:pPr>
+    </w:p>
+    <w:p>
+      <w:pPr>
+        <w:spacing w:before="160" w:after="40" w:line="259" w:lineRule="auto"/>
+        <w:jc w:val="left"/>
+        <w:keepNext/>
+        <w:widowControl/>
+      </w:pPr>
+      <w:r>
+        <w:rPr>
+          <w:rFonts w:ascii="Poppins" w:hAnsi="Poppins" w:cs="Poppins" w:eastAsia="Poppins"/>
+          <w:b/>
+          <w:i w:val="0"/>
+          <w:color w:val="1B3325"/>
+          <w:sz w:val="26"/>
+        </w:rPr>
+        <w:t>Precio y límites</w:t>
+      </w:r>
     </w:p>
     <w:p>
       <w:pPr>
@@ -782,48 +1029,15 @@
           <w:color w:val="1B3325"/>
           <w:sz w:val="26"/>
         </w:rPr>
-        <w:t xml:space="preserve">La directriz de $20.000 por módulo dejaba los tres en $60.000 por usuario, por encima de una suite que cobra una sola licencia. El precio que este informe recomienda es $15.000 para </w:t>
+        <w:t>Para 30 usuarios, los tres módulos son $990.000 al mes. La licencia de Odoo Standard en Colombia queda en $28.477 por usuario, sin implementación. La directriz de $20.000 por módulo sumaba $60.000 y dejaba el sistema completo por encima de esa licencia de una sola vez. El precio de esta tabla es el ajuste de la sección 10.1. Hay tres formas de pago: mensual, anualidad de 10 meses por 12, y licencia vitalicia de 22 mensualidades.</w:t>
       </w:r>
-      <w:r>
-        <w:rPr>
-          <w:rFonts w:ascii="Poppins" w:hAnsi="Poppins" w:cs="Poppins" w:eastAsia="Poppins"/>
-          <w:b/>
-          <w:i w:val="0"/>
-          <w:color w:val="1B3325"/>
-          <w:sz w:val="26"/>
-        </w:rPr>
-        <w:t>CRM</w:t>
-      </w:r>
-      <w:r>
-        <w:rPr>
-          <w:rFonts w:ascii="Poppins" w:hAnsi="Poppins" w:cs="Poppins" w:eastAsia="Poppins"/>
-          <w:b w:val="0"/>
-          <w:i w:val="0"/>
-          <w:color w:val="1B3325"/>
-          <w:sz w:val="26"/>
-        </w:rPr>
-        <w:t xml:space="preserve"> y </w:t>
-      </w:r>
-      <w:r>
-        <w:rPr>
-          <w:rFonts w:ascii="Poppins" w:hAnsi="Poppins" w:cs="Poppins" w:eastAsia="Poppins"/>
-          <w:b/>
-          <w:i w:val="0"/>
-          <w:color w:val="1B3325"/>
-          <w:sz w:val="26"/>
-        </w:rPr>
-        <w:t>ERP</w:t>
-      </w:r>
-      <w:r>
-        <w:rPr>
-          <w:rFonts w:ascii="Poppins" w:hAnsi="Poppins" w:cs="Poppins" w:eastAsia="Poppins"/>
-          <w:b w:val="0"/>
-          <w:i w:val="0"/>
-          <w:color w:val="1B3325"/>
-          <w:sz w:val="26"/>
-        </w:rPr>
-        <w:t xml:space="preserve">, $8.000 para asistencia y $10.000 para Drive. Los tres juntos son $33.000 por usuario, $990.000 al mes en 30 personas. La licencia de Odoo Standard en Colombia queda en $28.477 por usuario. </w:t>
-      </w:r>
+    </w:p>
+    <w:p>
+      <w:pPr>
+        <w:spacing w:before="0" w:after="160" w:line="259" w:lineRule="auto"/>
+        <w:jc w:val="both"/>
+        <w:widowControl/>
+      </w:pPr>
       <w:r>
         <w:rPr>
           <w:rFonts w:ascii="Poppins" w:hAnsi="Poppins" w:cs="Poppins" w:eastAsia="Poppins"/>
@@ -842,27 +1056,7 @@
           <w:color w:val="1B3325"/>
           <w:sz w:val="26"/>
         </w:rPr>
-        <w:t xml:space="preserve">La contrata, la paga, entrega el acceso y la renueva. El dominio también lo coloca el cliente. La mensualidad de </w:t>
-      </w:r>
-      <w:r>
-        <w:rPr>
-          <w:rFonts w:ascii="Poppins" w:hAnsi="Poppins" w:cs="Poppins" w:eastAsia="Poppins"/>
-          <w:b/>
-          <w:i w:val="0"/>
-          <w:color w:val="1B3325"/>
-          <w:sz w:val="26"/>
-        </w:rPr>
-        <w:t>RecoTime</w:t>
-      </w:r>
-      <w:r>
-        <w:rPr>
-          <w:rFonts w:ascii="Poppins" w:hAnsi="Poppins" w:cs="Poppins" w:eastAsia="Poppins"/>
-          <w:b w:val="0"/>
-          <w:i w:val="0"/>
-          <w:color w:val="1B3325"/>
-          <w:sz w:val="26"/>
-        </w:rPr>
-        <w:t xml:space="preserve"> no incluye servidor. La renovación del KVM 1 de Hostinger sale en $466.800 al año. Los 2 TB del Drive los entrega </w:t>
+        <w:t xml:space="preserve">La contrata, la paga, entrega el acceso y la renueva. El dominio también lo coloca el cliente. La mensualidad es solo el software. La renovación del KVM 1 de Hostinger, usada como referencia, sale en $466.800 al año. Los 2 TB del Drive los entrega </w:t>
       </w:r>
       <w:r>
         <w:rPr>
@@ -882,7 +1076,7 @@
           <w:color w:val="1B3325"/>
           <w:sz w:val="26"/>
         </w:rPr>
-        <w:t>.</w:t>
+        <w:t>, sí o sí, con ese módulo.</w:t>
       </w:r>
     </w:p>
     <w:p>
@@ -937,7 +1131,7 @@
           <w:color w:val="1B3325"/>
           <w:sz w:val="26"/>
         </w:rPr>
-        <w:t xml:space="preserve"> es un </w:t>
+        <w:t xml:space="preserve"> reúne la gestión de clientes, el chat interno de la empresa, la operación del equipo y la jornada. El </w:t>
       </w:r>
       <w:r>
         <w:rPr>
@@ -957,7 +1151,7 @@
           <w:color w:val="1B3325"/>
           <w:sz w:val="26"/>
         </w:rPr>
-        <w:t xml:space="preserve"> y un </w:t>
+        <w:t xml:space="preserve"> es el expediente de la gestión de cada cliente: quién lo atendió, qué se hizo, en qué estado quedó y qué se escribió en el chat interno. Cada cambio guarda usuario, fecha y hora. El </w:t>
       </w:r>
       <w:r>
         <w:rPr>
@@ -977,47 +1171,7 @@
           <w:color w:val="1B3325"/>
           <w:sz w:val="26"/>
         </w:rPr>
-        <w:t xml:space="preserve"> de gestión al mismo tiempo. El </w:t>
-      </w:r>
-      <w:r>
-        <w:rPr>
-          <w:rFonts w:ascii="Poppins" w:hAnsi="Poppins" w:cs="Poppins" w:eastAsia="Poppins"/>
-          <w:b/>
-          <w:i w:val="0"/>
-          <w:color w:val="1B3325"/>
-          <w:sz w:val="26"/>
-        </w:rPr>
-        <w:t>CRM</w:t>
-      </w:r>
-      <w:r>
-        <w:rPr>
-          <w:rFonts w:ascii="Poppins" w:hAnsi="Poppins" w:cs="Poppins" w:eastAsia="Poppins"/>
-          <w:b w:val="0"/>
-          <w:i w:val="0"/>
-          <w:color w:val="1B3325"/>
-          <w:sz w:val="26"/>
-        </w:rPr>
-        <w:t xml:space="preserve"> concentra clientes, contactos, oportunidades y el seguimiento comercial. El </w:t>
-      </w:r>
-      <w:r>
-        <w:rPr>
-          <w:rFonts w:ascii="Poppins" w:hAnsi="Poppins" w:cs="Poppins" w:eastAsia="Poppins"/>
-          <w:b/>
-          <w:i w:val="0"/>
-          <w:color w:val="1B3325"/>
-          <w:sz w:val="26"/>
-        </w:rPr>
-        <w:t>ERP</w:t>
-      </w:r>
-      <w:r>
-        <w:rPr>
-          <w:rFonts w:ascii="Poppins" w:hAnsi="Poppins" w:cs="Poppins" w:eastAsia="Poppins"/>
-          <w:b w:val="0"/>
-          <w:i w:val="0"/>
-          <w:color w:val="1B3325"/>
-          <w:sz w:val="26"/>
-        </w:rPr>
-        <w:t xml:space="preserve"> de gestión ordena la operación: áreas, cargos, procesos y el trabajo del día. Las dos capas comparten las mismas personas, de modo que un cliente, un responsable y una actividad quedan en un solo historial.</w:t>
+        <w:t xml:space="preserve"> de gestión ordena áreas, cargos y procesos, y comparte las mismas personas del expediente.</w:t>
       </w:r>
     </w:p>
     <w:p>
@@ -1128,7 +1282,7 @@
           <w:color w:val="1B3325"/>
           <w:sz w:val="26"/>
         </w:rPr>
-        <w:t xml:space="preserve"> cubre la gestión comercial, la operación del equipo, la jornada y la intranet. Por eso se ofrece al lado de Alegra o Siigo, y se compara con Odoo, Bitrix24 y Google Workspace en el tramo que hoy una pyme termina pagando por partes.</w:t>
+        <w:t xml:space="preserve"> cubre el expediente del cliente, el chat interno, la operación del equipo, la jornada y la intranet. Por eso se ofrece al lado de Alegra o Siigo, y se compara con Odoo, Bitrix24 y Google Workspace en el tramo que hoy una pyme termina pagando por partes.</w:t>
       </w:r>
     </w:p>
     <w:p>
@@ -1158,16 +1312,6 @@
       <w:r>
         <w:rPr>
           <w:rFonts w:ascii="Poppins" w:hAnsi="Poppins" w:cs="Poppins" w:eastAsia="Poppins"/>
-          <w:b w:val="0"/>
-          <w:i w:val="0"/>
-          <w:color w:val="1B3325"/>
-          <w:sz w:val="26"/>
-        </w:rPr>
-        <w:t xml:space="preserve">En </w:t>
-      </w:r>
-      <w:r>
-        <w:rPr>
-          <w:rFonts w:ascii="Poppins" w:hAnsi="Poppins" w:cs="Poppins" w:eastAsia="Poppins"/>
           <w:b/>
           <w:i w:val="0"/>
           <w:color w:val="1B3325"/>
@@ -1183,47 +1327,7 @@
           <w:color w:val="1B3325"/>
           <w:sz w:val="26"/>
         </w:rPr>
-        <w:t xml:space="preserve"> convertimos la operación diaria en un registro que gerencia puede abrir. Damos a la empresa el </w:t>
-      </w:r>
-      <w:r>
-        <w:rPr>
-          <w:rFonts w:ascii="Poppins" w:hAnsi="Poppins" w:cs="Poppins" w:eastAsia="Poppins"/>
-          <w:b/>
-          <w:i w:val="0"/>
-          <w:color w:val="1B3325"/>
-          <w:sz w:val="26"/>
-        </w:rPr>
-        <w:t>CRM</w:t>
-      </w:r>
-      <w:r>
-        <w:rPr>
-          <w:rFonts w:ascii="Poppins" w:hAnsi="Poppins" w:cs="Poppins" w:eastAsia="Poppins"/>
-          <w:b w:val="0"/>
-          <w:i w:val="0"/>
-          <w:color w:val="1B3325"/>
-          <w:sz w:val="26"/>
-        </w:rPr>
-        <w:t xml:space="preserve"> para no perder el seguimiento de un cliente, el </w:t>
-      </w:r>
-      <w:r>
-        <w:rPr>
-          <w:rFonts w:ascii="Poppins" w:hAnsi="Poppins" w:cs="Poppins" w:eastAsia="Poppins"/>
-          <w:b/>
-          <w:i w:val="0"/>
-          <w:color w:val="1B3325"/>
-          <w:sz w:val="26"/>
-        </w:rPr>
-        <w:t>ERP</w:t>
-      </w:r>
-      <w:r>
-        <w:rPr>
-          <w:rFonts w:ascii="Poppins" w:hAnsi="Poppins" w:cs="Poppins" w:eastAsia="Poppins"/>
-          <w:b w:val="0"/>
-          <w:i w:val="0"/>
-          <w:color w:val="1B3325"/>
-          <w:sz w:val="26"/>
-        </w:rPr>
-        <w:t xml:space="preserve"> de gestión para saber qué proceso está en curso, la asistencia para ver quién llegó, quién está en almuerzo y quién tomó un descanso, y el Drive para que la información de la empresa viva en un solo lugar. El supervisor corrige con el dato enfrente. El trabajador consulta su línea y las carpetas de su área.</w:t>
+        <w:t xml:space="preserve"> existe para que una empresa deje constancia de tres hechos que hoy se reconstruyen en chats personales y hojas sueltas: cómo se gestionó cada cliente, qué se dijo en el chat interno de la compañía y cómo fue la jornada de cada trabajador. El expediente del cliente guarda responsable, estado, fecha y hora. El chat interno guarda autor, fecha y hora, y permanece en el sistema cuando una persona deja la empresa. La asistencia separa llegada, almuerzo, descansos y salida. El Drive guarda los documentos de esa gestión. La empresa consulta el expediente. El trabajador consulta su línea del día y el chat de su trabajo. La nómina y la contabilidad siguen en el programa que la empresa ya tenga.</w:t>
       </w:r>
     </w:p>
     <w:p>
@@ -1258,7 +1362,7 @@
           <w:color w:val="1B3325"/>
           <w:sz w:val="26"/>
         </w:rPr>
-        <w:t xml:space="preserve">En 2030, </w:t>
+        <w:t xml:space="preserve">En 2030, una empresa que use </w:t>
       </w:r>
       <w:r>
         <w:rPr>
@@ -1278,7 +1382,47 @@
           <w:color w:val="1B3325"/>
           <w:sz w:val="26"/>
         </w:rPr>
-        <w:t xml:space="preserve"> será la plataforma de referencia en Colombia para las empresas que quieren el comercial y la jornada del equipo en el mismo lugar. Queremos ser reconocidos porque la trazabilidad del trabajador sirve para explicar una entrega, y porque la asistencia del día se entiende en una pantalla, con llegada, almuerzo y descansos, sin armar el reporte a mano al cierre de la semana.</w:t>
+        <w:t xml:space="preserve"> debe poder abrir el expediente de un cliente y ver quién lo gestionó, qué se acordó en el chat interno y en qué estado quedó, y debe poder abrir el día de un trabajador y ver la llegada, el almuerzo, los descansos y la salida sin armar el reporte a mano. Esa es la meta, medida en consultas que hoy no existen en un solo sistema. El lugar que </w:t>
+      </w:r>
+      <w:r>
+        <w:rPr>
+          <w:rFonts w:ascii="Poppins" w:hAnsi="Poppins" w:cs="Poppins" w:eastAsia="Poppins"/>
+          <w:b/>
+          <w:i w:val="0"/>
+          <w:color w:val="1B3325"/>
+          <w:sz w:val="26"/>
+        </w:rPr>
+        <w:t>RecoTime</w:t>
+      </w:r>
+      <w:r>
+        <w:rPr>
+          <w:rFonts w:ascii="Poppins" w:hAnsi="Poppins" w:cs="Poppins" w:eastAsia="Poppins"/>
+          <w:b w:val="0"/>
+          <w:i w:val="0"/>
+          <w:color w:val="1B3325"/>
+          <w:sz w:val="26"/>
+        </w:rPr>
+        <w:t xml:space="preserve"> busca es el de las pymes colombianas de 8 a 80 trabajadores que ya liquidan nómina y contabilidad en otro programa. El criterio de avance es concreto: la orden de trabajo y el historial del cliente viven en </w:t>
+      </w:r>
+      <w:r>
+        <w:rPr>
+          <w:rFonts w:ascii="Poppins" w:hAnsi="Poppins" w:cs="Poppins" w:eastAsia="Poppins"/>
+          <w:b/>
+          <w:i w:val="0"/>
+          <w:color w:val="1B3325"/>
+          <w:sz w:val="26"/>
+        </w:rPr>
+        <w:t>RecoTime</w:t>
+      </w:r>
+      <w:r>
+        <w:rPr>
+          <w:rFonts w:ascii="Poppins" w:hAnsi="Poppins" w:cs="Poppins" w:eastAsia="Poppins"/>
+          <w:b w:val="0"/>
+          <w:i w:val="0"/>
+          <w:color w:val="1B3325"/>
+          <w:sz w:val="26"/>
+        </w:rPr>
+        <w:t>, y el teléfono personal deja de ser el archivo de la empresa.</w:t>
       </w:r>
     </w:p>
     <w:p>
@@ -1673,7 +1817,7 @@
                 <w:color w:val="1B3325"/>
                 <w:sz w:val="20"/>
               </w:rPr>
-              <w:t>Orden comercial</w:t>
+              <w:t>Expediente del cliente</w:t>
             </w:r>
           </w:p>
         </w:tc>
@@ -1711,7 +1855,7 @@
                 <w:color w:val="1B3325"/>
                 <w:sz w:val="20"/>
               </w:rPr>
-              <w:t>El seguimiento de un cliente tiene dueño, etapa y próxima acción.</w:t>
+              <w:t>Cada gestión guarda responsable, estado, fecha, hora y el hilo del chat interno.</w:t>
             </w:r>
           </w:p>
         </w:tc>
@@ -1916,7 +2060,7 @@
           <w:color w:val="1B3325"/>
           <w:sz w:val="26"/>
         </w:rPr>
-        <w:t xml:space="preserve">Cuando los clientes viven en un chat, la asignación del equipo en una hoja y la asistencia en otro mensaje, gerencia reconstruye el día después de que pasó. </w:t>
+        <w:t xml:space="preserve">Cuando la gestión de un cliente vive en el WhatsApp de quien lo atendió, la orden del equipo en otro chat personal y la asistencia en un mensaje de «ya llegué», gerencia reconstruye el día después de que pasó. </w:t>
       </w:r>
       <w:r>
         <w:rPr>
@@ -1936,7 +2080,7 @@
           <w:color w:val="1B3325"/>
           <w:sz w:val="26"/>
         </w:rPr>
-        <w:t xml:space="preserve"> ordena ese recorrido así:</w:t>
+        <w:t xml:space="preserve"> separa esos registros así:</w:t>
       </w:r>
     </w:p>
     <w:tbl>
@@ -2090,7 +2234,7 @@
                 <w:color w:val="1B3325"/>
                 <w:sz w:val="20"/>
               </w:rPr>
-              <w:t>El seguimiento comercial está en chats, hojas y la memoria del vendedor.</w:t>
+              <w:t>La gestión del cliente está en el chat personal de quien lo atendió.</w:t>
             </w:r>
           </w:p>
         </w:tc>
@@ -2123,22 +2267,12 @@
             <w:r>
               <w:rPr>
                 <w:rFonts w:ascii="Poppins" w:hAnsi="Poppins" w:cs="Poppins" w:eastAsia="Poppins"/>
-                <w:b/>
+                <w:b w:val="0"/>
                 <w:i w:val="0"/>
                 <w:color w:val="1B3325"/>
                 <w:sz w:val="20"/>
               </w:rPr>
-              <w:t>CRM</w:t>
-            </w:r>
-            <w:r>
-              <w:rPr>
-                <w:rFonts w:ascii="Poppins" w:hAnsi="Poppins" w:cs="Poppins" w:eastAsia="Poppins"/>
-                <w:b w:val="0"/>
-                <w:i w:val="0"/>
-                <w:color w:val="1B3325"/>
-                <w:sz w:val="20"/>
-              </w:rPr>
-              <w:t xml:space="preserve"> con clientes, oportunidades, etapa y responsable.</w:t>
+              <w:t>Expediente del cliente: responsable, estado, fecha, hora e historial.</w:t>
             </w:r>
           </w:p>
         </w:tc>
@@ -2419,22 +2553,12 @@
             <w:r>
               <w:rPr>
                 <w:rFonts w:ascii="Poppins" w:hAnsi="Poppins" w:cs="Poppins" w:eastAsia="Poppins"/>
-                <w:b/>
+                <w:b w:val="0"/>
                 <w:i w:val="0"/>
                 <w:color w:val="1B3325"/>
                 <w:sz w:val="20"/>
               </w:rPr>
-              <w:t>CRM</w:t>
-            </w:r>
-            <w:r>
-              <w:rPr>
-                <w:rFonts w:ascii="Poppins" w:hAnsi="Poppins" w:cs="Poppins" w:eastAsia="Poppins"/>
-                <w:b w:val="0"/>
-                <w:i w:val="0"/>
-                <w:color w:val="1B3325"/>
-                <w:sz w:val="20"/>
-              </w:rPr>
-              <w:t>, tareas y asistencia se pagan por separado y no conversan.</w:t>
+              <w:t>Las órdenes del equipo se escriben en el teléfono personal.</w:t>
             </w:r>
           </w:p>
         </w:tc>
@@ -2472,7 +2596,7 @@
                 <w:color w:val="1B3325"/>
                 <w:sz w:val="20"/>
               </w:rPr>
-              <w:t>Una operación, un usuario por persona y un historial compartido.</w:t>
+              <w:t>Chat interno de la empresa: autor, fecha, hora, cliente o área.</w:t>
             </w:r>
           </w:p>
         </w:tc>
@@ -2607,27 +2731,7 @@
           <w:color w:val="1B3325"/>
           <w:sz w:val="26"/>
         </w:rPr>
-        <w:t xml:space="preserve">Pymes de servicios, operación y equipos de sede que necesitan </w:t>
-      </w:r>
-      <w:r>
-        <w:rPr>
-          <w:rFonts w:ascii="Poppins" w:hAnsi="Poppins" w:cs="Poppins" w:eastAsia="Poppins"/>
-          <w:b/>
-          <w:i w:val="0"/>
-          <w:color w:val="1B3325"/>
-          <w:sz w:val="26"/>
-        </w:rPr>
-        <w:t>CRM</w:t>
-      </w:r>
-      <w:r>
-        <w:rPr>
-          <w:rFonts w:ascii="Poppins" w:hAnsi="Poppins" w:cs="Poppins" w:eastAsia="Poppins"/>
-          <w:b w:val="0"/>
-          <w:i w:val="0"/>
-          <w:color w:val="1B3325"/>
-          <w:sz w:val="26"/>
-        </w:rPr>
-        <w:t xml:space="preserve"> y, al mismo tiempo, ver la jornada de su gente.</w:t>
+        <w:t>Pymes de servicios y operación que necesitan el expediente de cada cliente, un chat interno de la empresa y la jornada del equipo en el mismo sistema.</w:t>
       </w:r>
     </w:p>
     <w:p>
@@ -2765,7 +2869,7 @@
           <w:color w:val="1B3325"/>
           <w:sz w:val="26"/>
         </w:rPr>
-        <w:t xml:space="preserve"> tiene cuatro accesos. Cada persona entra con su usuario y su rol: gerencia, comercial, supervisor y trabajador.</w:t>
+        <w:t xml:space="preserve"> tiene cuatro accesos. Cada persona entra con su usuario y su rol: gerencia, gestión de clientes, supervisor y trabajador. El chat interno está disponible para los roles que la empresa habilite. Un mensaje no sale del sistema hacia el teléfono personal.</w:t>
       </w:r>
     </w:p>
     <w:tbl>
@@ -2947,27 +3051,7 @@
                 <w:color w:val="1B3325"/>
                 <w:sz w:val="20"/>
               </w:rPr>
-              <w:t xml:space="preserve">Ve el tablero, el avance del </w:t>
-            </w:r>
-            <w:r>
-              <w:rPr>
-                <w:rFonts w:ascii="Poppins" w:hAnsi="Poppins" w:cs="Poppins" w:eastAsia="Poppins"/>
-                <w:b/>
-                <w:i w:val="0"/>
-                <w:color w:val="1B3325"/>
-                <w:sz w:val="20"/>
-              </w:rPr>
-              <w:t>CRM</w:t>
-            </w:r>
-            <w:r>
-              <w:rPr>
-                <w:rFonts w:ascii="Poppins" w:hAnsi="Poppins" w:cs="Poppins" w:eastAsia="Poppins"/>
-                <w:b w:val="0"/>
-                <w:i w:val="0"/>
-                <w:color w:val="1B3325"/>
-                <w:sz w:val="20"/>
-              </w:rPr>
-              <w:t>, la asistencia del día y las carpetas del Drive.</w:t>
+              <w:t>Ve el tablero, el expediente de los clientes, el chat interno, la asistencia del día y el Drive.</w:t>
             </w:r>
           </w:p>
         </w:tc>
@@ -3010,7 +3094,7 @@
                 <w:color w:val="1B3325"/>
                 <w:sz w:val="20"/>
               </w:rPr>
-              <w:t>Comercial</w:t>
+              <w:t>Gestión de clientes</w:t>
             </w:r>
           </w:p>
         </w:tc>
@@ -3048,7 +3132,7 @@
                 <w:color w:val="1B3325"/>
                 <w:sz w:val="20"/>
               </w:rPr>
-              <w:t>Registra clientes, contactos y oportunidades. Deja la próxima acción y el responsable.</w:t>
+              <w:t>Actualiza el expediente: responsable, estado y lo tratado. Escribe en el chat interno del cliente o del área.</w:t>
             </w:r>
           </w:p>
         </w:tc>
@@ -3252,8 +3336,547 @@
           <w:color w:val="1B3325"/>
           <w:sz w:val="26"/>
         </w:rPr>
-        <w:t>La trazabilidad corre en paralelo. Una actividad se abre con trabajador, cliente o proceso, hora de inicio y estado. Al cerrarla, queda la hora de fin. Gerencia puede abrir a una persona y ver, en el mismo expediente, qué atendió y cómo fue su día.</w:t>
+        <w:t>La trazabilidad del trabajador corre en paralelo. Una actividad se abre con trabajador, cliente o proceso, hora de inicio y estado. Al cerrarla, queda la hora de fin. Gerencia puede abrir a una persona y ver qué atendió y cómo fue su día.</w:t>
       </w:r>
+    </w:p>
+    <w:p>
+      <w:pPr>
+        <w:spacing w:before="160" w:after="40" w:line="259" w:lineRule="auto"/>
+        <w:jc w:val="left"/>
+        <w:keepNext/>
+        <w:widowControl/>
+      </w:pPr>
+      <w:r>
+        <w:rPr>
+          <w:rFonts w:ascii="Poppins" w:hAnsi="Poppins" w:cs="Poppins" w:eastAsia="Poppins"/>
+          <w:b/>
+          <w:i w:val="0"/>
+          <w:color w:val="1B3325"/>
+          <w:sz w:val="26"/>
+        </w:rPr>
+        <w:t>Qué guarda cada registro</w:t>
+      </w:r>
+    </w:p>
+    <w:p>
+      <w:pPr>
+        <w:spacing w:before="0" w:after="160" w:line="259" w:lineRule="auto"/>
+        <w:jc w:val="both"/>
+        <w:widowControl/>
+      </w:pPr>
+      <w:r>
+        <w:rPr>
+          <w:rFonts w:ascii="Poppins" w:hAnsi="Poppins" w:cs="Poppins" w:eastAsia="Poppins"/>
+          <w:b w:val="0"/>
+          <w:i w:val="0"/>
+          <w:color w:val="1B3325"/>
+          <w:sz w:val="26"/>
+        </w:rPr>
+        <w:t>Esta versión no publica una base de datos ni una interfaz de programación. Sí fija qué dato mínimo queda en cada registro, para que la puesta en marcha y los reportes hablen de los mismos campos.</w:t>
+      </w:r>
+    </w:p>
+    <w:tbl>
+      <w:tblPr>
+        <w:tblW w:type="dxa" w:w="9600"/>
+        <w:jc w:val="center"/>
+        <w:tblLayout w:type="fixed"/>
+        <w:tblLook w:firstColumn="1" w:firstRow="1" w:lastColumn="0" w:lastRow="0" w:noHBand="0" w:noVBand="1" w:val="04A0"/>
+      </w:tblPr>
+      <w:tblGrid>
+        <w:gridCol w:w="2800"/>
+        <w:gridCol w:w="6800"/>
+      </w:tblGrid>
+      <w:tr>
+        <w:trPr>
+          <w:tblHeader/>
+          <w:cantSplit/>
+        </w:trPr>
+        <w:tc>
+          <w:tcPr>
+            <w:tcW w:type="dxa" w:w="2800"/>
+            <w:tcBorders>
+              <w:top w:val="single" w:sz="4" w:space="0" w:color="1B3325"/>
+              <w:left w:val="single" w:sz="4" w:space="0" w:color="1B3325"/>
+              <w:bottom w:val="single" w:sz="4" w:space="0" w:color="1B3325"/>
+              <w:right w:val="single" w:sz="4" w:space="0" w:color="1B3325"/>
+            </w:tcBorders>
+            <w:tcMar>
+              <w:top w:w="40" w:type="dxa"/>
+              <w:left w:w="80" w:type="dxa"/>
+              <w:bottom w:w="40" w:type="dxa"/>
+              <w:right w:w="80" w:type="dxa"/>
+            </w:tcMar>
+            <w:shd w:val="clear" w:color="auto" w:fill="1B3325"/>
+            <w:vAlign w:val="center"/>
+          </w:tcPr>
+          <w:p>
+            <w:pPr>
+              <w:spacing w:before="0" w:after="0" w:line="259" w:lineRule="auto"/>
+              <w:jc w:val="center"/>
+              <w:widowControl/>
+              <w:keepNext/>
+            </w:pPr>
+            <w:r/>
+            <w:r>
+              <w:rPr>
+                <w:rFonts w:ascii="Poppins" w:hAnsi="Poppins" w:cs="Poppins" w:eastAsia="Poppins"/>
+                <w:b/>
+                <w:i w:val="0"/>
+                <w:color w:val="FFFFFF"/>
+                <w:sz w:val="18"/>
+              </w:rPr>
+              <w:t>Registro</w:t>
+            </w:r>
+          </w:p>
+        </w:tc>
+        <w:tc>
+          <w:tcPr>
+            <w:tcW w:type="dxa" w:w="6800"/>
+            <w:tcBorders>
+              <w:top w:val="single" w:sz="4" w:space="0" w:color="1B3325"/>
+              <w:left w:val="single" w:sz="4" w:space="0" w:color="1B3325"/>
+              <w:bottom w:val="single" w:sz="4" w:space="0" w:color="1B3325"/>
+              <w:right w:val="single" w:sz="4" w:space="0" w:color="1B3325"/>
+            </w:tcBorders>
+            <w:tcMar>
+              <w:top w:w="40" w:type="dxa"/>
+              <w:left w:w="80" w:type="dxa"/>
+              <w:bottom w:w="40" w:type="dxa"/>
+              <w:right w:w="80" w:type="dxa"/>
+            </w:tcMar>
+            <w:shd w:val="clear" w:color="auto" w:fill="1B3325"/>
+            <w:vAlign w:val="center"/>
+          </w:tcPr>
+          <w:p>
+            <w:pPr>
+              <w:spacing w:before="0" w:after="0" w:line="259" w:lineRule="auto"/>
+              <w:jc w:val="center"/>
+              <w:widowControl/>
+              <w:keepNext/>
+            </w:pPr>
+            <w:r/>
+            <w:r>
+              <w:rPr>
+                <w:rFonts w:ascii="Poppins" w:hAnsi="Poppins" w:cs="Poppins" w:eastAsia="Poppins"/>
+                <w:b/>
+                <w:i w:val="0"/>
+                <w:color w:val="FFFFFF"/>
+                <w:sz w:val="18"/>
+              </w:rPr>
+              <w:t>Campos que quedan</w:t>
+            </w:r>
+          </w:p>
+        </w:tc>
+      </w:tr>
+      <w:tr>
+        <w:trPr>
+          <w:cantSplit/>
+        </w:trPr>
+        <w:tc>
+          <w:tcPr>
+            <w:tcW w:type="dxa" w:w="2800"/>
+            <w:tcBorders>
+              <w:top w:val="single" w:sz="4" w:space="0" w:color="1B3325"/>
+              <w:left w:val="single" w:sz="4" w:space="0" w:color="1B3325"/>
+              <w:bottom w:val="single" w:sz="4" w:space="0" w:color="1B3325"/>
+              <w:right w:val="single" w:sz="4" w:space="0" w:color="1B3325"/>
+            </w:tcBorders>
+            <w:tcMar>
+              <w:top w:w="40" w:type="dxa"/>
+              <w:left w:w="80" w:type="dxa"/>
+              <w:bottom w:w="40" w:type="dxa"/>
+              <w:right w:w="80" w:type="dxa"/>
+            </w:tcMar>
+            <w:shd w:val="clear" w:color="auto" w:fill="FFFFFF"/>
+            <w:vAlign w:val="center"/>
+          </w:tcPr>
+          <w:p>
+            <w:pPr>
+              <w:spacing w:before="0" w:after="0" w:line="259" w:lineRule="auto"/>
+              <w:jc w:val="left"/>
+              <w:widowControl/>
+              <w:keepNext/>
+            </w:pPr>
+            <w:r/>
+            <w:r>
+              <w:rPr>
+                <w:rFonts w:ascii="Poppins" w:hAnsi="Poppins" w:cs="Poppins" w:eastAsia="Poppins"/>
+                <w:b w:val="0"/>
+                <w:i w:val="0"/>
+                <w:color w:val="1B3325"/>
+                <w:sz w:val="18"/>
+              </w:rPr>
+              <w:t>Expediente del cliente</w:t>
+            </w:r>
+          </w:p>
+        </w:tc>
+        <w:tc>
+          <w:tcPr>
+            <w:tcW w:type="dxa" w:w="6800"/>
+            <w:tcBorders>
+              <w:top w:val="single" w:sz="4" w:space="0" w:color="1B3325"/>
+              <w:left w:val="single" w:sz="4" w:space="0" w:color="1B3325"/>
+              <w:bottom w:val="single" w:sz="4" w:space="0" w:color="1B3325"/>
+              <w:right w:val="single" w:sz="4" w:space="0" w:color="1B3325"/>
+            </w:tcBorders>
+            <w:tcMar>
+              <w:top w:w="40" w:type="dxa"/>
+              <w:left w:w="80" w:type="dxa"/>
+              <w:bottom w:w="40" w:type="dxa"/>
+              <w:right w:w="80" w:type="dxa"/>
+            </w:tcMar>
+            <w:shd w:val="clear" w:color="auto" w:fill="FFFFFF"/>
+            <w:vAlign w:val="center"/>
+          </w:tcPr>
+          <w:p>
+            <w:pPr>
+              <w:spacing w:before="0" w:after="0" w:line="259" w:lineRule="auto"/>
+              <w:jc w:val="left"/>
+              <w:widowControl/>
+              <w:keepNext/>
+            </w:pPr>
+            <w:r/>
+            <w:r>
+              <w:rPr>
+                <w:rFonts w:ascii="Poppins" w:hAnsi="Poppins" w:cs="Poppins" w:eastAsia="Poppins"/>
+                <w:b w:val="0"/>
+                <w:i w:val="0"/>
+                <w:color w:val="1B3325"/>
+                <w:sz w:val="18"/>
+              </w:rPr>
+              <w:t>Cliente, responsable, estado de la gestión, fecha y hora de cada cambio.</w:t>
+            </w:r>
+          </w:p>
+        </w:tc>
+      </w:tr>
+      <w:tr>
+        <w:trPr>
+          <w:cantSplit/>
+        </w:trPr>
+        <w:tc>
+          <w:tcPr>
+            <w:tcW w:type="dxa" w:w="2800"/>
+            <w:tcBorders>
+              <w:top w:val="single" w:sz="4" w:space="0" w:color="1B3325"/>
+              <w:left w:val="single" w:sz="4" w:space="0" w:color="1B3325"/>
+              <w:bottom w:val="single" w:sz="4" w:space="0" w:color="1B3325"/>
+              <w:right w:val="single" w:sz="4" w:space="0" w:color="1B3325"/>
+            </w:tcBorders>
+            <w:tcMar>
+              <w:top w:w="40" w:type="dxa"/>
+              <w:left w:w="80" w:type="dxa"/>
+              <w:bottom w:w="40" w:type="dxa"/>
+              <w:right w:w="80" w:type="dxa"/>
+            </w:tcMar>
+            <w:shd w:val="clear" w:color="auto" w:fill="F7FBF8"/>
+            <w:vAlign w:val="center"/>
+          </w:tcPr>
+          <w:p>
+            <w:pPr>
+              <w:spacing w:before="0" w:after="0" w:line="259" w:lineRule="auto"/>
+              <w:jc w:val="left"/>
+              <w:widowControl/>
+              <w:keepNext/>
+            </w:pPr>
+            <w:r/>
+            <w:r>
+              <w:rPr>
+                <w:rFonts w:ascii="Poppins" w:hAnsi="Poppins" w:cs="Poppins" w:eastAsia="Poppins"/>
+                <w:b w:val="0"/>
+                <w:i w:val="0"/>
+                <w:color w:val="1B3325"/>
+                <w:sz w:val="18"/>
+              </w:rPr>
+              <w:t>Mensaje del chat interno</w:t>
+            </w:r>
+          </w:p>
+        </w:tc>
+        <w:tc>
+          <w:tcPr>
+            <w:tcW w:type="dxa" w:w="6800"/>
+            <w:tcBorders>
+              <w:top w:val="single" w:sz="4" w:space="0" w:color="1B3325"/>
+              <w:left w:val="single" w:sz="4" w:space="0" w:color="1B3325"/>
+              <w:bottom w:val="single" w:sz="4" w:space="0" w:color="1B3325"/>
+              <w:right w:val="single" w:sz="4" w:space="0" w:color="1B3325"/>
+            </w:tcBorders>
+            <w:tcMar>
+              <w:top w:w="40" w:type="dxa"/>
+              <w:left w:w="80" w:type="dxa"/>
+              <w:bottom w:w="40" w:type="dxa"/>
+              <w:right w:w="80" w:type="dxa"/>
+            </w:tcMar>
+            <w:shd w:val="clear" w:color="auto" w:fill="F7FBF8"/>
+            <w:vAlign w:val="center"/>
+          </w:tcPr>
+          <w:p>
+            <w:pPr>
+              <w:spacing w:before="0" w:after="0" w:line="259" w:lineRule="auto"/>
+              <w:jc w:val="left"/>
+              <w:widowControl/>
+              <w:keepNext/>
+            </w:pPr>
+            <w:r/>
+            <w:r>
+              <w:rPr>
+                <w:rFonts w:ascii="Poppins" w:hAnsi="Poppins" w:cs="Poppins" w:eastAsia="Poppins"/>
+                <w:b w:val="0"/>
+                <w:i w:val="0"/>
+                <w:color w:val="1B3325"/>
+                <w:sz w:val="18"/>
+              </w:rPr>
+              <w:t>Autor, fecha, hora, cliente o área, y el texto. El hilo queda en la empresa.</w:t>
+            </w:r>
+          </w:p>
+        </w:tc>
+      </w:tr>
+      <w:tr>
+        <w:trPr>
+          <w:cantSplit/>
+        </w:trPr>
+        <w:tc>
+          <w:tcPr>
+            <w:tcW w:type="dxa" w:w="2800"/>
+            <w:tcBorders>
+              <w:top w:val="single" w:sz="4" w:space="0" w:color="1B3325"/>
+              <w:left w:val="single" w:sz="4" w:space="0" w:color="1B3325"/>
+              <w:bottom w:val="single" w:sz="4" w:space="0" w:color="1B3325"/>
+              <w:right w:val="single" w:sz="4" w:space="0" w:color="1B3325"/>
+            </w:tcBorders>
+            <w:tcMar>
+              <w:top w:w="40" w:type="dxa"/>
+              <w:left w:w="80" w:type="dxa"/>
+              <w:bottom w:w="40" w:type="dxa"/>
+              <w:right w:w="80" w:type="dxa"/>
+            </w:tcMar>
+            <w:shd w:val="clear" w:color="auto" w:fill="FFFFFF"/>
+            <w:vAlign w:val="center"/>
+          </w:tcPr>
+          <w:p>
+            <w:pPr>
+              <w:spacing w:before="0" w:after="0" w:line="259" w:lineRule="auto"/>
+              <w:jc w:val="left"/>
+              <w:widowControl/>
+              <w:keepNext/>
+            </w:pPr>
+            <w:r/>
+            <w:r>
+              <w:rPr>
+                <w:rFonts w:ascii="Poppins" w:hAnsi="Poppins" w:cs="Poppins" w:eastAsia="Poppins"/>
+                <w:b w:val="0"/>
+                <w:i w:val="0"/>
+                <w:color w:val="1B3325"/>
+                <w:sz w:val="18"/>
+              </w:rPr>
+              <w:t>Actividad del trabajador</w:t>
+            </w:r>
+          </w:p>
+        </w:tc>
+        <w:tc>
+          <w:tcPr>
+            <w:tcW w:type="dxa" w:w="6800"/>
+            <w:tcBorders>
+              <w:top w:val="single" w:sz="4" w:space="0" w:color="1B3325"/>
+              <w:left w:val="single" w:sz="4" w:space="0" w:color="1B3325"/>
+              <w:bottom w:val="single" w:sz="4" w:space="0" w:color="1B3325"/>
+              <w:right w:val="single" w:sz="4" w:space="0" w:color="1B3325"/>
+            </w:tcBorders>
+            <w:tcMar>
+              <w:top w:w="40" w:type="dxa"/>
+              <w:left w:w="80" w:type="dxa"/>
+              <w:bottom w:w="40" w:type="dxa"/>
+              <w:right w:w="80" w:type="dxa"/>
+            </w:tcMar>
+            <w:shd w:val="clear" w:color="auto" w:fill="FFFFFF"/>
+            <w:vAlign w:val="center"/>
+          </w:tcPr>
+          <w:p>
+            <w:pPr>
+              <w:spacing w:before="0" w:after="0" w:line="259" w:lineRule="auto"/>
+              <w:jc w:val="left"/>
+              <w:widowControl/>
+              <w:keepNext/>
+            </w:pPr>
+            <w:r/>
+            <w:r>
+              <w:rPr>
+                <w:rFonts w:ascii="Poppins" w:hAnsi="Poppins" w:cs="Poppins" w:eastAsia="Poppins"/>
+                <w:b w:val="0"/>
+                <w:i w:val="0"/>
+                <w:color w:val="1B3325"/>
+                <w:sz w:val="18"/>
+              </w:rPr>
+              <w:t>Trabajador, cliente o proceso, hora de inicio, hora de fin y estado.</w:t>
+            </w:r>
+          </w:p>
+        </w:tc>
+      </w:tr>
+      <w:tr>
+        <w:trPr>
+          <w:cantSplit/>
+        </w:trPr>
+        <w:tc>
+          <w:tcPr>
+            <w:tcW w:type="dxa" w:w="2800"/>
+            <w:tcBorders>
+              <w:top w:val="single" w:sz="4" w:space="0" w:color="1B3325"/>
+              <w:left w:val="single" w:sz="4" w:space="0" w:color="1B3325"/>
+              <w:bottom w:val="single" w:sz="4" w:space="0" w:color="1B3325"/>
+              <w:right w:val="single" w:sz="4" w:space="0" w:color="1B3325"/>
+            </w:tcBorders>
+            <w:tcMar>
+              <w:top w:w="40" w:type="dxa"/>
+              <w:left w:w="80" w:type="dxa"/>
+              <w:bottom w:w="40" w:type="dxa"/>
+              <w:right w:w="80" w:type="dxa"/>
+            </w:tcMar>
+            <w:shd w:val="clear" w:color="auto" w:fill="F7FBF8"/>
+            <w:vAlign w:val="center"/>
+          </w:tcPr>
+          <w:p>
+            <w:pPr>
+              <w:spacing w:before="0" w:after="0" w:line="259" w:lineRule="auto"/>
+              <w:jc w:val="left"/>
+              <w:widowControl/>
+              <w:keepNext/>
+            </w:pPr>
+            <w:r/>
+            <w:r>
+              <w:rPr>
+                <w:rFonts w:ascii="Poppins" w:hAnsi="Poppins" w:cs="Poppins" w:eastAsia="Poppins"/>
+                <w:b w:val="0"/>
+                <w:i w:val="0"/>
+                <w:color w:val="1B3325"/>
+                <w:sz w:val="18"/>
+              </w:rPr>
+              <w:t>Marca de asistencia</w:t>
+            </w:r>
+          </w:p>
+        </w:tc>
+        <w:tc>
+          <w:tcPr>
+            <w:tcW w:type="dxa" w:w="6800"/>
+            <w:tcBorders>
+              <w:top w:val="single" w:sz="4" w:space="0" w:color="1B3325"/>
+              <w:left w:val="single" w:sz="4" w:space="0" w:color="1B3325"/>
+              <w:bottom w:val="single" w:sz="4" w:space="0" w:color="1B3325"/>
+              <w:right w:val="single" w:sz="4" w:space="0" w:color="1B3325"/>
+            </w:tcBorders>
+            <w:tcMar>
+              <w:top w:w="40" w:type="dxa"/>
+              <w:left w:w="80" w:type="dxa"/>
+              <w:bottom w:w="40" w:type="dxa"/>
+              <w:right w:w="80" w:type="dxa"/>
+            </w:tcMar>
+            <w:shd w:val="clear" w:color="auto" w:fill="F7FBF8"/>
+            <w:vAlign w:val="center"/>
+          </w:tcPr>
+          <w:p>
+            <w:pPr>
+              <w:spacing w:before="0" w:after="0" w:line="259" w:lineRule="auto"/>
+              <w:jc w:val="left"/>
+              <w:widowControl/>
+              <w:keepNext/>
+            </w:pPr>
+            <w:r/>
+            <w:r>
+              <w:rPr>
+                <w:rFonts w:ascii="Poppins" w:hAnsi="Poppins" w:cs="Poppins" w:eastAsia="Poppins"/>
+                <w:b w:val="0"/>
+                <w:i w:val="0"/>
+                <w:color w:val="1B3325"/>
+                <w:sz w:val="18"/>
+              </w:rPr>
+              <w:t>Trabajador, tipo de marca, fecha y hora. Los tipos son llegada, inicio de almuerzo, fin de almuerzo, descanso y salida.</w:t>
+            </w:r>
+          </w:p>
+        </w:tc>
+      </w:tr>
+      <w:tr>
+        <w:trPr>
+          <w:cantSplit/>
+        </w:trPr>
+        <w:tc>
+          <w:tcPr>
+            <w:tcW w:type="dxa" w:w="2800"/>
+            <w:tcBorders>
+              <w:top w:val="single" w:sz="4" w:space="0" w:color="1B3325"/>
+              <w:left w:val="single" w:sz="4" w:space="0" w:color="1B3325"/>
+              <w:bottom w:val="single" w:sz="4" w:space="0" w:color="1B3325"/>
+              <w:right w:val="single" w:sz="4" w:space="0" w:color="1B3325"/>
+            </w:tcBorders>
+            <w:tcMar>
+              <w:top w:w="40" w:type="dxa"/>
+              <w:left w:w="80" w:type="dxa"/>
+              <w:bottom w:w="40" w:type="dxa"/>
+              <w:right w:w="80" w:type="dxa"/>
+            </w:tcMar>
+            <w:shd w:val="clear" w:color="auto" w:fill="FFFFFF"/>
+            <w:vAlign w:val="center"/>
+          </w:tcPr>
+          <w:p>
+            <w:pPr>
+              <w:spacing w:before="0" w:after="0" w:line="259" w:lineRule="auto"/>
+              <w:jc w:val="left"/>
+              <w:widowControl/>
+            </w:pPr>
+            <w:r/>
+            <w:r>
+              <w:rPr>
+                <w:rFonts w:ascii="Poppins" w:hAnsi="Poppins" w:cs="Poppins" w:eastAsia="Poppins"/>
+                <w:b w:val="0"/>
+                <w:i w:val="0"/>
+                <w:color w:val="1B3325"/>
+                <w:sz w:val="18"/>
+              </w:rPr>
+              <w:t>Documento del Drive</w:t>
+            </w:r>
+          </w:p>
+        </w:tc>
+        <w:tc>
+          <w:tcPr>
+            <w:tcW w:type="dxa" w:w="6800"/>
+            <w:tcBorders>
+              <w:top w:val="single" w:sz="4" w:space="0" w:color="1B3325"/>
+              <w:left w:val="single" w:sz="4" w:space="0" w:color="1B3325"/>
+              <w:bottom w:val="single" w:sz="4" w:space="0" w:color="1B3325"/>
+              <w:right w:val="single" w:sz="4" w:space="0" w:color="1B3325"/>
+            </w:tcBorders>
+            <w:tcMar>
+              <w:top w:w="40" w:type="dxa"/>
+              <w:left w:w="80" w:type="dxa"/>
+              <w:bottom w:w="40" w:type="dxa"/>
+              <w:right w:w="80" w:type="dxa"/>
+            </w:tcMar>
+            <w:shd w:val="clear" w:color="auto" w:fill="FFFFFF"/>
+            <w:vAlign w:val="center"/>
+          </w:tcPr>
+          <w:p>
+            <w:pPr>
+              <w:spacing w:before="0" w:after="0" w:line="259" w:lineRule="auto"/>
+              <w:jc w:val="left"/>
+              <w:widowControl/>
+            </w:pPr>
+            <w:r/>
+            <w:r>
+              <w:rPr>
+                <w:rFonts w:ascii="Poppins" w:hAnsi="Poppins" w:cs="Poppins" w:eastAsia="Poppins"/>
+                <w:b w:val="0"/>
+                <w:i w:val="0"/>
+                <w:color w:val="1B3325"/>
+                <w:sz w:val="18"/>
+              </w:rPr>
+              <w:t>Archivo, carpeta de área y rol que puede verlo. La cuota de la cuenta es de 2 TB.</w:t>
+            </w:r>
+          </w:p>
+        </w:tc>
+      </w:tr>
+    </w:tbl>
+    <w:p>
+      <w:pPr>
+        <w:spacing w:before="0" w:after="40" w:line="259" w:lineRule="auto"/>
+        <w:jc w:val="left"/>
+        <w:widowControl/>
+      </w:pPr>
     </w:p>
     <w:p>
       <w:pPr>
@@ -3482,7 +4105,7 @@
                 <w:color w:val="1B3325"/>
                 <w:sz w:val="20"/>
               </w:rPr>
-              <w:t>Clientes, contactos, oportunidades y seguimiento. Áreas, cargos, procesos y tablero. Trazabilidad del trabajador: ficha, asignación, actividad y estado. Reportes de la operación.</w:t>
+              <w:t>Expediente del cliente: responsable, estado, fecha y hora de cada cambio. Chat interno por cliente y por área, con autor, fecha y hora. Áreas, cargos, procesos y tablero. Trazabilidad del trabajador: ficha, asignación, actividad y estado. Reportes de la operación.</w:t>
             </w:r>
           </w:p>
         </w:tc>
@@ -18659,42 +19282,12 @@
             <w:r>
               <w:rPr>
                 <w:rFonts w:ascii="Poppins" w:hAnsi="Poppins" w:cs="Poppins" w:eastAsia="Poppins"/>
-                <w:b/>
+                <w:b w:val="0"/>
                 <w:i w:val="0"/>
                 <w:color w:val="1B3325"/>
                 <w:sz w:val="16"/>
               </w:rPr>
-              <w:t>CRM</w:t>
-            </w:r>
-            <w:r>
-              <w:rPr>
-                <w:rFonts w:ascii="Poppins" w:hAnsi="Poppins" w:cs="Poppins" w:eastAsia="Poppins"/>
-                <w:b w:val="0"/>
-                <w:i w:val="0"/>
-                <w:color w:val="1B3325"/>
-                <w:sz w:val="16"/>
-              </w:rPr>
-              <w:t xml:space="preserve">, </w:t>
-            </w:r>
-            <w:r>
-              <w:rPr>
-                <w:rFonts w:ascii="Poppins" w:hAnsi="Poppins" w:cs="Poppins" w:eastAsia="Poppins"/>
-                <w:b/>
-                <w:i w:val="0"/>
-                <w:color w:val="1B3325"/>
-                <w:sz w:val="16"/>
-              </w:rPr>
-              <w:t>ERP</w:t>
-            </w:r>
-            <w:r>
-              <w:rPr>
-                <w:rFonts w:ascii="Poppins" w:hAnsi="Poppins" w:cs="Poppins" w:eastAsia="Poppins"/>
-                <w:b w:val="0"/>
-                <w:i w:val="0"/>
-                <w:color w:val="1B3325"/>
-                <w:sz w:val="16"/>
-              </w:rPr>
-              <w:t xml:space="preserve"> y trazabilidad</w:t>
+              <w:t>Expediente del cliente y chat interno</w:t>
             </w:r>
           </w:p>
         </w:tc>
@@ -18770,7 +19363,7 @@
                 <w:color w:val="1B3325"/>
                 <w:sz w:val="16"/>
               </w:rPr>
-              <w:t xml:space="preserve">Odoo, Bitrix24, Zoho </w:t>
+              <w:t xml:space="preserve">Odoo y Zoho </w:t>
             </w:r>
             <w:r>
               <w:rPr>
@@ -18790,7 +19383,7 @@
                 <w:color w:val="1B3325"/>
                 <w:sz w:val="16"/>
               </w:rPr>
-              <w:t xml:space="preserve"> y HubSpot.</w:t>
+              <w:t xml:space="preserve"> llevan el cliente. Bitrix24 suma el chat de la empresa en el mismo producto.</w:t>
             </w:r>
           </w:p>
         </w:tc>
@@ -22100,27 +22693,7 @@
           <w:color w:val="1B3325"/>
           <w:sz w:val="26"/>
         </w:rPr>
-        <w:t xml:space="preserve">Confirmar el reparto: el módulo 1 reúne </w:t>
-      </w:r>
-      <w:r>
-        <w:rPr>
-          <w:rFonts w:ascii="Poppins" w:hAnsi="Poppins" w:cs="Poppins" w:eastAsia="Poppins"/>
-          <w:b/>
-          <w:i w:val="0"/>
-          <w:color w:val="1B3325"/>
-          <w:sz w:val="26"/>
-        </w:rPr>
-        <w:t>CRM</w:t>
-      </w:r>
-      <w:r>
-        <w:rPr>
-          <w:rFonts w:ascii="Poppins" w:hAnsi="Poppins" w:cs="Poppins" w:eastAsia="Poppins"/>
-          <w:b w:val="0"/>
-          <w:i w:val="0"/>
-          <w:color w:val="1B3325"/>
-          <w:sz w:val="26"/>
-        </w:rPr>
-        <w:t xml:space="preserve">, </w:t>
+        <w:t xml:space="preserve">Confirmar el reparto: el módulo 1 es la trazabilidad de la gestión de clientes, el chat interno y el </w:t>
       </w:r>
       <w:r>
         <w:rPr>
@@ -22140,47 +22713,7 @@
           <w:color w:val="1B3325"/>
           <w:sz w:val="26"/>
         </w:rPr>
-        <w:t xml:space="preserve"> de gestión y trazabilidad; el módulo 2 es la asistencia; el módulo 3 es el Drive. Para 30 usuarios, el </w:t>
-      </w:r>
-      <w:r>
-        <w:rPr>
-          <w:rFonts w:ascii="Poppins" w:hAnsi="Poppins" w:cs="Poppins" w:eastAsia="Poppins"/>
-          <w:b/>
-          <w:i w:val="0"/>
-          <w:color w:val="1B3325"/>
-          <w:sz w:val="26"/>
-        </w:rPr>
-        <w:t>CRM</w:t>
-      </w:r>
-      <w:r>
-        <w:rPr>
-          <w:rFonts w:ascii="Poppins" w:hAnsi="Poppins" w:cs="Poppins" w:eastAsia="Poppins"/>
-          <w:b w:val="0"/>
-          <w:i w:val="0"/>
-          <w:color w:val="1B3325"/>
-          <w:sz w:val="26"/>
-        </w:rPr>
-        <w:t xml:space="preserve"> y </w:t>
-      </w:r>
-      <w:r>
-        <w:rPr>
-          <w:rFonts w:ascii="Poppins" w:hAnsi="Poppins" w:cs="Poppins" w:eastAsia="Poppins"/>
-          <w:b/>
-          <w:i w:val="0"/>
-          <w:color w:val="1B3325"/>
-          <w:sz w:val="26"/>
-        </w:rPr>
-        <w:t>ERP</w:t>
-      </w:r>
-      <w:r>
-        <w:rPr>
-          <w:rFonts w:ascii="Poppins" w:hAnsi="Poppins" w:cs="Poppins" w:eastAsia="Poppins"/>
-          <w:b w:val="0"/>
-          <w:i w:val="0"/>
-          <w:color w:val="1B3325"/>
-          <w:sz w:val="26"/>
-        </w:rPr>
-        <w:t xml:space="preserve"> son $450.000 al mes y los tres módulos son $990.000.</w:t>
+        <w:t xml:space="preserve"> de áreas y procesos; el módulo 2 es la asistencia; el módulo 3 es el Drive. Para 30 usuarios, el módulo 1 son $450.000 al mes y los tres módulos son $990.000.</w:t>
       </w:r>
     </w:p>
     <w:p>
@@ -22361,6 +22894,649 @@
           <w:sz w:val="26"/>
         </w:rPr>
         <w:t>Dejar por escrito, en cada propuesta, que la VPS y el dominio los coloca el cliente, que la mensualidad es solo el software, que la nómina y la factura electrónica quedan por fuera, y que las marcas las registra el trabajador o el supervisor.</w:t>
+      </w:r>
+    </w:p>
+    <w:p>
+      <w:pPr>
+        <w:spacing w:before="240" w:after="80" w:line="259" w:lineRule="auto"/>
+        <w:jc w:val="left"/>
+        <w:keepNext/>
+        <w:widowControl/>
+      </w:pPr>
+      <w:r>
+        <w:rPr>
+          <w:rFonts w:ascii="Poppins" w:hAnsi="Poppins" w:cs="Poppins" w:eastAsia="Poppins"/>
+          <w:b/>
+          <w:i w:val="0"/>
+          <w:color w:val="1B3325"/>
+          <w:sz w:val="26"/>
+        </w:rPr>
+        <w:t>17. PARTE SOCIAL DEL SERVICIO</w:t>
+      </w:r>
+    </w:p>
+    <w:p>
+      <w:pPr>
+        <w:spacing w:before="0" w:after="160" w:line="259" w:lineRule="auto"/>
+        <w:jc w:val="both"/>
+        <w:widowControl/>
+      </w:pPr>
+      <w:r>
+        <w:rPr>
+          <w:rFonts w:ascii="Poppins" w:hAnsi="Poppins" w:cs="Poppins" w:eastAsia="Poppins"/>
+          <w:b/>
+          <w:i w:val="0"/>
+          <w:color w:val="1B3325"/>
+          <w:sz w:val="26"/>
+        </w:rPr>
+        <w:t>RecoTime</w:t>
+      </w:r>
+      <w:r>
+        <w:rPr>
+          <w:rFonts w:ascii="Poppins" w:hAnsi="Poppins" w:cs="Poppins" w:eastAsia="Poppins"/>
+          <w:b w:val="0"/>
+          <w:i w:val="0"/>
+          <w:color w:val="1B3325"/>
+          <w:sz w:val="26"/>
+        </w:rPr>
+        <w:t xml:space="preserve"> no liquida nómina, no reemplaza el área de gestión humana y no sustituye el reglamento interno de trabajo. La parte social está en dos registros que la operación ya necesita y que, en Colombia, además sostienen derechos del trabajador: la jornada, con el almuerzo y los descansos separados, y el chat interno, para que la orden de trabajo no viva en el teléfono personal.</w:t>
+      </w:r>
+    </w:p>
+    <w:p>
+      <w:pPr>
+        <w:spacing w:before="160" w:after="40" w:line="259" w:lineRule="auto"/>
+        <w:jc w:val="left"/>
+        <w:keepNext/>
+        <w:widowControl/>
+      </w:pPr>
+      <w:r>
+        <w:rPr>
+          <w:rFonts w:ascii="Poppins" w:hAnsi="Poppins" w:cs="Poppins" w:eastAsia="Poppins"/>
+          <w:b/>
+          <w:i w:val="0"/>
+          <w:color w:val="1B3325"/>
+          <w:sz w:val="26"/>
+        </w:rPr>
+        <w:t>17.1. La jornada, el almuerzo y los descansos</w:t>
+      </w:r>
+    </w:p>
+    <w:p>
+      <w:pPr>
+        <w:spacing w:before="0" w:after="160" w:line="259" w:lineRule="auto"/>
+        <w:jc w:val="both"/>
+        <w:widowControl/>
+      </w:pPr>
+      <w:r>
+        <w:rPr>
+          <w:rFonts w:ascii="Poppins" w:hAnsi="Poppins" w:cs="Poppins" w:eastAsia="Poppins"/>
+          <w:b w:val="0"/>
+          <w:i w:val="0"/>
+          <w:color w:val="1B3325"/>
+          <w:sz w:val="26"/>
+        </w:rPr>
+        <w:t>El artículo 161 del Código Sustantivo del Trabajo, modificado por la Ley 2101 de 2021 y recogido por la Ley 2466 de 2025, fija la jornada ordinaria máxima. La Circular 101 de 2025 del Ministerio del Trabajo recuerda el calendario de esa ley: desde el 15 de julio de 2026 la jornada máxima ordinaria es de 42 horas semanales, distribuidas de común acuerdo en 5 o 6 días, con un día de descanso. Esa jornada es tiempo de trabajo efectivo.</w:t>
+      </w:r>
+    </w:p>
+    <w:p>
+      <w:pPr>
+        <w:spacing w:before="0" w:after="160" w:line="259" w:lineRule="auto"/>
+        <w:jc w:val="both"/>
+        <w:widowControl/>
+      </w:pPr>
+      <w:r>
+        <w:rPr>
+          <w:rFonts w:ascii="Poppins" w:hAnsi="Poppins" w:cs="Poppins" w:eastAsia="Poppins"/>
+          <w:b w:val="0"/>
+          <w:i w:val="0"/>
+          <w:color w:val="1B3325"/>
+          <w:sz w:val="26"/>
+        </w:rPr>
+        <w:t>El artículo 167 del mismo código ordena distribuir las horas de cada jornada en al menos dos secciones, con un intermedio de descanso adaptado al trabajo y a las necesidades de los trabajadores. Ese intermedio no se computa en la jornada. El artículo 108 exige que el reglamento interno de trabajo fije las horas de entrada y salida, el tiempo de las comidas y los períodos de descanso.</w:t>
+      </w:r>
+    </w:p>
+    <w:p>
+      <w:pPr>
+        <w:spacing w:before="0" w:after="160" w:line="259" w:lineRule="auto"/>
+        <w:jc w:val="both"/>
+        <w:widowControl/>
+      </w:pPr>
+      <w:r>
+        <w:rPr>
+          <w:rFonts w:ascii="Poppins" w:hAnsi="Poppins" w:cs="Poppins" w:eastAsia="Poppins"/>
+          <w:b w:val="0"/>
+          <w:i w:val="0"/>
+          <w:color w:val="1B3325"/>
+          <w:sz w:val="26"/>
+        </w:rPr>
+        <w:t xml:space="preserve">El módulo de asistencia guarda cinco tipos de marca: llegada, inicio de almuerzo, fin de almuerzo, descanso y salida. Cada marca tiene trabajador, fecha y hora. El almuerzo queda separado de los descansos y del tiempo entre la llegada y la salida. El trabajador consulta su línea. El supervisor ve el día en curso. La marca la registra la persona o el supervisor dentro de </w:t>
+      </w:r>
+      <w:r>
+        <w:rPr>
+          <w:rFonts w:ascii="Poppins" w:hAnsi="Poppins" w:cs="Poppins" w:eastAsia="Poppins"/>
+          <w:b/>
+          <w:i w:val="0"/>
+          <w:color w:val="1B3325"/>
+          <w:sz w:val="26"/>
+        </w:rPr>
+        <w:t>RecoTime</w:t>
+      </w:r>
+      <w:r>
+        <w:rPr>
+          <w:rFonts w:ascii="Poppins" w:hAnsi="Poppins" w:cs="Poppins" w:eastAsia="Poppins"/>
+          <w:b w:val="0"/>
+          <w:i w:val="0"/>
+          <w:color w:val="1B3325"/>
+          <w:sz w:val="26"/>
+        </w:rPr>
+        <w:t xml:space="preserve">. Con ese registro, la empresa puede contrastar el día contra el horario de su reglamento y separar el intermedio que el artículo 167 deja fuera de la jornada. </w:t>
+      </w:r>
+      <w:r>
+        <w:rPr>
+          <w:rFonts w:ascii="Poppins" w:hAnsi="Poppins" w:cs="Poppins" w:eastAsia="Poppins"/>
+          <w:b/>
+          <w:i w:val="0"/>
+          <w:color w:val="1B3325"/>
+          <w:sz w:val="26"/>
+        </w:rPr>
+        <w:t>RecoTime</w:t>
+      </w:r>
+      <w:r>
+        <w:rPr>
+          <w:rFonts w:ascii="Poppins" w:hAnsi="Poppins" w:cs="Poppins" w:eastAsia="Poppins"/>
+          <w:b w:val="0"/>
+          <w:i w:val="0"/>
+          <w:color w:val="1B3325"/>
+          <w:sz w:val="26"/>
+        </w:rPr>
+        <w:t xml:space="preserve"> no calcula la nómina ni decide si una hora es extra: deja la evidencia para quien sí liquida.</w:t>
+      </w:r>
+    </w:p>
+    <w:p>
+      <w:pPr>
+        <w:spacing w:before="160" w:after="40" w:line="259" w:lineRule="auto"/>
+        <w:jc w:val="left"/>
+        <w:keepNext/>
+        <w:widowControl/>
+      </w:pPr>
+      <w:r>
+        <w:rPr>
+          <w:rFonts w:ascii="Poppins" w:hAnsi="Poppins" w:cs="Poppins" w:eastAsia="Poppins"/>
+          <w:b/>
+          <w:i w:val="0"/>
+          <w:color w:val="1B3325"/>
+          <w:sz w:val="26"/>
+        </w:rPr>
+        <w:t>17.2. El chat interno y la desconexión laboral</w:t>
+      </w:r>
+    </w:p>
+    <w:p>
+      <w:pPr>
+        <w:spacing w:before="0" w:after="160" w:line="259" w:lineRule="auto"/>
+        <w:jc w:val="both"/>
+        <w:widowControl/>
+      </w:pPr>
+      <w:r>
+        <w:rPr>
+          <w:rFonts w:ascii="Poppins" w:hAnsi="Poppins" w:cs="Poppins" w:eastAsia="Poppins"/>
+          <w:b w:val="0"/>
+          <w:i w:val="0"/>
+          <w:color w:val="1B3325"/>
+          <w:sz w:val="26"/>
+        </w:rPr>
+        <w:t>La Ley 2191 de 2022 regula la desconexión laboral. El artículo 3 la define como el derecho a no ser contactado, por cualquier medio, para asuntos de trabajo por fuera de la jornada, ni en vacaciones o descansos. El empleador debe abstenerse de dar órdenes fuera de esa jornada. El artículo 5 le exige una política de desconexión. El derecho empieza cuando termina la jornada. Hay cargos de dirección, confianza y manejo con un régimen propio, que la misma ley señala.</w:t>
+      </w:r>
+    </w:p>
+    <w:p>
+      <w:pPr>
+        <w:spacing w:before="0" w:after="160" w:line="259" w:lineRule="auto"/>
+        <w:jc w:val="both"/>
+        <w:widowControl/>
+      </w:pPr>
+      <w:r>
+        <w:rPr>
+          <w:rFonts w:ascii="Poppins" w:hAnsi="Poppins" w:cs="Poppins" w:eastAsia="Poppins"/>
+          <w:b w:val="0"/>
+          <w:i w:val="0"/>
+          <w:color w:val="1B3325"/>
+          <w:sz w:val="26"/>
+        </w:rPr>
+        <w:t xml:space="preserve">El chat interno de </w:t>
+      </w:r>
+      <w:r>
+        <w:rPr>
+          <w:rFonts w:ascii="Poppins" w:hAnsi="Poppins" w:cs="Poppins" w:eastAsia="Poppins"/>
+          <w:b/>
+          <w:i w:val="0"/>
+          <w:color w:val="1B3325"/>
+          <w:sz w:val="26"/>
+        </w:rPr>
+        <w:t>RecoTime</w:t>
+      </w:r>
+      <w:r>
+        <w:rPr>
+          <w:rFonts w:ascii="Poppins" w:hAnsi="Poppins" w:cs="Poppins" w:eastAsia="Poppins"/>
+          <w:b w:val="0"/>
+          <w:i w:val="0"/>
+          <w:color w:val="1B3325"/>
+          <w:sz w:val="26"/>
+        </w:rPr>
+        <w:t xml:space="preserve"> es el canal de la empresa. Un mensaje guarda autor, fecha, hora y el cliente o el área a la que pertenece. El hilo sigue en el sistema si la persona sale de la compañía. La orden deja de depender de un WhatsApp personal, que se borra, se mezcla con la vida privada y sigue disponible cuando la jornada ya terminó. Tener el chat dentro de </w:t>
+      </w:r>
+      <w:r>
+        <w:rPr>
+          <w:rFonts w:ascii="Poppins" w:hAnsi="Poppins" w:cs="Poppins" w:eastAsia="Poppins"/>
+          <w:b/>
+          <w:i w:val="0"/>
+          <w:color w:val="1B3325"/>
+          <w:sz w:val="26"/>
+        </w:rPr>
+        <w:t>RecoTime</w:t>
+      </w:r>
+      <w:r>
+        <w:rPr>
+          <w:rFonts w:ascii="Poppins" w:hAnsi="Poppins" w:cs="Poppins" w:eastAsia="Poppins"/>
+          <w:b w:val="0"/>
+          <w:i w:val="0"/>
+          <w:color w:val="1B3325"/>
+          <w:sz w:val="26"/>
+        </w:rPr>
+        <w:t xml:space="preserve"> no cumple la Ley 2191 por sí solo. Le da a la empresa un lugar donde la instrucción queda fechada, para aplicar la política de desconexión sobre un canal de trabajo y no sobre el número personal del trabajador.</w:t>
+      </w:r>
+    </w:p>
+    <w:p>
+      <w:pPr>
+        <w:spacing w:before="160" w:after="40" w:line="259" w:lineRule="auto"/>
+        <w:jc w:val="left"/>
+        <w:keepNext/>
+        <w:widowControl/>
+      </w:pPr>
+      <w:r>
+        <w:rPr>
+          <w:rFonts w:ascii="Poppins" w:hAnsi="Poppins" w:cs="Poppins" w:eastAsia="Poppins"/>
+          <w:b/>
+          <w:i w:val="0"/>
+          <w:color w:val="1B3325"/>
+          <w:sz w:val="26"/>
+        </w:rPr>
+        <w:t>17.3. Por qué conviene en esa área</w:t>
+      </w:r>
+    </w:p>
+    <w:tbl>
+      <w:tblPr>
+        <w:tblW w:type="dxa" w:w="9600"/>
+        <w:jc w:val="center"/>
+        <w:tblLayout w:type="fixed"/>
+        <w:tblLook w:firstColumn="1" w:firstRow="1" w:lastColumn="0" w:lastRow="0" w:noHBand="0" w:noVBand="1" w:val="04A0"/>
+      </w:tblPr>
+      <w:tblGrid>
+        <w:gridCol w:w="2200"/>
+        <w:gridCol w:w="7400"/>
+      </w:tblGrid>
+      <w:tr>
+        <w:trPr>
+          <w:tblHeader/>
+          <w:cantSplit/>
+        </w:trPr>
+        <w:tc>
+          <w:tcPr>
+            <w:tcW w:type="dxa" w:w="2200"/>
+            <w:tcBorders>
+              <w:top w:val="single" w:sz="4" w:space="0" w:color="1B3325"/>
+              <w:left w:val="single" w:sz="4" w:space="0" w:color="1B3325"/>
+              <w:bottom w:val="single" w:sz="4" w:space="0" w:color="1B3325"/>
+              <w:right w:val="single" w:sz="4" w:space="0" w:color="1B3325"/>
+            </w:tcBorders>
+            <w:tcMar>
+              <w:top w:w="40" w:type="dxa"/>
+              <w:left w:w="80" w:type="dxa"/>
+              <w:bottom w:w="40" w:type="dxa"/>
+              <w:right w:w="80" w:type="dxa"/>
+            </w:tcMar>
+            <w:shd w:val="clear" w:color="auto" w:fill="1B3325"/>
+            <w:vAlign w:val="center"/>
+          </w:tcPr>
+          <w:p>
+            <w:pPr>
+              <w:spacing w:before="0" w:after="0" w:line="259" w:lineRule="auto"/>
+              <w:jc w:val="center"/>
+              <w:widowControl/>
+              <w:keepNext/>
+            </w:pPr>
+            <w:r/>
+            <w:r>
+              <w:rPr>
+                <w:rFonts w:ascii="Poppins" w:hAnsi="Poppins" w:cs="Poppins" w:eastAsia="Poppins"/>
+                <w:b/>
+                <w:i w:val="0"/>
+                <w:color w:val="FFFFFF"/>
+                <w:sz w:val="18"/>
+              </w:rPr>
+              <w:t>Para quién</w:t>
+            </w:r>
+          </w:p>
+        </w:tc>
+        <w:tc>
+          <w:tcPr>
+            <w:tcW w:type="dxa" w:w="7400"/>
+            <w:tcBorders>
+              <w:top w:val="single" w:sz="4" w:space="0" w:color="1B3325"/>
+              <w:left w:val="single" w:sz="4" w:space="0" w:color="1B3325"/>
+              <w:bottom w:val="single" w:sz="4" w:space="0" w:color="1B3325"/>
+              <w:right w:val="single" w:sz="4" w:space="0" w:color="1B3325"/>
+            </w:tcBorders>
+            <w:tcMar>
+              <w:top w:w="40" w:type="dxa"/>
+              <w:left w:w="80" w:type="dxa"/>
+              <w:bottom w:w="40" w:type="dxa"/>
+              <w:right w:w="80" w:type="dxa"/>
+            </w:tcMar>
+            <w:shd w:val="clear" w:color="auto" w:fill="1B3325"/>
+            <w:vAlign w:val="center"/>
+          </w:tcPr>
+          <w:p>
+            <w:pPr>
+              <w:spacing w:before="0" w:after="0" w:line="259" w:lineRule="auto"/>
+              <w:jc w:val="center"/>
+              <w:widowControl/>
+              <w:keepNext/>
+            </w:pPr>
+            <w:r/>
+            <w:r>
+              <w:rPr>
+                <w:rFonts w:ascii="Poppins" w:hAnsi="Poppins" w:cs="Poppins" w:eastAsia="Poppins"/>
+                <w:b/>
+                <w:i w:val="0"/>
+                <w:color w:val="FFFFFF"/>
+                <w:sz w:val="18"/>
+              </w:rPr>
+              <w:t>Qué gana con el registro</w:t>
+            </w:r>
+          </w:p>
+        </w:tc>
+      </w:tr>
+      <w:tr>
+        <w:trPr>
+          <w:cantSplit/>
+        </w:trPr>
+        <w:tc>
+          <w:tcPr>
+            <w:tcW w:type="dxa" w:w="2200"/>
+            <w:tcBorders>
+              <w:top w:val="single" w:sz="4" w:space="0" w:color="1B3325"/>
+              <w:left w:val="single" w:sz="4" w:space="0" w:color="1B3325"/>
+              <w:bottom w:val="single" w:sz="4" w:space="0" w:color="1B3325"/>
+              <w:right w:val="single" w:sz="4" w:space="0" w:color="1B3325"/>
+            </w:tcBorders>
+            <w:tcMar>
+              <w:top w:w="40" w:type="dxa"/>
+              <w:left w:w="80" w:type="dxa"/>
+              <w:bottom w:w="40" w:type="dxa"/>
+              <w:right w:w="80" w:type="dxa"/>
+            </w:tcMar>
+            <w:shd w:val="clear" w:color="auto" w:fill="FFFFFF"/>
+            <w:vAlign w:val="center"/>
+          </w:tcPr>
+          <w:p>
+            <w:pPr>
+              <w:spacing w:before="0" w:after="0" w:line="259" w:lineRule="auto"/>
+              <w:jc w:val="left"/>
+              <w:widowControl/>
+              <w:keepNext/>
+            </w:pPr>
+            <w:r/>
+            <w:r>
+              <w:rPr>
+                <w:rFonts w:ascii="Poppins" w:hAnsi="Poppins" w:cs="Poppins" w:eastAsia="Poppins"/>
+                <w:b w:val="0"/>
+                <w:i w:val="0"/>
+                <w:color w:val="1B3325"/>
+                <w:sz w:val="18"/>
+              </w:rPr>
+              <w:t>El trabajador</w:t>
+            </w:r>
+          </w:p>
+        </w:tc>
+        <w:tc>
+          <w:tcPr>
+            <w:tcW w:type="dxa" w:w="7400"/>
+            <w:tcBorders>
+              <w:top w:val="single" w:sz="4" w:space="0" w:color="1B3325"/>
+              <w:left w:val="single" w:sz="4" w:space="0" w:color="1B3325"/>
+              <w:bottom w:val="single" w:sz="4" w:space="0" w:color="1B3325"/>
+              <w:right w:val="single" w:sz="4" w:space="0" w:color="1B3325"/>
+            </w:tcBorders>
+            <w:tcMar>
+              <w:top w:w="40" w:type="dxa"/>
+              <w:left w:w="80" w:type="dxa"/>
+              <w:bottom w:w="40" w:type="dxa"/>
+              <w:right w:w="80" w:type="dxa"/>
+            </w:tcMar>
+            <w:shd w:val="clear" w:color="auto" w:fill="FFFFFF"/>
+            <w:vAlign w:val="center"/>
+          </w:tcPr>
+          <w:p>
+            <w:pPr>
+              <w:spacing w:before="0" w:after="0" w:line="259" w:lineRule="auto"/>
+              <w:jc w:val="left"/>
+              <w:widowControl/>
+              <w:keepNext/>
+            </w:pPr>
+            <w:r/>
+            <w:r>
+              <w:rPr>
+                <w:rFonts w:ascii="Poppins" w:hAnsi="Poppins" w:cs="Poppins" w:eastAsia="Poppins"/>
+                <w:b w:val="0"/>
+                <w:i w:val="0"/>
+                <w:color w:val="1B3325"/>
+                <w:sz w:val="18"/>
+              </w:rPr>
+              <w:t>Consulta su línea del día y el chat de su trabajo. El almuerzo y los descansos no se diluyen en un mensaje de «ya llegué». Puede pedir el dato sin reconstruir la semana.</w:t>
+            </w:r>
+          </w:p>
+        </w:tc>
+      </w:tr>
+      <w:tr>
+        <w:trPr>
+          <w:cantSplit/>
+        </w:trPr>
+        <w:tc>
+          <w:tcPr>
+            <w:tcW w:type="dxa" w:w="2200"/>
+            <w:tcBorders>
+              <w:top w:val="single" w:sz="4" w:space="0" w:color="1B3325"/>
+              <w:left w:val="single" w:sz="4" w:space="0" w:color="1B3325"/>
+              <w:bottom w:val="single" w:sz="4" w:space="0" w:color="1B3325"/>
+              <w:right w:val="single" w:sz="4" w:space="0" w:color="1B3325"/>
+            </w:tcBorders>
+            <w:tcMar>
+              <w:top w:w="40" w:type="dxa"/>
+              <w:left w:w="80" w:type="dxa"/>
+              <w:bottom w:w="40" w:type="dxa"/>
+              <w:right w:w="80" w:type="dxa"/>
+            </w:tcMar>
+            <w:shd w:val="clear" w:color="auto" w:fill="F7FBF8"/>
+            <w:vAlign w:val="center"/>
+          </w:tcPr>
+          <w:p>
+            <w:pPr>
+              <w:spacing w:before="0" w:after="0" w:line="259" w:lineRule="auto"/>
+              <w:jc w:val="left"/>
+              <w:widowControl/>
+              <w:keepNext/>
+            </w:pPr>
+            <w:r/>
+            <w:r>
+              <w:rPr>
+                <w:rFonts w:ascii="Poppins" w:hAnsi="Poppins" w:cs="Poppins" w:eastAsia="Poppins"/>
+                <w:b w:val="0"/>
+                <w:i w:val="0"/>
+                <w:color w:val="1B3325"/>
+                <w:sz w:val="18"/>
+              </w:rPr>
+              <w:t>La empresa</w:t>
+            </w:r>
+          </w:p>
+        </w:tc>
+        <w:tc>
+          <w:tcPr>
+            <w:tcW w:type="dxa" w:w="7400"/>
+            <w:tcBorders>
+              <w:top w:val="single" w:sz="4" w:space="0" w:color="1B3325"/>
+              <w:left w:val="single" w:sz="4" w:space="0" w:color="1B3325"/>
+              <w:bottom w:val="single" w:sz="4" w:space="0" w:color="1B3325"/>
+              <w:right w:val="single" w:sz="4" w:space="0" w:color="1B3325"/>
+            </w:tcBorders>
+            <w:tcMar>
+              <w:top w:w="40" w:type="dxa"/>
+              <w:left w:w="80" w:type="dxa"/>
+              <w:bottom w:w="40" w:type="dxa"/>
+              <w:right w:w="80" w:type="dxa"/>
+            </w:tcMar>
+            <w:shd w:val="clear" w:color="auto" w:fill="F7FBF8"/>
+            <w:vAlign w:val="center"/>
+          </w:tcPr>
+          <w:p>
+            <w:pPr>
+              <w:spacing w:before="0" w:after="0" w:line="259" w:lineRule="auto"/>
+              <w:jc w:val="left"/>
+              <w:widowControl/>
+              <w:keepNext/>
+            </w:pPr>
+            <w:r/>
+            <w:r>
+              <w:rPr>
+                <w:rFonts w:ascii="Poppins" w:hAnsi="Poppins" w:cs="Poppins" w:eastAsia="Poppins"/>
+                <w:b w:val="0"/>
+                <w:i w:val="0"/>
+                <w:color w:val="1B3325"/>
+                <w:sz w:val="18"/>
+              </w:rPr>
+              <w:t>Explica una jornada con marcas de fecha y hora, y explica la gestión de un cliente con el expediente y el chat interno. El reglamento y la política de desconexión tienen un soporte que se puede abrir.</w:t>
+            </w:r>
+          </w:p>
+        </w:tc>
+      </w:tr>
+      <w:tr>
+        <w:trPr>
+          <w:cantSplit/>
+        </w:trPr>
+        <w:tc>
+          <w:tcPr>
+            <w:tcW w:type="dxa" w:w="2200"/>
+            <w:tcBorders>
+              <w:top w:val="single" w:sz="4" w:space="0" w:color="1B3325"/>
+              <w:left w:val="single" w:sz="4" w:space="0" w:color="1B3325"/>
+              <w:bottom w:val="single" w:sz="4" w:space="0" w:color="1B3325"/>
+              <w:right w:val="single" w:sz="4" w:space="0" w:color="1B3325"/>
+            </w:tcBorders>
+            <w:tcMar>
+              <w:top w:w="40" w:type="dxa"/>
+              <w:left w:w="80" w:type="dxa"/>
+              <w:bottom w:w="40" w:type="dxa"/>
+              <w:right w:w="80" w:type="dxa"/>
+            </w:tcMar>
+            <w:shd w:val="clear" w:color="auto" w:fill="FFFFFF"/>
+            <w:vAlign w:val="center"/>
+          </w:tcPr>
+          <w:p>
+            <w:pPr>
+              <w:spacing w:before="0" w:after="0" w:line="259" w:lineRule="auto"/>
+              <w:jc w:val="left"/>
+              <w:widowControl/>
+            </w:pPr>
+            <w:r/>
+            <w:r>
+              <w:rPr>
+                <w:rFonts w:ascii="Poppins" w:hAnsi="Poppins" w:cs="Poppins" w:eastAsia="Poppins"/>
+                <w:b w:val="0"/>
+                <w:i w:val="0"/>
+                <w:color w:val="1B3325"/>
+                <w:sz w:val="18"/>
+              </w:rPr>
+              <w:t>Una revisión o una queja</w:t>
+            </w:r>
+          </w:p>
+        </w:tc>
+        <w:tc>
+          <w:tcPr>
+            <w:tcW w:type="dxa" w:w="7400"/>
+            <w:tcBorders>
+              <w:top w:val="single" w:sz="4" w:space="0" w:color="1B3325"/>
+              <w:left w:val="single" w:sz="4" w:space="0" w:color="1B3325"/>
+              <w:bottom w:val="single" w:sz="4" w:space="0" w:color="1B3325"/>
+              <w:right w:val="single" w:sz="4" w:space="0" w:color="1B3325"/>
+            </w:tcBorders>
+            <w:tcMar>
+              <w:top w:w="40" w:type="dxa"/>
+              <w:left w:w="80" w:type="dxa"/>
+              <w:bottom w:w="40" w:type="dxa"/>
+              <w:right w:w="80" w:type="dxa"/>
+            </w:tcMar>
+            <w:shd w:val="clear" w:color="auto" w:fill="FFFFFF"/>
+            <w:vAlign w:val="center"/>
+          </w:tcPr>
+          <w:p>
+            <w:pPr>
+              <w:spacing w:before="0" w:after="0" w:line="259" w:lineRule="auto"/>
+              <w:jc w:val="left"/>
+              <w:widowControl/>
+            </w:pPr>
+            <w:r/>
+            <w:r>
+              <w:rPr>
+                <w:rFonts w:ascii="Poppins" w:hAnsi="Poppins" w:cs="Poppins" w:eastAsia="Poppins"/>
+                <w:b w:val="0"/>
+                <w:i w:val="0"/>
+                <w:color w:val="1B3325"/>
+                <w:sz w:val="18"/>
+              </w:rPr>
+              <w:t>El intermedio de descanso se distingue del tiempo de trabajo, que es la separación del artículo 167. La orden tiene autor y hora, que es el dato que la Ley 2191 pone en el centro.</w:t>
+            </w:r>
+          </w:p>
+        </w:tc>
+      </w:tr>
+    </w:tbl>
+    <w:p>
+      <w:pPr>
+        <w:spacing w:before="0" w:after="40" w:line="259" w:lineRule="auto"/>
+        <w:jc w:val="left"/>
+        <w:widowControl/>
+      </w:pPr>
+    </w:p>
+    <w:p>
+      <w:pPr>
+        <w:spacing w:before="0" w:after="160" w:line="259" w:lineRule="auto"/>
+        <w:jc w:val="both"/>
+        <w:widowControl/>
+      </w:pPr>
+      <w:r>
+        <w:rPr>
+          <w:rFonts w:ascii="Poppins" w:hAnsi="Poppins" w:cs="Poppins" w:eastAsia="Poppins"/>
+          <w:b w:val="0"/>
+          <w:i w:val="0"/>
+          <w:color w:val="1B3325"/>
+          <w:sz w:val="26"/>
+        </w:rPr>
+        <w:t xml:space="preserve">La parte social de </w:t>
+      </w:r>
+      <w:r>
+        <w:rPr>
+          <w:rFonts w:ascii="Poppins" w:hAnsi="Poppins" w:cs="Poppins" w:eastAsia="Poppins"/>
+          <w:b/>
+          <w:i w:val="0"/>
+          <w:color w:val="1B3325"/>
+          <w:sz w:val="26"/>
+        </w:rPr>
+        <w:t>RecoTime</w:t>
+      </w:r>
+      <w:r>
+        <w:rPr>
+          <w:rFonts w:ascii="Poppins" w:hAnsi="Poppins" w:cs="Poppins" w:eastAsia="Poppins"/>
+          <w:b w:val="0"/>
+          <w:i w:val="0"/>
+          <w:color w:val="1B3325"/>
+          <w:sz w:val="26"/>
+        </w:rPr>
+        <w:t xml:space="preserve"> es ese registro compartido. Protege el tiempo de descanso porque lo hace visible, y protege la vida personal porque saca la orden de trabajo del teléfono particular. La obligación legal sigue en la empresa: el reglamento, la política de desconexión y la liquidación de la jornada no se delegan en el software.</w:t>
       </w:r>
     </w:p>
     <w:p>

</xml_diff>

<commit_message>
Dejar la parte social en una nota breve sobre Fondo Emprender.
Co-authored-by: Jhon123Javier <Jhon123Javier@users.noreply.github.com>
</commit_message>
<xml_diff>
--- a/documentos/recotime/Informe The Company Dev - Perfil RecoTime.docx
+++ b/documentos/recotime/Informe The Company Dev - Perfil RecoTime.docx
@@ -256,7 +256,7 @@
           <w:color w:val="1B3325"/>
           <w:sz w:val="26"/>
         </w:rPr>
-        <w:t xml:space="preserve"> para aprobar la oferta. Las secciones 2 y 3 dicen para qué existe el sistema. La sección 9 trae el mercado. La sección 11 trae el precio. La sección 17 explica la parte social.</w:t>
+        <w:t xml:space="preserve"> para aprobar la oferta. Las secciones 2 y 3 dicen para qué existe el sistema. La sección 9 trae el mercado. La sección 11 trae el precio. La sección 17 deja, en corto, la parte social frente a Fondo Emprender.</w:t>
       </w:r>
     </w:p>
     <w:p>
@@ -22911,52 +22911,7 @@
           <w:color w:val="1B3325"/>
           <w:sz w:val="26"/>
         </w:rPr>
-        <w:t>17. PARTE SOCIAL DEL SERVICIO</w:t>
-      </w:r>
-    </w:p>
-    <w:p>
-      <w:pPr>
-        <w:spacing w:before="0" w:after="160" w:line="259" w:lineRule="auto"/>
-        <w:jc w:val="both"/>
-        <w:widowControl/>
-      </w:pPr>
-      <w:r>
-        <w:rPr>
-          <w:rFonts w:ascii="Poppins" w:hAnsi="Poppins" w:cs="Poppins" w:eastAsia="Poppins"/>
-          <w:b/>
-          <w:i w:val="0"/>
-          <w:color w:val="1B3325"/>
-          <w:sz w:val="26"/>
-        </w:rPr>
-        <w:t>RecoTime</w:t>
-      </w:r>
-      <w:r>
-        <w:rPr>
-          <w:rFonts w:ascii="Poppins" w:hAnsi="Poppins" w:cs="Poppins" w:eastAsia="Poppins"/>
-          <w:b w:val="0"/>
-          <w:i w:val="0"/>
-          <w:color w:val="1B3325"/>
-          <w:sz w:val="26"/>
-        </w:rPr>
-        <w:t xml:space="preserve"> no liquida nómina, no reemplaza el área de gestión humana y no sustituye el reglamento interno de trabajo. La parte social está en dos registros que la operación ya necesita y que, en Colombia, además sostienen derechos del trabajador: la jornada, con el almuerzo y los descansos separados, y el chat interno, para que la orden de trabajo no viva en el teléfono personal.</w:t>
-      </w:r>
-    </w:p>
-    <w:p>
-      <w:pPr>
-        <w:spacing w:before="160" w:after="40" w:line="259" w:lineRule="auto"/>
-        <w:jc w:val="left"/>
-        <w:keepNext/>
-        <w:widowControl/>
-      </w:pPr>
-      <w:r>
-        <w:rPr>
-          <w:rFonts w:ascii="Poppins" w:hAnsi="Poppins" w:cs="Poppins" w:eastAsia="Poppins"/>
-          <w:b/>
-          <w:i w:val="0"/>
-          <w:color w:val="1B3325"/>
-          <w:sz w:val="26"/>
-        </w:rPr>
-        <w:t>17.1. La jornada, el almuerzo y los descansos</w:t>
+        <w:t>17. PARTE SOCIAL</w:t>
       </w:r>
     </w:p>
     <w:p>
@@ -22973,41 +22928,7 @@
           <w:color w:val="1B3325"/>
           <w:sz w:val="26"/>
         </w:rPr>
-        <w:t>El artículo 161 del Código Sustantivo del Trabajo, modificado por la Ley 2101 de 2021 y recogido por la Ley 2466 de 2025, fija la jornada ordinaria máxima. La Circular 101 de 2025 del Ministerio del Trabajo recuerda el calendario de esa ley: desde el 15 de julio de 2026 la jornada máxima ordinaria es de 42 horas semanales, distribuidas de común acuerdo en 5 o 6 días, con un día de descanso. Esa jornada es tiempo de trabajo efectivo.</w:t>
-      </w:r>
-    </w:p>
-    <w:p>
-      <w:pPr>
-        <w:spacing w:before="0" w:after="160" w:line="259" w:lineRule="auto"/>
-        <w:jc w:val="both"/>
-        <w:widowControl/>
-      </w:pPr>
-      <w:r>
-        <w:rPr>
-          <w:rFonts w:ascii="Poppins" w:hAnsi="Poppins" w:cs="Poppins" w:eastAsia="Poppins"/>
-          <w:b w:val="0"/>
-          <w:i w:val="0"/>
-          <w:color w:val="1B3325"/>
-          <w:sz w:val="26"/>
-        </w:rPr>
-        <w:t>El artículo 167 del mismo código ordena distribuir las horas de cada jornada en al menos dos secciones, con un intermedio de descanso adaptado al trabajo y a las necesidades de los trabajadores. Ese intermedio no se computa en la jornada. El artículo 108 exige que el reglamento interno de trabajo fije las horas de entrada y salida, el tiempo de las comidas y los períodos de descanso.</w:t>
-      </w:r>
-    </w:p>
-    <w:p>
-      <w:pPr>
-        <w:spacing w:before="0" w:after="160" w:line="259" w:lineRule="auto"/>
-        <w:jc w:val="both"/>
-        <w:widowControl/>
-      </w:pPr>
-      <w:r>
-        <w:rPr>
-          <w:rFonts w:ascii="Poppins" w:hAnsi="Poppins" w:cs="Poppins" w:eastAsia="Poppins"/>
-          <w:b w:val="0"/>
-          <w:i w:val="0"/>
-          <w:color w:val="1B3325"/>
-          <w:sz w:val="26"/>
-        </w:rPr>
-        <w:t xml:space="preserve">El módulo de asistencia guarda cinco tipos de marca: llegada, inicio de almuerzo, fin de almuerzo, descanso y salida. Cada marca tiene trabajador, fecha y hora. El almuerzo queda separado de los descansos y del tiempo entre la llegada y la salida. El trabajador consulta su línea. El supervisor ve el día en curso. La marca la registra la persona o el supervisor dentro de </w:t>
+        <w:t xml:space="preserve">Más adelante, </w:t>
       </w:r>
       <w:r>
         <w:rPr>
@@ -23027,137 +22948,7 @@
           <w:color w:val="1B3325"/>
           <w:sz w:val="26"/>
         </w:rPr>
-        <w:t xml:space="preserve">. Con ese registro, la empresa puede contrastar el día contra el horario de su reglamento y separar el intermedio que el artículo 167 deja fuera de la jornada. </w:t>
-      </w:r>
-      <w:r>
-        <w:rPr>
-          <w:rFonts w:ascii="Poppins" w:hAnsi="Poppins" w:cs="Poppins" w:eastAsia="Poppins"/>
-          <w:b/>
-          <w:i w:val="0"/>
-          <w:color w:val="1B3325"/>
-          <w:sz w:val="26"/>
-        </w:rPr>
-        <w:t>RecoTime</w:t>
-      </w:r>
-      <w:r>
-        <w:rPr>
-          <w:rFonts w:ascii="Poppins" w:hAnsi="Poppins" w:cs="Poppins" w:eastAsia="Poppins"/>
-          <w:b w:val="0"/>
-          <w:i w:val="0"/>
-          <w:color w:val="1B3325"/>
-          <w:sz w:val="26"/>
-        </w:rPr>
-        <w:t xml:space="preserve"> no calcula la nómina ni decide si una hora es extra: deja la evidencia para quien sí liquida.</w:t>
-      </w:r>
-    </w:p>
-    <w:p>
-      <w:pPr>
-        <w:spacing w:before="160" w:after="40" w:line="259" w:lineRule="auto"/>
-        <w:jc w:val="left"/>
-        <w:keepNext/>
-        <w:widowControl/>
-      </w:pPr>
-      <w:r>
-        <w:rPr>
-          <w:rFonts w:ascii="Poppins" w:hAnsi="Poppins" w:cs="Poppins" w:eastAsia="Poppins"/>
-          <w:b/>
-          <w:i w:val="0"/>
-          <w:color w:val="1B3325"/>
-          <w:sz w:val="26"/>
-        </w:rPr>
-        <w:t>17.2. El chat interno y la desconexión laboral</w:t>
-      </w:r>
-    </w:p>
-    <w:p>
-      <w:pPr>
-        <w:spacing w:before="0" w:after="160" w:line="259" w:lineRule="auto"/>
-        <w:jc w:val="both"/>
-        <w:widowControl/>
-      </w:pPr>
-      <w:r>
-        <w:rPr>
-          <w:rFonts w:ascii="Poppins" w:hAnsi="Poppins" w:cs="Poppins" w:eastAsia="Poppins"/>
-          <w:b w:val="0"/>
-          <w:i w:val="0"/>
-          <w:color w:val="1B3325"/>
-          <w:sz w:val="26"/>
-        </w:rPr>
-        <w:t>La Ley 2191 de 2022 regula la desconexión laboral. El artículo 3 la define como el derecho a no ser contactado, por cualquier medio, para asuntos de trabajo por fuera de la jornada, ni en vacaciones o descansos. El empleador debe abstenerse de dar órdenes fuera de esa jornada. El artículo 5 le exige una política de desconexión. El derecho empieza cuando termina la jornada. Hay cargos de dirección, confianza y manejo con un régimen propio, que la misma ley señala.</w:t>
-      </w:r>
-    </w:p>
-    <w:p>
-      <w:pPr>
-        <w:spacing w:before="0" w:after="160" w:line="259" w:lineRule="auto"/>
-        <w:jc w:val="both"/>
-        <w:widowControl/>
-      </w:pPr>
-      <w:r>
-        <w:rPr>
-          <w:rFonts w:ascii="Poppins" w:hAnsi="Poppins" w:cs="Poppins" w:eastAsia="Poppins"/>
-          <w:b w:val="0"/>
-          <w:i w:val="0"/>
-          <w:color w:val="1B3325"/>
-          <w:sz w:val="26"/>
-        </w:rPr>
-        <w:t xml:space="preserve">El chat interno de </w:t>
-      </w:r>
-      <w:r>
-        <w:rPr>
-          <w:rFonts w:ascii="Poppins" w:hAnsi="Poppins" w:cs="Poppins" w:eastAsia="Poppins"/>
-          <w:b/>
-          <w:i w:val="0"/>
-          <w:color w:val="1B3325"/>
-          <w:sz w:val="26"/>
-        </w:rPr>
-        <w:t>RecoTime</w:t>
-      </w:r>
-      <w:r>
-        <w:rPr>
-          <w:rFonts w:ascii="Poppins" w:hAnsi="Poppins" w:cs="Poppins" w:eastAsia="Poppins"/>
-          <w:b w:val="0"/>
-          <w:i w:val="0"/>
-          <w:color w:val="1B3325"/>
-          <w:sz w:val="26"/>
-        </w:rPr>
-        <w:t xml:space="preserve"> es el canal de la empresa. Un mensaje guarda autor, fecha, hora y el cliente o el área a la que pertenece. El hilo sigue en el sistema si la persona sale de la compañía. La orden deja de depender de un WhatsApp personal, que se borra, se mezcla con la vida privada y sigue disponible cuando la jornada ya terminó. Tener el chat dentro de </w:t>
-      </w:r>
-      <w:r>
-        <w:rPr>
-          <w:rFonts w:ascii="Poppins" w:hAnsi="Poppins" w:cs="Poppins" w:eastAsia="Poppins"/>
-          <w:b/>
-          <w:i w:val="0"/>
-          <w:color w:val="1B3325"/>
-          <w:sz w:val="26"/>
-        </w:rPr>
-        <w:t>RecoTime</w:t>
-      </w:r>
-      <w:r>
-        <w:rPr>
-          <w:rFonts w:ascii="Poppins" w:hAnsi="Poppins" w:cs="Poppins" w:eastAsia="Poppins"/>
-          <w:b w:val="0"/>
-          <w:i w:val="0"/>
-          <w:color w:val="1B3325"/>
-          <w:sz w:val="26"/>
-        </w:rPr>
-        <w:t xml:space="preserve"> no cumple la Ley 2191 por sí solo. Le da a la empresa un lugar donde la instrucción queda fechada, para aplicar la política de desconexión sobre un canal de trabajo y no sobre el número personal del trabajador.</w:t>
-      </w:r>
-    </w:p>
-    <w:p>
-      <w:pPr>
-        <w:spacing w:before="160" w:after="40" w:line="259" w:lineRule="auto"/>
-        <w:jc w:val="left"/>
-        <w:keepNext/>
-        <w:widowControl/>
-      </w:pPr>
-      <w:r>
-        <w:rPr>
-          <w:rFonts w:ascii="Poppins" w:hAnsi="Poppins" w:cs="Poppins" w:eastAsia="Poppins"/>
-          <w:b/>
-          <w:i w:val="0"/>
-          <w:color w:val="1B3325"/>
-          <w:sz w:val="26"/>
-        </w:rPr>
-        <w:t>17.3. Por qué conviene en esa área</w:t>
+        <w:t xml:space="preserve"> puede acompañar a un emprendimiento que busque o ya tenga recursos del Fondo Emprender del SENA. Esta versión no incluye ese trámite. El fondo, en su reglamento de 2026, financia por dos líneas: Crear, para una iniciativa nueva, y Fortalecimiento productivo, para un negocio ya registrado. En las dos mira ingresos, autoempleo y puestos de trabajo. Esos son los temas sociales que este servicio toca, y de forma leve.</w:t>
       </w:r>
     </w:p>
     <w:tbl>
@@ -23168,8 +22959,8 @@
         <w:tblLook w:firstColumn="1" w:firstRow="1" w:lastColumn="0" w:lastRow="0" w:noHBand="0" w:noVBand="1" w:val="04A0"/>
       </w:tblPr>
       <w:tblGrid>
-        <w:gridCol w:w="2200"/>
-        <w:gridCol w:w="7400"/>
+        <w:gridCol w:w="2800"/>
+        <w:gridCol w:w="6800"/>
       </w:tblGrid>
       <w:tr>
         <w:trPr>
@@ -23178,7 +22969,7 @@
         </w:trPr>
         <w:tc>
           <w:tcPr>
-            <w:tcW w:type="dxa" w:w="2200"/>
+            <w:tcW w:type="dxa" w:w="2800"/>
             <w:tcBorders>
               <w:top w:val="single" w:sz="4" w:space="0" w:color="1B3325"/>
               <w:left w:val="single" w:sz="4" w:space="0" w:color="1B3325"/>
@@ -23210,13 +23001,13 @@
                 <w:color w:val="FFFFFF"/>
                 <w:sz w:val="18"/>
               </w:rPr>
-              <w:t>Para quién</w:t>
+              <w:t>Tema social</w:t>
             </w:r>
           </w:p>
         </w:tc>
         <w:tc>
           <w:tcPr>
-            <w:tcW w:type="dxa" w:w="7400"/>
+            <w:tcW w:type="dxa" w:w="6800"/>
             <w:tcBorders>
               <w:top w:val="single" w:sz="4" w:space="0" w:color="1B3325"/>
               <w:left w:val="single" w:sz="4" w:space="0" w:color="1B3325"/>
@@ -23248,7 +23039,17 @@
                 <w:color w:val="FFFFFF"/>
                 <w:sz w:val="18"/>
               </w:rPr>
-              <w:t>Qué gana con el registro</w:t>
+              <w:t xml:space="preserve">En qué puede ayudar </w:t>
+            </w:r>
+            <w:r>
+              <w:rPr>
+                <w:rFonts w:ascii="Poppins" w:hAnsi="Poppins" w:cs="Poppins" w:eastAsia="Poppins"/>
+                <w:b/>
+                <w:i w:val="0"/>
+                <w:color w:val="FFFFFF"/>
+                <w:sz w:val="18"/>
+              </w:rPr>
+              <w:t>RecoTime</w:t>
             </w:r>
           </w:p>
         </w:tc>
@@ -23259,7 +23060,7 @@
         </w:trPr>
         <w:tc>
           <w:tcPr>
-            <w:tcW w:type="dxa" w:w="2200"/>
+            <w:tcW w:type="dxa" w:w="2800"/>
             <w:tcBorders>
               <w:top w:val="single" w:sz="4" w:space="0" w:color="1B3325"/>
               <w:left w:val="single" w:sz="4" w:space="0" w:color="1B3325"/>
@@ -23291,13 +23092,13 @@
                 <w:color w:val="1B3325"/>
                 <w:sz w:val="18"/>
               </w:rPr>
-              <w:t>El trabajador</w:t>
+              <w:t>Autoempleo y puestos de trabajo</w:t>
             </w:r>
           </w:p>
         </w:tc>
         <w:tc>
           <w:tcPr>
-            <w:tcW w:type="dxa" w:w="7400"/>
+            <w:tcW w:type="dxa" w:w="6800"/>
             <w:tcBorders>
               <w:top w:val="single" w:sz="4" w:space="0" w:color="1B3325"/>
               <w:left w:val="single" w:sz="4" w:space="0" w:color="1B3325"/>
@@ -23329,7 +23130,7 @@
                 <w:color w:val="1B3325"/>
                 <w:sz w:val="18"/>
               </w:rPr>
-              <w:t>Consulta su línea del día y el chat de su trabajo. El almuerzo y los descansos no se diluyen en un mensaje de «ya llegué». Puede pedir el dato sin reconstruir la semana.</w:t>
+              <w:t>La asistencia deja quién llegó, almorzó, descansó y salió. Sirve para ver el equipo que la iniciativa dice tener o retener.</w:t>
             </w:r>
           </w:p>
         </w:tc>
@@ -23340,7 +23141,7 @@
         </w:trPr>
         <w:tc>
           <w:tcPr>
-            <w:tcW w:type="dxa" w:w="2200"/>
+            <w:tcW w:type="dxa" w:w="2800"/>
             <w:tcBorders>
               <w:top w:val="single" w:sz="4" w:space="0" w:color="1B3325"/>
               <w:left w:val="single" w:sz="4" w:space="0" w:color="1B3325"/>
@@ -23372,13 +23173,13 @@
                 <w:color w:val="1B3325"/>
                 <w:sz w:val="18"/>
               </w:rPr>
-              <w:t>La empresa</w:t>
+              <w:t>Orden de la unidad productiva</w:t>
             </w:r>
           </w:p>
         </w:tc>
         <w:tc>
           <w:tcPr>
-            <w:tcW w:type="dxa" w:w="7400"/>
+            <w:tcW w:type="dxa" w:w="6800"/>
             <w:tcBorders>
               <w:top w:val="single" w:sz="4" w:space="0" w:color="1B3325"/>
               <w:left w:val="single" w:sz="4" w:space="0" w:color="1B3325"/>
@@ -23410,7 +23211,7 @@
                 <w:color w:val="1B3325"/>
                 <w:sz w:val="18"/>
               </w:rPr>
-              <w:t>Explica una jornada con marcas de fecha y hora, y explica la gestión de un cliente con el expediente y el chat interno. El reglamento y la política de desconexión tienen un soporte que se puede abrir.</w:t>
+              <w:t>El expediente del cliente y el chat interno dejan cómo se atiende el negocio, dentro de la empresa.</w:t>
             </w:r>
           </w:p>
         </w:tc>
@@ -23421,7 +23222,7 @@
         </w:trPr>
         <w:tc>
           <w:tcPr>
-            <w:tcW w:type="dxa" w:w="2200"/>
+            <w:tcW w:type="dxa" w:w="2800"/>
             <w:tcBorders>
               <w:top w:val="single" w:sz="4" w:space="0" w:color="1B3325"/>
               <w:left w:val="single" w:sz="4" w:space="0" w:color="1B3325"/>
@@ -23452,13 +23253,13 @@
                 <w:color w:val="1B3325"/>
                 <w:sz w:val="18"/>
               </w:rPr>
-              <w:t>Una revisión o una queja</w:t>
+              <w:t>Continuidad del emprendimiento</w:t>
             </w:r>
           </w:p>
         </w:tc>
         <w:tc>
           <w:tcPr>
-            <w:tcW w:type="dxa" w:w="7400"/>
+            <w:tcW w:type="dxa" w:w="6800"/>
             <w:tcBorders>
               <w:top w:val="single" w:sz="4" w:space="0" w:color="1B3325"/>
               <w:left w:val="single" w:sz="4" w:space="0" w:color="1B3325"/>
@@ -23489,7 +23290,27 @@
                 <w:color w:val="1B3325"/>
                 <w:sz w:val="18"/>
               </w:rPr>
-              <w:t>El intermedio de descanso se distingue del tiempo de trabajo, que es la separación del artículo 167. La orden tiene autor y hora, que es el dato que la Ley 2191 pone en el centro.</w:t>
+              <w:t xml:space="preserve">El Drive guarda actas, formatos y la gestión. Los 2 TB los entrega </w:t>
+            </w:r>
+            <w:r>
+              <w:rPr>
+                <w:rFonts w:ascii="Poppins" w:hAnsi="Poppins" w:cs="Poppins" w:eastAsia="Poppins"/>
+                <w:b/>
+                <w:i w:val="0"/>
+                <w:color w:val="1B3325"/>
+                <w:sz w:val="18"/>
+              </w:rPr>
+              <w:t>THE COMPANY DEV</w:t>
+            </w:r>
+            <w:r>
+              <w:rPr>
+                <w:rFonts w:ascii="Poppins" w:hAnsi="Poppins" w:cs="Poppins" w:eastAsia="Poppins"/>
+                <w:b w:val="0"/>
+                <w:i w:val="0"/>
+                <w:color w:val="1B3325"/>
+                <w:sz w:val="18"/>
+              </w:rPr>
+              <w:t>.</w:t>
             </w:r>
           </w:p>
         </w:tc>
@@ -23516,27 +23337,7 @@
           <w:color w:val="1B3325"/>
           <w:sz w:val="26"/>
         </w:rPr>
-        <w:t xml:space="preserve">La parte social de </w:t>
-      </w:r>
-      <w:r>
-        <w:rPr>
-          <w:rFonts w:ascii="Poppins" w:hAnsi="Poppins" w:cs="Poppins" w:eastAsia="Poppins"/>
-          <w:b/>
-          <w:i w:val="0"/>
-          <w:color w:val="1B3325"/>
-          <w:sz w:val="26"/>
-        </w:rPr>
-        <w:t>RecoTime</w:t>
-      </w:r>
-      <w:r>
-        <w:rPr>
-          <w:rFonts w:ascii="Poppins" w:hAnsi="Poppins" w:cs="Poppins" w:eastAsia="Poppins"/>
-          <w:b w:val="0"/>
-          <w:i w:val="0"/>
-          <w:color w:val="1B3325"/>
-          <w:sz w:val="26"/>
-        </w:rPr>
-        <w:t xml:space="preserve"> es ese registro compartido. Protege el tiempo de descanso porque lo hace visible, y protege la vida personal porque saca la orden de trabajo del teléfono particular. La obligación legal sigue en la empresa: el reglamento, la política de desconexión y la liquidación de la jornada no se delegan en el software.</w:t>
+        <w:t>La ayuda es de operación. La postulación, los indicadores ante el fondo y la condonación siguen a cargo de quien presente el plan.</w:t>
       </w:r>
     </w:p>
     <w:p>

</xml_diff>

<commit_message>
Cambiar la frase de apertura del informe de RecoTime.
Co-authored-by: Jhon123Javier <Jhon123Javier@users.noreply.github.com>
</commit_message>
<xml_diff>
--- a/documentos/recotime/Informe The Company Dev - Perfil RecoTime.docx
+++ b/documentos/recotime/Informe The Company Dev - Perfil RecoTime.docx
@@ -169,7 +169,7 @@
     </w:p>
     <w:p>
       <w:pPr>
-        <w:spacing w:before="0" w:after="160" w:line="259" w:lineRule="auto"/>
+        <w:spacing w:before="40" w:after="160" w:line="259" w:lineRule="auto"/>
         <w:jc w:val="left"/>
         <w:widowControl/>
       </w:pPr>
@@ -178,10 +178,10 @@
           <w:rFonts w:ascii="Poppins" w:hAnsi="Poppins" w:cs="Poppins" w:eastAsia="Poppins"/>
           <w:b w:val="0"/>
           <w:i w:val="0"/>
-          <w:color w:val="1B3325"/>
-          <w:sz w:val="26"/>
+          <w:color w:val="003060"/>
+          <w:sz w:val="24"/>
         </w:rPr>
-        <w:t>“El día del equipo se entiende cuando se ve la llegada, el almuerzo, el descanso y el trabajo de cada persona.”</w:t>
+        <w:t>Quién atendió al cliente, qué se dijo y cómo fue la jornada.</w:t>
       </w:r>
     </w:p>
     <w:p>

</xml_diff>

<commit_message>
Ajustar la puesta en marcha a 1 o 2 semanas y pasar lo excluido a Kybox.
Co-authored-by: Jhon123Javier <Jhon123Javier@users.noreply.github.com>
</commit_message>
<xml_diff>
--- a/documentos/recotime/Informe The Company Dev - Perfil RecoTime.docx
+++ b/documentos/recotime/Informe The Company Dev - Perfil RecoTime.docx
@@ -2804,7 +2804,7 @@
           <w:color w:val="1B3325"/>
           <w:sz w:val="26"/>
         </w:rPr>
-        <w:t xml:space="preserve">El comprador de esta versión es la empresa que dirige personas y clientes. Las cifras de nómina y de contabilidad de la sección 9 sirven para mostrar qué problema cubre otro producto. </w:t>
+        <w:t xml:space="preserve">El comprador de esta versión es la empresa que dirige personas y clientes. Las cifras de nómina y de contabilidad de la sección 9 sirven para mostrar qué problema cubre otro producto. Nómina, contabilidad, varias sedes, reloj o aplicación en tienda se presuponen en </w:t>
       </w:r>
       <w:r>
         <w:rPr>
@@ -2814,7 +2814,7 @@
           <w:color w:val="1B3325"/>
           <w:sz w:val="26"/>
         </w:rPr>
-        <w:t>RecoTime</w:t>
+        <w:t>Kybox</w:t>
       </w:r>
       <w:r>
         <w:rPr>
@@ -2824,7 +2824,7 @@
           <w:color w:val="1B3325"/>
           <w:sz w:val="26"/>
         </w:rPr>
-        <w:t xml:space="preserve"> puede crecer después, por cotización, hacia varias sedes, marcación desde un reloj o una aplicación publicada en tienda.</w:t>
+        <w:t>, un servicio aparte.</w:t>
       </w:r>
     </w:p>
     <w:p>
@@ -4310,7 +4310,7 @@
           <w:color w:val="1B3325"/>
           <w:sz w:val="26"/>
         </w:rPr>
-        <w:t>La configuración, la carga inicial acordada, la estructura de carpetas del Drive, la capacitación por rol y la documentación básica van incluidas en las tres modalidades. El calendario propuesto es de 8 a 12 semanas, contadas desde el día en que la empresa entrega el organigrama, la lista de trabajadores, los clientes activos, el horario de llegada, almuerzo y descansos, y el acceso a la VPS y al dominio. Si esa información llega después, el calendario se corre.</w:t>
+        <w:t>La configuración, la carga inicial acordada, la estructura de carpetas del Drive, la capacitación por rol y la documentación básica van incluidas en las tres modalidades. La puesta en marcha dura de 1 a 2 semanas, contadas desde el día en que la empresa entrega a tiempo el organigrama, la lista de trabajadores, los clientes activos, el horario de llegada, almuerzo y descansos, y el acceso a la VPS y al dominio. Si esa información llega después, el calendario se corre.</w:t>
       </w:r>
     </w:p>
     <w:p>
@@ -4345,7 +4345,67 @@
           <w:color w:val="1B3325"/>
           <w:sz w:val="26"/>
         </w:rPr>
-        <w:t xml:space="preserve">Esta versión deja para una cotización posterior la nómina, la PILA, la nómina electrónica ante la DIAN, la factura electrónica, la contabilidad, el inventario, las compras y el POS. También se cotizan el reloj o el biométrico, la publicación en Play Store o App Store, varias sedes, el espacio por encima de la cuota de 2 TB y el consumo de WhatsApp. Las marcas de esta versión las registra el trabajador o el supervisor dentro de </w:t>
+        <w:t xml:space="preserve">Lo que queda fuera de esta versión se presupuesta por aparte, en otro servicio de </w:t>
+      </w:r>
+      <w:r>
+        <w:rPr>
+          <w:rFonts w:ascii="Poppins" w:hAnsi="Poppins" w:cs="Poppins" w:eastAsia="Poppins"/>
+          <w:b/>
+          <w:i w:val="0"/>
+          <w:color w:val="1B3325"/>
+          <w:sz w:val="26"/>
+        </w:rPr>
+        <w:t>THE COMPANY DEV</w:t>
+      </w:r>
+      <w:r>
+        <w:rPr>
+          <w:rFonts w:ascii="Poppins" w:hAnsi="Poppins" w:cs="Poppins" w:eastAsia="Poppins"/>
+          <w:b w:val="0"/>
+          <w:i w:val="0"/>
+          <w:color w:val="1B3325"/>
+          <w:sz w:val="26"/>
+        </w:rPr>
+        <w:t xml:space="preserve"> que se llama </w:t>
+      </w:r>
+      <w:r>
+        <w:rPr>
+          <w:rFonts w:ascii="Poppins" w:hAnsi="Poppins" w:cs="Poppins" w:eastAsia="Poppins"/>
+          <w:b/>
+          <w:i w:val="0"/>
+          <w:color w:val="1B3325"/>
+          <w:sz w:val="26"/>
+        </w:rPr>
+        <w:t>Kybox</w:t>
+      </w:r>
+      <w:r>
+        <w:rPr>
+          <w:rFonts w:ascii="Poppins" w:hAnsi="Poppins" w:cs="Poppins" w:eastAsia="Poppins"/>
+          <w:b w:val="0"/>
+          <w:i w:val="0"/>
+          <w:color w:val="1B3325"/>
+          <w:sz w:val="26"/>
+        </w:rPr>
+        <w:t xml:space="preserve">: la nómina, la PILA, la nómina electrónica ante la DIAN, la factura electrónica, la contabilidad, el inventario, las compras y el POS. En </w:t>
+      </w:r>
+      <w:r>
+        <w:rPr>
+          <w:rFonts w:ascii="Poppins" w:hAnsi="Poppins" w:cs="Poppins" w:eastAsia="Poppins"/>
+          <w:b/>
+          <w:i w:val="0"/>
+          <w:color w:val="1B3325"/>
+          <w:sz w:val="26"/>
+        </w:rPr>
+        <w:t>Kybox</w:t>
+      </w:r>
+      <w:r>
+        <w:rPr>
+          <w:rFonts w:ascii="Poppins" w:hAnsi="Poppins" w:cs="Poppins" w:eastAsia="Poppins"/>
+          <w:b w:val="0"/>
+          <w:i w:val="0"/>
+          <w:color w:val="1B3325"/>
+          <w:sz w:val="26"/>
+        </w:rPr>
+        <w:t xml:space="preserve"> también entran el reloj o el biométrico, la publicación en Play Store o App Store, varias sedes, el espacio por encima de la cuota de 2 TB y el consumo de WhatsApp. Las marcas de esta versión las registra el trabajador o el supervisor dentro de </w:t>
       </w:r>
       <w:r>
         <w:rPr>
@@ -4365,7 +4425,7 @@
           <w:color w:val="1B3325"/>
           <w:sz w:val="26"/>
         </w:rPr>
-        <w:t>. La VPS y el dominio no se cotizan aquí: los coloca el cliente.</w:t>
+        <w:t>. La VPS y el dominio los coloca el cliente.</w:t>
       </w:r>
     </w:p>
     <w:p>
@@ -18613,7 +18673,27 @@
                 <w:color w:val="1B3325"/>
                 <w:sz w:val="20"/>
               </w:rPr>
-              <w:t>Se cotizan, o permanecen en el software contable del cliente.</w:t>
+              <w:t xml:space="preserve">Se presupuesta en </w:t>
+            </w:r>
+            <w:r>
+              <w:rPr>
+                <w:rFonts w:ascii="Poppins" w:hAnsi="Poppins" w:cs="Poppins" w:eastAsia="Poppins"/>
+                <w:b/>
+                <w:i w:val="0"/>
+                <w:color w:val="1B3325"/>
+                <w:sz w:val="20"/>
+              </w:rPr>
+              <w:t>Kybox</w:t>
+            </w:r>
+            <w:r>
+              <w:rPr>
+                <w:rFonts w:ascii="Poppins" w:hAnsi="Poppins" w:cs="Poppins" w:eastAsia="Poppins"/>
+                <w:b w:val="0"/>
+                <w:i w:val="0"/>
+                <w:color w:val="1B3325"/>
+                <w:sz w:val="20"/>
+              </w:rPr>
+              <w:t>, o permanece en el software contable del cliente.</w:t>
             </w:r>
           </w:p>
         </w:tc>
@@ -18694,7 +18774,27 @@
                 <w:color w:val="1B3325"/>
                 <w:sz w:val="20"/>
               </w:rPr>
-              <w:t>Se cotizan según el alcance.</w:t>
+              <w:t xml:space="preserve">Se presupuesta en </w:t>
+            </w:r>
+            <w:r>
+              <w:rPr>
+                <w:rFonts w:ascii="Poppins" w:hAnsi="Poppins" w:cs="Poppins" w:eastAsia="Poppins"/>
+                <w:b/>
+                <w:i w:val="0"/>
+                <w:color w:val="1B3325"/>
+                <w:sz w:val="20"/>
+              </w:rPr>
+              <w:t>Kybox</w:t>
+            </w:r>
+            <w:r>
+              <w:rPr>
+                <w:rFonts w:ascii="Poppins" w:hAnsi="Poppins" w:cs="Poppins" w:eastAsia="Poppins"/>
+                <w:b w:val="0"/>
+                <w:i w:val="0"/>
+                <w:color w:val="1B3325"/>
+                <w:sz w:val="20"/>
+              </w:rPr>
+              <w:t>, según el alcance.</w:t>
             </w:r>
           </w:p>
         </w:tc>
@@ -18775,7 +18875,27 @@
                 <w:color w:val="1B3325"/>
                 <w:sz w:val="20"/>
               </w:rPr>
-              <w:t xml:space="preserve">Se cotiza. Esta versión registra la marca dentro de </w:t>
+              <w:t xml:space="preserve">Se presupuesta en </w:t>
+            </w:r>
+            <w:r>
+              <w:rPr>
+                <w:rFonts w:ascii="Poppins" w:hAnsi="Poppins" w:cs="Poppins" w:eastAsia="Poppins"/>
+                <w:b/>
+                <w:i w:val="0"/>
+                <w:color w:val="1B3325"/>
+                <w:sz w:val="20"/>
+              </w:rPr>
+              <w:t>Kybox</w:t>
+            </w:r>
+            <w:r>
+              <w:rPr>
+                <w:rFonts w:ascii="Poppins" w:hAnsi="Poppins" w:cs="Poppins" w:eastAsia="Poppins"/>
+                <w:b w:val="0"/>
+                <w:i w:val="0"/>
+                <w:color w:val="1B3325"/>
+                <w:sz w:val="20"/>
+              </w:rPr>
+              <w:t xml:space="preserve">. Esta versión registra la marca dentro de </w:t>
             </w:r>
             <w:r>
               <w:rPr>
@@ -18876,7 +18996,27 @@
                 <w:color w:val="1B3325"/>
                 <w:sz w:val="20"/>
               </w:rPr>
-              <w:t xml:space="preserve">Se cotiza. Los 2 TB del Drive los entrega </w:t>
+              <w:t xml:space="preserve">Se presupuesta en </w:t>
+            </w:r>
+            <w:r>
+              <w:rPr>
+                <w:rFonts w:ascii="Poppins" w:hAnsi="Poppins" w:cs="Poppins" w:eastAsia="Poppins"/>
+                <w:b/>
+                <w:i w:val="0"/>
+                <w:color w:val="1B3325"/>
+                <w:sz w:val="20"/>
+              </w:rPr>
+              <w:t>Kybox</w:t>
+            </w:r>
+            <w:r>
+              <w:rPr>
+                <w:rFonts w:ascii="Poppins" w:hAnsi="Poppins" w:cs="Poppins" w:eastAsia="Poppins"/>
+                <w:b w:val="0"/>
+                <w:i w:val="0"/>
+                <w:color w:val="1B3325"/>
+                <w:sz w:val="20"/>
+              </w:rPr>
+              <w:t xml:space="preserve">. Los 2 TB del Drive los entrega </w:t>
             </w:r>
             <w:r>
               <w:rPr>
@@ -18977,7 +19117,27 @@
                 <w:color w:val="1B3325"/>
                 <w:sz w:val="20"/>
               </w:rPr>
-              <w:t>Lo paga el cliente al proveedor de la línea. No va en la mensualidad.</w:t>
+              <w:t xml:space="preserve">Se presupuesta en </w:t>
+            </w:r>
+            <w:r>
+              <w:rPr>
+                <w:rFonts w:ascii="Poppins" w:hAnsi="Poppins" w:cs="Poppins" w:eastAsia="Poppins"/>
+                <w:b/>
+                <w:i w:val="0"/>
+                <w:color w:val="1B3325"/>
+                <w:sz w:val="20"/>
+              </w:rPr>
+              <w:t>Kybox</w:t>
+            </w:r>
+            <w:r>
+              <w:rPr>
+                <w:rFonts w:ascii="Poppins" w:hAnsi="Poppins" w:cs="Poppins" w:eastAsia="Poppins"/>
+                <w:b w:val="0"/>
+                <w:i w:val="0"/>
+                <w:color w:val="1B3325"/>
+                <w:sz w:val="20"/>
+              </w:rPr>
+              <w:t>. El consumo de la línea lo paga el cliente al proveedor.</w:t>
             </w:r>
           </w:p>
         </w:tc>
@@ -19970,7 +20130,27 @@
                 <w:color w:val="1B3325"/>
                 <w:sz w:val="16"/>
               </w:rPr>
-              <w:t>Fuera de esta versión</w:t>
+              <w:t xml:space="preserve">Fuera de esta versión. Se presupuesta en </w:t>
+            </w:r>
+            <w:r>
+              <w:rPr>
+                <w:rFonts w:ascii="Poppins" w:hAnsi="Poppins" w:cs="Poppins" w:eastAsia="Poppins"/>
+                <w:b/>
+                <w:i w:val="0"/>
+                <w:color w:val="1B3325"/>
+                <w:sz w:val="16"/>
+              </w:rPr>
+              <w:t>Kybox</w:t>
+            </w:r>
+            <w:r>
+              <w:rPr>
+                <w:rFonts w:ascii="Poppins" w:hAnsi="Poppins" w:cs="Poppins" w:eastAsia="Poppins"/>
+                <w:b w:val="0"/>
+                <w:i w:val="0"/>
+                <w:color w:val="1B3325"/>
+                <w:sz w:val="16"/>
+              </w:rPr>
+              <w:t>.</w:t>
             </w:r>
           </w:p>
         </w:tc>
@@ -20087,7 +20267,27 @@
                 <w:color w:val="1B3325"/>
                 <w:sz w:val="16"/>
               </w:rPr>
-              <w:t>Fuera de esta versión</w:t>
+              <w:t xml:space="preserve">Fuera de esta versión. Se presupuesta en </w:t>
+            </w:r>
+            <w:r>
+              <w:rPr>
+                <w:rFonts w:ascii="Poppins" w:hAnsi="Poppins" w:cs="Poppins" w:eastAsia="Poppins"/>
+                <w:b/>
+                <w:i w:val="0"/>
+                <w:color w:val="1B3325"/>
+                <w:sz w:val="16"/>
+              </w:rPr>
+              <w:t>Kybox</w:t>
+            </w:r>
+            <w:r>
+              <w:rPr>
+                <w:rFonts w:ascii="Poppins" w:hAnsi="Poppins" w:cs="Poppins" w:eastAsia="Poppins"/>
+                <w:b w:val="0"/>
+                <w:i w:val="0"/>
+                <w:color w:val="1B3325"/>
+                <w:sz w:val="16"/>
+              </w:rPr>
+              <w:t>.</w:t>
             </w:r>
           </w:p>
         </w:tc>
@@ -22203,7 +22403,7 @@
                 <w:color w:val="1B3325"/>
                 <w:sz w:val="20"/>
               </w:rPr>
-              <w:t>El calendario de 8 a 12 semanas corre cuando el cliente ya colocó la VPS y el dominio, y entregó organigrama, trabajadores, clientes y horario.</w:t>
+              <w:t>La puesta en marcha dura de 1 a 2 semanas cuando el cliente entrega a tiempo la VPS, el dominio, el organigrama, los trabajadores, los clientes y el horario.</w:t>
             </w:r>
           </w:p>
         </w:tc>
@@ -22817,7 +23017,7 @@
           <w:color w:val="1B3325"/>
           <w:sz w:val="26"/>
         </w:rPr>
-        <w:t>Aprobar el calendario de 8 a 12 semanas y las 3 horas mensuales de soporte.</w:t>
+        <w:t>Aprobar la puesta en marcha de 1 a 2 semanas, cuando el cliente entrega la información a tiempo, y las 3 horas mensuales de soporte.</w:t>
       </w:r>
     </w:p>
     <w:p>

</xml_diff>